<commit_message>
update ref.docx - shrink Source Code font size down to 6.5pt
</commit_message>
<xml_diff>
--- a/system/ref.docx
+++ b/system/ref.docx
@@ -1,6 +1,6 @@
 
 <file path=word/document.xml><?xml version="1.0" encoding="utf-8"?>
-<w:document xmlns:wpc="http://schemas.microsoft.com/office/word/2010/wordprocessingCanvas" xmlns:cx="http://schemas.microsoft.com/office/drawing/2014/chartex" xmlns:cx1="http://schemas.microsoft.com/office/drawing/2015/9/8/chartex" xmlns:cx2="http://schemas.microsoft.com/office/drawing/2015/10/21/chartex" xmlns:cx3="http://schemas.microsoft.com/office/drawing/2016/5/9/chartex" xmlns:cx4="http://schemas.microsoft.com/office/drawing/2016/5/10/chartex" xmlns:cx5="http://schemas.microsoft.com/office/drawing/2016/5/11/chartex" xmlns:cx6="http://schemas.microsoft.com/office/drawing/2016/5/12/chartex" xmlns:cx7="http://schemas.microsoft.com/office/drawing/2016/5/13/chartex" xmlns:cx8="http://schemas.microsoft.com/office/drawing/2016/5/14/chartex" xmlns:mc="http://schemas.openxmlformats.org/markup-compatibility/2006" xmlns:aink="http://schemas.microsoft.com/office/drawing/2016/ink" xmlns:am3d="http://schemas.microsoft.com/office/drawing/2017/model3d" xmlns:o="urn:schemas-microsoft-com:office:office" xmlns:oel="http://schemas.microsoft.com/office/2019/extlst" xmlns:r="http://schemas.openxmlformats.org/officeDocument/2006/relationships" xmlns:m="http://schemas.openxmlformats.org/officeDocument/2006/math" xmlns:v="urn:schemas-microsoft-com:vml" xmlns:wp14="http://schemas.microsoft.com/office/word/2010/wordprocessingDrawing" xmlns:wp="http://schemas.openxmlformats.org/drawingml/2006/wordprocessingDrawing" xmlns:w10="urn:schemas-microsoft-com:office:word" xmlns:w="http://schemas.openxmlformats.org/wordprocessingml/2006/main" xmlns:w14="http://schemas.microsoft.com/office/word/2010/wordml" xmlns:w15="http://schemas.microsoft.com/office/word/2012/wordml" xmlns:w16cex="http://schemas.microsoft.com/office/word/2018/wordml/cex" xmlns:w16cid="http://schemas.microsoft.com/office/word/2016/wordml/cid" xmlns:w16="http://schemas.microsoft.com/office/word/2018/wordml" xmlns:w16sdtdh="http://schemas.microsoft.com/office/word/2020/wordml/sdtdatahash" xmlns:w16se="http://schemas.microsoft.com/office/word/2015/wordml/symex" xmlns:wpg="http://schemas.microsoft.com/office/word/2010/wordprocessingGroup" xmlns:wpi="http://schemas.microsoft.com/office/word/2010/wordprocessingInk" xmlns:wne="http://schemas.microsoft.com/office/word/2006/wordml" xmlns:wps="http://schemas.microsoft.com/office/word/2010/wordprocessingShape" mc:Ignorable="w14 w15 w16se w16cid w16 w16cex w16sdtdh wp14">
+<w:document xmlns:wpc="http://schemas.microsoft.com/office/word/2010/wordprocessingCanvas" xmlns:cx="http://schemas.microsoft.com/office/drawing/2014/chartex" xmlns:cx1="http://schemas.microsoft.com/office/drawing/2015/9/8/chartex" xmlns:cx2="http://schemas.microsoft.com/office/drawing/2015/10/21/chartex" xmlns:cx3="http://schemas.microsoft.com/office/drawing/2016/5/9/chartex" xmlns:cx4="http://schemas.microsoft.com/office/drawing/2016/5/10/chartex" xmlns:cx5="http://schemas.microsoft.com/office/drawing/2016/5/11/chartex" xmlns:cx6="http://schemas.microsoft.com/office/drawing/2016/5/12/chartex" xmlns:cx7="http://schemas.microsoft.com/office/drawing/2016/5/13/chartex" xmlns:cx8="http://schemas.microsoft.com/office/drawing/2016/5/14/chartex" xmlns:mc="http://schemas.openxmlformats.org/markup-compatibility/2006" xmlns:aink="http://schemas.microsoft.com/office/drawing/2016/ink" xmlns:am3d="http://schemas.microsoft.com/office/drawing/2017/model3d" xmlns:o="urn:schemas-microsoft-com:office:office" xmlns:oel="http://schemas.microsoft.com/office/2019/extlst" xmlns:r="http://schemas.openxmlformats.org/officeDocument/2006/relationships" xmlns:m="http://schemas.openxmlformats.org/officeDocument/2006/math" xmlns:v="urn:schemas-microsoft-com:vml" xmlns:wp14="http://schemas.microsoft.com/office/word/2010/wordprocessingDrawing" xmlns:wp="http://schemas.openxmlformats.org/drawingml/2006/wordprocessingDrawing" xmlns:w10="urn:schemas-microsoft-com:office:word" xmlns:w="http://schemas.openxmlformats.org/wordprocessingml/2006/main" xmlns:w14="http://schemas.microsoft.com/office/word/2010/wordml" xmlns:w15="http://schemas.microsoft.com/office/word/2012/wordml" xmlns:w16cex="http://schemas.microsoft.com/office/word/2018/wordml/cex" xmlns:w16cid="http://schemas.microsoft.com/office/word/2016/wordml/cid" xmlns:w16="http://schemas.microsoft.com/office/word/2018/wordml" xmlns:w16du="http://schemas.microsoft.com/office/word/2023/wordml/word16du" xmlns:w16sdtdh="http://schemas.microsoft.com/office/word/2020/wordml/sdtdatahash" xmlns:w16sdtfl="http://schemas.microsoft.com/office/word/2024/wordml/sdtformatlock" xmlns:w16se="http://schemas.microsoft.com/office/word/2015/wordml/symex" xmlns:wpg="http://schemas.microsoft.com/office/word/2010/wordprocessingGroup" xmlns:wpi="http://schemas.microsoft.com/office/word/2010/wordprocessingInk" xmlns:wne="http://schemas.microsoft.com/office/word/2006/wordml" xmlns:wps="http://schemas.microsoft.com/office/word/2010/wordprocessingShape" mc:Ignorable="w14 w15 w16se w16cid w16 w16cex w16sdtdh w16sdtfl w16du wp14">
   <w:body>
     <w:p>
       <w:pPr>
@@ -2751,7 +2751,6 @@
         <w:rPr>
           <w:rStyle w:val="RegionMarkerTok"/>
         </w:rPr>
-        <w:lastRenderedPageBreak/>
         <w:t>RegionMarkerTok</w:t>
       </w:r>
       <w:r>
@@ -2817,6 +2816,7 @@
         <w:pStyle w:val="SourceCode"/>
       </w:pPr>
       <w:r>
+        <w:lastRenderedPageBreak/>
         <w:t>This is a pen</w:t>
       </w:r>
     </w:p>
@@ -3946,7 +3946,6 @@
         <w:rPr>
           <w:rStyle w:val="DecValTok"/>
         </w:rPr>
-        <w:lastRenderedPageBreak/>
         <w:t>reverse-docx:</w:t>
       </w:r>
       <w:r>
@@ -4038,6 +4037,7 @@
         <w:rPr>
           <w:rStyle w:val="CommentTok"/>
         </w:rPr>
+        <w:lastRenderedPageBreak/>
         <w:t>"""A setuptools based setup module.</w:t>
       </w:r>
       <w:r>
@@ -4662,7 +4662,6 @@
         <w:rPr>
           <w:rStyle w:val="NormalTok"/>
         </w:rPr>
-        <w:lastRenderedPageBreak/>
         <w:t xml:space="preserve">    </w:t>
       </w:r>
       <w:r>
@@ -5012,7 +5011,7 @@
 </file>
 
 <file path=word/endnotes.xml><?xml version="1.0" encoding="utf-8"?>
-<w:endnotes xmlns:wpc="http://schemas.microsoft.com/office/word/2010/wordprocessingCanvas" xmlns:cx="http://schemas.microsoft.com/office/drawing/2014/chartex" xmlns:cx1="http://schemas.microsoft.com/office/drawing/2015/9/8/chartex" xmlns:cx2="http://schemas.microsoft.com/office/drawing/2015/10/21/chartex" xmlns:cx3="http://schemas.microsoft.com/office/drawing/2016/5/9/chartex" xmlns:cx4="http://schemas.microsoft.com/office/drawing/2016/5/10/chartex" xmlns:cx5="http://schemas.microsoft.com/office/drawing/2016/5/11/chartex" xmlns:cx6="http://schemas.microsoft.com/office/drawing/2016/5/12/chartex" xmlns:cx7="http://schemas.microsoft.com/office/drawing/2016/5/13/chartex" xmlns:cx8="http://schemas.microsoft.com/office/drawing/2016/5/14/chartex" xmlns:mc="http://schemas.openxmlformats.org/markup-compatibility/2006" xmlns:aink="http://schemas.microsoft.com/office/drawing/2016/ink" xmlns:am3d="http://schemas.microsoft.com/office/drawing/2017/model3d" xmlns:o="urn:schemas-microsoft-com:office:office" xmlns:oel="http://schemas.microsoft.com/office/2019/extlst" xmlns:r="http://schemas.openxmlformats.org/officeDocument/2006/relationships" xmlns:m="http://schemas.openxmlformats.org/officeDocument/2006/math" xmlns:v="urn:schemas-microsoft-com:vml" xmlns:wp14="http://schemas.microsoft.com/office/word/2010/wordprocessingDrawing" xmlns:wp="http://schemas.openxmlformats.org/drawingml/2006/wordprocessingDrawing" xmlns:w10="urn:schemas-microsoft-com:office:word" xmlns:w="http://schemas.openxmlformats.org/wordprocessingml/2006/main" xmlns:w14="http://schemas.microsoft.com/office/word/2010/wordml" xmlns:w15="http://schemas.microsoft.com/office/word/2012/wordml" xmlns:w16cex="http://schemas.microsoft.com/office/word/2018/wordml/cex" xmlns:w16cid="http://schemas.microsoft.com/office/word/2016/wordml/cid" xmlns:w16="http://schemas.microsoft.com/office/word/2018/wordml" xmlns:w16sdtdh="http://schemas.microsoft.com/office/word/2020/wordml/sdtdatahash" xmlns:w16se="http://schemas.microsoft.com/office/word/2015/wordml/symex" xmlns:wpg="http://schemas.microsoft.com/office/word/2010/wordprocessingGroup" xmlns:wpi="http://schemas.microsoft.com/office/word/2010/wordprocessingInk" xmlns:wne="http://schemas.microsoft.com/office/word/2006/wordml" xmlns:wps="http://schemas.microsoft.com/office/word/2010/wordprocessingShape" mc:Ignorable="w14 w15 w16se w16cid w16 w16cex w16sdtdh wp14">
+<w:endnotes xmlns:wpc="http://schemas.microsoft.com/office/word/2010/wordprocessingCanvas" xmlns:cx="http://schemas.microsoft.com/office/drawing/2014/chartex" xmlns:cx1="http://schemas.microsoft.com/office/drawing/2015/9/8/chartex" xmlns:cx2="http://schemas.microsoft.com/office/drawing/2015/10/21/chartex" xmlns:cx3="http://schemas.microsoft.com/office/drawing/2016/5/9/chartex" xmlns:cx4="http://schemas.microsoft.com/office/drawing/2016/5/10/chartex" xmlns:cx5="http://schemas.microsoft.com/office/drawing/2016/5/11/chartex" xmlns:cx6="http://schemas.microsoft.com/office/drawing/2016/5/12/chartex" xmlns:cx7="http://schemas.microsoft.com/office/drawing/2016/5/13/chartex" xmlns:cx8="http://schemas.microsoft.com/office/drawing/2016/5/14/chartex" xmlns:mc="http://schemas.openxmlformats.org/markup-compatibility/2006" xmlns:aink="http://schemas.microsoft.com/office/drawing/2016/ink" xmlns:am3d="http://schemas.microsoft.com/office/drawing/2017/model3d" xmlns:o="urn:schemas-microsoft-com:office:office" xmlns:oel="http://schemas.microsoft.com/office/2019/extlst" xmlns:r="http://schemas.openxmlformats.org/officeDocument/2006/relationships" xmlns:m="http://schemas.openxmlformats.org/officeDocument/2006/math" xmlns:v="urn:schemas-microsoft-com:vml" xmlns:wp14="http://schemas.microsoft.com/office/word/2010/wordprocessingDrawing" xmlns:wp="http://schemas.openxmlformats.org/drawingml/2006/wordprocessingDrawing" xmlns:w10="urn:schemas-microsoft-com:office:word" xmlns:w="http://schemas.openxmlformats.org/wordprocessingml/2006/main" xmlns:w14="http://schemas.microsoft.com/office/word/2010/wordml" xmlns:w15="http://schemas.microsoft.com/office/word/2012/wordml" xmlns:w16cex="http://schemas.microsoft.com/office/word/2018/wordml/cex" xmlns:w16cid="http://schemas.microsoft.com/office/word/2016/wordml/cid" xmlns:w16="http://schemas.microsoft.com/office/word/2018/wordml" xmlns:w16du="http://schemas.microsoft.com/office/word/2023/wordml/word16du" xmlns:w16sdtdh="http://schemas.microsoft.com/office/word/2020/wordml/sdtdatahash" xmlns:w16sdtfl="http://schemas.microsoft.com/office/word/2024/wordml/sdtformatlock" xmlns:w16se="http://schemas.microsoft.com/office/word/2015/wordml/symex" xmlns:wpg="http://schemas.microsoft.com/office/word/2010/wordprocessingGroup" xmlns:wpi="http://schemas.microsoft.com/office/word/2010/wordprocessingInk" xmlns:wne="http://schemas.microsoft.com/office/word/2006/wordml" xmlns:wps="http://schemas.microsoft.com/office/word/2010/wordprocessingShape" mc:Ignorable="w14 w15 w16se w16cid w16 w16cex w16sdtdh w16sdtfl w16du wp14">
   <w:endnote w:type="separator" w:id="-1">
     <w:p>
       <w:r>
@@ -5031,7 +5030,7 @@
 </file>
 
 <file path=word/footer1.xml><?xml version="1.0" encoding="utf-8"?>
-<w:ftr xmlns:wpc="http://schemas.microsoft.com/office/word/2010/wordprocessingCanvas" xmlns:cx="http://schemas.microsoft.com/office/drawing/2014/chartex" xmlns:cx1="http://schemas.microsoft.com/office/drawing/2015/9/8/chartex" xmlns:cx2="http://schemas.microsoft.com/office/drawing/2015/10/21/chartex" xmlns:cx3="http://schemas.microsoft.com/office/drawing/2016/5/9/chartex" xmlns:cx4="http://schemas.microsoft.com/office/drawing/2016/5/10/chartex" xmlns:cx5="http://schemas.microsoft.com/office/drawing/2016/5/11/chartex" xmlns:cx6="http://schemas.microsoft.com/office/drawing/2016/5/12/chartex" xmlns:cx7="http://schemas.microsoft.com/office/drawing/2016/5/13/chartex" xmlns:cx8="http://schemas.microsoft.com/office/drawing/2016/5/14/chartex" xmlns:mc="http://schemas.openxmlformats.org/markup-compatibility/2006" xmlns:aink="http://schemas.microsoft.com/office/drawing/2016/ink" xmlns:am3d="http://schemas.microsoft.com/office/drawing/2017/model3d" xmlns:o="urn:schemas-microsoft-com:office:office" xmlns:oel="http://schemas.microsoft.com/office/2019/extlst" xmlns:r="http://schemas.openxmlformats.org/officeDocument/2006/relationships" xmlns:m="http://schemas.openxmlformats.org/officeDocument/2006/math" xmlns:v="urn:schemas-microsoft-com:vml" xmlns:wp14="http://schemas.microsoft.com/office/word/2010/wordprocessingDrawing" xmlns:wp="http://schemas.openxmlformats.org/drawingml/2006/wordprocessingDrawing" xmlns:w10="urn:schemas-microsoft-com:office:word" xmlns:w="http://schemas.openxmlformats.org/wordprocessingml/2006/main" xmlns:w14="http://schemas.microsoft.com/office/word/2010/wordml" xmlns:w15="http://schemas.microsoft.com/office/word/2012/wordml" xmlns:w16cex="http://schemas.microsoft.com/office/word/2018/wordml/cex" xmlns:w16cid="http://schemas.microsoft.com/office/word/2016/wordml/cid" xmlns:w16="http://schemas.microsoft.com/office/word/2018/wordml" xmlns:w16sdtdh="http://schemas.microsoft.com/office/word/2020/wordml/sdtdatahash" xmlns:w16se="http://schemas.microsoft.com/office/word/2015/wordml/symex" xmlns:wpg="http://schemas.microsoft.com/office/word/2010/wordprocessingGroup" xmlns:wpi="http://schemas.microsoft.com/office/word/2010/wordprocessingInk" xmlns:wne="http://schemas.microsoft.com/office/word/2006/wordml" xmlns:wps="http://schemas.microsoft.com/office/word/2010/wordprocessingShape" mc:Ignorable="w14 w15 w16se w16cid w16 w16cex w16sdtdh wp14">
+<w:ftr xmlns:wpc="http://schemas.microsoft.com/office/word/2010/wordprocessingCanvas" xmlns:cx="http://schemas.microsoft.com/office/drawing/2014/chartex" xmlns:cx1="http://schemas.microsoft.com/office/drawing/2015/9/8/chartex" xmlns:cx2="http://schemas.microsoft.com/office/drawing/2015/10/21/chartex" xmlns:cx3="http://schemas.microsoft.com/office/drawing/2016/5/9/chartex" xmlns:cx4="http://schemas.microsoft.com/office/drawing/2016/5/10/chartex" xmlns:cx5="http://schemas.microsoft.com/office/drawing/2016/5/11/chartex" xmlns:cx6="http://schemas.microsoft.com/office/drawing/2016/5/12/chartex" xmlns:cx7="http://schemas.microsoft.com/office/drawing/2016/5/13/chartex" xmlns:cx8="http://schemas.microsoft.com/office/drawing/2016/5/14/chartex" xmlns:mc="http://schemas.openxmlformats.org/markup-compatibility/2006" xmlns:aink="http://schemas.microsoft.com/office/drawing/2016/ink" xmlns:am3d="http://schemas.microsoft.com/office/drawing/2017/model3d" xmlns:o="urn:schemas-microsoft-com:office:office" xmlns:oel="http://schemas.microsoft.com/office/2019/extlst" xmlns:r="http://schemas.openxmlformats.org/officeDocument/2006/relationships" xmlns:m="http://schemas.openxmlformats.org/officeDocument/2006/math" xmlns:v="urn:schemas-microsoft-com:vml" xmlns:wp14="http://schemas.microsoft.com/office/word/2010/wordprocessingDrawing" xmlns:wp="http://schemas.openxmlformats.org/drawingml/2006/wordprocessingDrawing" xmlns:w10="urn:schemas-microsoft-com:office:word" xmlns:w="http://schemas.openxmlformats.org/wordprocessingml/2006/main" xmlns:w14="http://schemas.microsoft.com/office/word/2010/wordml" xmlns:w15="http://schemas.microsoft.com/office/word/2012/wordml" xmlns:w16cex="http://schemas.microsoft.com/office/word/2018/wordml/cex" xmlns:w16cid="http://schemas.microsoft.com/office/word/2016/wordml/cid" xmlns:w16="http://schemas.microsoft.com/office/word/2018/wordml" xmlns:w16du="http://schemas.microsoft.com/office/word/2023/wordml/word16du" xmlns:w16sdtdh="http://schemas.microsoft.com/office/word/2020/wordml/sdtdatahash" xmlns:w16sdtfl="http://schemas.microsoft.com/office/word/2024/wordml/sdtformatlock" xmlns:w16se="http://schemas.microsoft.com/office/word/2015/wordml/symex" xmlns:wpg="http://schemas.microsoft.com/office/word/2010/wordprocessingGroup" xmlns:wpi="http://schemas.microsoft.com/office/word/2010/wordprocessingInk" xmlns:wne="http://schemas.microsoft.com/office/word/2006/wordml" xmlns:wps="http://schemas.microsoft.com/office/word/2010/wordprocessingShape" mc:Ignorable="w14 w15 w16se w16cid w16 w16cex w16sdtdh w16sdtfl w16du wp14">
   <w:p>
     <w:pPr>
       <w:tabs>
@@ -5080,7 +5079,7 @@
 </file>
 
 <file path=word/footer2.xml><?xml version="1.0" encoding="utf-8"?>
-<w:ftr xmlns:wpc="http://schemas.microsoft.com/office/word/2010/wordprocessingCanvas" xmlns:cx="http://schemas.microsoft.com/office/drawing/2014/chartex" xmlns:cx1="http://schemas.microsoft.com/office/drawing/2015/9/8/chartex" xmlns:cx2="http://schemas.microsoft.com/office/drawing/2015/10/21/chartex" xmlns:cx3="http://schemas.microsoft.com/office/drawing/2016/5/9/chartex" xmlns:cx4="http://schemas.microsoft.com/office/drawing/2016/5/10/chartex" xmlns:cx5="http://schemas.microsoft.com/office/drawing/2016/5/11/chartex" xmlns:cx6="http://schemas.microsoft.com/office/drawing/2016/5/12/chartex" xmlns:cx7="http://schemas.microsoft.com/office/drawing/2016/5/13/chartex" xmlns:cx8="http://schemas.microsoft.com/office/drawing/2016/5/14/chartex" xmlns:mc="http://schemas.openxmlformats.org/markup-compatibility/2006" xmlns:aink="http://schemas.microsoft.com/office/drawing/2016/ink" xmlns:am3d="http://schemas.microsoft.com/office/drawing/2017/model3d" xmlns:o="urn:schemas-microsoft-com:office:office" xmlns:oel="http://schemas.microsoft.com/office/2019/extlst" xmlns:r="http://schemas.openxmlformats.org/officeDocument/2006/relationships" xmlns:m="http://schemas.openxmlformats.org/officeDocument/2006/math" xmlns:v="urn:schemas-microsoft-com:vml" xmlns:wp14="http://schemas.microsoft.com/office/word/2010/wordprocessingDrawing" xmlns:wp="http://schemas.openxmlformats.org/drawingml/2006/wordprocessingDrawing" xmlns:w10="urn:schemas-microsoft-com:office:word" xmlns:w="http://schemas.openxmlformats.org/wordprocessingml/2006/main" xmlns:w14="http://schemas.microsoft.com/office/word/2010/wordml" xmlns:w15="http://schemas.microsoft.com/office/word/2012/wordml" xmlns:w16cex="http://schemas.microsoft.com/office/word/2018/wordml/cex" xmlns:w16cid="http://schemas.microsoft.com/office/word/2016/wordml/cid" xmlns:w16="http://schemas.microsoft.com/office/word/2018/wordml" xmlns:w16sdtdh="http://schemas.microsoft.com/office/word/2020/wordml/sdtdatahash" xmlns:w16se="http://schemas.microsoft.com/office/word/2015/wordml/symex" xmlns:wpg="http://schemas.microsoft.com/office/word/2010/wordprocessingGroup" xmlns:wpi="http://schemas.microsoft.com/office/word/2010/wordprocessingInk" xmlns:wne="http://schemas.microsoft.com/office/word/2006/wordml" xmlns:wps="http://schemas.microsoft.com/office/word/2010/wordprocessingShape" mc:Ignorable="w14 w15 w16se w16cid w16 w16cex w16sdtdh wp14">
+<w:ftr xmlns:wpc="http://schemas.microsoft.com/office/word/2010/wordprocessingCanvas" xmlns:cx="http://schemas.microsoft.com/office/drawing/2014/chartex" xmlns:cx1="http://schemas.microsoft.com/office/drawing/2015/9/8/chartex" xmlns:cx2="http://schemas.microsoft.com/office/drawing/2015/10/21/chartex" xmlns:cx3="http://schemas.microsoft.com/office/drawing/2016/5/9/chartex" xmlns:cx4="http://schemas.microsoft.com/office/drawing/2016/5/10/chartex" xmlns:cx5="http://schemas.microsoft.com/office/drawing/2016/5/11/chartex" xmlns:cx6="http://schemas.microsoft.com/office/drawing/2016/5/12/chartex" xmlns:cx7="http://schemas.microsoft.com/office/drawing/2016/5/13/chartex" xmlns:cx8="http://schemas.microsoft.com/office/drawing/2016/5/14/chartex" xmlns:mc="http://schemas.openxmlformats.org/markup-compatibility/2006" xmlns:aink="http://schemas.microsoft.com/office/drawing/2016/ink" xmlns:am3d="http://schemas.microsoft.com/office/drawing/2017/model3d" xmlns:o="urn:schemas-microsoft-com:office:office" xmlns:oel="http://schemas.microsoft.com/office/2019/extlst" xmlns:r="http://schemas.openxmlformats.org/officeDocument/2006/relationships" xmlns:m="http://schemas.openxmlformats.org/officeDocument/2006/math" xmlns:v="urn:schemas-microsoft-com:vml" xmlns:wp14="http://schemas.microsoft.com/office/word/2010/wordprocessingDrawing" xmlns:wp="http://schemas.openxmlformats.org/drawingml/2006/wordprocessingDrawing" xmlns:w10="urn:schemas-microsoft-com:office:word" xmlns:w="http://schemas.openxmlformats.org/wordprocessingml/2006/main" xmlns:w14="http://schemas.microsoft.com/office/word/2010/wordml" xmlns:w15="http://schemas.microsoft.com/office/word/2012/wordml" xmlns:w16cex="http://schemas.microsoft.com/office/word/2018/wordml/cex" xmlns:w16cid="http://schemas.microsoft.com/office/word/2016/wordml/cid" xmlns:w16="http://schemas.microsoft.com/office/word/2018/wordml" xmlns:w16du="http://schemas.microsoft.com/office/word/2023/wordml/word16du" xmlns:w16sdtdh="http://schemas.microsoft.com/office/word/2020/wordml/sdtdatahash" xmlns:w16sdtfl="http://schemas.microsoft.com/office/word/2024/wordml/sdtformatlock" xmlns:w16se="http://schemas.microsoft.com/office/word/2015/wordml/symex" xmlns:wpg="http://schemas.microsoft.com/office/word/2010/wordprocessingGroup" xmlns:wpi="http://schemas.microsoft.com/office/word/2010/wordprocessingInk" xmlns:wne="http://schemas.microsoft.com/office/word/2006/wordml" xmlns:wps="http://schemas.microsoft.com/office/word/2010/wordprocessingShape" mc:Ignorable="w14 w15 w16se w16cid w16 w16cex w16sdtdh w16sdtfl w16du wp14">
   <w:p>
     <w:pPr>
       <w:tabs>
@@ -5135,7 +5134,7 @@
         <w:noProof/>
         <w:color w:val="0F243E" w:themeColor="text2" w:themeShade="80"/>
       </w:rPr>
-      <w:instrText>5</w:instrText>
+      <w:instrText>3</w:instrText>
     </w:r>
     <w:r>
       <w:rPr>
@@ -5164,7 +5163,7 @@
         <w:noProof/>
         <w:color w:val="0F243E" w:themeColor="text2" w:themeShade="80"/>
       </w:rPr>
-      <w:t>5</w:t>
+      <w:t>3</w:t>
     </w:r>
     <w:r>
       <w:rPr>
@@ -5192,7 +5191,7 @@
 </file>
 
 <file path=word/footer3.xml><?xml version="1.0" encoding="utf-8"?>
-<w:ftr xmlns:wpc="http://schemas.microsoft.com/office/word/2010/wordprocessingCanvas" xmlns:cx="http://schemas.microsoft.com/office/drawing/2014/chartex" xmlns:cx1="http://schemas.microsoft.com/office/drawing/2015/9/8/chartex" xmlns:cx2="http://schemas.microsoft.com/office/drawing/2015/10/21/chartex" xmlns:cx3="http://schemas.microsoft.com/office/drawing/2016/5/9/chartex" xmlns:cx4="http://schemas.microsoft.com/office/drawing/2016/5/10/chartex" xmlns:cx5="http://schemas.microsoft.com/office/drawing/2016/5/11/chartex" xmlns:cx6="http://schemas.microsoft.com/office/drawing/2016/5/12/chartex" xmlns:cx7="http://schemas.microsoft.com/office/drawing/2016/5/13/chartex" xmlns:cx8="http://schemas.microsoft.com/office/drawing/2016/5/14/chartex" xmlns:mc="http://schemas.openxmlformats.org/markup-compatibility/2006" xmlns:aink="http://schemas.microsoft.com/office/drawing/2016/ink" xmlns:am3d="http://schemas.microsoft.com/office/drawing/2017/model3d" xmlns:o="urn:schemas-microsoft-com:office:office" xmlns:oel="http://schemas.microsoft.com/office/2019/extlst" xmlns:r="http://schemas.openxmlformats.org/officeDocument/2006/relationships" xmlns:m="http://schemas.openxmlformats.org/officeDocument/2006/math" xmlns:v="urn:schemas-microsoft-com:vml" xmlns:wp14="http://schemas.microsoft.com/office/word/2010/wordprocessingDrawing" xmlns:wp="http://schemas.openxmlformats.org/drawingml/2006/wordprocessingDrawing" xmlns:w10="urn:schemas-microsoft-com:office:word" xmlns:w="http://schemas.openxmlformats.org/wordprocessingml/2006/main" xmlns:w14="http://schemas.microsoft.com/office/word/2010/wordml" xmlns:w15="http://schemas.microsoft.com/office/word/2012/wordml" xmlns:w16cex="http://schemas.microsoft.com/office/word/2018/wordml/cex" xmlns:w16cid="http://schemas.microsoft.com/office/word/2016/wordml/cid" xmlns:w16="http://schemas.microsoft.com/office/word/2018/wordml" xmlns:w16sdtdh="http://schemas.microsoft.com/office/word/2020/wordml/sdtdatahash" xmlns:w16se="http://schemas.microsoft.com/office/word/2015/wordml/symex" xmlns:wpg="http://schemas.microsoft.com/office/word/2010/wordprocessingGroup" xmlns:wpi="http://schemas.microsoft.com/office/word/2010/wordprocessingInk" xmlns:wne="http://schemas.microsoft.com/office/word/2006/wordml" xmlns:wps="http://schemas.microsoft.com/office/word/2010/wordprocessingShape" mc:Ignorable="w14 w15 w16se w16cid w16 w16cex w16sdtdh wp14">
+<w:ftr xmlns:wpc="http://schemas.microsoft.com/office/word/2010/wordprocessingCanvas" xmlns:cx="http://schemas.microsoft.com/office/drawing/2014/chartex" xmlns:cx1="http://schemas.microsoft.com/office/drawing/2015/9/8/chartex" xmlns:cx2="http://schemas.microsoft.com/office/drawing/2015/10/21/chartex" xmlns:cx3="http://schemas.microsoft.com/office/drawing/2016/5/9/chartex" xmlns:cx4="http://schemas.microsoft.com/office/drawing/2016/5/10/chartex" xmlns:cx5="http://schemas.microsoft.com/office/drawing/2016/5/11/chartex" xmlns:cx6="http://schemas.microsoft.com/office/drawing/2016/5/12/chartex" xmlns:cx7="http://schemas.microsoft.com/office/drawing/2016/5/13/chartex" xmlns:cx8="http://schemas.microsoft.com/office/drawing/2016/5/14/chartex" xmlns:mc="http://schemas.openxmlformats.org/markup-compatibility/2006" xmlns:aink="http://schemas.microsoft.com/office/drawing/2016/ink" xmlns:am3d="http://schemas.microsoft.com/office/drawing/2017/model3d" xmlns:o="urn:schemas-microsoft-com:office:office" xmlns:oel="http://schemas.microsoft.com/office/2019/extlst" xmlns:r="http://schemas.openxmlformats.org/officeDocument/2006/relationships" xmlns:m="http://schemas.openxmlformats.org/officeDocument/2006/math" xmlns:v="urn:schemas-microsoft-com:vml" xmlns:wp14="http://schemas.microsoft.com/office/word/2010/wordprocessingDrawing" xmlns:wp="http://schemas.openxmlformats.org/drawingml/2006/wordprocessingDrawing" xmlns:w10="urn:schemas-microsoft-com:office:word" xmlns:w="http://schemas.openxmlformats.org/wordprocessingml/2006/main" xmlns:w14="http://schemas.microsoft.com/office/word/2010/wordml" xmlns:w15="http://schemas.microsoft.com/office/word/2012/wordml" xmlns:w16cex="http://schemas.microsoft.com/office/word/2018/wordml/cex" xmlns:w16cid="http://schemas.microsoft.com/office/word/2016/wordml/cid" xmlns:w16="http://schemas.microsoft.com/office/word/2018/wordml" xmlns:w16du="http://schemas.microsoft.com/office/word/2023/wordml/word16du" xmlns:w16sdtdh="http://schemas.microsoft.com/office/word/2020/wordml/sdtdatahash" xmlns:w16sdtfl="http://schemas.microsoft.com/office/word/2024/wordml/sdtformatlock" xmlns:w16se="http://schemas.microsoft.com/office/word/2015/wordml/symex" xmlns:wpg="http://schemas.microsoft.com/office/word/2010/wordprocessingGroup" xmlns:wpi="http://schemas.microsoft.com/office/word/2010/wordprocessingInk" xmlns:wne="http://schemas.microsoft.com/office/word/2006/wordml" xmlns:wps="http://schemas.microsoft.com/office/word/2010/wordprocessingShape" mc:Ignorable="w14 w15 w16se w16cid w16 w16cex w16sdtdh w16sdtfl w16du wp14">
   <w:tbl>
     <w:tblPr>
       <w:tblW w:w="0" w:type="auto"/>
@@ -5272,7 +5271,7 @@
 </file>
 
 <file path=word/footnotes.xml><?xml version="1.0" encoding="utf-8"?>
-<w:footnotes xmlns:wpc="http://schemas.microsoft.com/office/word/2010/wordprocessingCanvas" xmlns:cx="http://schemas.microsoft.com/office/drawing/2014/chartex" xmlns:cx1="http://schemas.microsoft.com/office/drawing/2015/9/8/chartex" xmlns:cx2="http://schemas.microsoft.com/office/drawing/2015/10/21/chartex" xmlns:cx3="http://schemas.microsoft.com/office/drawing/2016/5/9/chartex" xmlns:cx4="http://schemas.microsoft.com/office/drawing/2016/5/10/chartex" xmlns:cx5="http://schemas.microsoft.com/office/drawing/2016/5/11/chartex" xmlns:cx6="http://schemas.microsoft.com/office/drawing/2016/5/12/chartex" xmlns:cx7="http://schemas.microsoft.com/office/drawing/2016/5/13/chartex" xmlns:cx8="http://schemas.microsoft.com/office/drawing/2016/5/14/chartex" xmlns:mc="http://schemas.openxmlformats.org/markup-compatibility/2006" xmlns:aink="http://schemas.microsoft.com/office/drawing/2016/ink" xmlns:am3d="http://schemas.microsoft.com/office/drawing/2017/model3d" xmlns:o="urn:schemas-microsoft-com:office:office" xmlns:oel="http://schemas.microsoft.com/office/2019/extlst" xmlns:r="http://schemas.openxmlformats.org/officeDocument/2006/relationships" xmlns:m="http://schemas.openxmlformats.org/officeDocument/2006/math" xmlns:v="urn:schemas-microsoft-com:vml" xmlns:wp14="http://schemas.microsoft.com/office/word/2010/wordprocessingDrawing" xmlns:wp="http://schemas.openxmlformats.org/drawingml/2006/wordprocessingDrawing" xmlns:w10="urn:schemas-microsoft-com:office:word" xmlns:w="http://schemas.openxmlformats.org/wordprocessingml/2006/main" xmlns:w14="http://schemas.microsoft.com/office/word/2010/wordml" xmlns:w15="http://schemas.microsoft.com/office/word/2012/wordml" xmlns:w16cex="http://schemas.microsoft.com/office/word/2018/wordml/cex" xmlns:w16cid="http://schemas.microsoft.com/office/word/2016/wordml/cid" xmlns:w16="http://schemas.microsoft.com/office/word/2018/wordml" xmlns:w16sdtdh="http://schemas.microsoft.com/office/word/2020/wordml/sdtdatahash" xmlns:w16se="http://schemas.microsoft.com/office/word/2015/wordml/symex" xmlns:wpg="http://schemas.microsoft.com/office/word/2010/wordprocessingGroup" xmlns:wpi="http://schemas.microsoft.com/office/word/2010/wordprocessingInk" xmlns:wne="http://schemas.microsoft.com/office/word/2006/wordml" xmlns:wps="http://schemas.microsoft.com/office/word/2010/wordprocessingShape" mc:Ignorable="w14 w15 w16se w16cid w16 w16cex w16sdtdh wp14">
+<w:footnotes xmlns:wpc="http://schemas.microsoft.com/office/word/2010/wordprocessingCanvas" xmlns:cx="http://schemas.microsoft.com/office/drawing/2014/chartex" xmlns:cx1="http://schemas.microsoft.com/office/drawing/2015/9/8/chartex" xmlns:cx2="http://schemas.microsoft.com/office/drawing/2015/10/21/chartex" xmlns:cx3="http://schemas.microsoft.com/office/drawing/2016/5/9/chartex" xmlns:cx4="http://schemas.microsoft.com/office/drawing/2016/5/10/chartex" xmlns:cx5="http://schemas.microsoft.com/office/drawing/2016/5/11/chartex" xmlns:cx6="http://schemas.microsoft.com/office/drawing/2016/5/12/chartex" xmlns:cx7="http://schemas.microsoft.com/office/drawing/2016/5/13/chartex" xmlns:cx8="http://schemas.microsoft.com/office/drawing/2016/5/14/chartex" xmlns:mc="http://schemas.openxmlformats.org/markup-compatibility/2006" xmlns:aink="http://schemas.microsoft.com/office/drawing/2016/ink" xmlns:am3d="http://schemas.microsoft.com/office/drawing/2017/model3d" xmlns:o="urn:schemas-microsoft-com:office:office" xmlns:oel="http://schemas.microsoft.com/office/2019/extlst" xmlns:r="http://schemas.openxmlformats.org/officeDocument/2006/relationships" xmlns:m="http://schemas.openxmlformats.org/officeDocument/2006/math" xmlns:v="urn:schemas-microsoft-com:vml" xmlns:wp14="http://schemas.microsoft.com/office/word/2010/wordprocessingDrawing" xmlns:wp="http://schemas.openxmlformats.org/drawingml/2006/wordprocessingDrawing" xmlns:w10="urn:schemas-microsoft-com:office:word" xmlns:w="http://schemas.openxmlformats.org/wordprocessingml/2006/main" xmlns:w14="http://schemas.microsoft.com/office/word/2010/wordml" xmlns:w15="http://schemas.microsoft.com/office/word/2012/wordml" xmlns:w16cex="http://schemas.microsoft.com/office/word/2018/wordml/cex" xmlns:w16cid="http://schemas.microsoft.com/office/word/2016/wordml/cid" xmlns:w16="http://schemas.microsoft.com/office/word/2018/wordml" xmlns:w16du="http://schemas.microsoft.com/office/word/2023/wordml/word16du" xmlns:w16sdtdh="http://schemas.microsoft.com/office/word/2020/wordml/sdtdatahash" xmlns:w16sdtfl="http://schemas.microsoft.com/office/word/2024/wordml/sdtformatlock" xmlns:w16se="http://schemas.microsoft.com/office/word/2015/wordml/symex" xmlns:wpg="http://schemas.microsoft.com/office/word/2010/wordprocessingGroup" xmlns:wpi="http://schemas.microsoft.com/office/word/2010/wordprocessingInk" xmlns:wne="http://schemas.microsoft.com/office/word/2006/wordml" xmlns:wps="http://schemas.microsoft.com/office/word/2010/wordprocessingShape" mc:Ignorable="w14 w15 w16se w16cid w16 w16cex w16sdtdh w16sdtfl w16du wp14">
   <w:footnote w:type="separator" w:id="-1">
     <w:p>
       <w:r>
@@ -5291,7 +5290,7 @@
 </file>
 
 <file path=word/header1.xml><?xml version="1.0" encoding="utf-8"?>
-<w:hdr xmlns:wpc="http://schemas.microsoft.com/office/word/2010/wordprocessingCanvas" xmlns:cx="http://schemas.microsoft.com/office/drawing/2014/chartex" xmlns:cx1="http://schemas.microsoft.com/office/drawing/2015/9/8/chartex" xmlns:cx2="http://schemas.microsoft.com/office/drawing/2015/10/21/chartex" xmlns:cx3="http://schemas.microsoft.com/office/drawing/2016/5/9/chartex" xmlns:cx4="http://schemas.microsoft.com/office/drawing/2016/5/10/chartex" xmlns:cx5="http://schemas.microsoft.com/office/drawing/2016/5/11/chartex" xmlns:cx6="http://schemas.microsoft.com/office/drawing/2016/5/12/chartex" xmlns:cx7="http://schemas.microsoft.com/office/drawing/2016/5/13/chartex" xmlns:cx8="http://schemas.microsoft.com/office/drawing/2016/5/14/chartex" xmlns:mc="http://schemas.openxmlformats.org/markup-compatibility/2006" xmlns:aink="http://schemas.microsoft.com/office/drawing/2016/ink" xmlns:am3d="http://schemas.microsoft.com/office/drawing/2017/model3d" xmlns:o="urn:schemas-microsoft-com:office:office" xmlns:oel="http://schemas.microsoft.com/office/2019/extlst" xmlns:r="http://schemas.openxmlformats.org/officeDocument/2006/relationships" xmlns:m="http://schemas.openxmlformats.org/officeDocument/2006/math" xmlns:v="urn:schemas-microsoft-com:vml" xmlns:wp14="http://schemas.microsoft.com/office/word/2010/wordprocessingDrawing" xmlns:wp="http://schemas.openxmlformats.org/drawingml/2006/wordprocessingDrawing" xmlns:w10="urn:schemas-microsoft-com:office:word" xmlns:w="http://schemas.openxmlformats.org/wordprocessingml/2006/main" xmlns:w14="http://schemas.microsoft.com/office/word/2010/wordml" xmlns:w15="http://schemas.microsoft.com/office/word/2012/wordml" xmlns:w16cex="http://schemas.microsoft.com/office/word/2018/wordml/cex" xmlns:w16cid="http://schemas.microsoft.com/office/word/2016/wordml/cid" xmlns:w16="http://schemas.microsoft.com/office/word/2018/wordml" xmlns:w16sdtdh="http://schemas.microsoft.com/office/word/2020/wordml/sdtdatahash" xmlns:w16se="http://schemas.microsoft.com/office/word/2015/wordml/symex" xmlns:wpg="http://schemas.microsoft.com/office/word/2010/wordprocessingGroup" xmlns:wpi="http://schemas.microsoft.com/office/word/2010/wordprocessingInk" xmlns:wne="http://schemas.microsoft.com/office/word/2006/wordml" xmlns:wps="http://schemas.microsoft.com/office/word/2010/wordprocessingShape" mc:Ignorable="w14 w15 w16se w16cid w16 w16cex w16sdtdh wp14">
+<w:hdr xmlns:wpc="http://schemas.microsoft.com/office/word/2010/wordprocessingCanvas" xmlns:cx="http://schemas.microsoft.com/office/drawing/2014/chartex" xmlns:cx1="http://schemas.microsoft.com/office/drawing/2015/9/8/chartex" xmlns:cx2="http://schemas.microsoft.com/office/drawing/2015/10/21/chartex" xmlns:cx3="http://schemas.microsoft.com/office/drawing/2016/5/9/chartex" xmlns:cx4="http://schemas.microsoft.com/office/drawing/2016/5/10/chartex" xmlns:cx5="http://schemas.microsoft.com/office/drawing/2016/5/11/chartex" xmlns:cx6="http://schemas.microsoft.com/office/drawing/2016/5/12/chartex" xmlns:cx7="http://schemas.microsoft.com/office/drawing/2016/5/13/chartex" xmlns:cx8="http://schemas.microsoft.com/office/drawing/2016/5/14/chartex" xmlns:mc="http://schemas.openxmlformats.org/markup-compatibility/2006" xmlns:aink="http://schemas.microsoft.com/office/drawing/2016/ink" xmlns:am3d="http://schemas.microsoft.com/office/drawing/2017/model3d" xmlns:o="urn:schemas-microsoft-com:office:office" xmlns:oel="http://schemas.microsoft.com/office/2019/extlst" xmlns:r="http://schemas.openxmlformats.org/officeDocument/2006/relationships" xmlns:m="http://schemas.openxmlformats.org/officeDocument/2006/math" xmlns:v="urn:schemas-microsoft-com:vml" xmlns:wp14="http://schemas.microsoft.com/office/word/2010/wordprocessingDrawing" xmlns:wp="http://schemas.openxmlformats.org/drawingml/2006/wordprocessingDrawing" xmlns:w10="urn:schemas-microsoft-com:office:word" xmlns:w="http://schemas.openxmlformats.org/wordprocessingml/2006/main" xmlns:w14="http://schemas.microsoft.com/office/word/2010/wordml" xmlns:w15="http://schemas.microsoft.com/office/word/2012/wordml" xmlns:w16cex="http://schemas.microsoft.com/office/word/2018/wordml/cex" xmlns:w16cid="http://schemas.microsoft.com/office/word/2016/wordml/cid" xmlns:w16="http://schemas.microsoft.com/office/word/2018/wordml" xmlns:w16du="http://schemas.microsoft.com/office/word/2023/wordml/word16du" xmlns:w16sdtdh="http://schemas.microsoft.com/office/word/2020/wordml/sdtdatahash" xmlns:w16sdtfl="http://schemas.microsoft.com/office/word/2024/wordml/sdtformatlock" xmlns:w16se="http://schemas.microsoft.com/office/word/2015/wordml/symex" xmlns:wpg="http://schemas.microsoft.com/office/word/2010/wordprocessingGroup" xmlns:wpi="http://schemas.microsoft.com/office/word/2010/wordprocessingInk" xmlns:wne="http://schemas.microsoft.com/office/word/2006/wordml" xmlns:wps="http://schemas.microsoft.com/office/word/2010/wordprocessingShape" mc:Ignorable="w14 w15 w16se w16cid w16 w16cex w16sdtdh w16sdtfl w16du wp14">
   <w:p>
     <w:pPr>
       <w:pStyle w:val="af3"/>
@@ -5346,7 +5345,7 @@
 </file>
 
 <file path=word/header2.xml><?xml version="1.0" encoding="utf-8"?>
-<w:hdr xmlns:wpc="http://schemas.microsoft.com/office/word/2010/wordprocessingCanvas" xmlns:cx="http://schemas.microsoft.com/office/drawing/2014/chartex" xmlns:cx1="http://schemas.microsoft.com/office/drawing/2015/9/8/chartex" xmlns:cx2="http://schemas.microsoft.com/office/drawing/2015/10/21/chartex" xmlns:cx3="http://schemas.microsoft.com/office/drawing/2016/5/9/chartex" xmlns:cx4="http://schemas.microsoft.com/office/drawing/2016/5/10/chartex" xmlns:cx5="http://schemas.microsoft.com/office/drawing/2016/5/11/chartex" xmlns:cx6="http://schemas.microsoft.com/office/drawing/2016/5/12/chartex" xmlns:cx7="http://schemas.microsoft.com/office/drawing/2016/5/13/chartex" xmlns:cx8="http://schemas.microsoft.com/office/drawing/2016/5/14/chartex" xmlns:mc="http://schemas.openxmlformats.org/markup-compatibility/2006" xmlns:aink="http://schemas.microsoft.com/office/drawing/2016/ink" xmlns:am3d="http://schemas.microsoft.com/office/drawing/2017/model3d" xmlns:o="urn:schemas-microsoft-com:office:office" xmlns:oel="http://schemas.microsoft.com/office/2019/extlst" xmlns:r="http://schemas.openxmlformats.org/officeDocument/2006/relationships" xmlns:m="http://schemas.openxmlformats.org/officeDocument/2006/math" xmlns:v="urn:schemas-microsoft-com:vml" xmlns:wp14="http://schemas.microsoft.com/office/word/2010/wordprocessingDrawing" xmlns:wp="http://schemas.openxmlformats.org/drawingml/2006/wordprocessingDrawing" xmlns:w10="urn:schemas-microsoft-com:office:word" xmlns:w="http://schemas.openxmlformats.org/wordprocessingml/2006/main" xmlns:w14="http://schemas.microsoft.com/office/word/2010/wordml" xmlns:w15="http://schemas.microsoft.com/office/word/2012/wordml" xmlns:w16cex="http://schemas.microsoft.com/office/word/2018/wordml/cex" xmlns:w16cid="http://schemas.microsoft.com/office/word/2016/wordml/cid" xmlns:w16="http://schemas.microsoft.com/office/word/2018/wordml" xmlns:w16sdtdh="http://schemas.microsoft.com/office/word/2020/wordml/sdtdatahash" xmlns:w16se="http://schemas.microsoft.com/office/word/2015/wordml/symex" xmlns:wpg="http://schemas.microsoft.com/office/word/2010/wordprocessingGroup" xmlns:wpi="http://schemas.microsoft.com/office/word/2010/wordprocessingInk" xmlns:wne="http://schemas.microsoft.com/office/word/2006/wordml" xmlns:wps="http://schemas.microsoft.com/office/word/2010/wordprocessingShape" mc:Ignorable="w14 w15 w16se w16cid w16 w16cex w16sdtdh wp14">
+<w:hdr xmlns:wpc="http://schemas.microsoft.com/office/word/2010/wordprocessingCanvas" xmlns:cx="http://schemas.microsoft.com/office/drawing/2014/chartex" xmlns:cx1="http://schemas.microsoft.com/office/drawing/2015/9/8/chartex" xmlns:cx2="http://schemas.microsoft.com/office/drawing/2015/10/21/chartex" xmlns:cx3="http://schemas.microsoft.com/office/drawing/2016/5/9/chartex" xmlns:cx4="http://schemas.microsoft.com/office/drawing/2016/5/10/chartex" xmlns:cx5="http://schemas.microsoft.com/office/drawing/2016/5/11/chartex" xmlns:cx6="http://schemas.microsoft.com/office/drawing/2016/5/12/chartex" xmlns:cx7="http://schemas.microsoft.com/office/drawing/2016/5/13/chartex" xmlns:cx8="http://schemas.microsoft.com/office/drawing/2016/5/14/chartex" xmlns:mc="http://schemas.openxmlformats.org/markup-compatibility/2006" xmlns:aink="http://schemas.microsoft.com/office/drawing/2016/ink" xmlns:am3d="http://schemas.microsoft.com/office/drawing/2017/model3d" xmlns:o="urn:schemas-microsoft-com:office:office" xmlns:oel="http://schemas.microsoft.com/office/2019/extlst" xmlns:r="http://schemas.openxmlformats.org/officeDocument/2006/relationships" xmlns:m="http://schemas.openxmlformats.org/officeDocument/2006/math" xmlns:v="urn:schemas-microsoft-com:vml" xmlns:wp14="http://schemas.microsoft.com/office/word/2010/wordprocessingDrawing" xmlns:wp="http://schemas.openxmlformats.org/drawingml/2006/wordprocessingDrawing" xmlns:w10="urn:schemas-microsoft-com:office:word" xmlns:w="http://schemas.openxmlformats.org/wordprocessingml/2006/main" xmlns:w14="http://schemas.microsoft.com/office/word/2010/wordml" xmlns:w15="http://schemas.microsoft.com/office/word/2012/wordml" xmlns:w16cex="http://schemas.microsoft.com/office/word/2018/wordml/cex" xmlns:w16cid="http://schemas.microsoft.com/office/word/2016/wordml/cid" xmlns:w16="http://schemas.microsoft.com/office/word/2018/wordml" xmlns:w16du="http://schemas.microsoft.com/office/word/2023/wordml/word16du" xmlns:w16sdtdh="http://schemas.microsoft.com/office/word/2020/wordml/sdtdatahash" xmlns:w16sdtfl="http://schemas.microsoft.com/office/word/2024/wordml/sdtformatlock" xmlns:w16se="http://schemas.microsoft.com/office/word/2015/wordml/symex" xmlns:wpg="http://schemas.microsoft.com/office/word/2010/wordprocessingGroup" xmlns:wpi="http://schemas.microsoft.com/office/word/2010/wordprocessingInk" xmlns:wne="http://schemas.microsoft.com/office/word/2006/wordml" xmlns:wps="http://schemas.microsoft.com/office/word/2010/wordprocessingShape" mc:Ignorable="w14 w15 w16se w16cid w16 w16cex w16sdtdh w16sdtfl w16du wp14">
   <w:p>
     <w:pPr>
       <w:pStyle w:val="af3"/>
@@ -5402,7 +5401,7 @@
 </file>
 
 <file path=word/header3.xml><?xml version="1.0" encoding="utf-8"?>
-<w:hdr xmlns:wpc="http://schemas.microsoft.com/office/word/2010/wordprocessingCanvas" xmlns:cx="http://schemas.microsoft.com/office/drawing/2014/chartex" xmlns:cx1="http://schemas.microsoft.com/office/drawing/2015/9/8/chartex" xmlns:cx2="http://schemas.microsoft.com/office/drawing/2015/10/21/chartex" xmlns:cx3="http://schemas.microsoft.com/office/drawing/2016/5/9/chartex" xmlns:cx4="http://schemas.microsoft.com/office/drawing/2016/5/10/chartex" xmlns:cx5="http://schemas.microsoft.com/office/drawing/2016/5/11/chartex" xmlns:cx6="http://schemas.microsoft.com/office/drawing/2016/5/12/chartex" xmlns:cx7="http://schemas.microsoft.com/office/drawing/2016/5/13/chartex" xmlns:cx8="http://schemas.microsoft.com/office/drawing/2016/5/14/chartex" xmlns:mc="http://schemas.openxmlformats.org/markup-compatibility/2006" xmlns:aink="http://schemas.microsoft.com/office/drawing/2016/ink" xmlns:am3d="http://schemas.microsoft.com/office/drawing/2017/model3d" xmlns:o="urn:schemas-microsoft-com:office:office" xmlns:oel="http://schemas.microsoft.com/office/2019/extlst" xmlns:r="http://schemas.openxmlformats.org/officeDocument/2006/relationships" xmlns:m="http://schemas.openxmlformats.org/officeDocument/2006/math" xmlns:v="urn:schemas-microsoft-com:vml" xmlns:wp14="http://schemas.microsoft.com/office/word/2010/wordprocessingDrawing" xmlns:wp="http://schemas.openxmlformats.org/drawingml/2006/wordprocessingDrawing" xmlns:w10="urn:schemas-microsoft-com:office:word" xmlns:w="http://schemas.openxmlformats.org/wordprocessingml/2006/main" xmlns:w14="http://schemas.microsoft.com/office/word/2010/wordml" xmlns:w15="http://schemas.microsoft.com/office/word/2012/wordml" xmlns:w16cex="http://schemas.microsoft.com/office/word/2018/wordml/cex" xmlns:w16cid="http://schemas.microsoft.com/office/word/2016/wordml/cid" xmlns:w16="http://schemas.microsoft.com/office/word/2018/wordml" xmlns:w16sdtdh="http://schemas.microsoft.com/office/word/2020/wordml/sdtdatahash" xmlns:w16se="http://schemas.microsoft.com/office/word/2015/wordml/symex" xmlns:wpg="http://schemas.microsoft.com/office/word/2010/wordprocessingGroup" xmlns:wpi="http://schemas.microsoft.com/office/word/2010/wordprocessingInk" xmlns:wne="http://schemas.microsoft.com/office/word/2006/wordml" xmlns:wps="http://schemas.microsoft.com/office/word/2010/wordprocessingShape" mc:Ignorable="w14 w15 w16se w16cid w16 w16cex w16sdtdh wp14">
+<w:hdr xmlns:wpc="http://schemas.microsoft.com/office/word/2010/wordprocessingCanvas" xmlns:cx="http://schemas.microsoft.com/office/drawing/2014/chartex" xmlns:cx1="http://schemas.microsoft.com/office/drawing/2015/9/8/chartex" xmlns:cx2="http://schemas.microsoft.com/office/drawing/2015/10/21/chartex" xmlns:cx3="http://schemas.microsoft.com/office/drawing/2016/5/9/chartex" xmlns:cx4="http://schemas.microsoft.com/office/drawing/2016/5/10/chartex" xmlns:cx5="http://schemas.microsoft.com/office/drawing/2016/5/11/chartex" xmlns:cx6="http://schemas.microsoft.com/office/drawing/2016/5/12/chartex" xmlns:cx7="http://schemas.microsoft.com/office/drawing/2016/5/13/chartex" xmlns:cx8="http://schemas.microsoft.com/office/drawing/2016/5/14/chartex" xmlns:mc="http://schemas.openxmlformats.org/markup-compatibility/2006" xmlns:aink="http://schemas.microsoft.com/office/drawing/2016/ink" xmlns:am3d="http://schemas.microsoft.com/office/drawing/2017/model3d" xmlns:o="urn:schemas-microsoft-com:office:office" xmlns:oel="http://schemas.microsoft.com/office/2019/extlst" xmlns:r="http://schemas.openxmlformats.org/officeDocument/2006/relationships" xmlns:m="http://schemas.openxmlformats.org/officeDocument/2006/math" xmlns:v="urn:schemas-microsoft-com:vml" xmlns:wp14="http://schemas.microsoft.com/office/word/2010/wordprocessingDrawing" xmlns:wp="http://schemas.openxmlformats.org/drawingml/2006/wordprocessingDrawing" xmlns:w10="urn:schemas-microsoft-com:office:word" xmlns:w="http://schemas.openxmlformats.org/wordprocessingml/2006/main" xmlns:w14="http://schemas.microsoft.com/office/word/2010/wordml" xmlns:w15="http://schemas.microsoft.com/office/word/2012/wordml" xmlns:w16cex="http://schemas.microsoft.com/office/word/2018/wordml/cex" xmlns:w16cid="http://schemas.microsoft.com/office/word/2016/wordml/cid" xmlns:w16="http://schemas.microsoft.com/office/word/2018/wordml" xmlns:w16du="http://schemas.microsoft.com/office/word/2023/wordml/word16du" xmlns:w16sdtdh="http://schemas.microsoft.com/office/word/2020/wordml/sdtdatahash" xmlns:w16sdtfl="http://schemas.microsoft.com/office/word/2024/wordml/sdtformatlock" xmlns:w16se="http://schemas.microsoft.com/office/word/2015/wordml/symex" xmlns:wpg="http://schemas.microsoft.com/office/word/2010/wordprocessingGroup" xmlns:wpi="http://schemas.microsoft.com/office/word/2010/wordprocessingInk" xmlns:wne="http://schemas.microsoft.com/office/word/2006/wordml" xmlns:wps="http://schemas.microsoft.com/office/word/2010/wordprocessingShape" mc:Ignorable="w14 w15 w16se w16cid w16 w16cex w16sdtdh w16sdtfl w16du wp14">
   <w:p>
     <w:pPr>
       <w:spacing w:line="264" w:lineRule="auto"/>
@@ -5468,7 +5467,7 @@
 </file>
 
 <file path=word/numbering.xml><?xml version="1.0" encoding="utf-8"?>
-<w:numbering xmlns:wpc="http://schemas.microsoft.com/office/word/2010/wordprocessingCanvas" xmlns:cx="http://schemas.microsoft.com/office/drawing/2014/chartex" xmlns:cx1="http://schemas.microsoft.com/office/drawing/2015/9/8/chartex" xmlns:cx2="http://schemas.microsoft.com/office/drawing/2015/10/21/chartex" xmlns:cx3="http://schemas.microsoft.com/office/drawing/2016/5/9/chartex" xmlns:cx4="http://schemas.microsoft.com/office/drawing/2016/5/10/chartex" xmlns:cx5="http://schemas.microsoft.com/office/drawing/2016/5/11/chartex" xmlns:cx6="http://schemas.microsoft.com/office/drawing/2016/5/12/chartex" xmlns:cx7="http://schemas.microsoft.com/office/drawing/2016/5/13/chartex" xmlns:cx8="http://schemas.microsoft.com/office/drawing/2016/5/14/chartex" xmlns:mc="http://schemas.openxmlformats.org/markup-compatibility/2006" xmlns:aink="http://schemas.microsoft.com/office/drawing/2016/ink" xmlns:am3d="http://schemas.microsoft.com/office/drawing/2017/model3d" xmlns:o="urn:schemas-microsoft-com:office:office" xmlns:oel="http://schemas.microsoft.com/office/2019/extlst" xmlns:r="http://schemas.openxmlformats.org/officeDocument/2006/relationships" xmlns:m="http://schemas.openxmlformats.org/officeDocument/2006/math" xmlns:v="urn:schemas-microsoft-com:vml" xmlns:wp14="http://schemas.microsoft.com/office/word/2010/wordprocessingDrawing" xmlns:wp="http://schemas.openxmlformats.org/drawingml/2006/wordprocessingDrawing" xmlns:w10="urn:schemas-microsoft-com:office:word" xmlns:w="http://schemas.openxmlformats.org/wordprocessingml/2006/main" xmlns:w14="http://schemas.microsoft.com/office/word/2010/wordml" xmlns:w15="http://schemas.microsoft.com/office/word/2012/wordml" xmlns:w16cex="http://schemas.microsoft.com/office/word/2018/wordml/cex" xmlns:w16cid="http://schemas.microsoft.com/office/word/2016/wordml/cid" xmlns:w16="http://schemas.microsoft.com/office/word/2018/wordml" xmlns:w16sdtdh="http://schemas.microsoft.com/office/word/2020/wordml/sdtdatahash" xmlns:w16se="http://schemas.microsoft.com/office/word/2015/wordml/symex" xmlns:wpg="http://schemas.microsoft.com/office/word/2010/wordprocessingGroup" xmlns:wpi="http://schemas.microsoft.com/office/word/2010/wordprocessingInk" xmlns:wne="http://schemas.microsoft.com/office/word/2006/wordml" xmlns:wps="http://schemas.microsoft.com/office/word/2010/wordprocessingShape" mc:Ignorable="w14 w15 w16se w16cid w16 w16cex w16sdtdh wp14">
+<w:numbering xmlns:wpc="http://schemas.microsoft.com/office/word/2010/wordprocessingCanvas" xmlns:cx="http://schemas.microsoft.com/office/drawing/2014/chartex" xmlns:cx1="http://schemas.microsoft.com/office/drawing/2015/9/8/chartex" xmlns:cx2="http://schemas.microsoft.com/office/drawing/2015/10/21/chartex" xmlns:cx3="http://schemas.microsoft.com/office/drawing/2016/5/9/chartex" xmlns:cx4="http://schemas.microsoft.com/office/drawing/2016/5/10/chartex" xmlns:cx5="http://schemas.microsoft.com/office/drawing/2016/5/11/chartex" xmlns:cx6="http://schemas.microsoft.com/office/drawing/2016/5/12/chartex" xmlns:cx7="http://schemas.microsoft.com/office/drawing/2016/5/13/chartex" xmlns:cx8="http://schemas.microsoft.com/office/drawing/2016/5/14/chartex" xmlns:mc="http://schemas.openxmlformats.org/markup-compatibility/2006" xmlns:aink="http://schemas.microsoft.com/office/drawing/2016/ink" xmlns:am3d="http://schemas.microsoft.com/office/drawing/2017/model3d" xmlns:o="urn:schemas-microsoft-com:office:office" xmlns:oel="http://schemas.microsoft.com/office/2019/extlst" xmlns:r="http://schemas.openxmlformats.org/officeDocument/2006/relationships" xmlns:m="http://schemas.openxmlformats.org/officeDocument/2006/math" xmlns:v="urn:schemas-microsoft-com:vml" xmlns:wp14="http://schemas.microsoft.com/office/word/2010/wordprocessingDrawing" xmlns:wp="http://schemas.openxmlformats.org/drawingml/2006/wordprocessingDrawing" xmlns:w10="urn:schemas-microsoft-com:office:word" xmlns:w="http://schemas.openxmlformats.org/wordprocessingml/2006/main" xmlns:w14="http://schemas.microsoft.com/office/word/2010/wordml" xmlns:w15="http://schemas.microsoft.com/office/word/2012/wordml" xmlns:w16cex="http://schemas.microsoft.com/office/word/2018/wordml/cex" xmlns:w16cid="http://schemas.microsoft.com/office/word/2016/wordml/cid" xmlns:w16="http://schemas.microsoft.com/office/word/2018/wordml" xmlns:w16du="http://schemas.microsoft.com/office/word/2023/wordml/word16du" xmlns:w16sdtdh="http://schemas.microsoft.com/office/word/2020/wordml/sdtdatahash" xmlns:w16sdtfl="http://schemas.microsoft.com/office/word/2024/wordml/sdtformatlock" xmlns:w16se="http://schemas.microsoft.com/office/word/2015/wordml/symex" xmlns:wpg="http://schemas.microsoft.com/office/word/2010/wordprocessingGroup" xmlns:wpi="http://schemas.microsoft.com/office/word/2010/wordprocessingInk" xmlns:wne="http://schemas.microsoft.com/office/word/2006/wordml" xmlns:wps="http://schemas.microsoft.com/office/word/2010/wordprocessingShape" mc:Ignorable="w14 w15 w16se w16cid w16 w16cex w16sdtdh w16sdtfl w16du wp14">
   <w:abstractNum w:abstractNumId="0" w15:restartNumberingAfterBreak="0">
     <w:nsid w:val="FFFFFF7C"/>
     <w:multiLevelType w:val="singleLevel"/>
@@ -9972,7 +9971,7 @@
 </file>
 
 <file path=word/styles.xml><?xml version="1.0" encoding="utf-8"?>
-<w:styles xmlns:mc="http://schemas.openxmlformats.org/markup-compatibility/2006" xmlns:r="http://schemas.openxmlformats.org/officeDocument/2006/relationships" xmlns:w="http://schemas.openxmlformats.org/wordprocessingml/2006/main" xmlns:w14="http://schemas.microsoft.com/office/word/2010/wordml" xmlns:w15="http://schemas.microsoft.com/office/word/2012/wordml" xmlns:w16cex="http://schemas.microsoft.com/office/word/2018/wordml/cex" xmlns:w16cid="http://schemas.microsoft.com/office/word/2016/wordml/cid" xmlns:w16="http://schemas.microsoft.com/office/word/2018/wordml" xmlns:w16sdtdh="http://schemas.microsoft.com/office/word/2020/wordml/sdtdatahash" xmlns:w16se="http://schemas.microsoft.com/office/word/2015/wordml/symex" mc:Ignorable="w14 w15 w16se w16cid w16 w16cex w16sdtdh">
+<w:styles xmlns:mc="http://schemas.openxmlformats.org/markup-compatibility/2006" xmlns:r="http://schemas.openxmlformats.org/officeDocument/2006/relationships" xmlns:w="http://schemas.openxmlformats.org/wordprocessingml/2006/main" xmlns:w14="http://schemas.microsoft.com/office/word/2010/wordml" xmlns:w15="http://schemas.microsoft.com/office/word/2012/wordml" xmlns:w16cex="http://schemas.microsoft.com/office/word/2018/wordml/cex" xmlns:w16cid="http://schemas.microsoft.com/office/word/2016/wordml/cid" xmlns:w16="http://schemas.microsoft.com/office/word/2018/wordml" xmlns:w16du="http://schemas.microsoft.com/office/word/2023/wordml/word16du" xmlns:w16sdtdh="http://schemas.microsoft.com/office/word/2020/wordml/sdtdatahash" xmlns:w16sdtfl="http://schemas.microsoft.com/office/word/2024/wordml/sdtformatlock" xmlns:w16se="http://schemas.microsoft.com/office/word/2015/wordml/symex" mc:Ignorable="w14 w15 w16se w16cid w16 w16cex w16sdtdh w16sdtfl w16du">
   <w:docDefaults>
     <w:rPrDefault>
       <w:rPr>
@@ -11936,7 +11935,7 @@
     <w:next w:val="a1"/>
     <w:autoRedefine/>
     <w:qFormat/>
-    <w:rsid w:val="00104086"/>
+    <w:rsid w:val="00F154A2"/>
     <w:pPr>
       <w:pBdr>
         <w:top w:val="single" w:sz="4" w:space="4" w:color="auto"/>
@@ -11949,7 +11948,8 @@
     </w:pPr>
     <w:rPr>
       <w:rFonts w:ascii="Source Code Pro" w:eastAsia="Ricty Diminished" w:hAnsi="Source Code Pro"/>
-      <w:sz w:val="16"/>
+      <w:sz w:val="13"/>
+      <w:szCs w:val="13"/>
     </w:rPr>
   </w:style>
   <w:style w:type="paragraph" w:customStyle="1" w:styleId="FigureCaption">

</xml_diff>

<commit_message>
update system/ref.docx - page margin narrowed to 12.7mm
</commit_message>
<xml_diff>
--- a/system/ref.docx
+++ b/system/ref.docx
@@ -145,64 +145,74 @@
             </w:rPr>
             <w:fldChar w:fldCharType="separate"/>
           </w:r>
-          <w:hyperlink w:anchor="_Toc135490218" w:history="1">
-            <w:r>
-              <w:rPr>
-                <w:rStyle w:val="af1"/>
-                <w:noProof/>
-                <w:lang w:eastAsia="ja-JP"/>
-              </w:rPr>
-              <w:t>まえがき</w:t>
-            </w:r>
-            <w:r>
-              <w:rPr>
-                <w:noProof/>
-                <w:webHidden/>
-              </w:rPr>
-              <w:tab/>
-            </w:r>
-            <w:r>
-              <w:rPr>
-                <w:noProof/>
-                <w:webHidden/>
-              </w:rPr>
-              <w:fldChar w:fldCharType="begin"/>
-            </w:r>
-            <w:r>
-              <w:rPr>
-                <w:noProof/>
-                <w:webHidden/>
-              </w:rPr>
-              <w:instrText xml:space="preserve"> PAGEREF _Toc135490218 \h </w:instrText>
-            </w:r>
-            <w:r>
-              <w:rPr>
-                <w:noProof/>
-                <w:webHidden/>
-              </w:rPr>
-            </w:r>
-            <w:r>
-              <w:rPr>
-                <w:noProof/>
-                <w:webHidden/>
-              </w:rPr>
-              <w:fldChar w:fldCharType="separate"/>
-            </w:r>
-            <w:r>
-              <w:rPr>
-                <w:noProof/>
-                <w:webHidden/>
-              </w:rPr>
-              <w:t>2</w:t>
-            </w:r>
-            <w:r>
-              <w:rPr>
-                <w:noProof/>
-                <w:webHidden/>
-              </w:rPr>
-              <w:fldChar w:fldCharType="end"/>
-            </w:r>
-          </w:hyperlink>
+          <w:r>
+            <w:fldChar w:fldCharType="begin"/>
+          </w:r>
+          <w:r>
+            <w:instrText>HYPERLINK \l "_Toc135490218"</w:instrText>
+          </w:r>
+          <w:r>
+            <w:fldChar w:fldCharType="separate"/>
+          </w:r>
+          <w:r>
+            <w:rPr>
+              <w:rStyle w:val="af1"/>
+              <w:noProof/>
+              <w:lang w:eastAsia="ja-JP"/>
+            </w:rPr>
+            <w:t>まえがき</w:t>
+          </w:r>
+          <w:r>
+            <w:rPr>
+              <w:noProof/>
+              <w:webHidden/>
+            </w:rPr>
+            <w:tab/>
+          </w:r>
+          <w:r>
+            <w:rPr>
+              <w:noProof/>
+              <w:webHidden/>
+            </w:rPr>
+            <w:fldChar w:fldCharType="begin"/>
+          </w:r>
+          <w:r>
+            <w:rPr>
+              <w:noProof/>
+              <w:webHidden/>
+            </w:rPr>
+            <w:instrText xml:space="preserve"> PAGEREF _Toc135490218 \h </w:instrText>
+          </w:r>
+          <w:r>
+            <w:rPr>
+              <w:noProof/>
+              <w:webHidden/>
+            </w:rPr>
+          </w:r>
+          <w:r>
+            <w:rPr>
+              <w:noProof/>
+              <w:webHidden/>
+            </w:rPr>
+            <w:fldChar w:fldCharType="separate"/>
+          </w:r>
+          <w:r>
+            <w:rPr>
+              <w:noProof/>
+              <w:webHidden/>
+            </w:rPr>
+            <w:t>2</w:t>
+          </w:r>
+          <w:r>
+            <w:rPr>
+              <w:noProof/>
+              <w:webHidden/>
+            </w:rPr>
+            <w:fldChar w:fldCharType="end"/>
+          </w:r>
+          <w:r>
+            <w:fldChar w:fldCharType="end"/>
+          </w:r>
         </w:p>
         <w:p>
           <w:pPr>
@@ -221,63 +231,73 @@
               <w14:ligatures w14:val="standardContextual"/>
             </w:rPr>
           </w:pPr>
-          <w:hyperlink w:anchor="_Toc135490219" w:history="1">
-            <w:r>
-              <w:rPr>
-                <w:rStyle w:val="af1"/>
-                <w:noProof/>
-              </w:rPr>
-              <w:t>&lt;Heading Unnumbered 2&gt;</w:t>
-            </w:r>
-            <w:r>
-              <w:rPr>
-                <w:noProof/>
-                <w:webHidden/>
-              </w:rPr>
-              <w:tab/>
-            </w:r>
-            <w:r>
-              <w:rPr>
-                <w:noProof/>
-                <w:webHidden/>
-              </w:rPr>
-              <w:fldChar w:fldCharType="begin"/>
-            </w:r>
-            <w:r>
-              <w:rPr>
-                <w:noProof/>
-                <w:webHidden/>
-              </w:rPr>
-              <w:instrText xml:space="preserve"> PAGEREF _Toc135490219 \h </w:instrText>
-            </w:r>
-            <w:r>
-              <w:rPr>
-                <w:noProof/>
-                <w:webHidden/>
-              </w:rPr>
-            </w:r>
-            <w:r>
-              <w:rPr>
-                <w:noProof/>
-                <w:webHidden/>
-              </w:rPr>
-              <w:fldChar w:fldCharType="separate"/>
-            </w:r>
-            <w:r>
-              <w:rPr>
-                <w:noProof/>
-                <w:webHidden/>
-              </w:rPr>
-              <w:t>2</w:t>
-            </w:r>
-            <w:r>
-              <w:rPr>
-                <w:noProof/>
-                <w:webHidden/>
-              </w:rPr>
-              <w:fldChar w:fldCharType="end"/>
-            </w:r>
-          </w:hyperlink>
+          <w:r>
+            <w:fldChar w:fldCharType="begin"/>
+          </w:r>
+          <w:r>
+            <w:instrText>HYPERLINK \l "_Toc135490219"</w:instrText>
+          </w:r>
+          <w:r>
+            <w:fldChar w:fldCharType="separate"/>
+          </w:r>
+          <w:r>
+            <w:rPr>
+              <w:rStyle w:val="af1"/>
+              <w:noProof/>
+            </w:rPr>
+            <w:t>&lt;Heading Unnumbered 2&gt;</w:t>
+          </w:r>
+          <w:r>
+            <w:rPr>
+              <w:noProof/>
+              <w:webHidden/>
+            </w:rPr>
+            <w:tab/>
+          </w:r>
+          <w:r>
+            <w:rPr>
+              <w:noProof/>
+              <w:webHidden/>
+            </w:rPr>
+            <w:fldChar w:fldCharType="begin"/>
+          </w:r>
+          <w:r>
+            <w:rPr>
+              <w:noProof/>
+              <w:webHidden/>
+            </w:rPr>
+            <w:instrText xml:space="preserve"> PAGEREF _Toc135490219 \h </w:instrText>
+          </w:r>
+          <w:r>
+            <w:rPr>
+              <w:noProof/>
+              <w:webHidden/>
+            </w:rPr>
+          </w:r>
+          <w:r>
+            <w:rPr>
+              <w:noProof/>
+              <w:webHidden/>
+            </w:rPr>
+            <w:fldChar w:fldCharType="separate"/>
+          </w:r>
+          <w:r>
+            <w:rPr>
+              <w:noProof/>
+              <w:webHidden/>
+            </w:rPr>
+            <w:t>2</w:t>
+          </w:r>
+          <w:r>
+            <w:rPr>
+              <w:noProof/>
+              <w:webHidden/>
+            </w:rPr>
+            <w:fldChar w:fldCharType="end"/>
+          </w:r>
+          <w:r>
+            <w:fldChar w:fldCharType="end"/>
+          </w:r>
         </w:p>
         <w:p>
           <w:pPr>
@@ -295,63 +315,73 @@
               <w14:ligatures w14:val="standardContextual"/>
             </w:rPr>
           </w:pPr>
-          <w:hyperlink w:anchor="_Toc135490220" w:history="1">
-            <w:r>
-              <w:rPr>
-                <w:rStyle w:val="af1"/>
-                <w:noProof/>
-              </w:rPr>
-              <w:t>&lt;Heading Unnumbered 3&gt;</w:t>
-            </w:r>
-            <w:r>
-              <w:rPr>
-                <w:noProof/>
-                <w:webHidden/>
-              </w:rPr>
-              <w:tab/>
-            </w:r>
-            <w:r>
-              <w:rPr>
-                <w:noProof/>
-                <w:webHidden/>
-              </w:rPr>
-              <w:fldChar w:fldCharType="begin"/>
-            </w:r>
-            <w:r>
-              <w:rPr>
-                <w:noProof/>
-                <w:webHidden/>
-              </w:rPr>
-              <w:instrText xml:space="preserve"> PAGEREF _Toc135490220 \h </w:instrText>
-            </w:r>
-            <w:r>
-              <w:rPr>
-                <w:noProof/>
-                <w:webHidden/>
-              </w:rPr>
-            </w:r>
-            <w:r>
-              <w:rPr>
-                <w:noProof/>
-                <w:webHidden/>
-              </w:rPr>
-              <w:fldChar w:fldCharType="separate"/>
-            </w:r>
-            <w:r>
-              <w:rPr>
-                <w:noProof/>
-                <w:webHidden/>
-              </w:rPr>
-              <w:t>2</w:t>
-            </w:r>
-            <w:r>
-              <w:rPr>
-                <w:noProof/>
-                <w:webHidden/>
-              </w:rPr>
-              <w:fldChar w:fldCharType="end"/>
-            </w:r>
-          </w:hyperlink>
+          <w:r>
+            <w:fldChar w:fldCharType="begin"/>
+          </w:r>
+          <w:r>
+            <w:instrText>HYPERLINK \l "_Toc135490220"</w:instrText>
+          </w:r>
+          <w:r>
+            <w:fldChar w:fldCharType="separate"/>
+          </w:r>
+          <w:r>
+            <w:rPr>
+              <w:rStyle w:val="af1"/>
+              <w:noProof/>
+            </w:rPr>
+            <w:t>&lt;Heading Unnumbered 3&gt;</w:t>
+          </w:r>
+          <w:r>
+            <w:rPr>
+              <w:noProof/>
+              <w:webHidden/>
+            </w:rPr>
+            <w:tab/>
+          </w:r>
+          <w:r>
+            <w:rPr>
+              <w:noProof/>
+              <w:webHidden/>
+            </w:rPr>
+            <w:fldChar w:fldCharType="begin"/>
+          </w:r>
+          <w:r>
+            <w:rPr>
+              <w:noProof/>
+              <w:webHidden/>
+            </w:rPr>
+            <w:instrText xml:space="preserve"> PAGEREF _Toc135490220 \h </w:instrText>
+          </w:r>
+          <w:r>
+            <w:rPr>
+              <w:noProof/>
+              <w:webHidden/>
+            </w:rPr>
+          </w:r>
+          <w:r>
+            <w:rPr>
+              <w:noProof/>
+              <w:webHidden/>
+            </w:rPr>
+            <w:fldChar w:fldCharType="separate"/>
+          </w:r>
+          <w:r>
+            <w:rPr>
+              <w:noProof/>
+              <w:webHidden/>
+            </w:rPr>
+            <w:t>2</w:t>
+          </w:r>
+          <w:r>
+            <w:rPr>
+              <w:noProof/>
+              <w:webHidden/>
+            </w:rPr>
+            <w:fldChar w:fldCharType="end"/>
+          </w:r>
+          <w:r>
+            <w:fldChar w:fldCharType="end"/>
+          </w:r>
         </w:p>
         <w:p>
           <w:pPr>
@@ -366,97 +396,107 @@
               <w14:ligatures w14:val="standardContextual"/>
             </w:rPr>
           </w:pPr>
-          <w:hyperlink w:anchor="_Toc135490221" w:history="1">
-            <w:r>
-              <w:rPr>
-                <w:rStyle w:val="af1"/>
-                <w:noProof/>
-              </w:rPr>
-              <w:t>1</w:t>
-            </w:r>
-            <w:r>
-              <w:rPr>
-                <w:rFonts w:asciiTheme="minorHAnsi" w:eastAsiaTheme="minorEastAsia" w:hAnsiTheme="minorHAnsi" w:cstheme="minorBidi"/>
-                <w:noProof/>
-                <w:color w:val="auto"/>
-                <w:kern w:val="2"/>
-                <w:sz w:val="21"/>
-                <w:lang w:eastAsia="ja-JP"/>
-                <w14:ligatures w14:val="standardContextual"/>
-              </w:rPr>
-              <w:tab/>
-            </w:r>
-            <w:r>
-              <w:rPr>
-                <w:rStyle w:val="af1"/>
-                <w:noProof/>
-              </w:rPr>
-              <w:t xml:space="preserve">&lt;Heading </w:t>
-            </w:r>
-            <w:r>
-              <w:rPr>
-                <w:rStyle w:val="af1"/>
-                <w:noProof/>
-                <w:lang w:eastAsia="ja-JP"/>
-              </w:rPr>
-              <w:t>にほんご</w:t>
-            </w:r>
-            <w:r>
-              <w:rPr>
-                <w:rStyle w:val="af1"/>
-                <w:noProof/>
-              </w:rPr>
-              <w:t>1&gt;</w:t>
-            </w:r>
-            <w:r>
-              <w:rPr>
-                <w:noProof/>
-                <w:webHidden/>
-              </w:rPr>
-              <w:tab/>
-            </w:r>
-            <w:r>
-              <w:rPr>
-                <w:noProof/>
-                <w:webHidden/>
-              </w:rPr>
-              <w:fldChar w:fldCharType="begin"/>
-            </w:r>
-            <w:r>
-              <w:rPr>
-                <w:noProof/>
-                <w:webHidden/>
-              </w:rPr>
-              <w:instrText xml:space="preserve"> PAGEREF _Toc135490221 \h </w:instrText>
-            </w:r>
-            <w:r>
-              <w:rPr>
-                <w:noProof/>
-                <w:webHidden/>
-              </w:rPr>
-            </w:r>
-            <w:r>
-              <w:rPr>
-                <w:noProof/>
-                <w:webHidden/>
-              </w:rPr>
-              <w:fldChar w:fldCharType="separate"/>
-            </w:r>
-            <w:r>
-              <w:rPr>
-                <w:noProof/>
-                <w:webHidden/>
-              </w:rPr>
-              <w:t>3</w:t>
-            </w:r>
-            <w:r>
-              <w:rPr>
-                <w:noProof/>
-                <w:webHidden/>
-              </w:rPr>
-              <w:fldChar w:fldCharType="end"/>
-            </w:r>
-          </w:hyperlink>
+          <w:r>
+            <w:fldChar w:fldCharType="begin"/>
+          </w:r>
+          <w:r>
+            <w:instrText>HYPERLINK \l "_Toc135490221"</w:instrText>
+          </w:r>
+          <w:r>
+            <w:fldChar w:fldCharType="separate"/>
+          </w:r>
+          <w:r>
+            <w:rPr>
+              <w:rStyle w:val="af1"/>
+              <w:noProof/>
+            </w:rPr>
+            <w:t>1</w:t>
+          </w:r>
+          <w:r>
+            <w:rPr>
+              <w:rFonts w:asciiTheme="minorHAnsi" w:eastAsiaTheme="minorEastAsia" w:hAnsiTheme="minorHAnsi" w:cstheme="minorBidi"/>
+              <w:noProof/>
+              <w:color w:val="auto"/>
+              <w:kern w:val="2"/>
+              <w:sz w:val="21"/>
+              <w:lang w:eastAsia="ja-JP"/>
+              <w14:ligatures w14:val="standardContextual"/>
+            </w:rPr>
+            <w:tab/>
+          </w:r>
+          <w:r>
+            <w:rPr>
+              <w:rStyle w:val="af1"/>
+              <w:noProof/>
+            </w:rPr>
+            <w:t xml:space="preserve">&lt;Heading </w:t>
+          </w:r>
+          <w:r>
+            <w:rPr>
+              <w:rStyle w:val="af1"/>
+              <w:noProof/>
+              <w:lang w:eastAsia="ja-JP"/>
+            </w:rPr>
+            <w:t>にほんご</w:t>
+          </w:r>
+          <w:r>
+            <w:rPr>
+              <w:rStyle w:val="af1"/>
+              <w:noProof/>
+            </w:rPr>
+            <w:t>1&gt;</w:t>
+          </w:r>
+          <w:r>
+            <w:rPr>
+              <w:noProof/>
+              <w:webHidden/>
+            </w:rPr>
+            <w:tab/>
+          </w:r>
+          <w:r>
+            <w:rPr>
+              <w:noProof/>
+              <w:webHidden/>
+            </w:rPr>
+            <w:fldChar w:fldCharType="begin"/>
+          </w:r>
+          <w:r>
+            <w:rPr>
+              <w:noProof/>
+              <w:webHidden/>
+            </w:rPr>
+            <w:instrText xml:space="preserve"> PAGEREF _Toc135490221 \h </w:instrText>
+          </w:r>
+          <w:r>
+            <w:rPr>
+              <w:noProof/>
+              <w:webHidden/>
+            </w:rPr>
+          </w:r>
+          <w:r>
+            <w:rPr>
+              <w:noProof/>
+              <w:webHidden/>
+            </w:rPr>
+            <w:fldChar w:fldCharType="separate"/>
+          </w:r>
+          <w:r>
+            <w:rPr>
+              <w:noProof/>
+              <w:webHidden/>
+            </w:rPr>
+            <w:t>3</w:t>
+          </w:r>
+          <w:r>
+            <w:rPr>
+              <w:noProof/>
+              <w:webHidden/>
+            </w:rPr>
+            <w:fldChar w:fldCharType="end"/>
+          </w:r>
+          <w:r>
+            <w:fldChar w:fldCharType="end"/>
+          </w:r>
         </w:p>
         <w:p>
           <w:pPr>
@@ -476,98 +516,108 @@
               <w14:ligatures w14:val="standardContextual"/>
             </w:rPr>
           </w:pPr>
-          <w:hyperlink w:anchor="_Toc135490222" w:history="1">
-            <w:r>
-              <w:rPr>
-                <w:rStyle w:val="af1"/>
-                <w:noProof/>
-              </w:rPr>
-              <w:t>1.1</w:t>
-            </w:r>
-            <w:r>
-              <w:rPr>
-                <w:rFonts w:asciiTheme="minorHAnsi" w:eastAsiaTheme="minorEastAsia" w:hAnsiTheme="minorHAnsi" w:cstheme="minorBidi"/>
-                <w:bCs w:val="0"/>
-                <w:noProof/>
-                <w:kern w:val="2"/>
-                <w:sz w:val="21"/>
-                <w:szCs w:val="24"/>
-                <w:lang w:eastAsia="ja-JP"/>
-                <w14:ligatures w14:val="standardContextual"/>
-              </w:rPr>
-              <w:tab/>
-            </w:r>
-            <w:r>
-              <w:rPr>
-                <w:rStyle w:val="af1"/>
-                <w:noProof/>
-              </w:rPr>
-              <w:t xml:space="preserve">&lt;Heading </w:t>
-            </w:r>
-            <w:r>
-              <w:rPr>
-                <w:rStyle w:val="af1"/>
-                <w:noProof/>
-                <w:lang w:eastAsia="ja-JP"/>
-              </w:rPr>
-              <w:t>にほんご</w:t>
-            </w:r>
-            <w:r>
-              <w:rPr>
-                <w:rStyle w:val="af1"/>
-                <w:noProof/>
-              </w:rPr>
-              <w:t>2&gt;</w:t>
-            </w:r>
-            <w:r>
-              <w:rPr>
-                <w:noProof/>
-                <w:webHidden/>
-              </w:rPr>
-              <w:tab/>
-            </w:r>
-            <w:r>
-              <w:rPr>
-                <w:noProof/>
-                <w:webHidden/>
-              </w:rPr>
-              <w:fldChar w:fldCharType="begin"/>
-            </w:r>
-            <w:r>
-              <w:rPr>
-                <w:noProof/>
-                <w:webHidden/>
-              </w:rPr>
-              <w:instrText xml:space="preserve"> PAGEREF _Toc135490222 \h </w:instrText>
-            </w:r>
-            <w:r>
-              <w:rPr>
-                <w:noProof/>
-                <w:webHidden/>
-              </w:rPr>
-            </w:r>
-            <w:r>
-              <w:rPr>
-                <w:noProof/>
-                <w:webHidden/>
-              </w:rPr>
-              <w:fldChar w:fldCharType="separate"/>
-            </w:r>
-            <w:r>
-              <w:rPr>
-                <w:noProof/>
-                <w:webHidden/>
-              </w:rPr>
-              <w:t>3</w:t>
-            </w:r>
-            <w:r>
-              <w:rPr>
-                <w:noProof/>
-                <w:webHidden/>
-              </w:rPr>
-              <w:fldChar w:fldCharType="end"/>
-            </w:r>
-          </w:hyperlink>
+          <w:r>
+            <w:fldChar w:fldCharType="begin"/>
+          </w:r>
+          <w:r>
+            <w:instrText>HYPERLINK \l "_Toc135490222"</w:instrText>
+          </w:r>
+          <w:r>
+            <w:fldChar w:fldCharType="separate"/>
+          </w:r>
+          <w:r>
+            <w:rPr>
+              <w:rStyle w:val="af1"/>
+              <w:noProof/>
+            </w:rPr>
+            <w:t>1.1</w:t>
+          </w:r>
+          <w:r>
+            <w:rPr>
+              <w:rFonts w:asciiTheme="minorHAnsi" w:eastAsiaTheme="minorEastAsia" w:hAnsiTheme="minorHAnsi" w:cstheme="minorBidi"/>
+              <w:bCs w:val="0"/>
+              <w:noProof/>
+              <w:kern w:val="2"/>
+              <w:sz w:val="21"/>
+              <w:szCs w:val="24"/>
+              <w:lang w:eastAsia="ja-JP"/>
+              <w14:ligatures w14:val="standardContextual"/>
+            </w:rPr>
+            <w:tab/>
+          </w:r>
+          <w:r>
+            <w:rPr>
+              <w:rStyle w:val="af1"/>
+              <w:noProof/>
+            </w:rPr>
+            <w:t xml:space="preserve">&lt;Heading </w:t>
+          </w:r>
+          <w:r>
+            <w:rPr>
+              <w:rStyle w:val="af1"/>
+              <w:noProof/>
+              <w:lang w:eastAsia="ja-JP"/>
+            </w:rPr>
+            <w:t>にほんご</w:t>
+          </w:r>
+          <w:r>
+            <w:rPr>
+              <w:rStyle w:val="af1"/>
+              <w:noProof/>
+            </w:rPr>
+            <w:t>2&gt;</w:t>
+          </w:r>
+          <w:r>
+            <w:rPr>
+              <w:noProof/>
+              <w:webHidden/>
+            </w:rPr>
+            <w:tab/>
+          </w:r>
+          <w:r>
+            <w:rPr>
+              <w:noProof/>
+              <w:webHidden/>
+            </w:rPr>
+            <w:fldChar w:fldCharType="begin"/>
+          </w:r>
+          <w:r>
+            <w:rPr>
+              <w:noProof/>
+              <w:webHidden/>
+            </w:rPr>
+            <w:instrText xml:space="preserve"> PAGEREF _Toc135490222 \h </w:instrText>
+          </w:r>
+          <w:r>
+            <w:rPr>
+              <w:noProof/>
+              <w:webHidden/>
+            </w:rPr>
+          </w:r>
+          <w:r>
+            <w:rPr>
+              <w:noProof/>
+              <w:webHidden/>
+            </w:rPr>
+            <w:fldChar w:fldCharType="separate"/>
+          </w:r>
+          <w:r>
+            <w:rPr>
+              <w:noProof/>
+              <w:webHidden/>
+            </w:rPr>
+            <w:t>3</w:t>
+          </w:r>
+          <w:r>
+            <w:rPr>
+              <w:noProof/>
+              <w:webHidden/>
+            </w:rPr>
+            <w:fldChar w:fldCharType="end"/>
+          </w:r>
+          <w:r>
+            <w:fldChar w:fldCharType="end"/>
+          </w:r>
         </w:p>
         <w:p>
           <w:pPr>
@@ -586,97 +636,107 @@
               <w14:ligatures w14:val="standardContextual"/>
             </w:rPr>
           </w:pPr>
-          <w:hyperlink w:anchor="_Toc135490223" w:history="1">
-            <w:r>
-              <w:rPr>
-                <w:rStyle w:val="af1"/>
-                <w:noProof/>
-              </w:rPr>
-              <w:t>1.1.1</w:t>
-            </w:r>
-            <w:r>
-              <w:rPr>
-                <w:rFonts w:asciiTheme="minorHAnsi" w:eastAsiaTheme="minorEastAsia" w:hAnsiTheme="minorHAnsi" w:cstheme="minorBidi"/>
-                <w:noProof/>
-                <w:kern w:val="2"/>
-                <w:sz w:val="21"/>
-                <w:szCs w:val="24"/>
-                <w:lang w:eastAsia="ja-JP"/>
-                <w14:ligatures w14:val="standardContextual"/>
-              </w:rPr>
-              <w:tab/>
-            </w:r>
-            <w:r>
-              <w:rPr>
-                <w:rStyle w:val="af1"/>
-                <w:noProof/>
-              </w:rPr>
-              <w:t xml:space="preserve">&lt;Heading </w:t>
-            </w:r>
-            <w:r>
-              <w:rPr>
-                <w:rStyle w:val="af1"/>
-                <w:noProof/>
-                <w:lang w:eastAsia="ja-JP"/>
-              </w:rPr>
-              <w:t>にほんご</w:t>
-            </w:r>
-            <w:r>
-              <w:rPr>
-                <w:rStyle w:val="af1"/>
-                <w:noProof/>
-              </w:rPr>
-              <w:t>3&gt;</w:t>
-            </w:r>
-            <w:r>
-              <w:rPr>
-                <w:noProof/>
-                <w:webHidden/>
-              </w:rPr>
-              <w:tab/>
-            </w:r>
-            <w:r>
-              <w:rPr>
-                <w:noProof/>
-                <w:webHidden/>
-              </w:rPr>
-              <w:fldChar w:fldCharType="begin"/>
-            </w:r>
-            <w:r>
-              <w:rPr>
-                <w:noProof/>
-                <w:webHidden/>
-              </w:rPr>
-              <w:instrText xml:space="preserve"> PAGEREF _Toc135490223 \h </w:instrText>
-            </w:r>
-            <w:r>
-              <w:rPr>
-                <w:noProof/>
-                <w:webHidden/>
-              </w:rPr>
-            </w:r>
-            <w:r>
-              <w:rPr>
-                <w:noProof/>
-                <w:webHidden/>
-              </w:rPr>
-              <w:fldChar w:fldCharType="separate"/>
-            </w:r>
-            <w:r>
-              <w:rPr>
-                <w:noProof/>
-                <w:webHidden/>
-              </w:rPr>
-              <w:t>3</w:t>
-            </w:r>
-            <w:r>
-              <w:rPr>
-                <w:noProof/>
-                <w:webHidden/>
-              </w:rPr>
-              <w:fldChar w:fldCharType="end"/>
-            </w:r>
-          </w:hyperlink>
+          <w:r>
+            <w:fldChar w:fldCharType="begin"/>
+          </w:r>
+          <w:r>
+            <w:instrText>HYPERLINK \l "_Toc135490223"</w:instrText>
+          </w:r>
+          <w:r>
+            <w:fldChar w:fldCharType="separate"/>
+          </w:r>
+          <w:r>
+            <w:rPr>
+              <w:rStyle w:val="af1"/>
+              <w:noProof/>
+            </w:rPr>
+            <w:t>1.1.1</w:t>
+          </w:r>
+          <w:r>
+            <w:rPr>
+              <w:rFonts w:asciiTheme="minorHAnsi" w:eastAsiaTheme="minorEastAsia" w:hAnsiTheme="minorHAnsi" w:cstheme="minorBidi"/>
+              <w:noProof/>
+              <w:kern w:val="2"/>
+              <w:sz w:val="21"/>
+              <w:szCs w:val="24"/>
+              <w:lang w:eastAsia="ja-JP"/>
+              <w14:ligatures w14:val="standardContextual"/>
+            </w:rPr>
+            <w:tab/>
+          </w:r>
+          <w:r>
+            <w:rPr>
+              <w:rStyle w:val="af1"/>
+              <w:noProof/>
+            </w:rPr>
+            <w:t xml:space="preserve">&lt;Heading </w:t>
+          </w:r>
+          <w:r>
+            <w:rPr>
+              <w:rStyle w:val="af1"/>
+              <w:noProof/>
+              <w:lang w:eastAsia="ja-JP"/>
+            </w:rPr>
+            <w:t>にほんご</w:t>
+          </w:r>
+          <w:r>
+            <w:rPr>
+              <w:rStyle w:val="af1"/>
+              <w:noProof/>
+            </w:rPr>
+            <w:t>3&gt;</w:t>
+          </w:r>
+          <w:r>
+            <w:rPr>
+              <w:noProof/>
+              <w:webHidden/>
+            </w:rPr>
+            <w:tab/>
+          </w:r>
+          <w:r>
+            <w:rPr>
+              <w:noProof/>
+              <w:webHidden/>
+            </w:rPr>
+            <w:fldChar w:fldCharType="begin"/>
+          </w:r>
+          <w:r>
+            <w:rPr>
+              <w:noProof/>
+              <w:webHidden/>
+            </w:rPr>
+            <w:instrText xml:space="preserve"> PAGEREF _Toc135490223 \h </w:instrText>
+          </w:r>
+          <w:r>
+            <w:rPr>
+              <w:noProof/>
+              <w:webHidden/>
+            </w:rPr>
+          </w:r>
+          <w:r>
+            <w:rPr>
+              <w:noProof/>
+              <w:webHidden/>
+            </w:rPr>
+            <w:fldChar w:fldCharType="separate"/>
+          </w:r>
+          <w:r>
+            <w:rPr>
+              <w:noProof/>
+              <w:webHidden/>
+            </w:rPr>
+            <w:t>3</w:t>
+          </w:r>
+          <w:r>
+            <w:rPr>
+              <w:noProof/>
+              <w:webHidden/>
+            </w:rPr>
+            <w:fldChar w:fldCharType="end"/>
+          </w:r>
+          <w:r>
+            <w:fldChar w:fldCharType="end"/>
+          </w:r>
         </w:p>
         <w:p>
           <w:pPr>
@@ -694,97 +754,107 @@
               <w14:ligatures w14:val="standardContextual"/>
             </w:rPr>
           </w:pPr>
-          <w:hyperlink w:anchor="_Toc135490224" w:history="1">
-            <w:r>
-              <w:rPr>
-                <w:rStyle w:val="af1"/>
-                <w:noProof/>
-              </w:rPr>
-              <w:t>Appendix A.</w:t>
-            </w:r>
-            <w:r>
-              <w:rPr>
-                <w:rFonts w:asciiTheme="minorHAnsi" w:eastAsiaTheme="minorEastAsia" w:hAnsiTheme="minorHAnsi" w:cstheme="minorBidi"/>
-                <w:noProof/>
-                <w:color w:val="auto"/>
-                <w:kern w:val="2"/>
-                <w:sz w:val="21"/>
-                <w:lang w:eastAsia="ja-JP"/>
-                <w14:ligatures w14:val="standardContextual"/>
-              </w:rPr>
-              <w:tab/>
-            </w:r>
-            <w:r>
-              <w:rPr>
-                <w:rStyle w:val="af1"/>
-                <w:noProof/>
-              </w:rPr>
-              <w:t xml:space="preserve">&lt;Appendix </w:t>
-            </w:r>
-            <w:r>
-              <w:rPr>
-                <w:rStyle w:val="af1"/>
-                <w:noProof/>
-                <w:lang w:eastAsia="ja-JP"/>
-              </w:rPr>
-              <w:t>にほんご</w:t>
-            </w:r>
-            <w:r>
-              <w:rPr>
-                <w:rStyle w:val="af1"/>
-                <w:noProof/>
-              </w:rPr>
-              <w:t>Title&gt;</w:t>
-            </w:r>
-            <w:r>
-              <w:rPr>
-                <w:noProof/>
-                <w:webHidden/>
-              </w:rPr>
-              <w:tab/>
-            </w:r>
-            <w:r>
-              <w:rPr>
-                <w:noProof/>
-                <w:webHidden/>
-              </w:rPr>
-              <w:fldChar w:fldCharType="begin"/>
-            </w:r>
-            <w:r>
-              <w:rPr>
-                <w:noProof/>
-                <w:webHidden/>
-              </w:rPr>
-              <w:instrText xml:space="preserve"> PAGEREF _Toc135490224 \h </w:instrText>
-            </w:r>
-            <w:r>
-              <w:rPr>
-                <w:noProof/>
-                <w:webHidden/>
-              </w:rPr>
-            </w:r>
-            <w:r>
-              <w:rPr>
-                <w:noProof/>
-                <w:webHidden/>
-              </w:rPr>
-              <w:fldChar w:fldCharType="separate"/>
-            </w:r>
-            <w:r>
-              <w:rPr>
-                <w:noProof/>
-                <w:webHidden/>
-              </w:rPr>
-              <w:t>5</w:t>
-            </w:r>
-            <w:r>
-              <w:rPr>
-                <w:noProof/>
-                <w:webHidden/>
-              </w:rPr>
-              <w:fldChar w:fldCharType="end"/>
-            </w:r>
-          </w:hyperlink>
+          <w:r>
+            <w:fldChar w:fldCharType="begin"/>
+          </w:r>
+          <w:r>
+            <w:instrText>HYPERLINK \l "_Toc135490224"</w:instrText>
+          </w:r>
+          <w:r>
+            <w:fldChar w:fldCharType="separate"/>
+          </w:r>
+          <w:r>
+            <w:rPr>
+              <w:rStyle w:val="af1"/>
+              <w:noProof/>
+            </w:rPr>
+            <w:t>Appendix A.</w:t>
+          </w:r>
+          <w:r>
+            <w:rPr>
+              <w:rFonts w:asciiTheme="minorHAnsi" w:eastAsiaTheme="minorEastAsia" w:hAnsiTheme="minorHAnsi" w:cstheme="minorBidi"/>
+              <w:noProof/>
+              <w:color w:val="auto"/>
+              <w:kern w:val="2"/>
+              <w:sz w:val="21"/>
+              <w:lang w:eastAsia="ja-JP"/>
+              <w14:ligatures w14:val="standardContextual"/>
+            </w:rPr>
+            <w:tab/>
+          </w:r>
+          <w:r>
+            <w:rPr>
+              <w:rStyle w:val="af1"/>
+              <w:noProof/>
+            </w:rPr>
+            <w:t xml:space="preserve">&lt;Appendix </w:t>
+          </w:r>
+          <w:r>
+            <w:rPr>
+              <w:rStyle w:val="af1"/>
+              <w:noProof/>
+              <w:lang w:eastAsia="ja-JP"/>
+            </w:rPr>
+            <w:t>にほんご</w:t>
+          </w:r>
+          <w:r>
+            <w:rPr>
+              <w:rStyle w:val="af1"/>
+              <w:noProof/>
+            </w:rPr>
+            <w:t>Title&gt;</w:t>
+          </w:r>
+          <w:r>
+            <w:rPr>
+              <w:noProof/>
+              <w:webHidden/>
+            </w:rPr>
+            <w:tab/>
+          </w:r>
+          <w:r>
+            <w:rPr>
+              <w:noProof/>
+              <w:webHidden/>
+            </w:rPr>
+            <w:fldChar w:fldCharType="begin"/>
+          </w:r>
+          <w:r>
+            <w:rPr>
+              <w:noProof/>
+              <w:webHidden/>
+            </w:rPr>
+            <w:instrText xml:space="preserve"> PAGEREF _Toc135490224 \h </w:instrText>
+          </w:r>
+          <w:r>
+            <w:rPr>
+              <w:noProof/>
+              <w:webHidden/>
+            </w:rPr>
+          </w:r>
+          <w:r>
+            <w:rPr>
+              <w:noProof/>
+              <w:webHidden/>
+            </w:rPr>
+            <w:fldChar w:fldCharType="separate"/>
+          </w:r>
+          <w:r>
+            <w:rPr>
+              <w:noProof/>
+              <w:webHidden/>
+            </w:rPr>
+            <w:t>5</w:t>
+          </w:r>
+          <w:r>
+            <w:rPr>
+              <w:noProof/>
+              <w:webHidden/>
+            </w:rPr>
+            <w:fldChar w:fldCharType="end"/>
+          </w:r>
+          <w:r>
+            <w:fldChar w:fldCharType="end"/>
+          </w:r>
         </w:p>
         <w:p>
           <w:pPr>
@@ -804,98 +874,108 @@
               <w14:ligatures w14:val="standardContextual"/>
             </w:rPr>
           </w:pPr>
-          <w:hyperlink w:anchor="_Toc135490225" w:history="1">
-            <w:r>
-              <w:rPr>
-                <w:rStyle w:val="af1"/>
-                <w:noProof/>
-              </w:rPr>
-              <w:t>A.1.</w:t>
-            </w:r>
-            <w:r>
-              <w:rPr>
-                <w:rFonts w:asciiTheme="minorHAnsi" w:eastAsiaTheme="minorEastAsia" w:hAnsiTheme="minorHAnsi" w:cstheme="minorBidi"/>
-                <w:bCs w:val="0"/>
-                <w:noProof/>
-                <w:kern w:val="2"/>
-                <w:sz w:val="21"/>
-                <w:szCs w:val="24"/>
-                <w:lang w:eastAsia="ja-JP"/>
-                <w14:ligatures w14:val="standardContextual"/>
-              </w:rPr>
-              <w:tab/>
-            </w:r>
-            <w:r>
-              <w:rPr>
-                <w:rStyle w:val="af1"/>
-                <w:noProof/>
-              </w:rPr>
-              <w:t xml:space="preserve">&lt;Appendix </w:t>
-            </w:r>
-            <w:r>
-              <w:rPr>
-                <w:rStyle w:val="af1"/>
-                <w:noProof/>
-                <w:lang w:eastAsia="ja-JP"/>
-              </w:rPr>
-              <w:t>にほんご</w:t>
-            </w:r>
-            <w:r>
-              <w:rPr>
-                <w:rStyle w:val="af1"/>
-                <w:noProof/>
-              </w:rPr>
-              <w:t>Subsection&gt;</w:t>
-            </w:r>
-            <w:r>
-              <w:rPr>
-                <w:noProof/>
-                <w:webHidden/>
-              </w:rPr>
-              <w:tab/>
-            </w:r>
-            <w:r>
-              <w:rPr>
-                <w:noProof/>
-                <w:webHidden/>
-              </w:rPr>
-              <w:fldChar w:fldCharType="begin"/>
-            </w:r>
-            <w:r>
-              <w:rPr>
-                <w:noProof/>
-                <w:webHidden/>
-              </w:rPr>
-              <w:instrText xml:space="preserve"> PAGEREF _Toc135490225 \h </w:instrText>
-            </w:r>
-            <w:r>
-              <w:rPr>
-                <w:noProof/>
-                <w:webHidden/>
-              </w:rPr>
-            </w:r>
-            <w:r>
-              <w:rPr>
-                <w:noProof/>
-                <w:webHidden/>
-              </w:rPr>
-              <w:fldChar w:fldCharType="separate"/>
-            </w:r>
-            <w:r>
-              <w:rPr>
-                <w:noProof/>
-                <w:webHidden/>
-              </w:rPr>
-              <w:t>5</w:t>
-            </w:r>
-            <w:r>
-              <w:rPr>
-                <w:noProof/>
-                <w:webHidden/>
-              </w:rPr>
-              <w:fldChar w:fldCharType="end"/>
-            </w:r>
-          </w:hyperlink>
+          <w:r>
+            <w:fldChar w:fldCharType="begin"/>
+          </w:r>
+          <w:r>
+            <w:instrText>HYPERLINK \l "_Toc135490225"</w:instrText>
+          </w:r>
+          <w:r>
+            <w:fldChar w:fldCharType="separate"/>
+          </w:r>
+          <w:r>
+            <w:rPr>
+              <w:rStyle w:val="af1"/>
+              <w:noProof/>
+            </w:rPr>
+            <w:t>A.1.</w:t>
+          </w:r>
+          <w:r>
+            <w:rPr>
+              <w:rFonts w:asciiTheme="minorHAnsi" w:eastAsiaTheme="minorEastAsia" w:hAnsiTheme="minorHAnsi" w:cstheme="minorBidi"/>
+              <w:bCs w:val="0"/>
+              <w:noProof/>
+              <w:kern w:val="2"/>
+              <w:sz w:val="21"/>
+              <w:szCs w:val="24"/>
+              <w:lang w:eastAsia="ja-JP"/>
+              <w14:ligatures w14:val="standardContextual"/>
+            </w:rPr>
+            <w:tab/>
+          </w:r>
+          <w:r>
+            <w:rPr>
+              <w:rStyle w:val="af1"/>
+              <w:noProof/>
+            </w:rPr>
+            <w:t xml:space="preserve">&lt;Appendix </w:t>
+          </w:r>
+          <w:r>
+            <w:rPr>
+              <w:rStyle w:val="af1"/>
+              <w:noProof/>
+              <w:lang w:eastAsia="ja-JP"/>
+            </w:rPr>
+            <w:t>にほんご</w:t>
+          </w:r>
+          <w:r>
+            <w:rPr>
+              <w:rStyle w:val="af1"/>
+              <w:noProof/>
+            </w:rPr>
+            <w:t>Subsection&gt;</w:t>
+          </w:r>
+          <w:r>
+            <w:rPr>
+              <w:noProof/>
+              <w:webHidden/>
+            </w:rPr>
+            <w:tab/>
+          </w:r>
+          <w:r>
+            <w:rPr>
+              <w:noProof/>
+              <w:webHidden/>
+            </w:rPr>
+            <w:fldChar w:fldCharType="begin"/>
+          </w:r>
+          <w:r>
+            <w:rPr>
+              <w:noProof/>
+              <w:webHidden/>
+            </w:rPr>
+            <w:instrText xml:space="preserve"> PAGEREF _Toc135490225 \h </w:instrText>
+          </w:r>
+          <w:r>
+            <w:rPr>
+              <w:noProof/>
+              <w:webHidden/>
+            </w:rPr>
+          </w:r>
+          <w:r>
+            <w:rPr>
+              <w:noProof/>
+              <w:webHidden/>
+            </w:rPr>
+            <w:fldChar w:fldCharType="separate"/>
+          </w:r>
+          <w:r>
+            <w:rPr>
+              <w:noProof/>
+              <w:webHidden/>
+            </w:rPr>
+            <w:t>5</w:t>
+          </w:r>
+          <w:r>
+            <w:rPr>
+              <w:noProof/>
+              <w:webHidden/>
+            </w:rPr>
+            <w:fldChar w:fldCharType="end"/>
+          </w:r>
+          <w:r>
+            <w:fldChar w:fldCharType="end"/>
+          </w:r>
         </w:p>
         <w:p>
           <w:pPr>
@@ -914,97 +994,107 @@
               <w14:ligatures w14:val="standardContextual"/>
             </w:rPr>
           </w:pPr>
-          <w:hyperlink w:anchor="_Toc135490226" w:history="1">
-            <w:r>
-              <w:rPr>
-                <w:rStyle w:val="af1"/>
-                <w:noProof/>
-              </w:rPr>
-              <w:t>A.1.1</w:t>
-            </w:r>
-            <w:r>
-              <w:rPr>
-                <w:rFonts w:asciiTheme="minorHAnsi" w:eastAsiaTheme="minorEastAsia" w:hAnsiTheme="minorHAnsi" w:cstheme="minorBidi"/>
-                <w:noProof/>
-                <w:kern w:val="2"/>
-                <w:sz w:val="21"/>
-                <w:szCs w:val="24"/>
-                <w:lang w:eastAsia="ja-JP"/>
-                <w14:ligatures w14:val="standardContextual"/>
-              </w:rPr>
-              <w:tab/>
-            </w:r>
-            <w:r>
-              <w:rPr>
-                <w:rStyle w:val="af1"/>
-                <w:noProof/>
-              </w:rPr>
-              <w:t xml:space="preserve">&lt;Appendix </w:t>
-            </w:r>
-            <w:r>
-              <w:rPr>
-                <w:rStyle w:val="af1"/>
-                <w:noProof/>
-                <w:lang w:eastAsia="ja-JP"/>
-              </w:rPr>
-              <w:t>にほんご</w:t>
-            </w:r>
-            <w:r>
-              <w:rPr>
-                <w:rStyle w:val="af1"/>
-                <w:noProof/>
-              </w:rPr>
-              <w:t>Heading 3&gt;</w:t>
-            </w:r>
-            <w:r>
-              <w:rPr>
-                <w:noProof/>
-                <w:webHidden/>
-              </w:rPr>
-              <w:tab/>
-            </w:r>
-            <w:r>
-              <w:rPr>
-                <w:noProof/>
-                <w:webHidden/>
-              </w:rPr>
-              <w:fldChar w:fldCharType="begin"/>
-            </w:r>
-            <w:r>
-              <w:rPr>
-                <w:noProof/>
-                <w:webHidden/>
-              </w:rPr>
-              <w:instrText xml:space="preserve"> PAGEREF _Toc135490226 \h </w:instrText>
-            </w:r>
-            <w:r>
-              <w:rPr>
-                <w:noProof/>
-                <w:webHidden/>
-              </w:rPr>
-            </w:r>
-            <w:r>
-              <w:rPr>
-                <w:noProof/>
-                <w:webHidden/>
-              </w:rPr>
-              <w:fldChar w:fldCharType="separate"/>
-            </w:r>
-            <w:r>
-              <w:rPr>
-                <w:noProof/>
-                <w:webHidden/>
-              </w:rPr>
-              <w:t>5</w:t>
-            </w:r>
-            <w:r>
-              <w:rPr>
-                <w:noProof/>
-                <w:webHidden/>
-              </w:rPr>
-              <w:fldChar w:fldCharType="end"/>
-            </w:r>
-          </w:hyperlink>
+          <w:r>
+            <w:fldChar w:fldCharType="begin"/>
+          </w:r>
+          <w:r>
+            <w:instrText>HYPERLINK \l "_Toc135490226"</w:instrText>
+          </w:r>
+          <w:r>
+            <w:fldChar w:fldCharType="separate"/>
+          </w:r>
+          <w:r>
+            <w:rPr>
+              <w:rStyle w:val="af1"/>
+              <w:noProof/>
+            </w:rPr>
+            <w:t>A.1.1</w:t>
+          </w:r>
+          <w:r>
+            <w:rPr>
+              <w:rFonts w:asciiTheme="minorHAnsi" w:eastAsiaTheme="minorEastAsia" w:hAnsiTheme="minorHAnsi" w:cstheme="minorBidi"/>
+              <w:noProof/>
+              <w:kern w:val="2"/>
+              <w:sz w:val="21"/>
+              <w:szCs w:val="24"/>
+              <w:lang w:eastAsia="ja-JP"/>
+              <w14:ligatures w14:val="standardContextual"/>
+            </w:rPr>
+            <w:tab/>
+          </w:r>
+          <w:r>
+            <w:rPr>
+              <w:rStyle w:val="af1"/>
+              <w:noProof/>
+            </w:rPr>
+            <w:t xml:space="preserve">&lt;Appendix </w:t>
+          </w:r>
+          <w:r>
+            <w:rPr>
+              <w:rStyle w:val="af1"/>
+              <w:noProof/>
+              <w:lang w:eastAsia="ja-JP"/>
+            </w:rPr>
+            <w:t>にほんご</w:t>
+          </w:r>
+          <w:r>
+            <w:rPr>
+              <w:rStyle w:val="af1"/>
+              <w:noProof/>
+            </w:rPr>
+            <w:t>Heading 3&gt;</w:t>
+          </w:r>
+          <w:r>
+            <w:rPr>
+              <w:noProof/>
+              <w:webHidden/>
+            </w:rPr>
+            <w:tab/>
+          </w:r>
+          <w:r>
+            <w:rPr>
+              <w:noProof/>
+              <w:webHidden/>
+            </w:rPr>
+            <w:fldChar w:fldCharType="begin"/>
+          </w:r>
+          <w:r>
+            <w:rPr>
+              <w:noProof/>
+              <w:webHidden/>
+            </w:rPr>
+            <w:instrText xml:space="preserve"> PAGEREF _Toc135490226 \h </w:instrText>
+          </w:r>
+          <w:r>
+            <w:rPr>
+              <w:noProof/>
+              <w:webHidden/>
+            </w:rPr>
+          </w:r>
+          <w:r>
+            <w:rPr>
+              <w:noProof/>
+              <w:webHidden/>
+            </w:rPr>
+            <w:fldChar w:fldCharType="separate"/>
+          </w:r>
+          <w:r>
+            <w:rPr>
+              <w:noProof/>
+              <w:webHidden/>
+            </w:rPr>
+            <w:t>5</w:t>
+          </w:r>
+          <w:r>
+            <w:rPr>
+              <w:noProof/>
+              <w:webHidden/>
+            </w:rPr>
+            <w:fldChar w:fldCharType="end"/>
+          </w:r>
+          <w:r>
+            <w:fldChar w:fldCharType="end"/>
+          </w:r>
         </w:p>
         <w:p>
           <w:r>
@@ -1265,8 +1355,8 @@
         <w:tblLook w:val="0620" w:firstRow="1" w:lastRow="0" w:firstColumn="0" w:lastColumn="0" w:noHBand="1" w:noVBand="1"/>
       </w:tblPr>
       <w:tblGrid>
-        <w:gridCol w:w="2276"/>
-        <w:gridCol w:w="2497"/>
+        <w:gridCol w:w="2570"/>
+        <w:gridCol w:w="2816"/>
         <w:gridCol w:w="675"/>
         <w:gridCol w:w="675"/>
         <w:gridCol w:w="675"/>
@@ -1612,7 +1702,7 @@
         <w:tblLook w:val="07C0" w:firstRow="0" w:lastRow="1" w:firstColumn="1" w:lastColumn="1" w:noHBand="1" w:noVBand="1"/>
       </w:tblPr>
       <w:tblGrid>
-        <w:gridCol w:w="8148"/>
+        <w:gridCol w:w="8868"/>
       </w:tblGrid>
       <w:tr>
         <w:trPr>
@@ -1829,12 +1919,12 @@
         <w:tblLook w:val="01E0" w:firstRow="1" w:lastRow="1" w:firstColumn="1" w:lastColumn="1" w:noHBand="0" w:noVBand="0"/>
       </w:tblPr>
       <w:tblGrid>
-        <w:gridCol w:w="1358"/>
-        <w:gridCol w:w="1358"/>
-        <w:gridCol w:w="1358"/>
-        <w:gridCol w:w="1358"/>
-        <w:gridCol w:w="1358"/>
-        <w:gridCol w:w="1358"/>
+        <w:gridCol w:w="1392"/>
+        <w:gridCol w:w="1392"/>
+        <w:gridCol w:w="1393"/>
+        <w:gridCol w:w="1393"/>
+        <w:gridCol w:w="1393"/>
+        <w:gridCol w:w="1393"/>
       </w:tblGrid>
       <w:tr>
         <w:trPr>
@@ -2816,7 +2906,6 @@
         <w:pStyle w:val="SourceCode"/>
       </w:pPr>
       <w:r>
-        <w:lastRenderedPageBreak/>
         <w:t>This is a pen</w:t>
       </w:r>
     </w:p>
@@ -2825,6 +2914,7 @@
         <w:pStyle w:val="a1"/>
       </w:pPr>
       <w:r>
+        <w:lastRenderedPageBreak/>
         <w:br/>
       </w:r>
     </w:p>
@@ -4037,28 +4127,28 @@
         <w:rPr>
           <w:rStyle w:val="CommentTok"/>
         </w:rPr>
+        <w:t>"""A setuptools based setup module.</w:t>
+      </w:r>
+      <w:r>
+        <w:br/>
+      </w:r>
+      <w:r>
+        <w:br/>
+      </w:r>
+      <w:r>
+        <w:rPr>
+          <w:rStyle w:val="CommentTok"/>
+        </w:rPr>
+        <w:t>See:</w:t>
+      </w:r>
+      <w:r>
+        <w:br/>
+      </w:r>
+      <w:r>
+        <w:rPr>
+          <w:rStyle w:val="CommentTok"/>
+        </w:rPr>
         <w:lastRenderedPageBreak/>
-        <w:t>"""A setuptools based setup module.</w:t>
-      </w:r>
-      <w:r>
-        <w:br/>
-      </w:r>
-      <w:r>
-        <w:br/>
-      </w:r>
-      <w:r>
-        <w:rPr>
-          <w:rStyle w:val="CommentTok"/>
-        </w:rPr>
-        <w:t>See:</w:t>
-      </w:r>
-      <w:r>
-        <w:br/>
-      </w:r>
-      <w:r>
-        <w:rPr>
-          <w:rStyle w:val="CommentTok"/>
-        </w:rPr>
         <w:t>https://packaging.python.org/en/latest/distributing.html</w:t>
       </w:r>
       <w:r>
@@ -4744,14 +4834,25 @@
       <w:pPr>
         <w:pStyle w:val="a1"/>
       </w:pPr>
-      <w:hyperlink r:id="rId7">
-        <w:r>
-          <w:rPr>
-            <w:rStyle w:val="af1"/>
-          </w:rPr>
-          <w:t>Link</w:t>
-        </w:r>
-      </w:hyperlink>
+      <w:r>
+        <w:lastRenderedPageBreak/>
+        <w:fldChar w:fldCharType="begin"/>
+      </w:r>
+      <w:r>
+        <w:instrText>HYPERLINK "https://google.com" \h</w:instrText>
+      </w:r>
+      <w:r>
+        <w:fldChar w:fldCharType="separate"/>
+      </w:r>
+      <w:r>
+        <w:rPr>
+          <w:rStyle w:val="af1"/>
+        </w:rPr>
+        <w:t>Link</w:t>
+      </w:r>
+      <w:r>
+        <w:fldChar w:fldCharType="end"/>
+      </w:r>
     </w:p>
     <w:p>
       <w:pPr>
@@ -4950,7 +5051,7 @@
                     </pic:cNvPicPr>
                   </pic:nvPicPr>
                   <pic:blipFill>
-                    <a:blip r:embed="rId8"/>
+                    <a:blip r:embed="rId7"/>
                     <a:stretch>
                       <a:fillRect/>
                     </a:stretch>
@@ -4993,18 +5094,23 @@
       </w:r>
     </w:p>
     <w:sectPr>
-      <w:headerReference w:type="even" r:id="rId9"/>
-      <w:headerReference w:type="default" r:id="rId10"/>
-      <w:footerReference w:type="even" r:id="rId11"/>
-      <w:footerReference w:type="default" r:id="rId12"/>
-      <w:headerReference w:type="first" r:id="rId13"/>
-      <w:footerReference w:type="first" r:id="rId14"/>
+      <w:headerReference w:type="even" r:id="rId8"/>
+      <w:headerReference w:type="default" r:id="rId9"/>
+      <w:footerReference w:type="even" r:id="rId10"/>
+      <w:footerReference w:type="default" r:id="rId11"/>
+      <w:headerReference w:type="first" r:id="rId12"/>
+      <w:footerReference w:type="first" r:id="rId13"/>
       <w:pgSz w:w="10318" w:h="14570" w:code="13"/>
-      <w:pgMar w:top="1440" w:right="1080" w:bottom="1440" w:left="1080" w:header="851" w:footer="992" w:gutter="0"/>
+      <w:pgMar w:top="720" w:right="720" w:bottom="720" w:left="720" w:header="851" w:footer="992" w:gutter="0"/>
       <w:pgNumType w:start="0"/>
       <w:cols w:space="425"/>
       <w:titlePg/>
       <w:docGrid w:linePitch="300" w:charSpace="-4333"/>
+      <w:sectPrChange w:id="31" w:author="Kazuki Yamamoto" w:date="2025-08-09T14:25:00Z" w16du:dateUtc="2025-08-09T05:25:00Z">
+        <w:sectPr>
+          <w:pgMar w:top="1440" w:right="1080" w:bottom="1440" w:left="1080" w:header="851" w:footer="992" w:gutter="0"/>
+        </w:sectPr>
+      </w:sectPrChange>
     </w:sectPr>
   </w:body>
 </w:document>
@@ -5134,7 +5240,7 @@
         <w:noProof/>
         <w:color w:val="0F243E" w:themeColor="text2" w:themeShade="80"/>
       </w:rPr>
-      <w:instrText>3</w:instrText>
+      <w:instrText>1</w:instrText>
     </w:r>
     <w:r>
       <w:rPr>
@@ -5163,7 +5269,7 @@
         <w:noProof/>
         <w:color w:val="0F243E" w:themeColor="text2" w:themeShade="80"/>
       </w:rPr>
-      <w:t>3</w:t>
+      <w:t>1</w:t>
     </w:r>
     <w:r>
       <w:rPr>
@@ -5195,20 +5301,45 @@
   <w:tbl>
     <w:tblPr>
       <w:tblW w:w="0" w:type="auto"/>
+      <w:jc w:val="center"/>
       <w:tblCellMar>
         <w:left w:w="99" w:type="dxa"/>
         <w:right w:w="99" w:type="dxa"/>
       </w:tblCellMar>
       <w:tblLook w:val="0000" w:firstRow="0" w:lastRow="0" w:firstColumn="0" w:lastColumn="0" w:noHBand="0" w:noVBand="0"/>
+      <w:tblPrChange w:id="25" w:author="Kazuki Yamamoto" w:date="2025-08-09T14:26:00Z" w16du:dateUtc="2025-08-09T05:26:00Z">
+        <w:tblPr>
+          <w:tblW w:w="0" w:type="auto"/>
+          <w:tblCellMar>
+            <w:left w:w="99" w:type="dxa"/>
+            <w:right w:w="99" w:type="dxa"/>
+          </w:tblCellMar>
+          <w:tblLook w:val="0000" w:firstRow="0" w:lastRow="0" w:firstColumn="0" w:lastColumn="0" w:noHBand="0" w:noVBand="0"/>
+        </w:tblPr>
+      </w:tblPrChange>
     </w:tblPr>
     <w:tblGrid>
-      <w:gridCol w:w="8158"/>
+      <w:gridCol w:w="8356"/>
+      <w:tblGridChange w:id="26">
+        <w:tblGrid>
+          <w:gridCol w:w="8356"/>
+        </w:tblGrid>
+      </w:tblGridChange>
     </w:tblGrid>
     <w:tr>
+      <w:trPr>
+        <w:jc w:val="center"/>
+      </w:trPr>
       <w:tc>
         <w:tcPr>
           <w:tcW w:w="8356" w:type="dxa"/>
           <w:vAlign w:val="center"/>
+          <w:tcPrChange w:id="27" w:author="Kazuki Yamamoto" w:date="2025-08-09T14:26:00Z" w16du:dateUtc="2025-08-09T05:26:00Z">
+            <w:tcPr>
+              <w:tcW w:w="8356" w:type="dxa"/>
+              <w:vAlign w:val="center"/>
+            </w:tcPr>
+          </w:tcPrChange>
         </w:tcPr>
         <w:p>
           <w:pPr>
@@ -5218,10 +5349,19 @@
       </w:tc>
     </w:tr>
     <w:tr>
+      <w:trPr>
+        <w:jc w:val="center"/>
+      </w:trPr>
       <w:tc>
         <w:tcPr>
           <w:tcW w:w="8356" w:type="dxa"/>
           <w:vAlign w:val="center"/>
+          <w:tcPrChange w:id="28" w:author="Kazuki Yamamoto" w:date="2025-08-09T14:26:00Z" w16du:dateUtc="2025-08-09T05:26:00Z">
+            <w:tcPr>
+              <w:tcW w:w="8356" w:type="dxa"/>
+              <w:vAlign w:val="center"/>
+            </w:tcPr>
+          </w:tcPrChange>
         </w:tcPr>
         <w:p>
           <w:pPr>
@@ -5231,10 +5371,19 @@
       </w:tc>
     </w:tr>
     <w:tr>
+      <w:trPr>
+        <w:jc w:val="center"/>
+      </w:trPr>
       <w:tc>
         <w:tcPr>
           <w:tcW w:w="8356" w:type="dxa"/>
           <w:vAlign w:val="center"/>
+          <w:tcPrChange w:id="29" w:author="Kazuki Yamamoto" w:date="2025-08-09T14:26:00Z" w16du:dateUtc="2025-08-09T05:26:00Z">
+            <w:tcPr>
+              <w:tcW w:w="8356" w:type="dxa"/>
+              <w:vAlign w:val="center"/>
+            </w:tcPr>
+          </w:tcPrChange>
         </w:tcPr>
         <w:p>
           <w:pPr>
@@ -5244,10 +5393,19 @@
       </w:tc>
     </w:tr>
     <w:tr>
+      <w:trPr>
+        <w:jc w:val="center"/>
+      </w:trPr>
       <w:tc>
         <w:tcPr>
           <w:tcW w:w="8356" w:type="dxa"/>
           <w:vAlign w:val="center"/>
+          <w:tcPrChange w:id="30" w:author="Kazuki Yamamoto" w:date="2025-08-09T14:26:00Z" w16du:dateUtc="2025-08-09T05:26:00Z">
+            <w:tcPr>
+              <w:tcW w:w="8356" w:type="dxa"/>
+              <w:vAlign w:val="center"/>
+            </w:tcPr>
+          </w:tcPrChange>
         </w:tcPr>
         <w:p>
           <w:pPr>
@@ -9968,6 +10126,14 @@
   </w:num>
   <w:numIdMacAtCleanup w:val="13"/>
 </w:numbering>
+</file>
+
+<file path=word/people.xml><?xml version="1.0" encoding="utf-8"?>
+<w15:people xmlns:wpc="http://schemas.microsoft.com/office/word/2010/wordprocessingCanvas" xmlns:cx="http://schemas.microsoft.com/office/drawing/2014/chartex" xmlns:cx1="http://schemas.microsoft.com/office/drawing/2015/9/8/chartex" xmlns:cx2="http://schemas.microsoft.com/office/drawing/2015/10/21/chartex" xmlns:cx3="http://schemas.microsoft.com/office/drawing/2016/5/9/chartex" xmlns:cx4="http://schemas.microsoft.com/office/drawing/2016/5/10/chartex" xmlns:cx5="http://schemas.microsoft.com/office/drawing/2016/5/11/chartex" xmlns:cx6="http://schemas.microsoft.com/office/drawing/2016/5/12/chartex" xmlns:cx7="http://schemas.microsoft.com/office/drawing/2016/5/13/chartex" xmlns:cx8="http://schemas.microsoft.com/office/drawing/2016/5/14/chartex" xmlns:mc="http://schemas.openxmlformats.org/markup-compatibility/2006" xmlns:aink="http://schemas.microsoft.com/office/drawing/2016/ink" xmlns:am3d="http://schemas.microsoft.com/office/drawing/2017/model3d" xmlns:o="urn:schemas-microsoft-com:office:office" xmlns:oel="http://schemas.microsoft.com/office/2019/extlst" xmlns:r="http://schemas.openxmlformats.org/officeDocument/2006/relationships" xmlns:m="http://schemas.openxmlformats.org/officeDocument/2006/math" xmlns:v="urn:schemas-microsoft-com:vml" xmlns:wp14="http://schemas.microsoft.com/office/word/2010/wordprocessingDrawing" xmlns:wp="http://schemas.openxmlformats.org/drawingml/2006/wordprocessingDrawing" xmlns:w10="urn:schemas-microsoft-com:office:word" xmlns:w="http://schemas.openxmlformats.org/wordprocessingml/2006/main" xmlns:w14="http://schemas.microsoft.com/office/word/2010/wordml" xmlns:w15="http://schemas.microsoft.com/office/word/2012/wordml" xmlns:w16cex="http://schemas.microsoft.com/office/word/2018/wordml/cex" xmlns:w16cid="http://schemas.microsoft.com/office/word/2016/wordml/cid" xmlns:w16="http://schemas.microsoft.com/office/word/2018/wordml" xmlns:w16du="http://schemas.microsoft.com/office/word/2023/wordml/word16du" xmlns:w16sdtdh="http://schemas.microsoft.com/office/word/2020/wordml/sdtdatahash" xmlns:w16sdtfl="http://schemas.microsoft.com/office/word/2024/wordml/sdtformatlock" xmlns:w16se="http://schemas.microsoft.com/office/word/2015/wordml/symex" xmlns:wpg="http://schemas.microsoft.com/office/word/2010/wordprocessingGroup" xmlns:wpi="http://schemas.microsoft.com/office/word/2010/wordprocessingInk" xmlns:wne="http://schemas.microsoft.com/office/word/2006/wordml" xmlns:wps="http://schemas.microsoft.com/office/word/2010/wordprocessingShape" mc:Ignorable="w14 w15 w16se w16cid w16 w16cex w16sdtdh w16sdtfl w16du wp14">
+  <w15:person w15:author="Kazuki Yamamoto">
+    <w15:presenceInfo w15:providerId="Windows Live" w15:userId="b66bea3e4ff20684"/>
+  </w15:person>
+</w15:people>
 </file>
 
 <file path=word/styles.xml><?xml version="1.0" encoding="utf-8"?>
@@ -12728,6 +12894,20 @@
     <w:qFormat/>
     <w:rsid w:val="00082EB2"/>
   </w:style>
+  <w:style w:type="paragraph" w:styleId="affb">
+    <w:name w:val="Revision"/>
+    <w:hidden/>
+    <w:semiHidden/>
+    <w:rsid w:val="00D30828"/>
+    <w:pPr>
+      <w:spacing w:after="0" w:line="240" w:lineRule="auto"/>
+    </w:pPr>
+    <w:rPr>
+      <w:rFonts w:ascii="Source Han Sans Regular" w:eastAsia="Source Han Sans Regular" w:hAnsi="Source Han Sans Regular" w:cs="Source Han Sans Regular"/>
+      <w:sz w:val="20"/>
+      <w:szCs w:val="20"/>
+    </w:rPr>
+  </w:style>
 </w:styles>
 </file>
 

</xml_diff>

<commit_message>
update system/ref.docx - fix xml parse error
</commit_message>
<xml_diff>
--- a/system/ref.docx
+++ b/system/ref.docx
@@ -145,74 +145,64 @@
             </w:rPr>
             <w:fldChar w:fldCharType="separate"/>
           </w:r>
-          <w:r>
-            <w:fldChar w:fldCharType="begin"/>
-          </w:r>
-          <w:r>
-            <w:instrText>HYPERLINK \l "_Toc135490218"</w:instrText>
-          </w:r>
-          <w:r>
-            <w:fldChar w:fldCharType="separate"/>
-          </w:r>
-          <w:r>
-            <w:rPr>
-              <w:rStyle w:val="af1"/>
-              <w:noProof/>
-              <w:lang w:eastAsia="ja-JP"/>
-            </w:rPr>
-            <w:t>まえがき</w:t>
-          </w:r>
-          <w:r>
-            <w:rPr>
-              <w:noProof/>
-              <w:webHidden/>
-            </w:rPr>
-            <w:tab/>
-          </w:r>
-          <w:r>
-            <w:rPr>
-              <w:noProof/>
-              <w:webHidden/>
-            </w:rPr>
-            <w:fldChar w:fldCharType="begin"/>
-          </w:r>
-          <w:r>
-            <w:rPr>
-              <w:noProof/>
-              <w:webHidden/>
-            </w:rPr>
-            <w:instrText xml:space="preserve"> PAGEREF _Toc135490218 \h </w:instrText>
-          </w:r>
-          <w:r>
-            <w:rPr>
-              <w:noProof/>
-              <w:webHidden/>
-            </w:rPr>
-          </w:r>
-          <w:r>
-            <w:rPr>
-              <w:noProof/>
-              <w:webHidden/>
-            </w:rPr>
-            <w:fldChar w:fldCharType="separate"/>
-          </w:r>
-          <w:r>
-            <w:rPr>
-              <w:noProof/>
-              <w:webHidden/>
-            </w:rPr>
-            <w:t>2</w:t>
-          </w:r>
-          <w:r>
-            <w:rPr>
-              <w:noProof/>
-              <w:webHidden/>
-            </w:rPr>
-            <w:fldChar w:fldCharType="end"/>
-          </w:r>
-          <w:r>
-            <w:fldChar w:fldCharType="end"/>
-          </w:r>
+          <w:hyperlink w:anchor="_Toc135490218" w:history="1">
+            <w:r>
+              <w:rPr>
+                <w:rStyle w:val="af1"/>
+                <w:noProof/>
+                <w:lang w:eastAsia="ja-JP"/>
+              </w:rPr>
+              <w:t>まえがき</w:t>
+            </w:r>
+            <w:r>
+              <w:rPr>
+                <w:noProof/>
+                <w:webHidden/>
+              </w:rPr>
+              <w:tab/>
+            </w:r>
+            <w:r>
+              <w:rPr>
+                <w:noProof/>
+                <w:webHidden/>
+              </w:rPr>
+              <w:fldChar w:fldCharType="begin"/>
+            </w:r>
+            <w:r>
+              <w:rPr>
+                <w:noProof/>
+                <w:webHidden/>
+              </w:rPr>
+              <w:instrText xml:space="preserve"> PAGEREF _Toc135490218 \h </w:instrText>
+            </w:r>
+            <w:r>
+              <w:rPr>
+                <w:noProof/>
+                <w:webHidden/>
+              </w:rPr>
+            </w:r>
+            <w:r>
+              <w:rPr>
+                <w:noProof/>
+                <w:webHidden/>
+              </w:rPr>
+              <w:fldChar w:fldCharType="separate"/>
+            </w:r>
+            <w:r>
+              <w:rPr>
+                <w:noProof/>
+                <w:webHidden/>
+              </w:rPr>
+              <w:t>2</w:t>
+            </w:r>
+            <w:r>
+              <w:rPr>
+                <w:noProof/>
+                <w:webHidden/>
+              </w:rPr>
+              <w:fldChar w:fldCharType="end"/>
+            </w:r>
+          </w:hyperlink>
         </w:p>
         <w:p>
           <w:pPr>
@@ -231,73 +221,63 @@
               <w14:ligatures w14:val="standardContextual"/>
             </w:rPr>
           </w:pPr>
-          <w:r>
-            <w:fldChar w:fldCharType="begin"/>
-          </w:r>
-          <w:r>
-            <w:instrText>HYPERLINK \l "_Toc135490219"</w:instrText>
-          </w:r>
-          <w:r>
-            <w:fldChar w:fldCharType="separate"/>
-          </w:r>
-          <w:r>
-            <w:rPr>
-              <w:rStyle w:val="af1"/>
-              <w:noProof/>
-            </w:rPr>
-            <w:t>&lt;Heading Unnumbered 2&gt;</w:t>
-          </w:r>
-          <w:r>
-            <w:rPr>
-              <w:noProof/>
-              <w:webHidden/>
-            </w:rPr>
-            <w:tab/>
-          </w:r>
-          <w:r>
-            <w:rPr>
-              <w:noProof/>
-              <w:webHidden/>
-            </w:rPr>
-            <w:fldChar w:fldCharType="begin"/>
-          </w:r>
-          <w:r>
-            <w:rPr>
-              <w:noProof/>
-              <w:webHidden/>
-            </w:rPr>
-            <w:instrText xml:space="preserve"> PAGEREF _Toc135490219 \h </w:instrText>
-          </w:r>
-          <w:r>
-            <w:rPr>
-              <w:noProof/>
-              <w:webHidden/>
-            </w:rPr>
-          </w:r>
-          <w:r>
-            <w:rPr>
-              <w:noProof/>
-              <w:webHidden/>
-            </w:rPr>
-            <w:fldChar w:fldCharType="separate"/>
-          </w:r>
-          <w:r>
-            <w:rPr>
-              <w:noProof/>
-              <w:webHidden/>
-            </w:rPr>
-            <w:t>2</w:t>
-          </w:r>
-          <w:r>
-            <w:rPr>
-              <w:noProof/>
-              <w:webHidden/>
-            </w:rPr>
-            <w:fldChar w:fldCharType="end"/>
-          </w:r>
-          <w:r>
-            <w:fldChar w:fldCharType="end"/>
-          </w:r>
+          <w:hyperlink w:anchor="_Toc135490219" w:history="1">
+            <w:r>
+              <w:rPr>
+                <w:rStyle w:val="af1"/>
+                <w:noProof/>
+              </w:rPr>
+              <w:t>&lt;Heading Unnumbered 2&gt;</w:t>
+            </w:r>
+            <w:r>
+              <w:rPr>
+                <w:noProof/>
+                <w:webHidden/>
+              </w:rPr>
+              <w:tab/>
+            </w:r>
+            <w:r>
+              <w:rPr>
+                <w:noProof/>
+                <w:webHidden/>
+              </w:rPr>
+              <w:fldChar w:fldCharType="begin"/>
+            </w:r>
+            <w:r>
+              <w:rPr>
+                <w:noProof/>
+                <w:webHidden/>
+              </w:rPr>
+              <w:instrText xml:space="preserve"> PAGEREF _Toc135490219 \h </w:instrText>
+            </w:r>
+            <w:r>
+              <w:rPr>
+                <w:noProof/>
+                <w:webHidden/>
+              </w:rPr>
+            </w:r>
+            <w:r>
+              <w:rPr>
+                <w:noProof/>
+                <w:webHidden/>
+              </w:rPr>
+              <w:fldChar w:fldCharType="separate"/>
+            </w:r>
+            <w:r>
+              <w:rPr>
+                <w:noProof/>
+                <w:webHidden/>
+              </w:rPr>
+              <w:t>2</w:t>
+            </w:r>
+            <w:r>
+              <w:rPr>
+                <w:noProof/>
+                <w:webHidden/>
+              </w:rPr>
+              <w:fldChar w:fldCharType="end"/>
+            </w:r>
+          </w:hyperlink>
         </w:p>
         <w:p>
           <w:pPr>
@@ -315,73 +295,63 @@
               <w14:ligatures w14:val="standardContextual"/>
             </w:rPr>
           </w:pPr>
-          <w:r>
-            <w:fldChar w:fldCharType="begin"/>
-          </w:r>
-          <w:r>
-            <w:instrText>HYPERLINK \l "_Toc135490220"</w:instrText>
-          </w:r>
-          <w:r>
-            <w:fldChar w:fldCharType="separate"/>
-          </w:r>
-          <w:r>
-            <w:rPr>
-              <w:rStyle w:val="af1"/>
-              <w:noProof/>
-            </w:rPr>
-            <w:t>&lt;Heading Unnumbered 3&gt;</w:t>
-          </w:r>
-          <w:r>
-            <w:rPr>
-              <w:noProof/>
-              <w:webHidden/>
-            </w:rPr>
-            <w:tab/>
-          </w:r>
-          <w:r>
-            <w:rPr>
-              <w:noProof/>
-              <w:webHidden/>
-            </w:rPr>
-            <w:fldChar w:fldCharType="begin"/>
-          </w:r>
-          <w:r>
-            <w:rPr>
-              <w:noProof/>
-              <w:webHidden/>
-            </w:rPr>
-            <w:instrText xml:space="preserve"> PAGEREF _Toc135490220 \h </w:instrText>
-          </w:r>
-          <w:r>
-            <w:rPr>
-              <w:noProof/>
-              <w:webHidden/>
-            </w:rPr>
-          </w:r>
-          <w:r>
-            <w:rPr>
-              <w:noProof/>
-              <w:webHidden/>
-            </w:rPr>
-            <w:fldChar w:fldCharType="separate"/>
-          </w:r>
-          <w:r>
-            <w:rPr>
-              <w:noProof/>
-              <w:webHidden/>
-            </w:rPr>
-            <w:t>2</w:t>
-          </w:r>
-          <w:r>
-            <w:rPr>
-              <w:noProof/>
-              <w:webHidden/>
-            </w:rPr>
-            <w:fldChar w:fldCharType="end"/>
-          </w:r>
-          <w:r>
-            <w:fldChar w:fldCharType="end"/>
-          </w:r>
+          <w:hyperlink w:anchor="_Toc135490220" w:history="1">
+            <w:r>
+              <w:rPr>
+                <w:rStyle w:val="af1"/>
+                <w:noProof/>
+              </w:rPr>
+              <w:t>&lt;Heading Unnumbered 3&gt;</w:t>
+            </w:r>
+            <w:r>
+              <w:rPr>
+                <w:noProof/>
+                <w:webHidden/>
+              </w:rPr>
+              <w:tab/>
+            </w:r>
+            <w:r>
+              <w:rPr>
+                <w:noProof/>
+                <w:webHidden/>
+              </w:rPr>
+              <w:fldChar w:fldCharType="begin"/>
+            </w:r>
+            <w:r>
+              <w:rPr>
+                <w:noProof/>
+                <w:webHidden/>
+              </w:rPr>
+              <w:instrText xml:space="preserve"> PAGEREF _Toc135490220 \h </w:instrText>
+            </w:r>
+            <w:r>
+              <w:rPr>
+                <w:noProof/>
+                <w:webHidden/>
+              </w:rPr>
+            </w:r>
+            <w:r>
+              <w:rPr>
+                <w:noProof/>
+                <w:webHidden/>
+              </w:rPr>
+              <w:fldChar w:fldCharType="separate"/>
+            </w:r>
+            <w:r>
+              <w:rPr>
+                <w:noProof/>
+                <w:webHidden/>
+              </w:rPr>
+              <w:t>2</w:t>
+            </w:r>
+            <w:r>
+              <w:rPr>
+                <w:noProof/>
+                <w:webHidden/>
+              </w:rPr>
+              <w:fldChar w:fldCharType="end"/>
+            </w:r>
+          </w:hyperlink>
         </w:p>
         <w:p>
           <w:pPr>
@@ -396,107 +366,97 @@
               <w14:ligatures w14:val="standardContextual"/>
             </w:rPr>
           </w:pPr>
-          <w:r>
-            <w:fldChar w:fldCharType="begin"/>
-          </w:r>
-          <w:r>
-            <w:instrText>HYPERLINK \l "_Toc135490221"</w:instrText>
-          </w:r>
-          <w:r>
-            <w:fldChar w:fldCharType="separate"/>
-          </w:r>
-          <w:r>
-            <w:rPr>
-              <w:rStyle w:val="af1"/>
-              <w:noProof/>
-            </w:rPr>
-            <w:t>1</w:t>
-          </w:r>
-          <w:r>
-            <w:rPr>
-              <w:rFonts w:asciiTheme="minorHAnsi" w:eastAsiaTheme="minorEastAsia" w:hAnsiTheme="minorHAnsi" w:cstheme="minorBidi"/>
-              <w:noProof/>
-              <w:color w:val="auto"/>
-              <w:kern w:val="2"/>
-              <w:sz w:val="21"/>
-              <w:lang w:eastAsia="ja-JP"/>
-              <w14:ligatures w14:val="standardContextual"/>
-            </w:rPr>
-            <w:tab/>
-          </w:r>
-          <w:r>
-            <w:rPr>
-              <w:rStyle w:val="af1"/>
-              <w:noProof/>
-            </w:rPr>
-            <w:t xml:space="preserve">&lt;Heading </w:t>
-          </w:r>
-          <w:r>
-            <w:rPr>
-              <w:rStyle w:val="af1"/>
-              <w:noProof/>
-              <w:lang w:eastAsia="ja-JP"/>
-            </w:rPr>
-            <w:t>にほんご</w:t>
-          </w:r>
-          <w:r>
-            <w:rPr>
-              <w:rStyle w:val="af1"/>
-              <w:noProof/>
-            </w:rPr>
-            <w:t>1&gt;</w:t>
-          </w:r>
-          <w:r>
-            <w:rPr>
-              <w:noProof/>
-              <w:webHidden/>
-            </w:rPr>
-            <w:tab/>
-          </w:r>
-          <w:r>
-            <w:rPr>
-              <w:noProof/>
-              <w:webHidden/>
-            </w:rPr>
-            <w:fldChar w:fldCharType="begin"/>
-          </w:r>
-          <w:r>
-            <w:rPr>
-              <w:noProof/>
-              <w:webHidden/>
-            </w:rPr>
-            <w:instrText xml:space="preserve"> PAGEREF _Toc135490221 \h </w:instrText>
-          </w:r>
-          <w:r>
-            <w:rPr>
-              <w:noProof/>
-              <w:webHidden/>
-            </w:rPr>
-          </w:r>
-          <w:r>
-            <w:rPr>
-              <w:noProof/>
-              <w:webHidden/>
-            </w:rPr>
-            <w:fldChar w:fldCharType="separate"/>
-          </w:r>
-          <w:r>
-            <w:rPr>
-              <w:noProof/>
-              <w:webHidden/>
-            </w:rPr>
-            <w:t>3</w:t>
-          </w:r>
-          <w:r>
-            <w:rPr>
-              <w:noProof/>
-              <w:webHidden/>
-            </w:rPr>
-            <w:fldChar w:fldCharType="end"/>
-          </w:r>
-          <w:r>
-            <w:fldChar w:fldCharType="end"/>
-          </w:r>
+          <w:hyperlink w:anchor="_Toc135490221" w:history="1">
+            <w:r>
+              <w:rPr>
+                <w:rStyle w:val="af1"/>
+                <w:noProof/>
+              </w:rPr>
+              <w:t>1</w:t>
+            </w:r>
+            <w:r>
+              <w:rPr>
+                <w:rFonts w:asciiTheme="minorHAnsi" w:eastAsiaTheme="minorEastAsia" w:hAnsiTheme="minorHAnsi" w:cstheme="minorBidi"/>
+                <w:noProof/>
+                <w:color w:val="auto"/>
+                <w:kern w:val="2"/>
+                <w:sz w:val="21"/>
+                <w:lang w:eastAsia="ja-JP"/>
+                <w14:ligatures w14:val="standardContextual"/>
+              </w:rPr>
+              <w:tab/>
+            </w:r>
+            <w:r>
+              <w:rPr>
+                <w:rStyle w:val="af1"/>
+                <w:noProof/>
+              </w:rPr>
+              <w:t xml:space="preserve">&lt;Heading </w:t>
+            </w:r>
+            <w:r>
+              <w:rPr>
+                <w:rStyle w:val="af1"/>
+                <w:noProof/>
+                <w:lang w:eastAsia="ja-JP"/>
+              </w:rPr>
+              <w:t>にほんご</w:t>
+            </w:r>
+            <w:r>
+              <w:rPr>
+                <w:rStyle w:val="af1"/>
+                <w:noProof/>
+              </w:rPr>
+              <w:t>1&gt;</w:t>
+            </w:r>
+            <w:r>
+              <w:rPr>
+                <w:noProof/>
+                <w:webHidden/>
+              </w:rPr>
+              <w:tab/>
+            </w:r>
+            <w:r>
+              <w:rPr>
+                <w:noProof/>
+                <w:webHidden/>
+              </w:rPr>
+              <w:fldChar w:fldCharType="begin"/>
+            </w:r>
+            <w:r>
+              <w:rPr>
+                <w:noProof/>
+                <w:webHidden/>
+              </w:rPr>
+              <w:instrText xml:space="preserve"> PAGEREF _Toc135490221 \h </w:instrText>
+            </w:r>
+            <w:r>
+              <w:rPr>
+                <w:noProof/>
+                <w:webHidden/>
+              </w:rPr>
+            </w:r>
+            <w:r>
+              <w:rPr>
+                <w:noProof/>
+                <w:webHidden/>
+              </w:rPr>
+              <w:fldChar w:fldCharType="separate"/>
+            </w:r>
+            <w:r>
+              <w:rPr>
+                <w:noProof/>
+                <w:webHidden/>
+              </w:rPr>
+              <w:t>3</w:t>
+            </w:r>
+            <w:r>
+              <w:rPr>
+                <w:noProof/>
+                <w:webHidden/>
+              </w:rPr>
+              <w:fldChar w:fldCharType="end"/>
+            </w:r>
+          </w:hyperlink>
         </w:p>
         <w:p>
           <w:pPr>
@@ -516,108 +476,98 @@
               <w14:ligatures w14:val="standardContextual"/>
             </w:rPr>
           </w:pPr>
-          <w:r>
-            <w:fldChar w:fldCharType="begin"/>
-          </w:r>
-          <w:r>
-            <w:instrText>HYPERLINK \l "_Toc135490222"</w:instrText>
-          </w:r>
-          <w:r>
-            <w:fldChar w:fldCharType="separate"/>
-          </w:r>
-          <w:r>
-            <w:rPr>
-              <w:rStyle w:val="af1"/>
-              <w:noProof/>
-            </w:rPr>
-            <w:t>1.1</w:t>
-          </w:r>
-          <w:r>
-            <w:rPr>
-              <w:rFonts w:asciiTheme="minorHAnsi" w:eastAsiaTheme="minorEastAsia" w:hAnsiTheme="minorHAnsi" w:cstheme="minorBidi"/>
-              <w:bCs w:val="0"/>
-              <w:noProof/>
-              <w:kern w:val="2"/>
-              <w:sz w:val="21"/>
-              <w:szCs w:val="24"/>
-              <w:lang w:eastAsia="ja-JP"/>
-              <w14:ligatures w14:val="standardContextual"/>
-            </w:rPr>
-            <w:tab/>
-          </w:r>
-          <w:r>
-            <w:rPr>
-              <w:rStyle w:val="af1"/>
-              <w:noProof/>
-            </w:rPr>
-            <w:t xml:space="preserve">&lt;Heading </w:t>
-          </w:r>
-          <w:r>
-            <w:rPr>
-              <w:rStyle w:val="af1"/>
-              <w:noProof/>
-              <w:lang w:eastAsia="ja-JP"/>
-            </w:rPr>
-            <w:t>にほんご</w:t>
-          </w:r>
-          <w:r>
-            <w:rPr>
-              <w:rStyle w:val="af1"/>
-              <w:noProof/>
-            </w:rPr>
-            <w:t>2&gt;</w:t>
-          </w:r>
-          <w:r>
-            <w:rPr>
-              <w:noProof/>
-              <w:webHidden/>
-            </w:rPr>
-            <w:tab/>
-          </w:r>
-          <w:r>
-            <w:rPr>
-              <w:noProof/>
-              <w:webHidden/>
-            </w:rPr>
-            <w:fldChar w:fldCharType="begin"/>
-          </w:r>
-          <w:r>
-            <w:rPr>
-              <w:noProof/>
-              <w:webHidden/>
-            </w:rPr>
-            <w:instrText xml:space="preserve"> PAGEREF _Toc135490222 \h </w:instrText>
-          </w:r>
-          <w:r>
-            <w:rPr>
-              <w:noProof/>
-              <w:webHidden/>
-            </w:rPr>
-          </w:r>
-          <w:r>
-            <w:rPr>
-              <w:noProof/>
-              <w:webHidden/>
-            </w:rPr>
-            <w:fldChar w:fldCharType="separate"/>
-          </w:r>
-          <w:r>
-            <w:rPr>
-              <w:noProof/>
-              <w:webHidden/>
-            </w:rPr>
-            <w:t>3</w:t>
-          </w:r>
-          <w:r>
-            <w:rPr>
-              <w:noProof/>
-              <w:webHidden/>
-            </w:rPr>
-            <w:fldChar w:fldCharType="end"/>
-          </w:r>
-          <w:r>
-            <w:fldChar w:fldCharType="end"/>
-          </w:r>
+          <w:hyperlink w:anchor="_Toc135490222" w:history="1">
+            <w:r>
+              <w:rPr>
+                <w:rStyle w:val="af1"/>
+                <w:noProof/>
+              </w:rPr>
+              <w:t>1.1</w:t>
+            </w:r>
+            <w:r>
+              <w:rPr>
+                <w:rFonts w:asciiTheme="minorHAnsi" w:eastAsiaTheme="minorEastAsia" w:hAnsiTheme="minorHAnsi" w:cstheme="minorBidi"/>
+                <w:bCs w:val="0"/>
+                <w:noProof/>
+                <w:kern w:val="2"/>
+                <w:sz w:val="21"/>
+                <w:szCs w:val="24"/>
+                <w:lang w:eastAsia="ja-JP"/>
+                <w14:ligatures w14:val="standardContextual"/>
+              </w:rPr>
+              <w:tab/>
+            </w:r>
+            <w:r>
+              <w:rPr>
+                <w:rStyle w:val="af1"/>
+                <w:noProof/>
+              </w:rPr>
+              <w:t xml:space="preserve">&lt;Heading </w:t>
+            </w:r>
+            <w:r>
+              <w:rPr>
+                <w:rStyle w:val="af1"/>
+                <w:noProof/>
+                <w:lang w:eastAsia="ja-JP"/>
+              </w:rPr>
+              <w:t>にほんご</w:t>
+            </w:r>
+            <w:r>
+              <w:rPr>
+                <w:rStyle w:val="af1"/>
+                <w:noProof/>
+              </w:rPr>
+              <w:t>2&gt;</w:t>
+            </w:r>
+            <w:r>
+              <w:rPr>
+                <w:noProof/>
+                <w:webHidden/>
+              </w:rPr>
+              <w:tab/>
+            </w:r>
+            <w:r>
+              <w:rPr>
+                <w:noProof/>
+                <w:webHidden/>
+              </w:rPr>
+              <w:fldChar w:fldCharType="begin"/>
+            </w:r>
+            <w:r>
+              <w:rPr>
+                <w:noProof/>
+                <w:webHidden/>
+              </w:rPr>
+              <w:instrText xml:space="preserve"> PAGEREF _Toc135490222 \h </w:instrText>
+            </w:r>
+            <w:r>
+              <w:rPr>
+                <w:noProof/>
+                <w:webHidden/>
+              </w:rPr>
+            </w:r>
+            <w:r>
+              <w:rPr>
+                <w:noProof/>
+                <w:webHidden/>
+              </w:rPr>
+              <w:fldChar w:fldCharType="separate"/>
+            </w:r>
+            <w:r>
+              <w:rPr>
+                <w:noProof/>
+                <w:webHidden/>
+              </w:rPr>
+              <w:t>3</w:t>
+            </w:r>
+            <w:r>
+              <w:rPr>
+                <w:noProof/>
+                <w:webHidden/>
+              </w:rPr>
+              <w:fldChar w:fldCharType="end"/>
+            </w:r>
+          </w:hyperlink>
         </w:p>
         <w:p>
           <w:pPr>
@@ -636,107 +586,97 @@
               <w14:ligatures w14:val="standardContextual"/>
             </w:rPr>
           </w:pPr>
-          <w:r>
-            <w:fldChar w:fldCharType="begin"/>
-          </w:r>
-          <w:r>
-            <w:instrText>HYPERLINK \l "_Toc135490223"</w:instrText>
-          </w:r>
-          <w:r>
-            <w:fldChar w:fldCharType="separate"/>
-          </w:r>
-          <w:r>
-            <w:rPr>
-              <w:rStyle w:val="af1"/>
-              <w:noProof/>
-            </w:rPr>
-            <w:t>1.1.1</w:t>
-          </w:r>
-          <w:r>
-            <w:rPr>
-              <w:rFonts w:asciiTheme="minorHAnsi" w:eastAsiaTheme="minorEastAsia" w:hAnsiTheme="minorHAnsi" w:cstheme="minorBidi"/>
-              <w:noProof/>
-              <w:kern w:val="2"/>
-              <w:sz w:val="21"/>
-              <w:szCs w:val="24"/>
-              <w:lang w:eastAsia="ja-JP"/>
-              <w14:ligatures w14:val="standardContextual"/>
-            </w:rPr>
-            <w:tab/>
-          </w:r>
-          <w:r>
-            <w:rPr>
-              <w:rStyle w:val="af1"/>
-              <w:noProof/>
-            </w:rPr>
-            <w:t xml:space="preserve">&lt;Heading </w:t>
-          </w:r>
-          <w:r>
-            <w:rPr>
-              <w:rStyle w:val="af1"/>
-              <w:noProof/>
-              <w:lang w:eastAsia="ja-JP"/>
-            </w:rPr>
-            <w:t>にほんご</w:t>
-          </w:r>
-          <w:r>
-            <w:rPr>
-              <w:rStyle w:val="af1"/>
-              <w:noProof/>
-            </w:rPr>
-            <w:t>3&gt;</w:t>
-          </w:r>
-          <w:r>
-            <w:rPr>
-              <w:noProof/>
-              <w:webHidden/>
-            </w:rPr>
-            <w:tab/>
-          </w:r>
-          <w:r>
-            <w:rPr>
-              <w:noProof/>
-              <w:webHidden/>
-            </w:rPr>
-            <w:fldChar w:fldCharType="begin"/>
-          </w:r>
-          <w:r>
-            <w:rPr>
-              <w:noProof/>
-              <w:webHidden/>
-            </w:rPr>
-            <w:instrText xml:space="preserve"> PAGEREF _Toc135490223 \h </w:instrText>
-          </w:r>
-          <w:r>
-            <w:rPr>
-              <w:noProof/>
-              <w:webHidden/>
-            </w:rPr>
-          </w:r>
-          <w:r>
-            <w:rPr>
-              <w:noProof/>
-              <w:webHidden/>
-            </w:rPr>
-            <w:fldChar w:fldCharType="separate"/>
-          </w:r>
-          <w:r>
-            <w:rPr>
-              <w:noProof/>
-              <w:webHidden/>
-            </w:rPr>
-            <w:t>3</w:t>
-          </w:r>
-          <w:r>
-            <w:rPr>
-              <w:noProof/>
-              <w:webHidden/>
-            </w:rPr>
-            <w:fldChar w:fldCharType="end"/>
-          </w:r>
-          <w:r>
-            <w:fldChar w:fldCharType="end"/>
-          </w:r>
+          <w:hyperlink w:anchor="_Toc135490223" w:history="1">
+            <w:r>
+              <w:rPr>
+                <w:rStyle w:val="af1"/>
+                <w:noProof/>
+              </w:rPr>
+              <w:t>1.1.1</w:t>
+            </w:r>
+            <w:r>
+              <w:rPr>
+                <w:rFonts w:asciiTheme="minorHAnsi" w:eastAsiaTheme="minorEastAsia" w:hAnsiTheme="minorHAnsi" w:cstheme="minorBidi"/>
+                <w:noProof/>
+                <w:kern w:val="2"/>
+                <w:sz w:val="21"/>
+                <w:szCs w:val="24"/>
+                <w:lang w:eastAsia="ja-JP"/>
+                <w14:ligatures w14:val="standardContextual"/>
+              </w:rPr>
+              <w:tab/>
+            </w:r>
+            <w:r>
+              <w:rPr>
+                <w:rStyle w:val="af1"/>
+                <w:noProof/>
+              </w:rPr>
+              <w:t xml:space="preserve">&lt;Heading </w:t>
+            </w:r>
+            <w:r>
+              <w:rPr>
+                <w:rStyle w:val="af1"/>
+                <w:noProof/>
+                <w:lang w:eastAsia="ja-JP"/>
+              </w:rPr>
+              <w:t>にほんご</w:t>
+            </w:r>
+            <w:r>
+              <w:rPr>
+                <w:rStyle w:val="af1"/>
+                <w:noProof/>
+              </w:rPr>
+              <w:t>3&gt;</w:t>
+            </w:r>
+            <w:r>
+              <w:rPr>
+                <w:noProof/>
+                <w:webHidden/>
+              </w:rPr>
+              <w:tab/>
+            </w:r>
+            <w:r>
+              <w:rPr>
+                <w:noProof/>
+                <w:webHidden/>
+              </w:rPr>
+              <w:fldChar w:fldCharType="begin"/>
+            </w:r>
+            <w:r>
+              <w:rPr>
+                <w:noProof/>
+                <w:webHidden/>
+              </w:rPr>
+              <w:instrText xml:space="preserve"> PAGEREF _Toc135490223 \h </w:instrText>
+            </w:r>
+            <w:r>
+              <w:rPr>
+                <w:noProof/>
+                <w:webHidden/>
+              </w:rPr>
+            </w:r>
+            <w:r>
+              <w:rPr>
+                <w:noProof/>
+                <w:webHidden/>
+              </w:rPr>
+              <w:fldChar w:fldCharType="separate"/>
+            </w:r>
+            <w:r>
+              <w:rPr>
+                <w:noProof/>
+                <w:webHidden/>
+              </w:rPr>
+              <w:t>3</w:t>
+            </w:r>
+            <w:r>
+              <w:rPr>
+                <w:noProof/>
+                <w:webHidden/>
+              </w:rPr>
+              <w:fldChar w:fldCharType="end"/>
+            </w:r>
+          </w:hyperlink>
         </w:p>
         <w:p>
           <w:pPr>
@@ -754,107 +694,97 @@
               <w14:ligatures w14:val="standardContextual"/>
             </w:rPr>
           </w:pPr>
-          <w:r>
-            <w:fldChar w:fldCharType="begin"/>
-          </w:r>
-          <w:r>
-            <w:instrText>HYPERLINK \l "_Toc135490224"</w:instrText>
-          </w:r>
-          <w:r>
-            <w:fldChar w:fldCharType="separate"/>
-          </w:r>
-          <w:r>
-            <w:rPr>
-              <w:rStyle w:val="af1"/>
-              <w:noProof/>
-            </w:rPr>
-            <w:t>Appendix A.</w:t>
-          </w:r>
-          <w:r>
-            <w:rPr>
-              <w:rFonts w:asciiTheme="minorHAnsi" w:eastAsiaTheme="minorEastAsia" w:hAnsiTheme="minorHAnsi" w:cstheme="minorBidi"/>
-              <w:noProof/>
-              <w:color w:val="auto"/>
-              <w:kern w:val="2"/>
-              <w:sz w:val="21"/>
-              <w:lang w:eastAsia="ja-JP"/>
-              <w14:ligatures w14:val="standardContextual"/>
-            </w:rPr>
-            <w:tab/>
-          </w:r>
-          <w:r>
-            <w:rPr>
-              <w:rStyle w:val="af1"/>
-              <w:noProof/>
-            </w:rPr>
-            <w:t xml:space="preserve">&lt;Appendix </w:t>
-          </w:r>
-          <w:r>
-            <w:rPr>
-              <w:rStyle w:val="af1"/>
-              <w:noProof/>
-              <w:lang w:eastAsia="ja-JP"/>
-            </w:rPr>
-            <w:t>にほんご</w:t>
-          </w:r>
-          <w:r>
-            <w:rPr>
-              <w:rStyle w:val="af1"/>
-              <w:noProof/>
-            </w:rPr>
-            <w:t>Title&gt;</w:t>
-          </w:r>
-          <w:r>
-            <w:rPr>
-              <w:noProof/>
-              <w:webHidden/>
-            </w:rPr>
-            <w:tab/>
-          </w:r>
-          <w:r>
-            <w:rPr>
-              <w:noProof/>
-              <w:webHidden/>
-            </w:rPr>
-            <w:fldChar w:fldCharType="begin"/>
-          </w:r>
-          <w:r>
-            <w:rPr>
-              <w:noProof/>
-              <w:webHidden/>
-            </w:rPr>
-            <w:instrText xml:space="preserve"> PAGEREF _Toc135490224 \h </w:instrText>
-          </w:r>
-          <w:r>
-            <w:rPr>
-              <w:noProof/>
-              <w:webHidden/>
-            </w:rPr>
-          </w:r>
-          <w:r>
-            <w:rPr>
-              <w:noProof/>
-              <w:webHidden/>
-            </w:rPr>
-            <w:fldChar w:fldCharType="separate"/>
-          </w:r>
-          <w:r>
-            <w:rPr>
-              <w:noProof/>
-              <w:webHidden/>
-            </w:rPr>
-            <w:t>5</w:t>
-          </w:r>
-          <w:r>
-            <w:rPr>
-              <w:noProof/>
-              <w:webHidden/>
-            </w:rPr>
-            <w:fldChar w:fldCharType="end"/>
-          </w:r>
-          <w:r>
-            <w:fldChar w:fldCharType="end"/>
-          </w:r>
+          <w:hyperlink w:anchor="_Toc135490224" w:history="1">
+            <w:r>
+              <w:rPr>
+                <w:rStyle w:val="af1"/>
+                <w:noProof/>
+              </w:rPr>
+              <w:t>Appendix A.</w:t>
+            </w:r>
+            <w:r>
+              <w:rPr>
+                <w:rFonts w:asciiTheme="minorHAnsi" w:eastAsiaTheme="minorEastAsia" w:hAnsiTheme="minorHAnsi" w:cstheme="minorBidi"/>
+                <w:noProof/>
+                <w:color w:val="auto"/>
+                <w:kern w:val="2"/>
+                <w:sz w:val="21"/>
+                <w:lang w:eastAsia="ja-JP"/>
+                <w14:ligatures w14:val="standardContextual"/>
+              </w:rPr>
+              <w:tab/>
+            </w:r>
+            <w:r>
+              <w:rPr>
+                <w:rStyle w:val="af1"/>
+                <w:noProof/>
+              </w:rPr>
+              <w:t xml:space="preserve">&lt;Appendix </w:t>
+            </w:r>
+            <w:r>
+              <w:rPr>
+                <w:rStyle w:val="af1"/>
+                <w:noProof/>
+                <w:lang w:eastAsia="ja-JP"/>
+              </w:rPr>
+              <w:t>にほんご</w:t>
+            </w:r>
+            <w:r>
+              <w:rPr>
+                <w:rStyle w:val="af1"/>
+                <w:noProof/>
+              </w:rPr>
+              <w:t>Title&gt;</w:t>
+            </w:r>
+            <w:r>
+              <w:rPr>
+                <w:noProof/>
+                <w:webHidden/>
+              </w:rPr>
+              <w:tab/>
+            </w:r>
+            <w:r>
+              <w:rPr>
+                <w:noProof/>
+                <w:webHidden/>
+              </w:rPr>
+              <w:fldChar w:fldCharType="begin"/>
+            </w:r>
+            <w:r>
+              <w:rPr>
+                <w:noProof/>
+                <w:webHidden/>
+              </w:rPr>
+              <w:instrText xml:space="preserve"> PAGEREF _Toc135490224 \h </w:instrText>
+            </w:r>
+            <w:r>
+              <w:rPr>
+                <w:noProof/>
+                <w:webHidden/>
+              </w:rPr>
+            </w:r>
+            <w:r>
+              <w:rPr>
+                <w:noProof/>
+                <w:webHidden/>
+              </w:rPr>
+              <w:fldChar w:fldCharType="separate"/>
+            </w:r>
+            <w:r>
+              <w:rPr>
+                <w:noProof/>
+                <w:webHidden/>
+              </w:rPr>
+              <w:t>5</w:t>
+            </w:r>
+            <w:r>
+              <w:rPr>
+                <w:noProof/>
+                <w:webHidden/>
+              </w:rPr>
+              <w:fldChar w:fldCharType="end"/>
+            </w:r>
+          </w:hyperlink>
         </w:p>
         <w:p>
           <w:pPr>
@@ -874,108 +804,98 @@
               <w14:ligatures w14:val="standardContextual"/>
             </w:rPr>
           </w:pPr>
-          <w:r>
-            <w:fldChar w:fldCharType="begin"/>
-          </w:r>
-          <w:r>
-            <w:instrText>HYPERLINK \l "_Toc135490225"</w:instrText>
-          </w:r>
-          <w:r>
-            <w:fldChar w:fldCharType="separate"/>
-          </w:r>
-          <w:r>
-            <w:rPr>
-              <w:rStyle w:val="af1"/>
-              <w:noProof/>
-            </w:rPr>
-            <w:t>A.1.</w:t>
-          </w:r>
-          <w:r>
-            <w:rPr>
-              <w:rFonts w:asciiTheme="minorHAnsi" w:eastAsiaTheme="minorEastAsia" w:hAnsiTheme="minorHAnsi" w:cstheme="minorBidi"/>
-              <w:bCs w:val="0"/>
-              <w:noProof/>
-              <w:kern w:val="2"/>
-              <w:sz w:val="21"/>
-              <w:szCs w:val="24"/>
-              <w:lang w:eastAsia="ja-JP"/>
-              <w14:ligatures w14:val="standardContextual"/>
-            </w:rPr>
-            <w:tab/>
-          </w:r>
-          <w:r>
-            <w:rPr>
-              <w:rStyle w:val="af1"/>
-              <w:noProof/>
-            </w:rPr>
-            <w:t xml:space="preserve">&lt;Appendix </w:t>
-          </w:r>
-          <w:r>
-            <w:rPr>
-              <w:rStyle w:val="af1"/>
-              <w:noProof/>
-              <w:lang w:eastAsia="ja-JP"/>
-            </w:rPr>
-            <w:t>にほんご</w:t>
-          </w:r>
-          <w:r>
-            <w:rPr>
-              <w:rStyle w:val="af1"/>
-              <w:noProof/>
-            </w:rPr>
-            <w:t>Subsection&gt;</w:t>
-          </w:r>
-          <w:r>
-            <w:rPr>
-              <w:noProof/>
-              <w:webHidden/>
-            </w:rPr>
-            <w:tab/>
-          </w:r>
-          <w:r>
-            <w:rPr>
-              <w:noProof/>
-              <w:webHidden/>
-            </w:rPr>
-            <w:fldChar w:fldCharType="begin"/>
-          </w:r>
-          <w:r>
-            <w:rPr>
-              <w:noProof/>
-              <w:webHidden/>
-            </w:rPr>
-            <w:instrText xml:space="preserve"> PAGEREF _Toc135490225 \h </w:instrText>
-          </w:r>
-          <w:r>
-            <w:rPr>
-              <w:noProof/>
-              <w:webHidden/>
-            </w:rPr>
-          </w:r>
-          <w:r>
-            <w:rPr>
-              <w:noProof/>
-              <w:webHidden/>
-            </w:rPr>
-            <w:fldChar w:fldCharType="separate"/>
-          </w:r>
-          <w:r>
-            <w:rPr>
-              <w:noProof/>
-              <w:webHidden/>
-            </w:rPr>
-            <w:t>5</w:t>
-          </w:r>
-          <w:r>
-            <w:rPr>
-              <w:noProof/>
-              <w:webHidden/>
-            </w:rPr>
-            <w:fldChar w:fldCharType="end"/>
-          </w:r>
-          <w:r>
-            <w:fldChar w:fldCharType="end"/>
-          </w:r>
+          <w:hyperlink w:anchor="_Toc135490225" w:history="1">
+            <w:r>
+              <w:rPr>
+                <w:rStyle w:val="af1"/>
+                <w:noProof/>
+              </w:rPr>
+              <w:t>A.1.</w:t>
+            </w:r>
+            <w:r>
+              <w:rPr>
+                <w:rFonts w:asciiTheme="minorHAnsi" w:eastAsiaTheme="minorEastAsia" w:hAnsiTheme="minorHAnsi" w:cstheme="minorBidi"/>
+                <w:bCs w:val="0"/>
+                <w:noProof/>
+                <w:kern w:val="2"/>
+                <w:sz w:val="21"/>
+                <w:szCs w:val="24"/>
+                <w:lang w:eastAsia="ja-JP"/>
+                <w14:ligatures w14:val="standardContextual"/>
+              </w:rPr>
+              <w:tab/>
+            </w:r>
+            <w:r>
+              <w:rPr>
+                <w:rStyle w:val="af1"/>
+                <w:noProof/>
+              </w:rPr>
+              <w:t xml:space="preserve">&lt;Appendix </w:t>
+            </w:r>
+            <w:r>
+              <w:rPr>
+                <w:rStyle w:val="af1"/>
+                <w:noProof/>
+                <w:lang w:eastAsia="ja-JP"/>
+              </w:rPr>
+              <w:t>にほんご</w:t>
+            </w:r>
+            <w:r>
+              <w:rPr>
+                <w:rStyle w:val="af1"/>
+                <w:noProof/>
+              </w:rPr>
+              <w:t>Subsection&gt;</w:t>
+            </w:r>
+            <w:r>
+              <w:rPr>
+                <w:noProof/>
+                <w:webHidden/>
+              </w:rPr>
+              <w:tab/>
+            </w:r>
+            <w:r>
+              <w:rPr>
+                <w:noProof/>
+                <w:webHidden/>
+              </w:rPr>
+              <w:fldChar w:fldCharType="begin"/>
+            </w:r>
+            <w:r>
+              <w:rPr>
+                <w:noProof/>
+                <w:webHidden/>
+              </w:rPr>
+              <w:instrText xml:space="preserve"> PAGEREF _Toc135490225 \h </w:instrText>
+            </w:r>
+            <w:r>
+              <w:rPr>
+                <w:noProof/>
+                <w:webHidden/>
+              </w:rPr>
+            </w:r>
+            <w:r>
+              <w:rPr>
+                <w:noProof/>
+                <w:webHidden/>
+              </w:rPr>
+              <w:fldChar w:fldCharType="separate"/>
+            </w:r>
+            <w:r>
+              <w:rPr>
+                <w:noProof/>
+                <w:webHidden/>
+              </w:rPr>
+              <w:t>5</w:t>
+            </w:r>
+            <w:r>
+              <w:rPr>
+                <w:noProof/>
+                <w:webHidden/>
+              </w:rPr>
+              <w:fldChar w:fldCharType="end"/>
+            </w:r>
+          </w:hyperlink>
         </w:p>
         <w:p>
           <w:pPr>
@@ -994,107 +914,97 @@
               <w14:ligatures w14:val="standardContextual"/>
             </w:rPr>
           </w:pPr>
-          <w:r>
-            <w:fldChar w:fldCharType="begin"/>
-          </w:r>
-          <w:r>
-            <w:instrText>HYPERLINK \l "_Toc135490226"</w:instrText>
-          </w:r>
-          <w:r>
-            <w:fldChar w:fldCharType="separate"/>
-          </w:r>
-          <w:r>
-            <w:rPr>
-              <w:rStyle w:val="af1"/>
-              <w:noProof/>
-            </w:rPr>
-            <w:t>A.1.1</w:t>
-          </w:r>
-          <w:r>
-            <w:rPr>
-              <w:rFonts w:asciiTheme="minorHAnsi" w:eastAsiaTheme="minorEastAsia" w:hAnsiTheme="minorHAnsi" w:cstheme="minorBidi"/>
-              <w:noProof/>
-              <w:kern w:val="2"/>
-              <w:sz w:val="21"/>
-              <w:szCs w:val="24"/>
-              <w:lang w:eastAsia="ja-JP"/>
-              <w14:ligatures w14:val="standardContextual"/>
-            </w:rPr>
-            <w:tab/>
-          </w:r>
-          <w:r>
-            <w:rPr>
-              <w:rStyle w:val="af1"/>
-              <w:noProof/>
-            </w:rPr>
-            <w:t xml:space="preserve">&lt;Appendix </w:t>
-          </w:r>
-          <w:r>
-            <w:rPr>
-              <w:rStyle w:val="af1"/>
-              <w:noProof/>
-              <w:lang w:eastAsia="ja-JP"/>
-            </w:rPr>
-            <w:t>にほんご</w:t>
-          </w:r>
-          <w:r>
-            <w:rPr>
-              <w:rStyle w:val="af1"/>
-              <w:noProof/>
-            </w:rPr>
-            <w:t>Heading 3&gt;</w:t>
-          </w:r>
-          <w:r>
-            <w:rPr>
-              <w:noProof/>
-              <w:webHidden/>
-            </w:rPr>
-            <w:tab/>
-          </w:r>
-          <w:r>
-            <w:rPr>
-              <w:noProof/>
-              <w:webHidden/>
-            </w:rPr>
-            <w:fldChar w:fldCharType="begin"/>
-          </w:r>
-          <w:r>
-            <w:rPr>
-              <w:noProof/>
-              <w:webHidden/>
-            </w:rPr>
-            <w:instrText xml:space="preserve"> PAGEREF _Toc135490226 \h </w:instrText>
-          </w:r>
-          <w:r>
-            <w:rPr>
-              <w:noProof/>
-              <w:webHidden/>
-            </w:rPr>
-          </w:r>
-          <w:r>
-            <w:rPr>
-              <w:noProof/>
-              <w:webHidden/>
-            </w:rPr>
-            <w:fldChar w:fldCharType="separate"/>
-          </w:r>
-          <w:r>
-            <w:rPr>
-              <w:noProof/>
-              <w:webHidden/>
-            </w:rPr>
-            <w:t>5</w:t>
-          </w:r>
-          <w:r>
-            <w:rPr>
-              <w:noProof/>
-              <w:webHidden/>
-            </w:rPr>
-            <w:fldChar w:fldCharType="end"/>
-          </w:r>
-          <w:r>
-            <w:fldChar w:fldCharType="end"/>
-          </w:r>
+          <w:hyperlink w:anchor="_Toc135490226" w:history="1">
+            <w:r>
+              <w:rPr>
+                <w:rStyle w:val="af1"/>
+                <w:noProof/>
+              </w:rPr>
+              <w:t>A.1.1</w:t>
+            </w:r>
+            <w:r>
+              <w:rPr>
+                <w:rFonts w:asciiTheme="minorHAnsi" w:eastAsiaTheme="minorEastAsia" w:hAnsiTheme="minorHAnsi" w:cstheme="minorBidi"/>
+                <w:noProof/>
+                <w:kern w:val="2"/>
+                <w:sz w:val="21"/>
+                <w:szCs w:val="24"/>
+                <w:lang w:eastAsia="ja-JP"/>
+                <w14:ligatures w14:val="standardContextual"/>
+              </w:rPr>
+              <w:tab/>
+            </w:r>
+            <w:r>
+              <w:rPr>
+                <w:rStyle w:val="af1"/>
+                <w:noProof/>
+              </w:rPr>
+              <w:t xml:space="preserve">&lt;Appendix </w:t>
+            </w:r>
+            <w:r>
+              <w:rPr>
+                <w:rStyle w:val="af1"/>
+                <w:noProof/>
+                <w:lang w:eastAsia="ja-JP"/>
+              </w:rPr>
+              <w:t>にほんご</w:t>
+            </w:r>
+            <w:r>
+              <w:rPr>
+                <w:rStyle w:val="af1"/>
+                <w:noProof/>
+              </w:rPr>
+              <w:t>Heading 3&gt;</w:t>
+            </w:r>
+            <w:r>
+              <w:rPr>
+                <w:noProof/>
+                <w:webHidden/>
+              </w:rPr>
+              <w:tab/>
+            </w:r>
+            <w:r>
+              <w:rPr>
+                <w:noProof/>
+                <w:webHidden/>
+              </w:rPr>
+              <w:fldChar w:fldCharType="begin"/>
+            </w:r>
+            <w:r>
+              <w:rPr>
+                <w:noProof/>
+                <w:webHidden/>
+              </w:rPr>
+              <w:instrText xml:space="preserve"> PAGEREF _Toc135490226 \h </w:instrText>
+            </w:r>
+            <w:r>
+              <w:rPr>
+                <w:noProof/>
+                <w:webHidden/>
+              </w:rPr>
+            </w:r>
+            <w:r>
+              <w:rPr>
+                <w:noProof/>
+                <w:webHidden/>
+              </w:rPr>
+              <w:fldChar w:fldCharType="separate"/>
+            </w:r>
+            <w:r>
+              <w:rPr>
+                <w:noProof/>
+                <w:webHidden/>
+              </w:rPr>
+              <w:t>5</w:t>
+            </w:r>
+            <w:r>
+              <w:rPr>
+                <w:noProof/>
+                <w:webHidden/>
+              </w:rPr>
+              <w:fldChar w:fldCharType="end"/>
+            </w:r>
+          </w:hyperlink>
         </w:p>
         <w:p>
           <w:r>
@@ -4834,25 +4744,14 @@
       <w:pPr>
         <w:pStyle w:val="a1"/>
       </w:pPr>
-      <w:r>
-        <w:lastRenderedPageBreak/>
-        <w:fldChar w:fldCharType="begin"/>
-      </w:r>
-      <w:r>
-        <w:instrText>HYPERLINK "https://google.com" \h</w:instrText>
-      </w:r>
-      <w:r>
-        <w:fldChar w:fldCharType="separate"/>
-      </w:r>
-      <w:r>
-        <w:rPr>
-          <w:rStyle w:val="af1"/>
-        </w:rPr>
-        <w:t>Link</w:t>
-      </w:r>
-      <w:r>
-        <w:fldChar w:fldCharType="end"/>
-      </w:r>
+      <w:hyperlink r:id="rId7">
+        <w:r>
+          <w:rPr>
+            <w:rStyle w:val="af1"/>
+          </w:rPr>
+          <w:t>Link</w:t>
+        </w:r>
+      </w:hyperlink>
     </w:p>
     <w:p>
       <w:pPr>
@@ -5051,7 +4950,7 @@
                     </pic:cNvPicPr>
                   </pic:nvPicPr>
                   <pic:blipFill>
-                    <a:blip r:embed="rId7"/>
+                    <a:blip r:embed="rId8"/>
                     <a:stretch>
                       <a:fillRect/>
                     </a:stretch>
@@ -5094,23 +4993,18 @@
       </w:r>
     </w:p>
     <w:sectPr>
-      <w:headerReference w:type="even" r:id="rId8"/>
-      <w:headerReference w:type="default" r:id="rId9"/>
-      <w:footerReference w:type="even" r:id="rId10"/>
-      <w:footerReference w:type="default" r:id="rId11"/>
-      <w:headerReference w:type="first" r:id="rId12"/>
-      <w:footerReference w:type="first" r:id="rId13"/>
+      <w:headerReference w:type="even" r:id="rId9"/>
+      <w:headerReference w:type="default" r:id="rId10"/>
+      <w:footerReference w:type="even" r:id="rId11"/>
+      <w:footerReference w:type="default" r:id="rId12"/>
+      <w:headerReference w:type="first" r:id="rId13"/>
+      <w:footerReference w:type="first" r:id="rId14"/>
       <w:pgSz w:w="10318" w:h="14570" w:code="13"/>
       <w:pgMar w:top="720" w:right="720" w:bottom="720" w:left="720" w:header="851" w:footer="992" w:gutter="0"/>
       <w:pgNumType w:start="0"/>
       <w:cols w:space="425"/>
       <w:titlePg/>
       <w:docGrid w:linePitch="300" w:charSpace="-4333"/>
-      <w:sectPrChange w:id="31" w:author="Kazuki Yamamoto" w:date="2025-08-09T14:25:00Z" w16du:dateUtc="2025-08-09T05:25:00Z">
-        <w:sectPr>
-          <w:pgMar w:top="1440" w:right="1080" w:bottom="1440" w:left="1080" w:header="851" w:footer="992" w:gutter="0"/>
-        </w:sectPr>
-      </w:sectPrChange>
     </w:sectPr>
   </w:body>
 </w:document>

</xml_diff>

<commit_message>
update system/ref.docx - fix listing styles
</commit_message>
<xml_diff>
--- a/system/ref.docx
+++ b/system/ref.docx
@@ -105,7 +105,8 @@
           <w:bCs w:val="0"/>
           <w:i w:val="0"/>
           <w:iCs w:val="0"/>
-          <w:szCs w:val="20"/>
+          <w:sz w:val="18"/>
+          <w:szCs w:val="18"/>
         </w:rPr>
       </w:sdtEndPr>
       <w:sdtContent>
@@ -206,7 +207,7 @@
         </w:p>
         <w:p>
           <w:pPr>
-            <w:pStyle w:val="26"/>
+            <w:pStyle w:val="27"/>
             <w:tabs>
               <w:tab w:val="right" w:leader="dot" w:pos="8148"/>
             </w:tabs>
@@ -281,7 +282,7 @@
         </w:p>
         <w:p>
           <w:pPr>
-            <w:pStyle w:val="32"/>
+            <w:pStyle w:val="33"/>
             <w:tabs>
               <w:tab w:val="right" w:leader="dot" w:pos="8148"/>
             </w:tabs>
@@ -460,7 +461,7 @@
         </w:p>
         <w:p>
           <w:pPr>
-            <w:pStyle w:val="26"/>
+            <w:pStyle w:val="27"/>
             <w:tabs>
               <w:tab w:val="left" w:pos="800"/>
               <w:tab w:val="right" w:leader="dot" w:pos="8148"/>
@@ -571,7 +572,7 @@
         </w:p>
         <w:p>
           <w:pPr>
-            <w:pStyle w:val="32"/>
+            <w:pStyle w:val="33"/>
             <w:tabs>
               <w:tab w:val="left" w:pos="1200"/>
               <w:tab w:val="right" w:leader="dot" w:pos="8148"/>
@@ -788,7 +789,7 @@
         </w:p>
         <w:p>
           <w:pPr>
-            <w:pStyle w:val="26"/>
+            <w:pStyle w:val="27"/>
             <w:tabs>
               <w:tab w:val="left" w:pos="800"/>
               <w:tab w:val="right" w:leader="dot" w:pos="8148"/>
@@ -899,7 +900,7 @@
         </w:p>
         <w:p>
           <w:pPr>
-            <w:pStyle w:val="32"/>
+            <w:pStyle w:val="33"/>
             <w:tabs>
               <w:tab w:val="left" w:pos="1200"/>
               <w:tab w:val="right" w:leader="dot" w:pos="8148"/>
@@ -1147,7 +1148,7 @@
     </w:p>
     <w:p>
       <w:pPr>
-        <w:pStyle w:val="30"/>
+        <w:pStyle w:val="31"/>
       </w:pPr>
       <w:bookmarkStart w:id="11" w:name="heading-3"/>
       <w:bookmarkStart w:id="12" w:name="_Toc135490223"/>
@@ -1169,7 +1170,7 @@
     </w:p>
     <w:p>
       <w:pPr>
-        <w:pStyle w:val="4"/>
+        <w:pStyle w:val="40"/>
       </w:pPr>
       <w:bookmarkStart w:id="13" w:name="heading-4"/>
       <w:r>
@@ -1731,43 +1732,68 @@
     </w:p>
     <w:p>
       <w:pPr>
-        <w:pStyle w:val="a1"/>
-      </w:pPr>
-      <w:r>
-        <w:br/>
+        <w:pStyle w:val="BulletList3"/>
+      </w:pPr>
+      <w:r>
+        <w:t xml:space="preserve">&lt;Bullet </w:t>
+      </w:r>
+      <w:r>
+        <w:rPr>
+          <w:rFonts w:hint="eastAsia"/>
+          <w:lang w:eastAsia="ja-JP"/>
+        </w:rPr>
+        <w:t>にほんご</w:t>
+      </w:r>
+      <w:r>
+        <w:t xml:space="preserve">List </w:t>
+      </w:r>
+      <w:r>
+        <w:rPr>
+          <w:rFonts w:hint="eastAsia"/>
+          <w:lang w:eastAsia="ja-JP"/>
+        </w:rPr>
+        <w:t>３</w:t>
+      </w:r>
+      <w:r>
+        <w:t>&gt;</w:t>
       </w:r>
     </w:p>
     <w:p>
       <w:pPr>
-        <w:pStyle w:val="FeatureList1"/>
-      </w:pPr>
-      <w:r>
-        <w:t>&lt;Feature List 1&gt;</w:t>
+        <w:pStyle w:val="a1"/>
+      </w:pPr>
+      <w:r>
+        <w:br/>
       </w:r>
     </w:p>
     <w:p>
       <w:pPr>
-        <w:pStyle w:val="FeatureList2"/>
-      </w:pPr>
-      <w:r>
-        <w:t>&lt;Feature List 2&gt;</w:t>
+        <w:pStyle w:val="FeatureList1"/>
+      </w:pPr>
+      <w:r>
+        <w:t>&lt;Feature List 1&gt;</w:t>
       </w:r>
     </w:p>
     <w:p>
       <w:pPr>
-        <w:pStyle w:val="a1"/>
-      </w:pPr>
-      <w:r>
-        <w:br/>
+        <w:pStyle w:val="FeatureList2"/>
+      </w:pPr>
+      <w:r>
+        <w:t>&lt;Feature List 2&gt;</w:t>
       </w:r>
     </w:p>
     <w:p>
       <w:pPr>
+        <w:pStyle w:val="a1"/>
+      </w:pPr>
+      <w:r>
+        <w:br/>
+      </w:r>
+    </w:p>
+    <w:p>
+      <w:pPr>
         <w:spacing w:after="160" w:line="259" w:lineRule="auto"/>
         <w:contextualSpacing w:val="0"/>
-        <w:rPr>
-          <w:sz w:val="18"/>
-        </w:rPr>
       </w:pPr>
       <w:r>
         <w:br w:type="page"/>
@@ -1784,19 +1810,34 @@
     </w:p>
     <w:p>
       <w:pPr>
-        <w:pStyle w:val="NumberedList2"/>
-      </w:pPr>
-      <w:r>
-        <w:t>&lt;Numbered List 2&gt;</w:t>
-      </w:r>
+        <w:pStyle w:val="BulletList1"/>
+      </w:pPr>
     </w:p>
     <w:p>
       <w:pPr>
+        <w:pStyle w:val="NumberedList2"/>
+      </w:pPr>
+      <w:r>
+        <w:t>&lt;Numbered List 2&gt;</w:t>
+      </w:r>
+    </w:p>
+    <w:p>
+      <w:pPr>
+        <w:pStyle w:val="BulletList2"/>
+      </w:pPr>
+    </w:p>
+    <w:p>
+      <w:pPr>
         <w:pStyle w:val="NumberedList3"/>
       </w:pPr>
       <w:r>
         <w:t>&lt;Numbered List 3&gt;</w:t>
       </w:r>
+    </w:p>
+    <w:p>
+      <w:pPr>
+        <w:pStyle w:val="BulletList3"/>
+      </w:pPr>
     </w:p>
     <w:p>
       <w:pPr>
@@ -4058,16 +4099,16 @@
         <w:rPr>
           <w:rStyle w:val="CommentTok"/>
         </w:rPr>
+        <w:t>https://packaging.python.org/en/latest/distributing.html</w:t>
+      </w:r>
+      <w:r>
+        <w:br/>
+      </w:r>
+      <w:r>
+        <w:rPr>
+          <w:rStyle w:val="CommentTok"/>
+        </w:rPr>
         <w:lastRenderedPageBreak/>
-        <w:t>https://packaging.python.org/en/latest/distributing.html</w:t>
-      </w:r>
-      <w:r>
-        <w:br/>
-      </w:r>
-      <w:r>
-        <w:rPr>
-          <w:rStyle w:val="CommentTok"/>
-        </w:rPr>
         <w:t>https://github.com/pypa/sampleproject</w:t>
       </w:r>
       <w:r>
@@ -5134,7 +5175,7 @@
         <w:noProof/>
         <w:color w:val="0F243E" w:themeColor="text2" w:themeShade="80"/>
       </w:rPr>
-      <w:instrText>1</w:instrText>
+      <w:instrText>5</w:instrText>
     </w:r>
     <w:r>
       <w:rPr>
@@ -5163,7 +5204,7 @@
         <w:noProof/>
         <w:color w:val="0F243E" w:themeColor="text2" w:themeShade="80"/>
       </w:rPr>
-      <w:t>1</w:t>
+      <w:t>5</w:t>
     </w:r>
     <w:r>
       <w:rPr>
@@ -5201,24 +5242,9 @@
         <w:right w:w="99" w:type="dxa"/>
       </w:tblCellMar>
       <w:tblLook w:val="0000" w:firstRow="0" w:lastRow="0" w:firstColumn="0" w:lastColumn="0" w:noHBand="0" w:noVBand="0"/>
-      <w:tblPrChange w:id="25" w:author="Kazuki Yamamoto" w:date="2025-08-09T14:26:00Z" w16du:dateUtc="2025-08-09T05:26:00Z">
-        <w:tblPr>
-          <w:tblW w:w="0" w:type="auto"/>
-          <w:tblCellMar>
-            <w:left w:w="99" w:type="dxa"/>
-            <w:right w:w="99" w:type="dxa"/>
-          </w:tblCellMar>
-          <w:tblLook w:val="0000" w:firstRow="0" w:lastRow="0" w:firstColumn="0" w:lastColumn="0" w:noHBand="0" w:noVBand="0"/>
-        </w:tblPr>
-      </w:tblPrChange>
     </w:tblPr>
     <w:tblGrid>
       <w:gridCol w:w="8356"/>
-      <w:tblGridChange w:id="26">
-        <w:tblGrid>
-          <w:gridCol w:w="8356"/>
-        </w:tblGrid>
-      </w:tblGridChange>
     </w:tblGrid>
     <w:tr>
       <w:trPr>
@@ -5228,12 +5254,6 @@
         <w:tcPr>
           <w:tcW w:w="8356" w:type="dxa"/>
           <w:vAlign w:val="center"/>
-          <w:tcPrChange w:id="27" w:author="Kazuki Yamamoto" w:date="2025-08-09T14:26:00Z" w16du:dateUtc="2025-08-09T05:26:00Z">
-            <w:tcPr>
-              <w:tcW w:w="8356" w:type="dxa"/>
-              <w:vAlign w:val="center"/>
-            </w:tcPr>
-          </w:tcPrChange>
         </w:tcPr>
         <w:p>
           <w:pPr>
@@ -5250,12 +5270,6 @@
         <w:tcPr>
           <w:tcW w:w="8356" w:type="dxa"/>
           <w:vAlign w:val="center"/>
-          <w:tcPrChange w:id="28" w:author="Kazuki Yamamoto" w:date="2025-08-09T14:26:00Z" w16du:dateUtc="2025-08-09T05:26:00Z">
-            <w:tcPr>
-              <w:tcW w:w="8356" w:type="dxa"/>
-              <w:vAlign w:val="center"/>
-            </w:tcPr>
-          </w:tcPrChange>
         </w:tcPr>
         <w:p>
           <w:pPr>
@@ -5272,12 +5286,6 @@
         <w:tcPr>
           <w:tcW w:w="8356" w:type="dxa"/>
           <w:vAlign w:val="center"/>
-          <w:tcPrChange w:id="29" w:author="Kazuki Yamamoto" w:date="2025-08-09T14:26:00Z" w16du:dateUtc="2025-08-09T05:26:00Z">
-            <w:tcPr>
-              <w:tcW w:w="8356" w:type="dxa"/>
-              <w:vAlign w:val="center"/>
-            </w:tcPr>
-          </w:tcPrChange>
         </w:tcPr>
         <w:p>
           <w:pPr>
@@ -5294,12 +5302,6 @@
         <w:tcPr>
           <w:tcW w:w="8356" w:type="dxa"/>
           <w:vAlign w:val="center"/>
-          <w:tcPrChange w:id="30" w:author="Kazuki Yamamoto" w:date="2025-08-09T14:26:00Z" w16du:dateUtc="2025-08-09T05:26:00Z">
-            <w:tcPr>
-              <w:tcW w:w="8356" w:type="dxa"/>
-              <w:vAlign w:val="center"/>
-            </w:tcPr>
-          </w:tcPrChange>
         </w:tcPr>
         <w:p>
           <w:pPr>
@@ -5611,7 +5613,7 @@
   <w:abstractNum w:abstractNumId="5" w15:restartNumberingAfterBreak="0">
     <w:nsid w:val="FFFFFF81"/>
     <w:multiLevelType w:val="singleLevel"/>
-    <w:tmpl w:val="CE90E92A"/>
+    <w:tmpl w:val="D69E225A"/>
     <w:lvl w:ilvl="0">
       <w:start w:val="1"/>
       <w:numFmt w:val="bullet"/>
@@ -5631,7 +5633,7 @@
   <w:abstractNum w:abstractNumId="6" w15:restartNumberingAfterBreak="0">
     <w:nsid w:val="FFFFFF82"/>
     <w:multiLevelType w:val="singleLevel"/>
-    <w:tmpl w:val="982EB404"/>
+    <w:tmpl w:val="798A2C08"/>
     <w:lvl w:ilvl="0">
       <w:start w:val="1"/>
       <w:numFmt w:val="bullet"/>
@@ -5652,7 +5654,7 @@
   <w:abstractNum w:abstractNumId="7" w15:restartNumberingAfterBreak="0">
     <w:nsid w:val="FFFFFF83"/>
     <w:multiLevelType w:val="singleLevel"/>
-    <w:tmpl w:val="69A670D6"/>
+    <w:tmpl w:val="2DB868E0"/>
     <w:lvl w:ilvl="0">
       <w:start w:val="1"/>
       <w:numFmt w:val="bullet"/>
@@ -5709,6 +5711,120 @@
     </w:lvl>
   </w:abstractNum>
   <w:abstractNum w:abstractNumId="10" w15:restartNumberingAfterBreak="0">
+    <w:nsid w:val="0A9643E0"/>
+    <w:multiLevelType w:val="multilevel"/>
+    <w:tmpl w:val="1E5CF244"/>
+    <w:styleLink w:val="30"/>
+    <w:lvl w:ilvl="0">
+      <w:start w:val="1"/>
+      <w:numFmt w:val="bullet"/>
+      <w:lvlText w:val=""/>
+      <w:lvlJc w:val="left"/>
+      <w:pPr>
+        <w:ind w:left="420" w:hanging="420"/>
+      </w:pPr>
+      <w:rPr>
+        <w:rFonts w:ascii="Wingdings" w:hAnsi="Wingdings" w:hint="default"/>
+      </w:rPr>
+    </w:lvl>
+    <w:lvl w:ilvl="1">
+      <w:start w:val="1"/>
+      <w:numFmt w:val="bullet"/>
+      <w:lvlText w:val=""/>
+      <w:lvlJc w:val="left"/>
+      <w:pPr>
+        <w:ind w:left="840" w:hanging="420"/>
+      </w:pPr>
+      <w:rPr>
+        <w:rFonts w:ascii="Wingdings" w:hAnsi="Wingdings" w:hint="default"/>
+      </w:rPr>
+    </w:lvl>
+    <w:lvl w:ilvl="2">
+      <w:start w:val="1"/>
+      <w:numFmt w:val="bullet"/>
+      <w:lvlText w:val=""/>
+      <w:lvlJc w:val="left"/>
+      <w:pPr>
+        <w:ind w:left="1260" w:hanging="420"/>
+      </w:pPr>
+      <w:rPr>
+        <w:rFonts w:ascii="Wingdings" w:hAnsi="Wingdings" w:hint="default"/>
+      </w:rPr>
+    </w:lvl>
+    <w:lvl w:ilvl="3">
+      <w:start w:val="1"/>
+      <w:numFmt w:val="bullet"/>
+      <w:lvlText w:val=""/>
+      <w:lvlJc w:val="left"/>
+      <w:pPr>
+        <w:ind w:left="1680" w:hanging="420"/>
+      </w:pPr>
+      <w:rPr>
+        <w:rFonts w:ascii="Wingdings" w:hAnsi="Wingdings" w:hint="default"/>
+      </w:rPr>
+    </w:lvl>
+    <w:lvl w:ilvl="4">
+      <w:start w:val="1"/>
+      <w:numFmt w:val="bullet"/>
+      <w:lvlText w:val=""/>
+      <w:lvlJc w:val="left"/>
+      <w:pPr>
+        <w:ind w:left="2100" w:hanging="420"/>
+      </w:pPr>
+      <w:rPr>
+        <w:rFonts w:ascii="Wingdings" w:hAnsi="Wingdings" w:hint="default"/>
+      </w:rPr>
+    </w:lvl>
+    <w:lvl w:ilvl="5">
+      <w:start w:val="1"/>
+      <w:numFmt w:val="bullet"/>
+      <w:lvlText w:val=""/>
+      <w:lvlJc w:val="left"/>
+      <w:pPr>
+        <w:ind w:left="2520" w:hanging="420"/>
+      </w:pPr>
+      <w:rPr>
+        <w:rFonts w:ascii="Wingdings" w:hAnsi="Wingdings" w:hint="default"/>
+      </w:rPr>
+    </w:lvl>
+    <w:lvl w:ilvl="6">
+      <w:start w:val="1"/>
+      <w:numFmt w:val="bullet"/>
+      <w:lvlText w:val=""/>
+      <w:lvlJc w:val="left"/>
+      <w:pPr>
+        <w:ind w:left="2940" w:hanging="420"/>
+      </w:pPr>
+      <w:rPr>
+        <w:rFonts w:ascii="Wingdings" w:hAnsi="Wingdings" w:hint="default"/>
+      </w:rPr>
+    </w:lvl>
+    <w:lvl w:ilvl="7">
+      <w:start w:val="1"/>
+      <w:numFmt w:val="bullet"/>
+      <w:lvlText w:val=""/>
+      <w:lvlJc w:val="left"/>
+      <w:pPr>
+        <w:ind w:left="3360" w:hanging="420"/>
+      </w:pPr>
+      <w:rPr>
+        <w:rFonts w:ascii="Wingdings" w:hAnsi="Wingdings" w:hint="default"/>
+      </w:rPr>
+    </w:lvl>
+    <w:lvl w:ilvl="8">
+      <w:start w:val="1"/>
+      <w:numFmt w:val="bullet"/>
+      <w:lvlText w:val=""/>
+      <w:lvlJc w:val="left"/>
+      <w:pPr>
+        <w:ind w:left="3780" w:hanging="420"/>
+      </w:pPr>
+      <w:rPr>
+        <w:rFonts w:ascii="Wingdings" w:hAnsi="Wingdings" w:hint="default"/>
+      </w:rPr>
+    </w:lvl>
+  </w:abstractNum>
+  <w:abstractNum w:abstractNumId="11" w15:restartNumberingAfterBreak="0">
     <w:nsid w:val="0A97650B"/>
     <w:multiLevelType w:val="multilevel"/>
     <w:tmpl w:val="58A2ACAA"/>
@@ -5822,7 +5938,94 @@
       </w:rPr>
     </w:lvl>
   </w:abstractNum>
-  <w:abstractNum w:abstractNumId="11" w15:restartNumberingAfterBreak="0">
+  <w:abstractNum w:abstractNumId="12" w15:restartNumberingAfterBreak="0">
+    <w:nsid w:val="0F473F09"/>
+    <w:multiLevelType w:val="hybridMultilevel"/>
+    <w:tmpl w:val="F7C838E0"/>
+    <w:lvl w:ilvl="0" w:tplc="F830F8AC">
+      <w:start w:val="1"/>
+      <w:numFmt w:val="decimal"/>
+      <w:pStyle w:val="NumberedList1"/>
+      <w:lvlText w:val="%1."/>
+      <w:lvlJc w:val="left"/>
+      <w:pPr>
+        <w:ind w:left="440" w:hanging="440"/>
+      </w:pPr>
+    </w:lvl>
+    <w:lvl w:ilvl="1" w:tplc="04090017" w:tentative="1">
+      <w:start w:val="1"/>
+      <w:numFmt w:val="aiueoFullWidth"/>
+      <w:lvlText w:val="(%2)"/>
+      <w:lvlJc w:val="left"/>
+      <w:pPr>
+        <w:ind w:left="880" w:hanging="440"/>
+      </w:pPr>
+    </w:lvl>
+    <w:lvl w:ilvl="2" w:tplc="04090011" w:tentative="1">
+      <w:start w:val="1"/>
+      <w:numFmt w:val="decimalEnclosedCircle"/>
+      <w:lvlText w:val="%3"/>
+      <w:lvlJc w:val="left"/>
+      <w:pPr>
+        <w:ind w:left="1320" w:hanging="440"/>
+      </w:pPr>
+    </w:lvl>
+    <w:lvl w:ilvl="3" w:tplc="0409000F" w:tentative="1">
+      <w:start w:val="1"/>
+      <w:numFmt w:val="decimal"/>
+      <w:lvlText w:val="%4."/>
+      <w:lvlJc w:val="left"/>
+      <w:pPr>
+        <w:ind w:left="1760" w:hanging="440"/>
+      </w:pPr>
+    </w:lvl>
+    <w:lvl w:ilvl="4" w:tplc="04090017" w:tentative="1">
+      <w:start w:val="1"/>
+      <w:numFmt w:val="aiueoFullWidth"/>
+      <w:lvlText w:val="(%5)"/>
+      <w:lvlJc w:val="left"/>
+      <w:pPr>
+        <w:ind w:left="2200" w:hanging="440"/>
+      </w:pPr>
+    </w:lvl>
+    <w:lvl w:ilvl="5" w:tplc="04090011" w:tentative="1">
+      <w:start w:val="1"/>
+      <w:numFmt w:val="decimalEnclosedCircle"/>
+      <w:lvlText w:val="%6"/>
+      <w:lvlJc w:val="left"/>
+      <w:pPr>
+        <w:ind w:left="2640" w:hanging="440"/>
+      </w:pPr>
+    </w:lvl>
+    <w:lvl w:ilvl="6" w:tplc="0409000F" w:tentative="1">
+      <w:start w:val="1"/>
+      <w:numFmt w:val="decimal"/>
+      <w:lvlText w:val="%7."/>
+      <w:lvlJc w:val="left"/>
+      <w:pPr>
+        <w:ind w:left="3080" w:hanging="440"/>
+      </w:pPr>
+    </w:lvl>
+    <w:lvl w:ilvl="7" w:tplc="04090017" w:tentative="1">
+      <w:start w:val="1"/>
+      <w:numFmt w:val="aiueoFullWidth"/>
+      <w:lvlText w:val="(%8)"/>
+      <w:lvlJc w:val="left"/>
+      <w:pPr>
+        <w:ind w:left="3520" w:hanging="440"/>
+      </w:pPr>
+    </w:lvl>
+    <w:lvl w:ilvl="8" w:tplc="04090011" w:tentative="1">
+      <w:start w:val="1"/>
+      <w:numFmt w:val="decimalEnclosedCircle"/>
+      <w:lvlText w:val="%9"/>
+      <w:lvlJc w:val="left"/>
+      <w:pPr>
+        <w:ind w:left="3960" w:hanging="440"/>
+      </w:pPr>
+    </w:lvl>
+  </w:abstractNum>
+  <w:abstractNum w:abstractNumId="13" w15:restartNumberingAfterBreak="0">
     <w:nsid w:val="12296B79"/>
     <w:multiLevelType w:val="multilevel"/>
     <w:tmpl w:val="FAA2DEE0"/>
@@ -5936,7 +6139,7 @@
       </w:rPr>
     </w:lvl>
   </w:abstractNum>
-  <w:abstractNum w:abstractNumId="12" w15:restartNumberingAfterBreak="0">
+  <w:abstractNum w:abstractNumId="14" w15:restartNumberingAfterBreak="0">
     <w:nsid w:val="1482775B"/>
     <w:multiLevelType w:val="multilevel"/>
     <w:tmpl w:val="CA30452E"/>
@@ -5963,7 +6166,7 @@
     <w:lvl w:ilvl="2">
       <w:start w:val="1"/>
       <w:numFmt w:val="decimal"/>
-      <w:pStyle w:val="30"/>
+      <w:pStyle w:val="31"/>
       <w:lvlText w:val="%1.%2.%3"/>
       <w:lvlJc w:val="left"/>
       <w:pPr>
@@ -6029,7 +6232,7 @@
       </w:pPr>
     </w:lvl>
   </w:abstractNum>
-  <w:abstractNum w:abstractNumId="13" w15:restartNumberingAfterBreak="0">
+  <w:abstractNum w:abstractNumId="15" w15:restartNumberingAfterBreak="0">
     <w:nsid w:val="169059F6"/>
     <w:multiLevelType w:val="multilevel"/>
     <w:tmpl w:val="8E524998"/>
@@ -6143,7 +6346,121 @@
       </w:rPr>
     </w:lvl>
   </w:abstractNum>
-  <w:abstractNum w:abstractNumId="14" w15:restartNumberingAfterBreak="0">
+  <w:abstractNum w:abstractNumId="16" w15:restartNumberingAfterBreak="0">
+    <w:nsid w:val="20731ECC"/>
+    <w:multiLevelType w:val="multilevel"/>
+    <w:tmpl w:val="55DC64C2"/>
+    <w:styleLink w:val="21"/>
+    <w:lvl w:ilvl="0">
+      <w:start w:val="1"/>
+      <w:numFmt w:val="bullet"/>
+      <w:lvlText w:val=""/>
+      <w:lvlJc w:val="left"/>
+      <w:pPr>
+        <w:ind w:left="440" w:hanging="440"/>
+      </w:pPr>
+      <w:rPr>
+        <w:rFonts w:ascii="Wingdings" w:hAnsi="Wingdings" w:hint="default"/>
+      </w:rPr>
+    </w:lvl>
+    <w:lvl w:ilvl="1">
+      <w:start w:val="1"/>
+      <w:numFmt w:val="bullet"/>
+      <w:lvlText w:val=""/>
+      <w:lvlJc w:val="left"/>
+      <w:pPr>
+        <w:ind w:left="880" w:hanging="440"/>
+      </w:pPr>
+      <w:rPr>
+        <w:rFonts w:ascii="Wingdings" w:hAnsi="Wingdings" w:hint="default"/>
+      </w:rPr>
+    </w:lvl>
+    <w:lvl w:ilvl="2">
+      <w:start w:val="1"/>
+      <w:numFmt w:val="bullet"/>
+      <w:lvlText w:val=""/>
+      <w:lvlJc w:val="left"/>
+      <w:pPr>
+        <w:ind w:left="1320" w:hanging="440"/>
+      </w:pPr>
+      <w:rPr>
+        <w:rFonts w:ascii="Wingdings" w:hAnsi="Wingdings" w:hint="default"/>
+      </w:rPr>
+    </w:lvl>
+    <w:lvl w:ilvl="3">
+      <w:start w:val="1"/>
+      <w:numFmt w:val="bullet"/>
+      <w:lvlText w:val=""/>
+      <w:lvlJc w:val="left"/>
+      <w:pPr>
+        <w:ind w:left="1760" w:hanging="440"/>
+      </w:pPr>
+      <w:rPr>
+        <w:rFonts w:ascii="Wingdings" w:hAnsi="Wingdings" w:hint="default"/>
+      </w:rPr>
+    </w:lvl>
+    <w:lvl w:ilvl="4">
+      <w:start w:val="1"/>
+      <w:numFmt w:val="bullet"/>
+      <w:lvlText w:val=""/>
+      <w:lvlJc w:val="left"/>
+      <w:pPr>
+        <w:ind w:left="2200" w:hanging="440"/>
+      </w:pPr>
+      <w:rPr>
+        <w:rFonts w:ascii="Wingdings" w:hAnsi="Wingdings" w:hint="default"/>
+      </w:rPr>
+    </w:lvl>
+    <w:lvl w:ilvl="5">
+      <w:start w:val="1"/>
+      <w:numFmt w:val="bullet"/>
+      <w:lvlText w:val=""/>
+      <w:lvlJc w:val="left"/>
+      <w:pPr>
+        <w:ind w:left="2640" w:hanging="440"/>
+      </w:pPr>
+      <w:rPr>
+        <w:rFonts w:ascii="Wingdings" w:hAnsi="Wingdings" w:hint="default"/>
+      </w:rPr>
+    </w:lvl>
+    <w:lvl w:ilvl="6">
+      <w:start w:val="1"/>
+      <w:numFmt w:val="bullet"/>
+      <w:lvlText w:val=""/>
+      <w:lvlJc w:val="left"/>
+      <w:pPr>
+        <w:ind w:left="3080" w:hanging="440"/>
+      </w:pPr>
+      <w:rPr>
+        <w:rFonts w:ascii="Wingdings" w:hAnsi="Wingdings" w:hint="default"/>
+      </w:rPr>
+    </w:lvl>
+    <w:lvl w:ilvl="7">
+      <w:start w:val="1"/>
+      <w:numFmt w:val="bullet"/>
+      <w:lvlText w:val=""/>
+      <w:lvlJc w:val="left"/>
+      <w:pPr>
+        <w:ind w:left="3520" w:hanging="440"/>
+      </w:pPr>
+      <w:rPr>
+        <w:rFonts w:ascii="Wingdings" w:hAnsi="Wingdings" w:hint="default"/>
+      </w:rPr>
+    </w:lvl>
+    <w:lvl w:ilvl="8">
+      <w:start w:val="1"/>
+      <w:numFmt w:val="bullet"/>
+      <w:lvlText w:val=""/>
+      <w:lvlJc w:val="left"/>
+      <w:pPr>
+        <w:ind w:left="3960" w:hanging="440"/>
+      </w:pPr>
+      <w:rPr>
+        <w:rFonts w:ascii="Wingdings" w:hAnsi="Wingdings" w:hint="default"/>
+      </w:rPr>
+    </w:lvl>
+  </w:abstractNum>
+  <w:abstractNum w:abstractNumId="17" w15:restartNumberingAfterBreak="0">
     <w:nsid w:val="27093EE9"/>
     <w:multiLevelType w:val="multilevel"/>
     <w:tmpl w:val="BA282B22"/>
@@ -6257,7 +6574,7 @@
       </w:rPr>
     </w:lvl>
   </w:abstractNum>
-  <w:abstractNum w:abstractNumId="15" w15:restartNumberingAfterBreak="0">
+  <w:abstractNum w:abstractNumId="18" w15:restartNumberingAfterBreak="0">
     <w:nsid w:val="29D177CC"/>
     <w:multiLevelType w:val="hybridMultilevel"/>
     <w:tmpl w:val="CA6E6360"/>
@@ -6372,7 +6689,97 @@
       </w:rPr>
     </w:lvl>
   </w:abstractNum>
-  <w:abstractNum w:abstractNumId="16" w15:restartNumberingAfterBreak="0">
+  <w:abstractNum w:abstractNumId="19" w15:restartNumberingAfterBreak="0">
+    <w:nsid w:val="2BB62758"/>
+    <w:multiLevelType w:val="hybridMultilevel"/>
+    <w:tmpl w:val="413ADF6A"/>
+    <w:lvl w:ilvl="0" w:tplc="04B88346">
+      <w:start w:val="1"/>
+      <w:numFmt w:val="lowerRoman"/>
+      <w:pStyle w:val="NumberedList3"/>
+      <w:lvlText w:val="%1."/>
+      <w:lvlJc w:val="left"/>
+      <w:pPr>
+        <w:ind w:left="702" w:hanging="136"/>
+      </w:pPr>
+      <w:rPr>
+        <w:rFonts w:hint="eastAsia"/>
+      </w:rPr>
+    </w:lvl>
+    <w:lvl w:ilvl="1" w:tplc="04090017" w:tentative="1">
+      <w:start w:val="1"/>
+      <w:numFmt w:val="aiueoFullWidth"/>
+      <w:lvlText w:val="(%2)"/>
+      <w:lvlJc w:val="left"/>
+      <w:pPr>
+        <w:ind w:left="880" w:hanging="440"/>
+      </w:pPr>
+    </w:lvl>
+    <w:lvl w:ilvl="2" w:tplc="04090011" w:tentative="1">
+      <w:start w:val="1"/>
+      <w:numFmt w:val="decimalEnclosedCircle"/>
+      <w:lvlText w:val="%3"/>
+      <w:lvlJc w:val="left"/>
+      <w:pPr>
+        <w:ind w:left="1320" w:hanging="440"/>
+      </w:pPr>
+    </w:lvl>
+    <w:lvl w:ilvl="3" w:tplc="0409000F" w:tentative="1">
+      <w:start w:val="1"/>
+      <w:numFmt w:val="decimal"/>
+      <w:lvlText w:val="%4."/>
+      <w:lvlJc w:val="left"/>
+      <w:pPr>
+        <w:ind w:left="1760" w:hanging="440"/>
+      </w:pPr>
+    </w:lvl>
+    <w:lvl w:ilvl="4" w:tplc="04090017" w:tentative="1">
+      <w:start w:val="1"/>
+      <w:numFmt w:val="aiueoFullWidth"/>
+      <w:lvlText w:val="(%5)"/>
+      <w:lvlJc w:val="left"/>
+      <w:pPr>
+        <w:ind w:left="2200" w:hanging="440"/>
+      </w:pPr>
+    </w:lvl>
+    <w:lvl w:ilvl="5" w:tplc="04090011" w:tentative="1">
+      <w:start w:val="1"/>
+      <w:numFmt w:val="decimalEnclosedCircle"/>
+      <w:lvlText w:val="%6"/>
+      <w:lvlJc w:val="left"/>
+      <w:pPr>
+        <w:ind w:left="2640" w:hanging="440"/>
+      </w:pPr>
+    </w:lvl>
+    <w:lvl w:ilvl="6" w:tplc="0409000F" w:tentative="1">
+      <w:start w:val="1"/>
+      <w:numFmt w:val="decimal"/>
+      <w:lvlText w:val="%7."/>
+      <w:lvlJc w:val="left"/>
+      <w:pPr>
+        <w:ind w:left="3080" w:hanging="440"/>
+      </w:pPr>
+    </w:lvl>
+    <w:lvl w:ilvl="7" w:tplc="04090017" w:tentative="1">
+      <w:start w:val="1"/>
+      <w:numFmt w:val="aiueoFullWidth"/>
+      <w:lvlText w:val="(%8)"/>
+      <w:lvlJc w:val="left"/>
+      <w:pPr>
+        <w:ind w:left="3520" w:hanging="440"/>
+      </w:pPr>
+    </w:lvl>
+    <w:lvl w:ilvl="8" w:tplc="04090011" w:tentative="1">
+      <w:start w:val="1"/>
+      <w:numFmt w:val="decimalEnclosedCircle"/>
+      <w:lvlText w:val="%9"/>
+      <w:lvlJc w:val="left"/>
+      <w:pPr>
+        <w:ind w:left="3960" w:hanging="440"/>
+      </w:pPr>
+    </w:lvl>
+  </w:abstractNum>
+  <w:abstractNum w:abstractNumId="20" w15:restartNumberingAfterBreak="0">
     <w:nsid w:val="30B2507A"/>
     <w:multiLevelType w:val="multilevel"/>
     <w:tmpl w:val="64102A98"/>
@@ -6486,7 +6893,211 @@
       </w:rPr>
     </w:lvl>
   </w:abstractNum>
-  <w:abstractNum w:abstractNumId="17" w15:restartNumberingAfterBreak="0">
+  <w:abstractNum w:abstractNumId="21" w15:restartNumberingAfterBreak="0">
+    <w:nsid w:val="30D47519"/>
+    <w:multiLevelType w:val="hybridMultilevel"/>
+    <w:tmpl w:val="0136BD3A"/>
+    <w:lvl w:ilvl="0" w:tplc="3B38657C">
+      <w:start w:val="1"/>
+      <w:numFmt w:val="bullet"/>
+      <w:pStyle w:val="FeatureList2"/>
+      <w:lvlText w:val=""/>
+      <w:lvlJc w:val="left"/>
+      <w:pPr>
+        <w:ind w:left="440" w:hanging="440"/>
+      </w:pPr>
+      <w:rPr>
+        <w:rFonts w:ascii="Wingdings" w:hAnsi="Wingdings" w:hint="default"/>
+      </w:rPr>
+    </w:lvl>
+    <w:lvl w:ilvl="1" w:tplc="0409000B" w:tentative="1">
+      <w:start w:val="1"/>
+      <w:numFmt w:val="bullet"/>
+      <w:lvlText w:val=""/>
+      <w:lvlJc w:val="left"/>
+      <w:pPr>
+        <w:ind w:left="880" w:hanging="440"/>
+      </w:pPr>
+      <w:rPr>
+        <w:rFonts w:ascii="Wingdings" w:hAnsi="Wingdings" w:hint="default"/>
+      </w:rPr>
+    </w:lvl>
+    <w:lvl w:ilvl="2" w:tplc="0409000D" w:tentative="1">
+      <w:start w:val="1"/>
+      <w:numFmt w:val="bullet"/>
+      <w:lvlText w:val=""/>
+      <w:lvlJc w:val="left"/>
+      <w:pPr>
+        <w:ind w:left="1320" w:hanging="440"/>
+      </w:pPr>
+      <w:rPr>
+        <w:rFonts w:ascii="Wingdings" w:hAnsi="Wingdings" w:hint="default"/>
+      </w:rPr>
+    </w:lvl>
+    <w:lvl w:ilvl="3" w:tplc="04090001" w:tentative="1">
+      <w:start w:val="1"/>
+      <w:numFmt w:val="bullet"/>
+      <w:lvlText w:val=""/>
+      <w:lvlJc w:val="left"/>
+      <w:pPr>
+        <w:ind w:left="1760" w:hanging="440"/>
+      </w:pPr>
+      <w:rPr>
+        <w:rFonts w:ascii="Wingdings" w:hAnsi="Wingdings" w:hint="default"/>
+      </w:rPr>
+    </w:lvl>
+    <w:lvl w:ilvl="4" w:tplc="0409000B" w:tentative="1">
+      <w:start w:val="1"/>
+      <w:numFmt w:val="bullet"/>
+      <w:lvlText w:val=""/>
+      <w:lvlJc w:val="left"/>
+      <w:pPr>
+        <w:ind w:left="2200" w:hanging="440"/>
+      </w:pPr>
+      <w:rPr>
+        <w:rFonts w:ascii="Wingdings" w:hAnsi="Wingdings" w:hint="default"/>
+      </w:rPr>
+    </w:lvl>
+    <w:lvl w:ilvl="5" w:tplc="0409000D" w:tentative="1">
+      <w:start w:val="1"/>
+      <w:numFmt w:val="bullet"/>
+      <w:lvlText w:val=""/>
+      <w:lvlJc w:val="left"/>
+      <w:pPr>
+        <w:ind w:left="2640" w:hanging="440"/>
+      </w:pPr>
+      <w:rPr>
+        <w:rFonts w:ascii="Wingdings" w:hAnsi="Wingdings" w:hint="default"/>
+      </w:rPr>
+    </w:lvl>
+    <w:lvl w:ilvl="6" w:tplc="04090001" w:tentative="1">
+      <w:start w:val="1"/>
+      <w:numFmt w:val="bullet"/>
+      <w:lvlText w:val=""/>
+      <w:lvlJc w:val="left"/>
+      <w:pPr>
+        <w:ind w:left="3080" w:hanging="440"/>
+      </w:pPr>
+      <w:rPr>
+        <w:rFonts w:ascii="Wingdings" w:hAnsi="Wingdings" w:hint="default"/>
+      </w:rPr>
+    </w:lvl>
+    <w:lvl w:ilvl="7" w:tplc="0409000B" w:tentative="1">
+      <w:start w:val="1"/>
+      <w:numFmt w:val="bullet"/>
+      <w:lvlText w:val=""/>
+      <w:lvlJc w:val="left"/>
+      <w:pPr>
+        <w:ind w:left="3520" w:hanging="440"/>
+      </w:pPr>
+      <w:rPr>
+        <w:rFonts w:ascii="Wingdings" w:hAnsi="Wingdings" w:hint="default"/>
+      </w:rPr>
+    </w:lvl>
+    <w:lvl w:ilvl="8" w:tplc="0409000D" w:tentative="1">
+      <w:start w:val="1"/>
+      <w:numFmt w:val="bullet"/>
+      <w:lvlText w:val=""/>
+      <w:lvlJc w:val="left"/>
+      <w:pPr>
+        <w:ind w:left="3960" w:hanging="440"/>
+      </w:pPr>
+      <w:rPr>
+        <w:rFonts w:ascii="Wingdings" w:hAnsi="Wingdings" w:hint="default"/>
+      </w:rPr>
+    </w:lvl>
+  </w:abstractNum>
+  <w:abstractNum w:abstractNumId="22" w15:restartNumberingAfterBreak="0">
+    <w:nsid w:val="3B2F4905"/>
+    <w:multiLevelType w:val="multilevel"/>
+    <w:tmpl w:val="1AA21B0A"/>
+    <w:styleLink w:val="4"/>
+    <w:lvl w:ilvl="0">
+      <w:start w:val="1"/>
+      <w:numFmt w:val="lowerLetter"/>
+      <w:lvlText w:val="%1."/>
+      <w:lvlJc w:val="left"/>
+      <w:pPr>
+        <w:ind w:left="680" w:hanging="260"/>
+      </w:pPr>
+      <w:rPr>
+        <w:rFonts w:hint="eastAsia"/>
+      </w:rPr>
+    </w:lvl>
+    <w:lvl w:ilvl="1">
+      <w:start w:val="1"/>
+      <w:numFmt w:val="aiueoFullWidth"/>
+      <w:lvlText w:val="(%2)"/>
+      <w:lvlJc w:val="left"/>
+      <w:pPr>
+        <w:ind w:left="840" w:hanging="420"/>
+      </w:pPr>
+    </w:lvl>
+    <w:lvl w:ilvl="2">
+      <w:start w:val="1"/>
+      <w:numFmt w:val="decimalEnclosedCircle"/>
+      <w:lvlText w:val="%3"/>
+      <w:lvlJc w:val="left"/>
+      <w:pPr>
+        <w:ind w:left="1260" w:hanging="420"/>
+      </w:pPr>
+    </w:lvl>
+    <w:lvl w:ilvl="3">
+      <w:start w:val="1"/>
+      <w:numFmt w:val="decimal"/>
+      <w:lvlText w:val="%4."/>
+      <w:lvlJc w:val="left"/>
+      <w:pPr>
+        <w:ind w:left="1680" w:hanging="420"/>
+      </w:pPr>
+    </w:lvl>
+    <w:lvl w:ilvl="4">
+      <w:start w:val="1"/>
+      <w:numFmt w:val="aiueoFullWidth"/>
+      <w:lvlText w:val="(%5)"/>
+      <w:lvlJc w:val="left"/>
+      <w:pPr>
+        <w:ind w:left="2100" w:hanging="420"/>
+      </w:pPr>
+    </w:lvl>
+    <w:lvl w:ilvl="5">
+      <w:start w:val="1"/>
+      <w:numFmt w:val="decimalEnclosedCircle"/>
+      <w:lvlText w:val="%6"/>
+      <w:lvlJc w:val="left"/>
+      <w:pPr>
+        <w:ind w:left="2520" w:hanging="420"/>
+      </w:pPr>
+    </w:lvl>
+    <w:lvl w:ilvl="6">
+      <w:start w:val="1"/>
+      <w:numFmt w:val="decimal"/>
+      <w:lvlText w:val="%7."/>
+      <w:lvlJc w:val="left"/>
+      <w:pPr>
+        <w:ind w:left="2940" w:hanging="420"/>
+      </w:pPr>
+    </w:lvl>
+    <w:lvl w:ilvl="7">
+      <w:start w:val="1"/>
+      <w:numFmt w:val="aiueoFullWidth"/>
+      <w:lvlText w:val="(%8)"/>
+      <w:lvlJc w:val="left"/>
+      <w:pPr>
+        <w:ind w:left="3360" w:hanging="420"/>
+      </w:pPr>
+    </w:lvl>
+    <w:lvl w:ilvl="8">
+      <w:start w:val="1"/>
+      <w:numFmt w:val="decimalEnclosedCircle"/>
+      <w:lvlText w:val="%9"/>
+      <w:lvlJc w:val="left"/>
+      <w:pPr>
+        <w:ind w:left="3780" w:hanging="420"/>
+      </w:pPr>
+    </w:lvl>
+  </w:abstractNum>
+  <w:abstractNum w:abstractNumId="23" w15:restartNumberingAfterBreak="0">
     <w:nsid w:val="4D2376CD"/>
     <w:multiLevelType w:val="multilevel"/>
     <w:tmpl w:val="04B28204"/>
@@ -6600,7 +7211,187 @@
       </w:rPr>
     </w:lvl>
   </w:abstractNum>
-  <w:abstractNum w:abstractNumId="18" w15:restartNumberingAfterBreak="0">
+  <w:abstractNum w:abstractNumId="24" w15:restartNumberingAfterBreak="0">
+    <w:nsid w:val="53DB3C4E"/>
+    <w:multiLevelType w:val="hybridMultilevel"/>
+    <w:tmpl w:val="BF4EB892"/>
+    <w:lvl w:ilvl="0" w:tplc="CE645EB6">
+      <w:start w:val="1"/>
+      <w:numFmt w:val="lowerLetter"/>
+      <w:pStyle w:val="NumberedList2"/>
+      <w:lvlText w:val="%1."/>
+      <w:lvlJc w:val="left"/>
+      <w:pPr>
+        <w:ind w:left="420" w:hanging="136"/>
+      </w:pPr>
+      <w:rPr>
+        <w:rFonts w:hint="eastAsia"/>
+      </w:rPr>
+    </w:lvl>
+    <w:lvl w:ilvl="1" w:tplc="04090017" w:tentative="1">
+      <w:start w:val="1"/>
+      <w:numFmt w:val="aiueoFullWidth"/>
+      <w:lvlText w:val="(%2)"/>
+      <w:lvlJc w:val="left"/>
+      <w:pPr>
+        <w:ind w:left="880" w:hanging="440"/>
+      </w:pPr>
+    </w:lvl>
+    <w:lvl w:ilvl="2" w:tplc="04090011" w:tentative="1">
+      <w:start w:val="1"/>
+      <w:numFmt w:val="decimalEnclosedCircle"/>
+      <w:lvlText w:val="%3"/>
+      <w:lvlJc w:val="left"/>
+      <w:pPr>
+        <w:ind w:left="1320" w:hanging="440"/>
+      </w:pPr>
+    </w:lvl>
+    <w:lvl w:ilvl="3" w:tplc="0409000F" w:tentative="1">
+      <w:start w:val="1"/>
+      <w:numFmt w:val="decimal"/>
+      <w:lvlText w:val="%4."/>
+      <w:lvlJc w:val="left"/>
+      <w:pPr>
+        <w:ind w:left="1760" w:hanging="440"/>
+      </w:pPr>
+    </w:lvl>
+    <w:lvl w:ilvl="4" w:tplc="04090017" w:tentative="1">
+      <w:start w:val="1"/>
+      <w:numFmt w:val="aiueoFullWidth"/>
+      <w:lvlText w:val="(%5)"/>
+      <w:lvlJc w:val="left"/>
+      <w:pPr>
+        <w:ind w:left="2200" w:hanging="440"/>
+      </w:pPr>
+    </w:lvl>
+    <w:lvl w:ilvl="5" w:tplc="04090011" w:tentative="1">
+      <w:start w:val="1"/>
+      <w:numFmt w:val="decimalEnclosedCircle"/>
+      <w:lvlText w:val="%6"/>
+      <w:lvlJc w:val="left"/>
+      <w:pPr>
+        <w:ind w:left="2640" w:hanging="440"/>
+      </w:pPr>
+    </w:lvl>
+    <w:lvl w:ilvl="6" w:tplc="0409000F" w:tentative="1">
+      <w:start w:val="1"/>
+      <w:numFmt w:val="decimal"/>
+      <w:lvlText w:val="%7."/>
+      <w:lvlJc w:val="left"/>
+      <w:pPr>
+        <w:ind w:left="3080" w:hanging="440"/>
+      </w:pPr>
+    </w:lvl>
+    <w:lvl w:ilvl="7" w:tplc="04090017" w:tentative="1">
+      <w:start w:val="1"/>
+      <w:numFmt w:val="aiueoFullWidth"/>
+      <w:lvlText w:val="(%8)"/>
+      <w:lvlJc w:val="left"/>
+      <w:pPr>
+        <w:ind w:left="3520" w:hanging="440"/>
+      </w:pPr>
+    </w:lvl>
+    <w:lvl w:ilvl="8" w:tplc="04090011" w:tentative="1">
+      <w:start w:val="1"/>
+      <w:numFmt w:val="decimalEnclosedCircle"/>
+      <w:lvlText w:val="%9"/>
+      <w:lvlJc w:val="left"/>
+      <w:pPr>
+        <w:ind w:left="3960" w:hanging="440"/>
+      </w:pPr>
+    </w:lvl>
+  </w:abstractNum>
+  <w:abstractNum w:abstractNumId="25" w15:restartNumberingAfterBreak="0">
+    <w:nsid w:val="541D335C"/>
+    <w:multiLevelType w:val="multilevel"/>
+    <w:tmpl w:val="7C400F1C"/>
+    <w:styleLink w:val="50"/>
+    <w:lvl w:ilvl="0">
+      <w:start w:val="1"/>
+      <w:numFmt w:val="lowerLetter"/>
+      <w:lvlText w:val="%1."/>
+      <w:lvlJc w:val="left"/>
+      <w:pPr>
+        <w:ind w:left="420" w:firstLine="0"/>
+      </w:pPr>
+      <w:rPr>
+        <w:rFonts w:hint="eastAsia"/>
+      </w:rPr>
+    </w:lvl>
+    <w:lvl w:ilvl="1">
+      <w:start w:val="1"/>
+      <w:numFmt w:val="aiueoFullWidth"/>
+      <w:lvlText w:val="(%2)"/>
+      <w:lvlJc w:val="left"/>
+      <w:pPr>
+        <w:ind w:left="880" w:hanging="440"/>
+      </w:pPr>
+    </w:lvl>
+    <w:lvl w:ilvl="2">
+      <w:start w:val="1"/>
+      <w:numFmt w:val="decimalEnclosedCircle"/>
+      <w:lvlText w:val="%3"/>
+      <w:lvlJc w:val="left"/>
+      <w:pPr>
+        <w:ind w:left="1320" w:hanging="440"/>
+      </w:pPr>
+    </w:lvl>
+    <w:lvl w:ilvl="3">
+      <w:start w:val="1"/>
+      <w:numFmt w:val="decimal"/>
+      <w:lvlText w:val="%4."/>
+      <w:lvlJc w:val="left"/>
+      <w:pPr>
+        <w:ind w:left="1760" w:hanging="440"/>
+      </w:pPr>
+    </w:lvl>
+    <w:lvl w:ilvl="4">
+      <w:start w:val="1"/>
+      <w:numFmt w:val="aiueoFullWidth"/>
+      <w:lvlText w:val="(%5)"/>
+      <w:lvlJc w:val="left"/>
+      <w:pPr>
+        <w:ind w:left="2200" w:hanging="440"/>
+      </w:pPr>
+    </w:lvl>
+    <w:lvl w:ilvl="5">
+      <w:start w:val="1"/>
+      <w:numFmt w:val="decimalEnclosedCircle"/>
+      <w:lvlText w:val="%6"/>
+      <w:lvlJc w:val="left"/>
+      <w:pPr>
+        <w:ind w:left="2640" w:hanging="440"/>
+      </w:pPr>
+    </w:lvl>
+    <w:lvl w:ilvl="6">
+      <w:start w:val="1"/>
+      <w:numFmt w:val="decimal"/>
+      <w:lvlText w:val="%7."/>
+      <w:lvlJc w:val="left"/>
+      <w:pPr>
+        <w:ind w:left="3080" w:hanging="440"/>
+      </w:pPr>
+    </w:lvl>
+    <w:lvl w:ilvl="7">
+      <w:start w:val="1"/>
+      <w:numFmt w:val="aiueoFullWidth"/>
+      <w:lvlText w:val="(%8)"/>
+      <w:lvlJc w:val="left"/>
+      <w:pPr>
+        <w:ind w:left="3520" w:hanging="440"/>
+      </w:pPr>
+    </w:lvl>
+    <w:lvl w:ilvl="8">
+      <w:start w:val="1"/>
+      <w:numFmt w:val="decimalEnclosedCircle"/>
+      <w:lvlText w:val="%9"/>
+      <w:lvlJc w:val="left"/>
+      <w:pPr>
+        <w:ind w:left="3960" w:hanging="440"/>
+      </w:pPr>
+    </w:lvl>
+  </w:abstractNum>
+  <w:abstractNum w:abstractNumId="26" w15:restartNumberingAfterBreak="0">
     <w:nsid w:val="54A92301"/>
     <w:multiLevelType w:val="hybridMultilevel"/>
     <w:tmpl w:val="1AA21B0A"/>
@@ -6690,7 +7481,7 @@
       </w:pPr>
     </w:lvl>
   </w:abstractNum>
-  <w:abstractNum w:abstractNumId="19" w15:restartNumberingAfterBreak="0">
+  <w:abstractNum w:abstractNumId="27" w15:restartNumberingAfterBreak="0">
     <w:nsid w:val="59153D9E"/>
     <w:multiLevelType w:val="multilevel"/>
     <w:tmpl w:val="08866ED8"/>
@@ -6805,7 +7596,211 @@
       </w:rPr>
     </w:lvl>
   </w:abstractNum>
-  <w:abstractNum w:abstractNumId="20" w15:restartNumberingAfterBreak="0">
+  <w:abstractNum w:abstractNumId="28" w15:restartNumberingAfterBreak="0">
+    <w:nsid w:val="5AB75AAC"/>
+    <w:multiLevelType w:val="multilevel"/>
+    <w:tmpl w:val="50125688"/>
+    <w:styleLink w:val="60"/>
+    <w:lvl w:ilvl="0">
+      <w:start w:val="1"/>
+      <w:numFmt w:val="lowerLetter"/>
+      <w:lvlText w:val="%1."/>
+      <w:lvlJc w:val="left"/>
+      <w:pPr>
+        <w:ind w:left="420" w:firstLine="0"/>
+      </w:pPr>
+      <w:rPr>
+        <w:rFonts w:hint="eastAsia"/>
+      </w:rPr>
+    </w:lvl>
+    <w:lvl w:ilvl="1">
+      <w:start w:val="1"/>
+      <w:numFmt w:val="aiueoFullWidth"/>
+      <w:lvlText w:val="(%2)"/>
+      <w:lvlJc w:val="left"/>
+      <w:pPr>
+        <w:ind w:left="880" w:hanging="440"/>
+      </w:pPr>
+    </w:lvl>
+    <w:lvl w:ilvl="2">
+      <w:start w:val="1"/>
+      <w:numFmt w:val="decimalEnclosedCircle"/>
+      <w:lvlText w:val="%3"/>
+      <w:lvlJc w:val="left"/>
+      <w:pPr>
+        <w:ind w:left="1320" w:hanging="440"/>
+      </w:pPr>
+    </w:lvl>
+    <w:lvl w:ilvl="3">
+      <w:start w:val="1"/>
+      <w:numFmt w:val="decimal"/>
+      <w:lvlText w:val="%4."/>
+      <w:lvlJc w:val="left"/>
+      <w:pPr>
+        <w:ind w:left="1760" w:hanging="440"/>
+      </w:pPr>
+    </w:lvl>
+    <w:lvl w:ilvl="4">
+      <w:start w:val="1"/>
+      <w:numFmt w:val="aiueoFullWidth"/>
+      <w:lvlText w:val="(%5)"/>
+      <w:lvlJc w:val="left"/>
+      <w:pPr>
+        <w:ind w:left="2200" w:hanging="440"/>
+      </w:pPr>
+    </w:lvl>
+    <w:lvl w:ilvl="5">
+      <w:start w:val="1"/>
+      <w:numFmt w:val="decimalEnclosedCircle"/>
+      <w:lvlText w:val="%6"/>
+      <w:lvlJc w:val="left"/>
+      <w:pPr>
+        <w:ind w:left="2640" w:hanging="440"/>
+      </w:pPr>
+    </w:lvl>
+    <w:lvl w:ilvl="6">
+      <w:start w:val="1"/>
+      <w:numFmt w:val="decimal"/>
+      <w:lvlText w:val="%7."/>
+      <w:lvlJc w:val="left"/>
+      <w:pPr>
+        <w:ind w:left="3080" w:hanging="440"/>
+      </w:pPr>
+    </w:lvl>
+    <w:lvl w:ilvl="7">
+      <w:start w:val="1"/>
+      <w:numFmt w:val="aiueoFullWidth"/>
+      <w:lvlText w:val="(%8)"/>
+      <w:lvlJc w:val="left"/>
+      <w:pPr>
+        <w:ind w:left="3520" w:hanging="440"/>
+      </w:pPr>
+    </w:lvl>
+    <w:lvl w:ilvl="8">
+      <w:start w:val="1"/>
+      <w:numFmt w:val="decimalEnclosedCircle"/>
+      <w:lvlText w:val="%9"/>
+      <w:lvlJc w:val="left"/>
+      <w:pPr>
+        <w:ind w:left="3960" w:hanging="440"/>
+      </w:pPr>
+    </w:lvl>
+  </w:abstractNum>
+  <w:abstractNum w:abstractNumId="29" w15:restartNumberingAfterBreak="0">
+    <w:nsid w:val="5DA375FD"/>
+    <w:multiLevelType w:val="hybridMultilevel"/>
+    <w:tmpl w:val="55DC64C2"/>
+    <w:lvl w:ilvl="0" w:tplc="34D4FF06">
+      <w:start w:val="1"/>
+      <w:numFmt w:val="bullet"/>
+      <w:pStyle w:val="FeatureList1"/>
+      <w:lvlText w:val=""/>
+      <w:lvlJc w:val="left"/>
+      <w:pPr>
+        <w:ind w:left="440" w:hanging="440"/>
+      </w:pPr>
+      <w:rPr>
+        <w:rFonts w:ascii="Wingdings" w:hAnsi="Wingdings" w:hint="default"/>
+      </w:rPr>
+    </w:lvl>
+    <w:lvl w:ilvl="1" w:tplc="0409000B" w:tentative="1">
+      <w:start w:val="1"/>
+      <w:numFmt w:val="bullet"/>
+      <w:lvlText w:val=""/>
+      <w:lvlJc w:val="left"/>
+      <w:pPr>
+        <w:ind w:left="880" w:hanging="440"/>
+      </w:pPr>
+      <w:rPr>
+        <w:rFonts w:ascii="Wingdings" w:hAnsi="Wingdings" w:hint="default"/>
+      </w:rPr>
+    </w:lvl>
+    <w:lvl w:ilvl="2" w:tplc="0409000D" w:tentative="1">
+      <w:start w:val="1"/>
+      <w:numFmt w:val="bullet"/>
+      <w:lvlText w:val=""/>
+      <w:lvlJc w:val="left"/>
+      <w:pPr>
+        <w:ind w:left="1320" w:hanging="440"/>
+      </w:pPr>
+      <w:rPr>
+        <w:rFonts w:ascii="Wingdings" w:hAnsi="Wingdings" w:hint="default"/>
+      </w:rPr>
+    </w:lvl>
+    <w:lvl w:ilvl="3" w:tplc="04090001" w:tentative="1">
+      <w:start w:val="1"/>
+      <w:numFmt w:val="bullet"/>
+      <w:lvlText w:val=""/>
+      <w:lvlJc w:val="left"/>
+      <w:pPr>
+        <w:ind w:left="1760" w:hanging="440"/>
+      </w:pPr>
+      <w:rPr>
+        <w:rFonts w:ascii="Wingdings" w:hAnsi="Wingdings" w:hint="default"/>
+      </w:rPr>
+    </w:lvl>
+    <w:lvl w:ilvl="4" w:tplc="0409000B" w:tentative="1">
+      <w:start w:val="1"/>
+      <w:numFmt w:val="bullet"/>
+      <w:lvlText w:val=""/>
+      <w:lvlJc w:val="left"/>
+      <w:pPr>
+        <w:ind w:left="2200" w:hanging="440"/>
+      </w:pPr>
+      <w:rPr>
+        <w:rFonts w:ascii="Wingdings" w:hAnsi="Wingdings" w:hint="default"/>
+      </w:rPr>
+    </w:lvl>
+    <w:lvl w:ilvl="5" w:tplc="0409000D" w:tentative="1">
+      <w:start w:val="1"/>
+      <w:numFmt w:val="bullet"/>
+      <w:lvlText w:val=""/>
+      <w:lvlJc w:val="left"/>
+      <w:pPr>
+        <w:ind w:left="2640" w:hanging="440"/>
+      </w:pPr>
+      <w:rPr>
+        <w:rFonts w:ascii="Wingdings" w:hAnsi="Wingdings" w:hint="default"/>
+      </w:rPr>
+    </w:lvl>
+    <w:lvl w:ilvl="6" w:tplc="04090001" w:tentative="1">
+      <w:start w:val="1"/>
+      <w:numFmt w:val="bullet"/>
+      <w:lvlText w:val=""/>
+      <w:lvlJc w:val="left"/>
+      <w:pPr>
+        <w:ind w:left="3080" w:hanging="440"/>
+      </w:pPr>
+      <w:rPr>
+        <w:rFonts w:ascii="Wingdings" w:hAnsi="Wingdings" w:hint="default"/>
+      </w:rPr>
+    </w:lvl>
+    <w:lvl w:ilvl="7" w:tplc="0409000B" w:tentative="1">
+      <w:start w:val="1"/>
+      <w:numFmt w:val="bullet"/>
+      <w:lvlText w:val=""/>
+      <w:lvlJc w:val="left"/>
+      <w:pPr>
+        <w:ind w:left="3520" w:hanging="440"/>
+      </w:pPr>
+      <w:rPr>
+        <w:rFonts w:ascii="Wingdings" w:hAnsi="Wingdings" w:hint="default"/>
+      </w:rPr>
+    </w:lvl>
+    <w:lvl w:ilvl="8" w:tplc="0409000D" w:tentative="1">
+      <w:start w:val="1"/>
+      <w:numFmt w:val="bullet"/>
+      <w:lvlText w:val=""/>
+      <w:lvlJc w:val="left"/>
+      <w:pPr>
+        <w:ind w:left="3960" w:hanging="440"/>
+      </w:pPr>
+      <w:rPr>
+        <w:rFonts w:ascii="Wingdings" w:hAnsi="Wingdings" w:hint="default"/>
+      </w:rPr>
+    </w:lvl>
+  </w:abstractNum>
+  <w:abstractNum w:abstractNumId="30" w15:restartNumberingAfterBreak="0">
     <w:nsid w:val="670F7905"/>
     <w:multiLevelType w:val="hybridMultilevel"/>
     <w:tmpl w:val="93B4E204"/>
@@ -6892,7 +7887,7 @@
       </w:pPr>
     </w:lvl>
   </w:abstractNum>
-  <w:abstractNum w:abstractNumId="21" w15:restartNumberingAfterBreak="0">
+  <w:abstractNum w:abstractNumId="31" w15:restartNumberingAfterBreak="0">
     <w:nsid w:val="7EE624E8"/>
     <w:multiLevelType w:val="hybridMultilevel"/>
     <w:tmpl w:val="1E5CF244"/>
@@ -7007,7 +8002,7 @@
     </w:lvl>
   </w:abstractNum>
   <w:num w:numId="1" w16cid:durableId="1802502186">
-    <w:abstractNumId w:val="12"/>
+    <w:abstractNumId w:val="14"/>
   </w:num>
   <w:num w:numId="2" w16cid:durableId="1273324151">
     <w:abstractNumId w:val="9"/>
@@ -7019,31 +8014,31 @@
     <w:abstractNumId w:val="6"/>
   </w:num>
   <w:num w:numId="5" w16cid:durableId="2040474776">
-    <w:abstractNumId w:val="15"/>
+    <w:abstractNumId w:val="18"/>
   </w:num>
   <w:num w:numId="6" w16cid:durableId="466170772">
-    <w:abstractNumId w:val="21"/>
+    <w:abstractNumId w:val="31"/>
   </w:num>
   <w:num w:numId="7" w16cid:durableId="672680547">
-    <w:abstractNumId w:val="20"/>
+    <w:abstractNumId w:val="30"/>
   </w:num>
   <w:num w:numId="8" w16cid:durableId="1060245511">
-    <w:abstractNumId w:val="18"/>
+    <w:abstractNumId w:val="26"/>
   </w:num>
   <w:num w:numId="9" w16cid:durableId="1925334434">
+    <w:abstractNumId w:val="13"/>
+  </w:num>
+  <w:num w:numId="10" w16cid:durableId="1137334843">
+    <w:abstractNumId w:val="23"/>
+  </w:num>
+  <w:num w:numId="11" w16cid:durableId="772824642">
     <w:abstractNumId w:val="11"/>
   </w:num>
-  <w:num w:numId="10" w16cid:durableId="1137334843">
+  <w:num w:numId="12" w16cid:durableId="922884341">
+    <w:abstractNumId w:val="27"/>
+  </w:num>
+  <w:num w:numId="13" w16cid:durableId="1661075547">
     <w:abstractNumId w:val="17"/>
-  </w:num>
-  <w:num w:numId="11" w16cid:durableId="772824642">
-    <w:abstractNumId w:val="10"/>
-  </w:num>
-  <w:num w:numId="12" w16cid:durableId="922884341">
-    <w:abstractNumId w:val="19"/>
-  </w:num>
-  <w:num w:numId="13" w16cid:durableId="1661075547">
-    <w:abstractNumId w:val="14"/>
   </w:num>
   <w:num w:numId="14" w16cid:durableId="676469128">
     <w:abstractNumId w:val="0"/>
@@ -7067,7 +8062,7 @@
     <w:abstractNumId w:val="5"/>
   </w:num>
   <w:num w:numId="21" w16cid:durableId="521432179">
-    <w:abstractNumId w:val="16"/>
+    <w:abstractNumId w:val="20"/>
   </w:num>
   <w:num w:numId="22" w16cid:durableId="1141966459">
     <w:abstractNumId w:val="0"/>
@@ -8315,7 +9310,7 @@
     <w:abstractNumId w:val="5"/>
   </w:num>
   <w:num w:numId="437" w16cid:durableId="1878926449">
-    <w:abstractNumId w:val="13"/>
+    <w:abstractNumId w:val="15"/>
   </w:num>
   <w:num w:numId="438" w16cid:durableId="1859077444">
     <w:abstractNumId w:val="0"/>
@@ -10018,16 +11013,38 @@
   <w:num w:numId="1004" w16cid:durableId="1794132675">
     <w:abstractNumId w:val="5"/>
   </w:num>
+  <w:num w:numId="1005" w16cid:durableId="255022638">
+    <w:abstractNumId w:val="29"/>
+  </w:num>
+  <w:num w:numId="1006" w16cid:durableId="869413548">
+    <w:abstractNumId w:val="16"/>
+  </w:num>
+  <w:num w:numId="1007" w16cid:durableId="1757048193">
+    <w:abstractNumId w:val="21"/>
+  </w:num>
+  <w:num w:numId="1008" w16cid:durableId="577251243">
+    <w:abstractNumId w:val="10"/>
+  </w:num>
+  <w:num w:numId="1009" w16cid:durableId="1123236127">
+    <w:abstractNumId w:val="12"/>
+  </w:num>
+  <w:num w:numId="1010" w16cid:durableId="389615637">
+    <w:abstractNumId w:val="22"/>
+  </w:num>
+  <w:num w:numId="1011" w16cid:durableId="1174758875">
+    <w:abstractNumId w:val="24"/>
+  </w:num>
+  <w:num w:numId="1012" w16cid:durableId="374086054">
+    <w:abstractNumId w:val="25"/>
+  </w:num>
+  <w:num w:numId="1013" w16cid:durableId="856384484">
+    <w:abstractNumId w:val="28"/>
+  </w:num>
+  <w:num w:numId="1014" w16cid:durableId="1165128092">
+    <w:abstractNumId w:val="19"/>
+  </w:num>
   <w:numIdMacAtCleanup w:val="13"/>
 </w:numbering>
-</file>
-
-<file path=word/people.xml><?xml version="1.0" encoding="utf-8"?>
-<w15:people xmlns:wpc="http://schemas.microsoft.com/office/word/2010/wordprocessingCanvas" xmlns:cx="http://schemas.microsoft.com/office/drawing/2014/chartex" xmlns:cx1="http://schemas.microsoft.com/office/drawing/2015/9/8/chartex" xmlns:cx2="http://schemas.microsoft.com/office/drawing/2015/10/21/chartex" xmlns:cx3="http://schemas.microsoft.com/office/drawing/2016/5/9/chartex" xmlns:cx4="http://schemas.microsoft.com/office/drawing/2016/5/10/chartex" xmlns:cx5="http://schemas.microsoft.com/office/drawing/2016/5/11/chartex" xmlns:cx6="http://schemas.microsoft.com/office/drawing/2016/5/12/chartex" xmlns:cx7="http://schemas.microsoft.com/office/drawing/2016/5/13/chartex" xmlns:cx8="http://schemas.microsoft.com/office/drawing/2016/5/14/chartex" xmlns:mc="http://schemas.openxmlformats.org/markup-compatibility/2006" xmlns:aink="http://schemas.microsoft.com/office/drawing/2016/ink" xmlns:am3d="http://schemas.microsoft.com/office/drawing/2017/model3d" xmlns:o="urn:schemas-microsoft-com:office:office" xmlns:oel="http://schemas.microsoft.com/office/2019/extlst" xmlns:r="http://schemas.openxmlformats.org/officeDocument/2006/relationships" xmlns:m="http://schemas.openxmlformats.org/officeDocument/2006/math" xmlns:v="urn:schemas-microsoft-com:vml" xmlns:wp14="http://schemas.microsoft.com/office/word/2010/wordprocessingDrawing" xmlns:wp="http://schemas.openxmlformats.org/drawingml/2006/wordprocessingDrawing" xmlns:w10="urn:schemas-microsoft-com:office:word" xmlns:w="http://schemas.openxmlformats.org/wordprocessingml/2006/main" xmlns:w14="http://schemas.microsoft.com/office/word/2010/wordml" xmlns:w15="http://schemas.microsoft.com/office/word/2012/wordml" xmlns:w16cex="http://schemas.microsoft.com/office/word/2018/wordml/cex" xmlns:w16cid="http://schemas.microsoft.com/office/word/2016/wordml/cid" xmlns:w16="http://schemas.microsoft.com/office/word/2018/wordml" xmlns:w16du="http://schemas.microsoft.com/office/word/2023/wordml/word16du" xmlns:w16sdtdh="http://schemas.microsoft.com/office/word/2020/wordml/sdtdatahash" xmlns:w16sdtfl="http://schemas.microsoft.com/office/word/2024/wordml/sdtformatlock" xmlns:w16se="http://schemas.microsoft.com/office/word/2015/wordml/symex" xmlns:wpg="http://schemas.microsoft.com/office/word/2010/wordprocessingGroup" xmlns:wpi="http://schemas.microsoft.com/office/word/2010/wordprocessingInk" xmlns:wne="http://schemas.microsoft.com/office/word/2006/wordml" xmlns:wps="http://schemas.microsoft.com/office/word/2010/wordprocessingShape" mc:Ignorable="w14 w15 w16se w16cid w16 w16cex w16sdtdh w16sdtfl w16du wp14">
-  <w15:person w15:author="Kazuki Yamamoto">
-    <w15:presenceInfo w15:providerId="Windows Live" w15:userId="b66bea3e4ff20684"/>
-  </w15:person>
-</w15:people>
 </file>
 
 <file path=word/styles.xml><?xml version="1.0" encoding="utf-8"?>
@@ -10414,15 +11431,15 @@
   <w:style w:type="paragraph" w:default="1" w:styleId="a0">
     <w:name w:val="Normal"/>
     <w:qFormat/>
-    <w:rsid w:val="005B012C"/>
+    <w:rsid w:val="00227F02"/>
     <w:pPr>
       <w:spacing w:after="0" w:line="240" w:lineRule="auto"/>
       <w:contextualSpacing/>
     </w:pPr>
     <w:rPr>
       <w:rFonts w:ascii="Source Han Sans Regular" w:eastAsia="Source Han Sans Regular" w:hAnsi="Source Han Sans Regular" w:cs="Source Han Sans Regular"/>
-      <w:sz w:val="20"/>
-      <w:szCs w:val="20"/>
+      <w:sz w:val="18"/>
+      <w:szCs w:val="18"/>
     </w:rPr>
   </w:style>
   <w:style w:type="paragraph" w:styleId="1">
@@ -10456,7 +11473,7 @@
   <w:style w:type="paragraph" w:styleId="20">
     <w:name w:val="heading 2"/>
     <w:next w:val="a0"/>
-    <w:link w:val="21"/>
+    <w:link w:val="22"/>
     <w:autoRedefine/>
     <w:uiPriority w:val="9"/>
     <w:unhideWhenUsed/>
@@ -10480,11 +11497,11 @@
       <w:szCs w:val="28"/>
     </w:rPr>
   </w:style>
-  <w:style w:type="paragraph" w:styleId="30">
+  <w:style w:type="paragraph" w:styleId="31">
     <w:name w:val="heading 3"/>
     <w:basedOn w:val="a0"/>
     <w:next w:val="a0"/>
-    <w:link w:val="31"/>
+    <w:link w:val="32"/>
     <w:autoRedefine/>
     <w:uiPriority w:val="9"/>
     <w:unhideWhenUsed/>
@@ -10506,11 +11523,11 @@
       <w:szCs w:val="24"/>
     </w:rPr>
   </w:style>
-  <w:style w:type="paragraph" w:styleId="4">
+  <w:style w:type="paragraph" w:styleId="40">
     <w:name w:val="heading 4"/>
     <w:basedOn w:val="a0"/>
     <w:next w:val="a0"/>
-    <w:link w:val="40"/>
+    <w:link w:val="41"/>
     <w:autoRedefine/>
     <w:uiPriority w:val="9"/>
     <w:unhideWhenUsed/>
@@ -10528,9 +11545,9 @@
   </w:style>
   <w:style w:type="paragraph" w:styleId="5">
     <w:name w:val="heading 5"/>
-    <w:basedOn w:val="4"/>
+    <w:basedOn w:val="40"/>
     <w:next w:val="a0"/>
-    <w:link w:val="50"/>
+    <w:link w:val="51"/>
     <w:autoRedefine/>
     <w:uiPriority w:val="9"/>
     <w:unhideWhenUsed/>
@@ -10542,15 +11559,12 @@
       </w:numPr>
       <w:outlineLvl w:val="4"/>
     </w:pPr>
-    <w:rPr>
-      <w:sz w:val="18"/>
-    </w:rPr>
   </w:style>
   <w:style w:type="paragraph" w:styleId="6">
     <w:name w:val="heading 6"/>
     <w:basedOn w:val="a0"/>
     <w:next w:val="a0"/>
-    <w:link w:val="60"/>
+    <w:link w:val="61"/>
     <w:uiPriority w:val="9"/>
     <w:unhideWhenUsed/>
     <w:qFormat/>
@@ -10682,9 +11696,6 @@
     <w:autoRedefine/>
     <w:qFormat/>
     <w:rsid w:val="00082EB2"/>
-    <w:rPr>
-      <w:sz w:val="18"/>
-    </w:rPr>
   </w:style>
   <w:style w:type="paragraph" w:customStyle="1" w:styleId="FirstParagraph">
     <w:name w:val="First Paragraph"/>
@@ -10814,7 +11825,6 @@
     <w:rPr>
       <w:bCs/>
       <w:color w:val="595959" w:themeColor="text1" w:themeTint="A6"/>
-      <w:szCs w:val="18"/>
     </w:rPr>
   </w:style>
   <w:style w:type="paragraph" w:styleId="ad">
@@ -11034,7 +12044,7 @@
       <w:ind w:left="720"/>
     </w:pPr>
   </w:style>
-  <w:style w:type="character" w:customStyle="1" w:styleId="60">
+  <w:style w:type="character" w:customStyle="1" w:styleId="61">
     <w:name w:val="見出し 6 (文字)"/>
     <w:basedOn w:val="a2"/>
     <w:link w:val="6"/>
@@ -11425,8 +12435,6 @@
     <w:rsid w:val="009E1693"/>
     <w:rPr>
       <w:rFonts w:ascii="ヒラギノ角ゴ ProN W3" w:eastAsia="ヒラギノ角ゴ ProN W3"/>
-      <w:sz w:val="18"/>
-      <w:szCs w:val="18"/>
     </w:rPr>
   </w:style>
   <w:style w:type="character" w:customStyle="1" w:styleId="afd">
@@ -11454,7 +12462,7 @@
       <w:szCs w:val="36"/>
     </w:rPr>
   </w:style>
-  <w:style w:type="character" w:customStyle="1" w:styleId="21">
+  <w:style w:type="character" w:customStyle="1" w:styleId="22">
     <w:name w:val="見出し 2 (文字)"/>
     <w:basedOn w:val="a2"/>
     <w:link w:val="20"/>
@@ -11467,10 +12475,10 @@
       <w:szCs w:val="28"/>
     </w:rPr>
   </w:style>
-  <w:style w:type="character" w:customStyle="1" w:styleId="31">
+  <w:style w:type="character" w:customStyle="1" w:styleId="32">
     <w:name w:val="見出し 3 (文字)"/>
     <w:basedOn w:val="a2"/>
-    <w:link w:val="30"/>
+    <w:link w:val="31"/>
     <w:uiPriority w:val="9"/>
     <w:rsid w:val="005B012C"/>
     <w:rPr>
@@ -11480,10 +12488,10 @@
       <w:szCs w:val="24"/>
     </w:rPr>
   </w:style>
-  <w:style w:type="character" w:customStyle="1" w:styleId="40">
+  <w:style w:type="character" w:customStyle="1" w:styleId="41">
     <w:name w:val="見出し 4 (文字)"/>
     <w:basedOn w:val="a2"/>
-    <w:link w:val="4"/>
+    <w:link w:val="40"/>
     <w:uiPriority w:val="9"/>
     <w:rsid w:val="005B012C"/>
     <w:rPr>
@@ -11494,7 +12502,7 @@
       <w:szCs w:val="20"/>
     </w:rPr>
   </w:style>
-  <w:style w:type="character" w:customStyle="1" w:styleId="50">
+  <w:style w:type="character" w:customStyle="1" w:styleId="51">
     <w:name w:val="見出し 5 (文字)"/>
     <w:basedOn w:val="a2"/>
     <w:link w:val="5"/>
@@ -11633,11 +12641,11 @@
       <w:color w:val="000000" w:themeColor="text1"/>
     </w:rPr>
   </w:style>
-  <w:style w:type="paragraph" w:styleId="22">
+  <w:style w:type="paragraph" w:styleId="23">
     <w:name w:val="Intense Quote"/>
     <w:basedOn w:val="a0"/>
     <w:next w:val="a0"/>
-    <w:link w:val="23"/>
+    <w:link w:val="24"/>
     <w:uiPriority w:val="30"/>
     <w:qFormat/>
     <w:rsid w:val="00313492"/>
@@ -11655,10 +12663,10 @@
       <w:color w:val="000000" w:themeColor="text1"/>
     </w:rPr>
   </w:style>
-  <w:style w:type="character" w:customStyle="1" w:styleId="23">
+  <w:style w:type="character" w:customStyle="1" w:styleId="24">
     <w:name w:val="引用文 2 (文字)"/>
     <w:basedOn w:val="a2"/>
-    <w:link w:val="22"/>
+    <w:link w:val="23"/>
     <w:uiPriority w:val="30"/>
     <w:rsid w:val="00313492"/>
     <w:rPr>
@@ -11678,7 +12686,7 @@
       <w:color w:val="404040" w:themeColor="text1" w:themeTint="BF"/>
     </w:rPr>
   </w:style>
-  <w:style w:type="character" w:styleId="24">
+  <w:style w:type="character" w:styleId="25">
     <w:name w:val="Intense Emphasis"/>
     <w:basedOn w:val="a2"/>
     <w:uiPriority w:val="21"/>
@@ -11704,7 +12712,7 @@
       <w:u w:val="single" w:color="7F7F7F" w:themeColor="text1" w:themeTint="80"/>
     </w:rPr>
   </w:style>
-  <w:style w:type="character" w:styleId="25">
+  <w:style w:type="character" w:styleId="26">
     <w:name w:val="Intense Reference"/>
     <w:basedOn w:val="a2"/>
     <w:uiPriority w:val="32"/>
@@ -11730,7 +12738,7 @@
       <w:spacing w:val="5"/>
     </w:rPr>
   </w:style>
-  <w:style w:type="paragraph" w:styleId="26">
+  <w:style w:type="paragraph" w:styleId="27">
     <w:name w:val="toc 2"/>
     <w:basedOn w:val="a0"/>
     <w:next w:val="a0"/>
@@ -11748,7 +12756,7 @@
       <w:sz w:val="22"/>
     </w:rPr>
   </w:style>
-  <w:style w:type="paragraph" w:styleId="32">
+  <w:style w:type="paragraph" w:styleId="33">
     <w:name w:val="toc 3"/>
     <w:basedOn w:val="a0"/>
     <w:next w:val="a0"/>
@@ -11824,7 +12832,7 @@
   </w:style>
   <w:style w:type="paragraph" w:customStyle="1" w:styleId="HeadingUnnumbered3">
     <w:name w:val="Heading Unnumbered 3"/>
-    <w:basedOn w:val="30"/>
+    <w:basedOn w:val="31"/>
     <w:autoRedefine/>
     <w:qFormat/>
     <w:rsid w:val="007F64DA"/>
@@ -11841,7 +12849,7 @@
   </w:style>
   <w:style w:type="paragraph" w:customStyle="1" w:styleId="HeadingUnnumbered4">
     <w:name w:val="Heading Unnumbered 4"/>
-    <w:basedOn w:val="4"/>
+    <w:basedOn w:val="40"/>
     <w:autoRedefine/>
     <w:qFormat/>
     <w:rsid w:val="007F64DA"/>
@@ -11903,9 +12911,9 @@
     <w:basedOn w:val="3"/>
     <w:autoRedefine/>
     <w:qFormat/>
-    <w:rsid w:val="00277BAF"/>
-  </w:style>
-  <w:style w:type="paragraph" w:styleId="41">
+    <w:rsid w:val="00B90103"/>
+  </w:style>
+  <w:style w:type="paragraph" w:styleId="42">
     <w:name w:val="toc 4"/>
     <w:basedOn w:val="a0"/>
     <w:next w:val="a0"/>
@@ -11919,7 +12927,7 @@
       <w:rFonts w:asciiTheme="minorHAnsi" w:eastAsiaTheme="minorHAnsi"/>
     </w:rPr>
   </w:style>
-  <w:style w:type="paragraph" w:styleId="51">
+  <w:style w:type="paragraph" w:styleId="52">
     <w:name w:val="toc 5"/>
     <w:basedOn w:val="a0"/>
     <w:next w:val="a0"/>
@@ -11933,7 +12941,7 @@
       <w:rFonts w:asciiTheme="minorHAnsi" w:eastAsiaTheme="minorHAnsi"/>
     </w:rPr>
   </w:style>
-  <w:style w:type="paragraph" w:styleId="61">
+  <w:style w:type="paragraph" w:styleId="62">
     <w:name w:val="toc 6"/>
     <w:basedOn w:val="a0"/>
     <w:next w:val="a0"/>
@@ -12556,7 +13564,7 @@
   </w:style>
   <w:style w:type="paragraph" w:customStyle="1" w:styleId="AppendixHeading3">
     <w:name w:val="Appendix Heading 3"/>
-    <w:basedOn w:val="30"/>
+    <w:basedOn w:val="31"/>
     <w:autoRedefine/>
     <w:qFormat/>
     <w:rsid w:val="005640ED"/>
@@ -12568,8 +13576,8 @@
   </w:style>
   <w:style w:type="paragraph" w:customStyle="1" w:styleId="AppendixHeading4">
     <w:name w:val="Appendix Heading 4"/>
-    <w:basedOn w:val="4"/>
-    <w:next w:val="4"/>
+    <w:basedOn w:val="40"/>
+    <w:next w:val="40"/>
     <w:autoRedefine/>
     <w:qFormat/>
     <w:rsid w:val="00507E56"/>
@@ -12595,29 +13603,27 @@
   </w:style>
   <w:style w:type="paragraph" w:customStyle="1" w:styleId="FeatureList1">
     <w:name w:val="Feature List 1"/>
+    <w:basedOn w:val="a0"/>
     <w:autoRedefine/>
     <w:qFormat/>
     <w:rsid w:val="005B012C"/>
     <w:pPr>
-      <w:spacing w:line="240" w:lineRule="auto"/>
-      <w:contextualSpacing/>
+      <w:numPr>
+        <w:numId w:val="1005"/>
+      </w:numPr>
     </w:pPr>
-    <w:rPr>
-      <w:rFonts w:ascii="Source Han Sans Regular" w:eastAsia="Source Han Sans Regular" w:hAnsi="Source Han Sans Regular" w:cs="Source Han Sans Regular"/>
-    </w:rPr>
   </w:style>
   <w:style w:type="paragraph" w:customStyle="1" w:styleId="FeatureList2">
     <w:name w:val="Feature List 2"/>
+    <w:basedOn w:val="FeatureList1"/>
     <w:autoRedefine/>
     <w:qFormat/>
     <w:rsid w:val="005B012C"/>
     <w:pPr>
-      <w:spacing w:line="240" w:lineRule="auto"/>
-      <w:contextualSpacing/>
+      <w:numPr>
+        <w:numId w:val="1007"/>
+      </w:numPr>
     </w:pPr>
-    <w:rPr>
-      <w:rFonts w:ascii="Source Han Sans Regular" w:eastAsia="Source Han Sans Regular" w:hAnsi="Source Han Sans Regular" w:cs="Source Han Sans Regular"/>
-    </w:rPr>
   </w:style>
   <w:style w:type="paragraph" w:customStyle="1" w:styleId="Note">
     <w:name w:val="Note"/>
@@ -12628,30 +13634,40 @@
   </w:style>
   <w:style w:type="paragraph" w:customStyle="1" w:styleId="NumberedList1">
     <w:name w:val="Numbered List 1"/>
+    <w:basedOn w:val="BulletList1"/>
     <w:autoRedefine/>
     <w:qFormat/>
     <w:rsid w:val="00C17E2B"/>
     <w:pPr>
-      <w:spacing w:after="40" w:line="240" w:lineRule="auto"/>
-      <w:contextualSpacing/>
+      <w:numPr>
+        <w:numId w:val="1009"/>
+      </w:numPr>
+      <w:spacing w:after="40"/>
     </w:pPr>
-    <w:rPr>
-      <w:rFonts w:ascii="Source Han Sans Regular" w:eastAsia="Source Han Sans Regular" w:hAnsi="Source Han Sans Regular" w:cs="Source Han Sans Regular"/>
-    </w:rPr>
   </w:style>
   <w:style w:type="paragraph" w:customStyle="1" w:styleId="NumberedList2">
     <w:name w:val="Numbered List 2"/>
-    <w:basedOn w:val="NumberedList1"/>
+    <w:basedOn w:val="NumberBullet2"/>
+    <w:autoRedefine/>
+    <w:qFormat/>
+    <w:rsid w:val="00B90103"/>
+    <w:pPr>
+      <w:numPr>
+        <w:numId w:val="1011"/>
+      </w:numPr>
+    </w:pPr>
+  </w:style>
+  <w:style w:type="paragraph" w:customStyle="1" w:styleId="NumberedList3">
+    <w:name w:val="Numbered List 3"/>
+    <w:basedOn w:val="BulletList3"/>
     <w:autoRedefine/>
     <w:qFormat/>
     <w:rsid w:val="00C17E2B"/>
-  </w:style>
-  <w:style w:type="paragraph" w:customStyle="1" w:styleId="NumberedList3">
-    <w:name w:val="Numbered List 3"/>
-    <w:basedOn w:val="NumberedList2"/>
-    <w:autoRedefine/>
-    <w:qFormat/>
-    <w:rsid w:val="00C17E2B"/>
+    <w:pPr>
+      <w:numPr>
+        <w:numId w:val="1014"/>
+      </w:numPr>
+    </w:pPr>
   </w:style>
   <w:style w:type="paragraph" w:customStyle="1" w:styleId="ReferenceList">
     <w:name w:val="Reference List"/>
@@ -12746,7 +13762,6 @@
     </w:pPr>
     <w:rPr>
       <w:bCs/>
-      <w:szCs w:val="18"/>
     </w:rPr>
   </w:style>
   <w:style w:type="numbering" w:customStyle="1" w:styleId="10">
@@ -12778,7 +13793,6 @@
       <w:b/>
       <w:bCs/>
       <w:vanish/>
-      <w:szCs w:val="18"/>
     </w:rPr>
   </w:style>
   <w:style w:type="paragraph" w:customStyle="1" w:styleId="16">
@@ -12801,6 +13815,56 @@
       <w:sz w:val="20"/>
       <w:szCs w:val="20"/>
     </w:rPr>
+  </w:style>
+  <w:style w:type="numbering" w:customStyle="1" w:styleId="21">
+    <w:name w:val="現在のリスト2"/>
+    <w:uiPriority w:val="99"/>
+    <w:rsid w:val="00B90103"/>
+    <w:pPr>
+      <w:numPr>
+        <w:numId w:val="1006"/>
+      </w:numPr>
+    </w:pPr>
+  </w:style>
+  <w:style w:type="numbering" w:customStyle="1" w:styleId="30">
+    <w:name w:val="現在のリスト3"/>
+    <w:uiPriority w:val="99"/>
+    <w:rsid w:val="00B90103"/>
+    <w:pPr>
+      <w:numPr>
+        <w:numId w:val="1008"/>
+      </w:numPr>
+    </w:pPr>
+  </w:style>
+  <w:style w:type="numbering" w:customStyle="1" w:styleId="4">
+    <w:name w:val="現在のリスト4"/>
+    <w:uiPriority w:val="99"/>
+    <w:rsid w:val="00B90103"/>
+    <w:pPr>
+      <w:numPr>
+        <w:numId w:val="1010"/>
+      </w:numPr>
+    </w:pPr>
+  </w:style>
+  <w:style w:type="numbering" w:customStyle="1" w:styleId="50">
+    <w:name w:val="現在のリスト5"/>
+    <w:uiPriority w:val="99"/>
+    <w:rsid w:val="00B90103"/>
+    <w:pPr>
+      <w:numPr>
+        <w:numId w:val="1012"/>
+      </w:numPr>
+    </w:pPr>
+  </w:style>
+  <w:style w:type="numbering" w:customStyle="1" w:styleId="60">
+    <w:name w:val="現在のリスト6"/>
+    <w:uiPriority w:val="99"/>
+    <w:rsid w:val="00B90103"/>
+    <w:pPr>
+      <w:numPr>
+        <w:numId w:val="1013"/>
+      </w:numPr>
+    </w:pPr>
   </w:style>
 </w:styles>
 </file>

</xml_diff>

<commit_message>
update ref.docx - add extra bottom-aligned section
</commit_message>
<xml_diff>
--- a/system/ref.docx
+++ b/system/ref.docx
@@ -1266,8 +1266,8 @@
         <w:tblLook w:val="0620" w:firstRow="1" w:lastRow="0" w:firstColumn="0" w:lastColumn="0" w:noHBand="1" w:noVBand="1"/>
       </w:tblPr>
       <w:tblGrid>
-        <w:gridCol w:w="2570"/>
-        <w:gridCol w:w="2816"/>
+        <w:gridCol w:w="2578"/>
+        <w:gridCol w:w="2823"/>
         <w:gridCol w:w="675"/>
         <w:gridCol w:w="675"/>
         <w:gridCol w:w="675"/>
@@ -4099,6 +4099,7 @@
         <w:rPr>
           <w:rStyle w:val="CommentTok"/>
         </w:rPr>
+        <w:lastRenderedPageBreak/>
         <w:t>https://packaging.python.org/en/latest/distributing.html</w:t>
       </w:r>
       <w:r>
@@ -4108,7 +4109,6 @@
         <w:rPr>
           <w:rStyle w:val="CommentTok"/>
         </w:rPr>
-        <w:lastRenderedPageBreak/>
         <w:t>https://github.com/pypa/sampleproject</w:t>
       </w:r>
       <w:r>
@@ -5033,18 +5033,52 @@
         <w:t xml:space="preserve"> Figure 1.1: Front image</w:t>
       </w:r>
     </w:p>
+    <w:p>
+      <w:pPr>
+        <w:pStyle w:val="FigureCaption"/>
+      </w:pPr>
+    </w:p>
+    <w:p>
+      <w:pPr>
+        <w:pStyle w:val="FigureCaption"/>
+        <w:sectPr>
+          <w:headerReference w:type="even" r:id="rId9"/>
+          <w:headerReference w:type="default" r:id="rId10"/>
+          <w:footerReference w:type="even" r:id="rId11"/>
+          <w:footerReference w:type="default" r:id="rId12"/>
+          <w:headerReference w:type="first" r:id="rId13"/>
+          <w:footerReference w:type="first" r:id="rId14"/>
+          <w:pgSz w:w="10318" w:h="14570" w:code="13"/>
+          <w:pgMar w:top="720" w:right="720" w:bottom="720" w:left="720" w:header="851" w:footer="992" w:gutter="0"/>
+          <w:pgNumType w:start="0"/>
+          <w:cols w:space="425"/>
+          <w:titlePg/>
+          <w:docGrid w:linePitch="300" w:charSpace="-4333"/>
+        </w:sectPr>
+      </w:pPr>
+    </w:p>
+    <w:p>
+      <w:pPr>
+        <w:pStyle w:val="FigureCaption"/>
+      </w:pPr>
+      <w:r>
+        <w:rPr>
+          <w:rFonts w:hint="eastAsia"/>
+          <w:lang w:eastAsia="ja-JP"/>
+        </w:rPr>
+        <w:lastRenderedPageBreak/>
+        <w:t>下寄せ</w:t>
+      </w:r>
+    </w:p>
     <w:sectPr>
-      <w:headerReference w:type="even" r:id="rId9"/>
-      <w:headerReference w:type="default" r:id="rId10"/>
-      <w:footerReference w:type="even" r:id="rId11"/>
-      <w:footerReference w:type="default" r:id="rId12"/>
-      <w:headerReference w:type="first" r:id="rId13"/>
-      <w:footerReference w:type="first" r:id="rId14"/>
+      <w:headerReference w:type="default" r:id="rId15"/>
+      <w:footerReference w:type="default" r:id="rId16"/>
+      <w:headerReference w:type="first" r:id="rId17"/>
       <w:pgSz w:w="10318" w:h="14570" w:code="13"/>
       <w:pgMar w:top="720" w:right="720" w:bottom="720" w:left="720" w:header="851" w:footer="992" w:gutter="0"/>
       <w:pgNumType w:start="0"/>
       <w:cols w:space="425"/>
-      <w:titlePg/>
+      <w:vAlign w:val="bottom"/>
       <w:docGrid w:linePitch="300" w:charSpace="-4333"/>
     </w:sectPr>
   </w:body>
@@ -5175,7 +5209,7 @@
         <w:noProof/>
         <w:color w:val="0F243E" w:themeColor="text2" w:themeShade="80"/>
       </w:rPr>
-      <w:instrText>5</w:instrText>
+      <w:instrText>9</w:instrText>
     </w:r>
     <w:r>
       <w:rPr>
@@ -5204,7 +5238,7 @@
         <w:noProof/>
         <w:color w:val="0F243E" w:themeColor="text2" w:themeShade="80"/>
       </w:rPr>
-      <w:t>5</w:t>
+      <w:t>9</w:t>
     </w:r>
     <w:r>
       <w:rPr>
@@ -5324,6 +5358,25 @@
 </w:ftr>
 </file>
 
+<file path=word/footer4.xml><?xml version="1.0" encoding="utf-8"?>
+<w:ftr xmlns:wpc="http://schemas.microsoft.com/office/word/2010/wordprocessingCanvas" xmlns:cx="http://schemas.microsoft.com/office/drawing/2014/chartex" xmlns:cx1="http://schemas.microsoft.com/office/drawing/2015/9/8/chartex" xmlns:cx2="http://schemas.microsoft.com/office/drawing/2015/10/21/chartex" xmlns:cx3="http://schemas.microsoft.com/office/drawing/2016/5/9/chartex" xmlns:cx4="http://schemas.microsoft.com/office/drawing/2016/5/10/chartex" xmlns:cx5="http://schemas.microsoft.com/office/drawing/2016/5/11/chartex" xmlns:cx6="http://schemas.microsoft.com/office/drawing/2016/5/12/chartex" xmlns:cx7="http://schemas.microsoft.com/office/drawing/2016/5/13/chartex" xmlns:cx8="http://schemas.microsoft.com/office/drawing/2016/5/14/chartex" xmlns:mc="http://schemas.openxmlformats.org/markup-compatibility/2006" xmlns:aink="http://schemas.microsoft.com/office/drawing/2016/ink" xmlns:am3d="http://schemas.microsoft.com/office/drawing/2017/model3d" xmlns:o="urn:schemas-microsoft-com:office:office" xmlns:oel="http://schemas.microsoft.com/office/2019/extlst" xmlns:r="http://schemas.openxmlformats.org/officeDocument/2006/relationships" xmlns:m="http://schemas.openxmlformats.org/officeDocument/2006/math" xmlns:v="urn:schemas-microsoft-com:vml" xmlns:wp14="http://schemas.microsoft.com/office/word/2010/wordprocessingDrawing" xmlns:wp="http://schemas.openxmlformats.org/drawingml/2006/wordprocessingDrawing" xmlns:w10="urn:schemas-microsoft-com:office:word" xmlns:w="http://schemas.openxmlformats.org/wordprocessingml/2006/main" xmlns:w14="http://schemas.microsoft.com/office/word/2010/wordml" xmlns:w15="http://schemas.microsoft.com/office/word/2012/wordml" xmlns:w16cex="http://schemas.microsoft.com/office/word/2018/wordml/cex" xmlns:w16cid="http://schemas.microsoft.com/office/word/2016/wordml/cid" xmlns:w16="http://schemas.microsoft.com/office/word/2018/wordml" xmlns:w16du="http://schemas.microsoft.com/office/word/2023/wordml/word16du" xmlns:w16sdtdh="http://schemas.microsoft.com/office/word/2020/wordml/sdtdatahash" xmlns:w16sdtfl="http://schemas.microsoft.com/office/word/2024/wordml/sdtformatlock" xmlns:w16se="http://schemas.microsoft.com/office/word/2015/wordml/symex" xmlns:wpg="http://schemas.microsoft.com/office/word/2010/wordprocessingGroup" xmlns:wpi="http://schemas.microsoft.com/office/word/2010/wordprocessingInk" xmlns:wne="http://schemas.microsoft.com/office/word/2006/wordml" xmlns:wps="http://schemas.microsoft.com/office/word/2010/wordprocessingShape" mc:Ignorable="w14 w15 w16se w16cid w16 w16cex w16sdtdh w16sdtfl w16du wp14">
+  <w:p>
+    <w:pPr>
+      <w:tabs>
+        <w:tab w:val="center" w:pos="4550"/>
+        <w:tab w:val="left" w:pos="5818"/>
+      </w:tabs>
+      <w:ind w:right="260"/>
+      <w:jc w:val="right"/>
+      <w:rPr>
+        <w:rFonts w:cs="Times New Roman (本文のフォント - コンプレ"/>
+        <w:color w:val="0F243E" w:themeColor="text2" w:themeShade="80"/>
+      </w:rPr>
+    </w:pPr>
+  </w:p>
+</w:ftr>
+</file>
+
 <file path=word/footnotes.xml><?xml version="1.0" encoding="utf-8"?>
 <w:footnotes xmlns:wpc="http://schemas.microsoft.com/office/word/2010/wordprocessingCanvas" xmlns:cx="http://schemas.microsoft.com/office/drawing/2014/chartex" xmlns:cx1="http://schemas.microsoft.com/office/drawing/2015/9/8/chartex" xmlns:cx2="http://schemas.microsoft.com/office/drawing/2015/10/21/chartex" xmlns:cx3="http://schemas.microsoft.com/office/drawing/2016/5/9/chartex" xmlns:cx4="http://schemas.microsoft.com/office/drawing/2016/5/10/chartex" xmlns:cx5="http://schemas.microsoft.com/office/drawing/2016/5/11/chartex" xmlns:cx6="http://schemas.microsoft.com/office/drawing/2016/5/12/chartex" xmlns:cx7="http://schemas.microsoft.com/office/drawing/2016/5/13/chartex" xmlns:cx8="http://schemas.microsoft.com/office/drawing/2016/5/14/chartex" xmlns:mc="http://schemas.openxmlformats.org/markup-compatibility/2006" xmlns:aink="http://schemas.microsoft.com/office/drawing/2016/ink" xmlns:am3d="http://schemas.microsoft.com/office/drawing/2017/model3d" xmlns:o="urn:schemas-microsoft-com:office:office" xmlns:oel="http://schemas.microsoft.com/office/2019/extlst" xmlns:r="http://schemas.openxmlformats.org/officeDocument/2006/relationships" xmlns:m="http://schemas.openxmlformats.org/officeDocument/2006/math" xmlns:v="urn:schemas-microsoft-com:vml" xmlns:wp14="http://schemas.microsoft.com/office/word/2010/wordprocessingDrawing" xmlns:wp="http://schemas.openxmlformats.org/drawingml/2006/wordprocessingDrawing" xmlns:w10="urn:schemas-microsoft-com:office:word" xmlns:w="http://schemas.openxmlformats.org/wordprocessingml/2006/main" xmlns:w14="http://schemas.microsoft.com/office/word/2010/wordml" xmlns:w15="http://schemas.microsoft.com/office/word/2012/wordml" xmlns:w16cex="http://schemas.microsoft.com/office/word/2018/wordml/cex" xmlns:w16cid="http://schemas.microsoft.com/office/word/2016/wordml/cid" xmlns:w16="http://schemas.microsoft.com/office/word/2018/wordml" xmlns:w16du="http://schemas.microsoft.com/office/word/2023/wordml/word16du" xmlns:w16sdtdh="http://schemas.microsoft.com/office/word/2020/wordml/sdtdatahash" xmlns:w16sdtfl="http://schemas.microsoft.com/office/word/2024/wordml/sdtformatlock" xmlns:w16se="http://schemas.microsoft.com/office/word/2015/wordml/symex" xmlns:wpg="http://schemas.microsoft.com/office/word/2010/wordprocessingGroup" xmlns:wpi="http://schemas.microsoft.com/office/word/2010/wordprocessingInk" xmlns:wne="http://schemas.microsoft.com/office/word/2006/wordml" xmlns:wps="http://schemas.microsoft.com/office/word/2010/wordprocessingShape" mc:Ignorable="w14 w15 w16se w16cid w16 w16cex w16sdtdh w16sdtfl w16du wp14">
   <w:footnote w:type="separator" w:id="-1">
@@ -5403,53 +5456,9 @@
   <w:p>
     <w:pPr>
       <w:pStyle w:val="af3"/>
+      <w:ind w:right="90"/>
       <w:jc w:val="right"/>
     </w:pPr>
-    <w:r>
-      <w:rPr>
-        <w:rFonts w:asciiTheme="majorHAnsi" w:eastAsiaTheme="majorEastAsia" w:hAnsiTheme="majorHAnsi" w:cstheme="majorBidi"/>
-      </w:rPr>
-      <w:fldChar w:fldCharType="begin"/>
-    </w:r>
-    <w:r>
-      <w:rPr>
-        <w:rFonts w:asciiTheme="majorHAnsi" w:eastAsiaTheme="majorEastAsia" w:hAnsiTheme="majorHAnsi" w:cstheme="majorBidi"/>
-      </w:rPr>
-      <w:instrText xml:space="preserve"> </w:instrText>
-    </w:r>
-    <w:r>
-      <w:rPr>
-        <w:rFonts w:asciiTheme="majorHAnsi" w:eastAsiaTheme="majorEastAsia" w:hAnsiTheme="majorHAnsi" w:cstheme="majorBidi"/>
-        <w:lang w:eastAsia="ja-JP"/>
-      </w:rPr>
-      <w:instrText>DOCPROPERTY TITLE-META \* MERGEFORMAT</w:instrText>
-    </w:r>
-    <w:r>
-      <w:rPr>
-        <w:rFonts w:asciiTheme="majorHAnsi" w:eastAsiaTheme="majorEastAsia" w:hAnsiTheme="majorHAnsi" w:cstheme="majorBidi" w:hint="eastAsia"/>
-        <w:lang w:eastAsia="ja-JP"/>
-      </w:rPr>
-      <w:instrText xml:space="preserve"> </w:instrText>
-    </w:r>
-    <w:r>
-      <w:rPr>
-        <w:rFonts w:asciiTheme="majorHAnsi" w:eastAsiaTheme="majorEastAsia" w:hAnsiTheme="majorHAnsi" w:cstheme="majorBidi"/>
-      </w:rPr>
-      <w:fldChar w:fldCharType="separate"/>
-    </w:r>
-    <w:r>
-      <w:rPr>
-        <w:rFonts w:asciiTheme="majorHAnsi" w:eastAsiaTheme="majorEastAsia" w:hAnsiTheme="majorHAnsi" w:cstheme="majorBidi"/>
-        <w:lang w:eastAsia="ja-JP"/>
-      </w:rPr>
-      <w:t>本のタイトル</w:t>
-    </w:r>
-    <w:r>
-      <w:rPr>
-        <w:rFonts w:asciiTheme="majorHAnsi" w:eastAsiaTheme="majorEastAsia" w:hAnsiTheme="majorHAnsi" w:cstheme="majorBidi"/>
-      </w:rPr>
-      <w:fldChar w:fldCharType="end"/>
-    </w:r>
   </w:p>
 </w:hdr>
 </file>
@@ -5477,6 +5486,84 @@
           <wp:effectExtent l="0" t="0" r="5080" b="0"/>
           <wp:wrapNone/>
           <wp:docPr id="3" name="図 3"/>
+          <wp:cNvGraphicFramePr>
+            <a:graphicFrameLocks xmlns:a="http://schemas.openxmlformats.org/drawingml/2006/main" noChangeAspect="1"/>
+          </wp:cNvGraphicFramePr>
+          <a:graphic xmlns:a="http://schemas.openxmlformats.org/drawingml/2006/main">
+            <a:graphicData uri="http://schemas.openxmlformats.org/drawingml/2006/picture">
+              <pic:pic xmlns:pic="http://schemas.openxmlformats.org/drawingml/2006/picture">
+                <pic:nvPicPr>
+                  <pic:cNvPr id="7" name="markdown-logo-1664x1024.png"/>
+                  <pic:cNvPicPr/>
+                </pic:nvPicPr>
+                <pic:blipFill>
+                  <a:blip r:embed="rId1">
+                    <a:alphaModFix amt="20000"/>
+                  </a:blip>
+                  <a:stretch>
+                    <a:fillRect/>
+                  </a:stretch>
+                </pic:blipFill>
+                <pic:spPr>
+                  <a:xfrm>
+                    <a:off x="0" y="0"/>
+                    <a:ext cx="6192520" cy="3810635"/>
+                  </a:xfrm>
+                  <a:prstGeom prst="rect">
+                    <a:avLst/>
+                  </a:prstGeom>
+                </pic:spPr>
+              </pic:pic>
+            </a:graphicData>
+          </a:graphic>
+          <wp14:sizeRelH relativeFrom="page">
+            <wp14:pctWidth>0</wp14:pctWidth>
+          </wp14:sizeRelH>
+          <wp14:sizeRelV relativeFrom="page">
+            <wp14:pctHeight>0</wp14:pctHeight>
+          </wp14:sizeRelV>
+        </wp:anchor>
+      </w:drawing>
+    </w:r>
+  </w:p>
+</w:hdr>
+</file>
+
+<file path=word/header4.xml><?xml version="1.0" encoding="utf-8"?>
+<w:hdr xmlns:wpc="http://schemas.microsoft.com/office/word/2010/wordprocessingCanvas" xmlns:cx="http://schemas.microsoft.com/office/drawing/2014/chartex" xmlns:cx1="http://schemas.microsoft.com/office/drawing/2015/9/8/chartex" xmlns:cx2="http://schemas.microsoft.com/office/drawing/2015/10/21/chartex" xmlns:cx3="http://schemas.microsoft.com/office/drawing/2016/5/9/chartex" xmlns:cx4="http://schemas.microsoft.com/office/drawing/2016/5/10/chartex" xmlns:cx5="http://schemas.microsoft.com/office/drawing/2016/5/11/chartex" xmlns:cx6="http://schemas.microsoft.com/office/drawing/2016/5/12/chartex" xmlns:cx7="http://schemas.microsoft.com/office/drawing/2016/5/13/chartex" xmlns:cx8="http://schemas.microsoft.com/office/drawing/2016/5/14/chartex" xmlns:mc="http://schemas.openxmlformats.org/markup-compatibility/2006" xmlns:aink="http://schemas.microsoft.com/office/drawing/2016/ink" xmlns:am3d="http://schemas.microsoft.com/office/drawing/2017/model3d" xmlns:o="urn:schemas-microsoft-com:office:office" xmlns:oel="http://schemas.microsoft.com/office/2019/extlst" xmlns:r="http://schemas.openxmlformats.org/officeDocument/2006/relationships" xmlns:m="http://schemas.openxmlformats.org/officeDocument/2006/math" xmlns:v="urn:schemas-microsoft-com:vml" xmlns:wp14="http://schemas.microsoft.com/office/word/2010/wordprocessingDrawing" xmlns:wp="http://schemas.openxmlformats.org/drawingml/2006/wordprocessingDrawing" xmlns:w10="urn:schemas-microsoft-com:office:word" xmlns:w="http://schemas.openxmlformats.org/wordprocessingml/2006/main" xmlns:w14="http://schemas.microsoft.com/office/word/2010/wordml" xmlns:w15="http://schemas.microsoft.com/office/word/2012/wordml" xmlns:w16cex="http://schemas.microsoft.com/office/word/2018/wordml/cex" xmlns:w16cid="http://schemas.microsoft.com/office/word/2016/wordml/cid" xmlns:w16="http://schemas.microsoft.com/office/word/2018/wordml" xmlns:w16du="http://schemas.microsoft.com/office/word/2023/wordml/word16du" xmlns:w16sdtdh="http://schemas.microsoft.com/office/word/2020/wordml/sdtdatahash" xmlns:w16sdtfl="http://schemas.microsoft.com/office/word/2024/wordml/sdtformatlock" xmlns:w16se="http://schemas.microsoft.com/office/word/2015/wordml/symex" xmlns:wpg="http://schemas.microsoft.com/office/word/2010/wordprocessingGroup" xmlns:wpi="http://schemas.microsoft.com/office/word/2010/wordprocessingInk" xmlns:wne="http://schemas.microsoft.com/office/word/2006/wordml" xmlns:wps="http://schemas.microsoft.com/office/word/2010/wordprocessingShape" mc:Ignorable="w14 w15 w16se w16cid w16 w16cex w16sdtdh w16sdtfl w16du wp14">
+  <w:p>
+    <w:pPr>
+      <w:pStyle w:val="af3"/>
+      <w:ind w:right="90"/>
+      <w:jc w:val="right"/>
+    </w:pPr>
+  </w:p>
+</w:hdr>
+</file>
+
+<file path=word/header5.xml><?xml version="1.0" encoding="utf-8"?>
+<w:hdr xmlns:wpc="http://schemas.microsoft.com/office/word/2010/wordprocessingCanvas" xmlns:cx="http://schemas.microsoft.com/office/drawing/2014/chartex" xmlns:cx1="http://schemas.microsoft.com/office/drawing/2015/9/8/chartex" xmlns:cx2="http://schemas.microsoft.com/office/drawing/2015/10/21/chartex" xmlns:cx3="http://schemas.microsoft.com/office/drawing/2016/5/9/chartex" xmlns:cx4="http://schemas.microsoft.com/office/drawing/2016/5/10/chartex" xmlns:cx5="http://schemas.microsoft.com/office/drawing/2016/5/11/chartex" xmlns:cx6="http://schemas.microsoft.com/office/drawing/2016/5/12/chartex" xmlns:cx7="http://schemas.microsoft.com/office/drawing/2016/5/13/chartex" xmlns:cx8="http://schemas.microsoft.com/office/drawing/2016/5/14/chartex" xmlns:mc="http://schemas.openxmlformats.org/markup-compatibility/2006" xmlns:aink="http://schemas.microsoft.com/office/drawing/2016/ink" xmlns:am3d="http://schemas.microsoft.com/office/drawing/2017/model3d" xmlns:o="urn:schemas-microsoft-com:office:office" xmlns:oel="http://schemas.microsoft.com/office/2019/extlst" xmlns:r="http://schemas.openxmlformats.org/officeDocument/2006/relationships" xmlns:m="http://schemas.openxmlformats.org/officeDocument/2006/math" xmlns:v="urn:schemas-microsoft-com:vml" xmlns:wp14="http://schemas.microsoft.com/office/word/2010/wordprocessingDrawing" xmlns:wp="http://schemas.openxmlformats.org/drawingml/2006/wordprocessingDrawing" xmlns:w10="urn:schemas-microsoft-com:office:word" xmlns:w="http://schemas.openxmlformats.org/wordprocessingml/2006/main" xmlns:w14="http://schemas.microsoft.com/office/word/2010/wordml" xmlns:w15="http://schemas.microsoft.com/office/word/2012/wordml" xmlns:w16cex="http://schemas.microsoft.com/office/word/2018/wordml/cex" xmlns:w16cid="http://schemas.microsoft.com/office/word/2016/wordml/cid" xmlns:w16="http://schemas.microsoft.com/office/word/2018/wordml" xmlns:w16du="http://schemas.microsoft.com/office/word/2023/wordml/word16du" xmlns:w16sdtdh="http://schemas.microsoft.com/office/word/2020/wordml/sdtdatahash" xmlns:w16sdtfl="http://schemas.microsoft.com/office/word/2024/wordml/sdtformatlock" xmlns:w16se="http://schemas.microsoft.com/office/word/2015/wordml/symex" xmlns:wpg="http://schemas.microsoft.com/office/word/2010/wordprocessingGroup" xmlns:wpi="http://schemas.microsoft.com/office/word/2010/wordprocessingInk" xmlns:wne="http://schemas.microsoft.com/office/word/2006/wordml" xmlns:wps="http://schemas.microsoft.com/office/word/2010/wordprocessingShape" mc:Ignorable="w14 w15 w16se w16cid w16 w16cex w16sdtdh w16sdtfl w16du wp14">
+  <w:p>
+    <w:pPr>
+      <w:spacing w:line="264" w:lineRule="auto"/>
+    </w:pPr>
+    <w:r>
+      <w:rPr>
+        <w:noProof/>
+      </w:rPr>
+      <w:drawing>
+        <wp:anchor distT="0" distB="0" distL="114300" distR="114300" simplePos="0" relativeHeight="251660288" behindDoc="1" locked="0" layoutInCell="1" allowOverlap="1" wp14:anchorId="7034E78F" wp14:editId="38A44C6A">
+          <wp:simplePos x="0" y="0"/>
+          <wp:positionH relativeFrom="margin">
+            <wp:align>center</wp:align>
+          </wp:positionH>
+          <wp:positionV relativeFrom="margin">
+            <wp:align>center</wp:align>
+          </wp:positionV>
+          <wp:extent cx="6192520" cy="3810635"/>
+          <wp:effectExtent l="0" t="0" r="5080" b="0"/>
+          <wp:wrapNone/>
+          <wp:docPr id="1474887122" name="図 1474887122"/>
           <wp:cNvGraphicFramePr>
             <a:graphicFrameLocks xmlns:a="http://schemas.openxmlformats.org/drawingml/2006/main" noChangeAspect="1"/>
           </wp:cNvGraphicFramePr>

</xml_diff>

<commit_message>
update ref.docx - remove border from Source Code paragraph style
</commit_message>
<xml_diff>
--- a/system/ref.docx
+++ b/system/ref.docx
@@ -4078,6 +4078,7 @@
         <w:rPr>
           <w:rStyle w:val="CommentTok"/>
         </w:rPr>
+        <w:lastRenderedPageBreak/>
         <w:t>"""A setuptools based setup module.</w:t>
       </w:r>
       <w:r>
@@ -4099,7 +4100,6 @@
         <w:rPr>
           <w:rStyle w:val="CommentTok"/>
         </w:rPr>
-        <w:lastRenderedPageBreak/>
         <w:t>https://packaging.python.org/en/latest/distributing.html</w:t>
       </w:r>
       <w:r>
@@ -4823,28 +4823,23 @@
     </w:p>
     <w:tbl>
       <w:tblPr>
-        <w:tblStyle w:val="Centered"/>
+        <w:tblStyle w:val="43"/>
         <w:tblW w:w="0" w:type="pct"/>
-        <w:jc w:val="center"/>
         <w:tblLook w:val="07E0" w:firstRow="1" w:lastRow="1" w:firstColumn="1" w:lastColumn="1" w:noHBand="1" w:noVBand="1"/>
       </w:tblPr>
       <w:tblGrid>
-        <w:gridCol w:w="3816"/>
-        <w:gridCol w:w="778"/>
-        <w:gridCol w:w="706"/>
+        <w:gridCol w:w="3992"/>
+        <w:gridCol w:w="800"/>
+        <w:gridCol w:w="688"/>
       </w:tblGrid>
       <w:tr>
         <w:trPr>
           <w:cnfStyle w:val="100000000000" w:firstRow="1" w:lastRow="0" w:firstColumn="0" w:lastColumn="0" w:oddVBand="0" w:evenVBand="0" w:oddHBand="0" w:evenHBand="0" w:firstRowFirstColumn="0" w:firstRowLastColumn="0" w:lastRowFirstColumn="0" w:lastRowLastColumn="0"/>
-          <w:jc w:val="center"/>
         </w:trPr>
         <w:tc>
           <w:tcPr>
+            <w:cnfStyle w:val="001000000100" w:firstRow="0" w:lastRow="0" w:firstColumn="1" w:lastColumn="0" w:oddVBand="0" w:evenVBand="0" w:oddHBand="0" w:evenHBand="0" w:firstRowFirstColumn="1" w:firstRowLastColumn="0" w:lastRowFirstColumn="0" w:lastRowLastColumn="0"/>
             <w:tcW w:w="0" w:type="auto"/>
-            <w:tcBorders>
-              <w:bottom w:val="single" w:sz="0" w:space="0" w:color="auto"/>
-            </w:tcBorders>
-            <w:vAlign w:val="center"/>
           </w:tcPr>
           <w:p>
             <w:pPr>
@@ -4858,104 +4853,98 @@
         <w:tc>
           <w:tcPr>
             <w:tcW w:w="0" w:type="auto"/>
-            <w:tcBorders>
-              <w:bottom w:val="single" w:sz="0" w:space="0" w:color="auto"/>
-            </w:tcBorders>
-            <w:vAlign w:val="center"/>
           </w:tcPr>
           <w:p>
             <w:pPr>
               <w:pStyle w:val="TableHeadCenter"/>
+              <w:cnfStyle w:val="100000000000" w:firstRow="1" w:lastRow="0" w:firstColumn="0" w:lastColumn="0" w:oddVBand="0" w:evenVBand="0" w:oddHBand="0" w:evenHBand="0" w:firstRowFirstColumn="0" w:firstRowLastColumn="0" w:lastRowFirstColumn="0" w:lastRowLastColumn="0"/>
             </w:pPr>
             <w:r>
               <w:t>is</w:t>
+            </w:r>
+          </w:p>
+        </w:tc>
+        <w:tc>
+          <w:tcPr>
+            <w:cnfStyle w:val="000100001000" w:firstRow="0" w:lastRow="0" w:firstColumn="0" w:lastColumn="1" w:oddVBand="0" w:evenVBand="0" w:oddHBand="0" w:evenHBand="0" w:firstRowFirstColumn="0" w:firstRowLastColumn="1" w:lastRowFirstColumn="0" w:lastRowLastColumn="0"/>
+            <w:tcW w:w="0" w:type="auto"/>
+          </w:tcPr>
+          <w:p>
+            <w:pPr>
+              <w:pStyle w:val="TableHeadRight"/>
+            </w:pPr>
+            <w:r>
+              <w:t>Table</w:t>
+            </w:r>
+          </w:p>
+        </w:tc>
+      </w:tr>
+      <w:tr>
+        <w:trPr>
+          <w:cnfStyle w:val="010000000000" w:firstRow="0" w:lastRow="1" w:firstColumn="0" w:lastColumn="0" w:oddVBand="0" w:evenVBand="0" w:oddHBand="0" w:evenHBand="0" w:firstRowFirstColumn="0" w:firstRowLastColumn="0" w:lastRowFirstColumn="0" w:lastRowLastColumn="0"/>
+        </w:trPr>
+        <w:tc>
+          <w:tcPr>
+            <w:cnfStyle w:val="001000000001" w:firstRow="0" w:lastRow="0" w:firstColumn="1" w:lastColumn="0" w:oddVBand="0" w:evenVBand="0" w:oddHBand="0" w:evenHBand="0" w:firstRowFirstColumn="0" w:firstRowLastColumn="0" w:lastRowFirstColumn="1" w:lastRowLastColumn="0"/>
+            <w:tcW w:w="0" w:type="auto"/>
+          </w:tcPr>
+          <w:p>
+            <w:pPr>
+              <w:pStyle w:val="TableBodyLeft"/>
+            </w:pPr>
+            <w:r>
+              <w:t>Left</w:t>
+            </w:r>
+            <w:r>
+              <w:t xml:space="preserve"> Left Left Left Left Left Left Left Left</w:t>
+            </w:r>
+          </w:p>
+          <w:p>
+            <w:pPr>
+              <w:pStyle w:val="TableBodyLeft"/>
+            </w:pPr>
+            <w:r>
+              <w:rPr>
+                <w:rFonts w:hint="eastAsia"/>
+                <w:lang w:eastAsia="ja-JP"/>
+              </w:rPr>
+              <w:t xml:space="preserve">Left </w:t>
+            </w:r>
+            <w:r>
+              <w:t xml:space="preserve">Left Left Left Left Left Left Left Left Left </w:t>
+            </w:r>
+            <w:r>
+              <w:br/>
+              <w:t>Left Left</w:t>
+            </w:r>
+          </w:p>
+          <w:p>
+            <w:pPr>
+              <w:pStyle w:val="ae"/>
+            </w:pPr>
+            <w:r>
+              <w:t>Left Left Left Left</w:t>
             </w:r>
           </w:p>
         </w:tc>
         <w:tc>
           <w:tcPr>
             <w:tcW w:w="0" w:type="auto"/>
-            <w:tcBorders>
-              <w:bottom w:val="single" w:sz="0" w:space="0" w:color="auto"/>
-            </w:tcBorders>
-            <w:vAlign w:val="center"/>
           </w:tcPr>
           <w:p>
             <w:pPr>
-              <w:pStyle w:val="TableHeadRight"/>
+              <w:pStyle w:val="TableBodyCenter"/>
+              <w:cnfStyle w:val="010000000000" w:firstRow="0" w:lastRow="1" w:firstColumn="0" w:lastColumn="0" w:oddVBand="0" w:evenVBand="0" w:oddHBand="0" w:evenHBand="0" w:firstRowFirstColumn="0" w:firstRowLastColumn="0" w:lastRowFirstColumn="0" w:lastRowLastColumn="0"/>
             </w:pPr>
             <w:r>
-              <w:t>Table</w:t>
-            </w:r>
-          </w:p>
-        </w:tc>
-      </w:tr>
-      <w:tr>
-        <w:trPr>
-          <w:jc w:val="center"/>
-        </w:trPr>
-        <w:tc>
-          <w:tcPr>
-            <w:tcW w:w="0" w:type="auto"/>
-            <w:vAlign w:val="center"/>
-          </w:tcPr>
-          <w:p>
-            <w:pPr>
-              <w:pStyle w:val="TableBodyLeft"/>
-            </w:pPr>
-            <w:r>
-              <w:t>Left</w:t>
-            </w:r>
-            <w:r>
-              <w:t xml:space="preserve"> Left Left Left Left Left Left Left Left</w:t>
-            </w:r>
-          </w:p>
-          <w:p>
-            <w:pPr>
-              <w:pStyle w:val="TableBodyLeft"/>
-            </w:pPr>
-            <w:r>
-              <w:rPr>
-                <w:rFonts w:hint="eastAsia"/>
-                <w:lang w:eastAsia="ja-JP"/>
-              </w:rPr>
-              <w:t xml:space="preserve">Left </w:t>
-            </w:r>
-            <w:r>
-              <w:t xml:space="preserve">Left Left Left Left Left Left Left Left Left </w:t>
-            </w:r>
-            <w:r>
-              <w:br/>
-              <w:t>Left Left</w:t>
-            </w:r>
-          </w:p>
-          <w:p>
-            <w:pPr>
-              <w:pStyle w:val="ae"/>
-            </w:pPr>
-            <w:r>
-              <w:t>Left Left Left Left</w:t>
+              <w:t>Center</w:t>
             </w:r>
           </w:p>
         </w:tc>
         <w:tc>
           <w:tcPr>
+            <w:cnfStyle w:val="000100000010" w:firstRow="0" w:lastRow="0" w:firstColumn="0" w:lastColumn="1" w:oddVBand="0" w:evenVBand="0" w:oddHBand="0" w:evenHBand="0" w:firstRowFirstColumn="0" w:firstRowLastColumn="0" w:lastRowFirstColumn="0" w:lastRowLastColumn="1"/>
             <w:tcW w:w="0" w:type="auto"/>
-            <w:vAlign w:val="center"/>
-          </w:tcPr>
-          <w:p>
-            <w:pPr>
-              <w:pStyle w:val="TableBodyCenter"/>
-            </w:pPr>
-            <w:r>
-              <w:t>Center</w:t>
-            </w:r>
-          </w:p>
-        </w:tc>
-        <w:tc>
-          <w:tcPr>
-            <w:tcW w:w="0" w:type="auto"/>
-            <w:vAlign w:val="center"/>
           </w:tcPr>
           <w:p>
             <w:pPr>
@@ -13090,19 +13079,13 @@
     <w:next w:val="a1"/>
     <w:autoRedefine/>
     <w:qFormat/>
-    <w:rsid w:val="00F154A2"/>
+    <w:rsid w:val="00E73127"/>
     <w:pPr>
-      <w:pBdr>
-        <w:top w:val="single" w:sz="4" w:space="4" w:color="auto"/>
-        <w:left w:val="single" w:sz="4" w:space="4" w:color="auto"/>
-        <w:bottom w:val="single" w:sz="4" w:space="4" w:color="auto"/>
-        <w:right w:val="single" w:sz="4" w:space="4" w:color="auto"/>
-      </w:pBdr>
       <w:shd w:val="clear" w:color="auto" w:fill="F2F2F2" w:themeFill="background1" w:themeFillShade="F2"/>
       <w:spacing w:after="120"/>
     </w:pPr>
     <w:rPr>
-      <w:rFonts w:ascii="Source Code Pro" w:eastAsia="Ricty Diminished" w:hAnsi="Source Code Pro"/>
+      <w:rFonts w:ascii="Source Han Code JP R" w:eastAsia="Source Han Code JP R" w:hAnsi="Source Han Code JP R" w:cs="Source Han Code JP R"/>
       <w:sz w:val="13"/>
       <w:szCs w:val="13"/>
     </w:rPr>
@@ -13952,6 +13935,121 @@
         <w:numId w:val="1013"/>
       </w:numPr>
     </w:pPr>
+  </w:style>
+  <w:style w:type="table" w:styleId="43">
+    <w:name w:val="Plain Table 4"/>
+    <w:basedOn w:val="a3"/>
+    <w:rsid w:val="00282C2B"/>
+    <w:pPr>
+      <w:spacing w:after="0" w:line="240" w:lineRule="auto"/>
+      <w:jc w:val="center"/>
+    </w:pPr>
+    <w:rPr>
+      <w:rFonts w:ascii="Source Han Sans JP" w:eastAsia="Source Han Sans JP" w:hAnsi="Source Han Sans JP" w:cs="Source Han Sans JP"/>
+    </w:rPr>
+    <w:tblPr>
+      <w:tblStyleRowBandSize w:val="1"/>
+      <w:tblStyleColBandSize w:val="1"/>
+      <w:jc w:val="center"/>
+    </w:tblPr>
+    <w:trPr>
+      <w:jc w:val="center"/>
+    </w:trPr>
+    <w:tcPr>
+      <w:vAlign w:val="center"/>
+    </w:tcPr>
+    <w:tblStylePr w:type="firstRow">
+      <w:rPr>
+        <w:rFonts w:ascii="Source Han Sans JP" w:eastAsia="Source Han Sans JP" w:hAnsi="Source Han Sans JP" w:cs="Source Han Sans JP"/>
+        <w:b/>
+        <w:bCs/>
+        <w:sz w:val="22"/>
+        <w:szCs w:val="22"/>
+      </w:rPr>
+    </w:tblStylePr>
+    <w:tblStylePr w:type="lastRow">
+      <w:rPr>
+        <w:rFonts w:ascii="Source Han Sans JP" w:eastAsia="Source Han Sans JP" w:hAnsi="Source Han Sans JP" w:cs="Source Han Sans JP"/>
+        <w:b/>
+        <w:bCs/>
+        <w:sz w:val="22"/>
+        <w:szCs w:val="22"/>
+      </w:rPr>
+    </w:tblStylePr>
+    <w:tblStylePr w:type="firstCol">
+      <w:rPr>
+        <w:rFonts w:ascii="Source Han Sans JP" w:eastAsia="Source Han Sans JP" w:hAnsi="Source Han Sans JP" w:cs="Source Han Sans JP"/>
+        <w:b w:val="0"/>
+        <w:bCs w:val="0"/>
+        <w:sz w:val="22"/>
+        <w:szCs w:val="22"/>
+      </w:rPr>
+    </w:tblStylePr>
+    <w:tblStylePr w:type="lastCol">
+      <w:rPr>
+        <w:rFonts w:ascii="Source Han Sans JP" w:eastAsia="Source Han Sans JP" w:hAnsi="Source Han Sans JP" w:cs="Source Han Sans JP"/>
+        <w:b w:val="0"/>
+        <w:bCs w:val="0"/>
+        <w:sz w:val="22"/>
+        <w:szCs w:val="22"/>
+      </w:rPr>
+    </w:tblStylePr>
+    <w:tblStylePr w:type="band1Vert">
+      <w:rPr>
+        <w:rFonts w:ascii="Source Han Sans JP" w:eastAsia="Source Han Sans JP" w:hAnsi="Source Han Sans JP" w:cs="Source Han Sans JP"/>
+        <w:sz w:val="22"/>
+        <w:szCs w:val="22"/>
+      </w:rPr>
+    </w:tblStylePr>
+    <w:tblStylePr w:type="band2Vert">
+      <w:rPr>
+        <w:rFonts w:ascii="Source Han Sans JP" w:eastAsia="Source Han Sans JP" w:hAnsi="Source Han Sans JP" w:cs="Source Han Sans JP"/>
+        <w:sz w:val="22"/>
+        <w:szCs w:val="22"/>
+      </w:rPr>
+    </w:tblStylePr>
+    <w:tblStylePr w:type="band1Horz">
+      <w:rPr>
+        <w:rFonts w:ascii="Source Han Sans JP" w:eastAsia="Source Han Sans JP" w:hAnsi="Source Han Sans JP" w:cs="Source Han Sans JP"/>
+        <w:sz w:val="22"/>
+        <w:szCs w:val="22"/>
+      </w:rPr>
+    </w:tblStylePr>
+    <w:tblStylePr w:type="band2Horz">
+      <w:rPr>
+        <w:rFonts w:ascii="Source Han Sans JP" w:eastAsia="Source Han Sans JP" w:hAnsi="Source Han Sans JP" w:cs="Source Han Sans JP"/>
+        <w:sz w:val="22"/>
+        <w:szCs w:val="22"/>
+      </w:rPr>
+    </w:tblStylePr>
+    <w:tblStylePr w:type="neCell">
+      <w:rPr>
+        <w:rFonts w:ascii="Source Han Sans JP" w:eastAsia="Source Han Sans JP" w:hAnsi="Source Han Sans JP" w:cs="Source Han Sans JP"/>
+        <w:sz w:val="22"/>
+        <w:szCs w:val="22"/>
+      </w:rPr>
+    </w:tblStylePr>
+    <w:tblStylePr w:type="nwCell">
+      <w:rPr>
+        <w:rFonts w:ascii="Source Han Sans JP" w:eastAsia="Source Han Sans JP" w:hAnsi="Source Han Sans JP" w:cs="Source Han Sans JP"/>
+        <w:sz w:val="22"/>
+        <w:szCs w:val="22"/>
+      </w:rPr>
+    </w:tblStylePr>
+    <w:tblStylePr w:type="seCell">
+      <w:rPr>
+        <w:rFonts w:ascii="Source Han Sans JP" w:eastAsia="Source Han Sans JP" w:hAnsi="Source Han Sans JP" w:cs="Source Han Sans JP"/>
+        <w:sz w:val="22"/>
+        <w:szCs w:val="22"/>
+      </w:rPr>
+    </w:tblStylePr>
+    <w:tblStylePr w:type="swCell">
+      <w:rPr>
+        <w:rFonts w:ascii="Source Han Sans JP" w:eastAsia="Source Han Sans JP" w:hAnsi="Source Han Sans JP" w:cs="Source Han Sans JP"/>
+        <w:sz w:val="22"/>
+        <w:szCs w:val="22"/>
+      </w:rPr>
+    </w:tblStylePr>
   </w:style>
 </w:styles>
 </file>

</xml_diff>

<commit_message>
update ref.docx - add No Grid Left table style
</commit_message>
<xml_diff>
--- a/system/ref.docx
+++ b/system/ref.docx
@@ -1609,20 +1609,15 @@
       <w:tblPr>
         <w:tblStyle w:val="Centered"/>
         <w:tblW w:w="5000" w:type="pct"/>
-        <w:jc w:val="center"/>
         <w:tblLook w:val="07C0" w:firstRow="0" w:lastRow="1" w:firstColumn="1" w:lastColumn="1" w:noHBand="1" w:noVBand="1"/>
       </w:tblPr>
       <w:tblGrid>
         <w:gridCol w:w="8868"/>
       </w:tblGrid>
       <w:tr>
-        <w:trPr>
-          <w:jc w:val="center"/>
-        </w:trPr>
         <w:tc>
           <w:tcPr>
             <w:tcW w:w="0" w:type="auto"/>
-            <w:vAlign w:val="center"/>
           </w:tcPr>
           <w:p>
             <w:pPr>
@@ -4823,22 +4818,18 @@
     </w:p>
     <w:tbl>
       <w:tblPr>
-        <w:tblStyle w:val="43"/>
+        <w:tblStyle w:val="NoGridLeft"/>
         <w:tblW w:w="0" w:type="pct"/>
-        <w:tblLook w:val="07E0" w:firstRow="1" w:lastRow="1" w:firstColumn="1" w:lastColumn="1" w:noHBand="1" w:noVBand="1"/>
+        <w:tblLook w:val="0600" w:firstRow="0" w:lastRow="0" w:firstColumn="0" w:lastColumn="0" w:noHBand="1" w:noVBand="1"/>
       </w:tblPr>
       <w:tblGrid>
-        <w:gridCol w:w="3992"/>
-        <w:gridCol w:w="800"/>
-        <w:gridCol w:w="688"/>
+        <w:gridCol w:w="3816"/>
+        <w:gridCol w:w="778"/>
+        <w:gridCol w:w="706"/>
       </w:tblGrid>
       <w:tr>
-        <w:trPr>
-          <w:cnfStyle w:val="100000000000" w:firstRow="1" w:lastRow="0" w:firstColumn="0" w:lastColumn="0" w:oddVBand="0" w:evenVBand="0" w:oddHBand="0" w:evenHBand="0" w:firstRowFirstColumn="0" w:firstRowLastColumn="0" w:lastRowFirstColumn="0" w:lastRowLastColumn="0"/>
-        </w:trPr>
         <w:tc>
           <w:tcPr>
-            <w:cnfStyle w:val="001000000100" w:firstRow="0" w:lastRow="0" w:firstColumn="1" w:lastColumn="0" w:oddVBand="0" w:evenVBand="0" w:oddHBand="0" w:evenHBand="0" w:firstRowFirstColumn="1" w:firstRowLastColumn="0" w:lastRowFirstColumn="0" w:lastRowLastColumn="0"/>
             <w:tcW w:w="0" w:type="auto"/>
           </w:tcPr>
           <w:p>
@@ -4857,7 +4848,6 @@
           <w:p>
             <w:pPr>
               <w:pStyle w:val="TableHeadCenter"/>
-              <w:cnfStyle w:val="100000000000" w:firstRow="1" w:lastRow="0" w:firstColumn="0" w:lastColumn="0" w:oddVBand="0" w:evenVBand="0" w:oddHBand="0" w:evenHBand="0" w:firstRowFirstColumn="0" w:firstRowLastColumn="0" w:lastRowFirstColumn="0" w:lastRowLastColumn="0"/>
             </w:pPr>
             <w:r>
               <w:t>is</w:t>
@@ -4866,7 +4856,6 @@
         </w:tc>
         <w:tc>
           <w:tcPr>
-            <w:cnfStyle w:val="000100001000" w:firstRow="0" w:lastRow="0" w:firstColumn="0" w:lastColumn="1" w:oddVBand="0" w:evenVBand="0" w:oddHBand="0" w:evenHBand="0" w:firstRowFirstColumn="0" w:firstRowLastColumn="1" w:lastRowFirstColumn="0" w:lastRowLastColumn="0"/>
             <w:tcW w:w="0" w:type="auto"/>
           </w:tcPr>
           <w:p>
@@ -4880,12 +4869,8 @@
         </w:tc>
       </w:tr>
       <w:tr>
-        <w:trPr>
-          <w:cnfStyle w:val="010000000000" w:firstRow="0" w:lastRow="1" w:firstColumn="0" w:lastColumn="0" w:oddVBand="0" w:evenVBand="0" w:oddHBand="0" w:evenHBand="0" w:firstRowFirstColumn="0" w:firstRowLastColumn="0" w:lastRowFirstColumn="0" w:lastRowLastColumn="0"/>
-        </w:trPr>
         <w:tc>
           <w:tcPr>
-            <w:cnfStyle w:val="001000000001" w:firstRow="0" w:lastRow="0" w:firstColumn="1" w:lastColumn="0" w:oddVBand="0" w:evenVBand="0" w:oddHBand="0" w:evenHBand="0" w:firstRowFirstColumn="0" w:firstRowLastColumn="0" w:lastRowFirstColumn="1" w:lastRowLastColumn="0"/>
             <w:tcW w:w="0" w:type="auto"/>
           </w:tcPr>
           <w:p>
@@ -4934,7 +4919,6 @@
           <w:p>
             <w:pPr>
               <w:pStyle w:val="TableBodyCenter"/>
-              <w:cnfStyle w:val="010000000000" w:firstRow="0" w:lastRow="1" w:firstColumn="0" w:lastColumn="0" w:oddVBand="0" w:evenVBand="0" w:oddHBand="0" w:evenHBand="0" w:firstRowFirstColumn="0" w:firstRowLastColumn="0" w:lastRowFirstColumn="0" w:lastRowLastColumn="0"/>
             </w:pPr>
             <w:r>
               <w:t>Center</w:t>
@@ -4943,7 +4927,6 @@
         </w:tc>
         <w:tc>
           <w:tcPr>
-            <w:cnfStyle w:val="000100000010" w:firstRow="0" w:lastRow="0" w:firstColumn="0" w:lastColumn="1" w:oddVBand="0" w:evenVBand="0" w:oddHBand="0" w:evenHBand="0" w:firstRowFirstColumn="0" w:firstRowLastColumn="0" w:lastRowFirstColumn="0" w:lastRowLastColumn="1"/>
             <w:tcW w:w="0" w:type="auto"/>
           </w:tcPr>
           <w:p>
@@ -13079,10 +13062,10 @@
     <w:next w:val="a1"/>
     <w:autoRedefine/>
     <w:qFormat/>
-    <w:rsid w:val="00E73127"/>
+    <w:rsid w:val="004F2ECD"/>
     <w:pPr>
       <w:shd w:val="clear" w:color="auto" w:fill="F2F2F2" w:themeFill="background1" w:themeFillShade="F2"/>
-      <w:spacing w:after="120"/>
+      <w:spacing w:before="40" w:after="120"/>
     </w:pPr>
     <w:rPr>
       <w:rFonts w:ascii="Source Han Code JP R" w:eastAsia="Source Han Code JP R" w:hAnsi="Source Han Code JP R" w:cs="Source Han Code JP R"/>
@@ -13756,7 +13739,7 @@
     <w:basedOn w:val="TableBodyLeft"/>
     <w:autoRedefine/>
     <w:qFormat/>
-    <w:rsid w:val="00C17E2B"/>
+    <w:rsid w:val="00232111"/>
     <w:pPr>
       <w:jc w:val="center"/>
     </w:pPr>
@@ -13936,20 +13919,19 @@
       </w:numPr>
     </w:pPr>
   </w:style>
-  <w:style w:type="table" w:styleId="43">
-    <w:name w:val="Plain Table 4"/>
+  <w:style w:type="table" w:customStyle="1" w:styleId="NoGridLeft">
+    <w:name w:val="No Grid Left"/>
     <w:basedOn w:val="a3"/>
-    <w:rsid w:val="00282C2B"/>
+    <w:uiPriority w:val="99"/>
+    <w:rsid w:val="00C55C7E"/>
     <w:pPr>
       <w:spacing w:after="0" w:line="240" w:lineRule="auto"/>
-      <w:jc w:val="center"/>
+      <w:jc w:val="both"/>
     </w:pPr>
     <w:rPr>
       <w:rFonts w:ascii="Source Han Sans JP" w:eastAsia="Source Han Sans JP" w:hAnsi="Source Han Sans JP" w:cs="Source Han Sans JP"/>
     </w:rPr>
     <w:tblPr>
-      <w:tblStyleRowBandSize w:val="1"/>
-      <w:tblStyleColBandSize w:val="1"/>
       <w:jc w:val="center"/>
     </w:tblPr>
     <w:trPr>
@@ -13958,98 +13940,6 @@
     <w:tcPr>
       <w:vAlign w:val="center"/>
     </w:tcPr>
-    <w:tblStylePr w:type="firstRow">
-      <w:rPr>
-        <w:rFonts w:ascii="Source Han Sans JP" w:eastAsia="Source Han Sans JP" w:hAnsi="Source Han Sans JP" w:cs="Source Han Sans JP"/>
-        <w:b/>
-        <w:bCs/>
-        <w:sz w:val="22"/>
-        <w:szCs w:val="22"/>
-      </w:rPr>
-    </w:tblStylePr>
-    <w:tblStylePr w:type="lastRow">
-      <w:rPr>
-        <w:rFonts w:ascii="Source Han Sans JP" w:eastAsia="Source Han Sans JP" w:hAnsi="Source Han Sans JP" w:cs="Source Han Sans JP"/>
-        <w:b/>
-        <w:bCs/>
-        <w:sz w:val="22"/>
-        <w:szCs w:val="22"/>
-      </w:rPr>
-    </w:tblStylePr>
-    <w:tblStylePr w:type="firstCol">
-      <w:rPr>
-        <w:rFonts w:ascii="Source Han Sans JP" w:eastAsia="Source Han Sans JP" w:hAnsi="Source Han Sans JP" w:cs="Source Han Sans JP"/>
-        <w:b w:val="0"/>
-        <w:bCs w:val="0"/>
-        <w:sz w:val="22"/>
-        <w:szCs w:val="22"/>
-      </w:rPr>
-    </w:tblStylePr>
-    <w:tblStylePr w:type="lastCol">
-      <w:rPr>
-        <w:rFonts w:ascii="Source Han Sans JP" w:eastAsia="Source Han Sans JP" w:hAnsi="Source Han Sans JP" w:cs="Source Han Sans JP"/>
-        <w:b w:val="0"/>
-        <w:bCs w:val="0"/>
-        <w:sz w:val="22"/>
-        <w:szCs w:val="22"/>
-      </w:rPr>
-    </w:tblStylePr>
-    <w:tblStylePr w:type="band1Vert">
-      <w:rPr>
-        <w:rFonts w:ascii="Source Han Sans JP" w:eastAsia="Source Han Sans JP" w:hAnsi="Source Han Sans JP" w:cs="Source Han Sans JP"/>
-        <w:sz w:val="22"/>
-        <w:szCs w:val="22"/>
-      </w:rPr>
-    </w:tblStylePr>
-    <w:tblStylePr w:type="band2Vert">
-      <w:rPr>
-        <w:rFonts w:ascii="Source Han Sans JP" w:eastAsia="Source Han Sans JP" w:hAnsi="Source Han Sans JP" w:cs="Source Han Sans JP"/>
-        <w:sz w:val="22"/>
-        <w:szCs w:val="22"/>
-      </w:rPr>
-    </w:tblStylePr>
-    <w:tblStylePr w:type="band1Horz">
-      <w:rPr>
-        <w:rFonts w:ascii="Source Han Sans JP" w:eastAsia="Source Han Sans JP" w:hAnsi="Source Han Sans JP" w:cs="Source Han Sans JP"/>
-        <w:sz w:val="22"/>
-        <w:szCs w:val="22"/>
-      </w:rPr>
-    </w:tblStylePr>
-    <w:tblStylePr w:type="band2Horz">
-      <w:rPr>
-        <w:rFonts w:ascii="Source Han Sans JP" w:eastAsia="Source Han Sans JP" w:hAnsi="Source Han Sans JP" w:cs="Source Han Sans JP"/>
-        <w:sz w:val="22"/>
-        <w:szCs w:val="22"/>
-      </w:rPr>
-    </w:tblStylePr>
-    <w:tblStylePr w:type="neCell">
-      <w:rPr>
-        <w:rFonts w:ascii="Source Han Sans JP" w:eastAsia="Source Han Sans JP" w:hAnsi="Source Han Sans JP" w:cs="Source Han Sans JP"/>
-        <w:sz w:val="22"/>
-        <w:szCs w:val="22"/>
-      </w:rPr>
-    </w:tblStylePr>
-    <w:tblStylePr w:type="nwCell">
-      <w:rPr>
-        <w:rFonts w:ascii="Source Han Sans JP" w:eastAsia="Source Han Sans JP" w:hAnsi="Source Han Sans JP" w:cs="Source Han Sans JP"/>
-        <w:sz w:val="22"/>
-        <w:szCs w:val="22"/>
-      </w:rPr>
-    </w:tblStylePr>
-    <w:tblStylePr w:type="seCell">
-      <w:rPr>
-        <w:rFonts w:ascii="Source Han Sans JP" w:eastAsia="Source Han Sans JP" w:hAnsi="Source Han Sans JP" w:cs="Source Han Sans JP"/>
-        <w:sz w:val="22"/>
-        <w:szCs w:val="22"/>
-      </w:rPr>
-    </w:tblStylePr>
-    <w:tblStylePr w:type="swCell">
-      <w:rPr>
-        <w:rFonts w:ascii="Source Han Sans JP" w:eastAsia="Source Han Sans JP" w:hAnsi="Source Han Sans JP" w:cs="Source Han Sans JP"/>
-        <w:sz w:val="22"/>
-        <w:szCs w:val="22"/>
-      </w:rPr>
-    </w:tblStylePr>
   </w:style>
 </w:styles>
 </file>

</xml_diff>

<commit_message>
update ref.docx - fix No Grid Left table style to left-aligned
</commit_message>
<xml_diff>
--- a/system/ref.docx
+++ b/system/ref.docx
@@ -2401,151 +2401,173 @@
       <w:pPr>
         <w:pStyle w:val="SourceCode"/>
       </w:pPr>
-      <w:r>
-        <w:rPr>
-          <w:rStyle w:val="ImportTok"/>
-        </w:rPr>
-        <w:t>import</w:t>
-      </w:r>
-      <w:r>
-        <w:rPr>
-          <w:rStyle w:val="NormalTok"/>
-        </w:rPr>
-        <w:t xml:space="preserve"> pprint</w:t>
-      </w:r>
-      <w:r>
-        <w:br/>
-      </w:r>
-      <w:r>
-        <w:rPr>
-          <w:rStyle w:val="ImportTok"/>
-        </w:rPr>
-        <w:t>import</w:t>
-      </w:r>
-      <w:r>
-        <w:rPr>
-          <w:rStyle w:val="NormalTok"/>
-        </w:rPr>
-        <w:t xml:space="preserve"> docx</w:t>
-      </w:r>
-      <w:r>
-        <w:br/>
-      </w:r>
-      <w:r>
-        <w:br/>
-      </w:r>
-      <w:r>
-        <w:rPr>
-          <w:rStyle w:val="NormalTok"/>
-        </w:rPr>
-        <w:t xml:space="preserve">d </w:t>
-      </w:r>
-      <w:r>
-        <w:rPr>
-          <w:rStyle w:val="OperatorTok"/>
-        </w:rPr>
-        <w:t>=</w:t>
-      </w:r>
-      <w:r>
-        <w:rPr>
-          <w:rStyle w:val="NormalTok"/>
-        </w:rPr>
-        <w:t xml:space="preserve"> docx.Document(</w:t>
-      </w:r>
-      <w:r>
-        <w:rPr>
-          <w:rStyle w:val="StringTok"/>
-        </w:rPr>
-        <w:t>"custom-reference.docx"</w:t>
-      </w:r>
-      <w:r>
-        <w:rPr>
-          <w:rStyle w:val="NormalTok"/>
-        </w:rPr>
-        <w:t>)</w:t>
-      </w:r>
-      <w:r>
-        <w:br/>
-      </w:r>
-      <w:r>
-        <w:rPr>
-          <w:rStyle w:val="NormalTok"/>
-        </w:rPr>
-        <w:t>pprint.pprint(</w:t>
-      </w:r>
-      <w:r>
-        <w:rPr>
-          <w:rStyle w:val="BuiltInTok"/>
-        </w:rPr>
-        <w:t>sorted</w:t>
-      </w:r>
-      <w:r>
-        <w:rPr>
-          <w:rStyle w:val="NormalTok"/>
-        </w:rPr>
-        <w:t xml:space="preserve">([s.name </w:t>
-      </w:r>
-      <w:r>
-        <w:rPr>
-          <w:rStyle w:val="ControlFlowTok"/>
-        </w:rPr>
-        <w:t>for</w:t>
-      </w:r>
-      <w:r>
-        <w:rPr>
-          <w:rStyle w:val="NormalTok"/>
-        </w:rPr>
-        <w:t xml:space="preserve"> s </w:t>
-      </w:r>
-      <w:r>
-        <w:rPr>
-          <w:rStyle w:val="KeywordTok"/>
-        </w:rPr>
-        <w:t>in</w:t>
-      </w:r>
-      <w:r>
-        <w:rPr>
-          <w:rStyle w:val="NormalTok"/>
-        </w:rPr>
-        <w:t xml:space="preserve"> d.styles </w:t>
-      </w:r>
-      <w:r>
-        <w:rPr>
-          <w:rStyle w:val="ControlFlowTok"/>
-        </w:rPr>
-        <w:t>if</w:t>
-      </w:r>
-      <w:r>
-        <w:rPr>
-          <w:rStyle w:val="NormalTok"/>
-        </w:rPr>
-        <w:t xml:space="preserve"> </w:t>
-      </w:r>
-      <w:r>
-        <w:rPr>
-          <w:rStyle w:val="StringTok"/>
-        </w:rPr>
-        <w:t>"Tok"</w:t>
-      </w:r>
-      <w:r>
-        <w:rPr>
-          <w:rStyle w:val="NormalTok"/>
-        </w:rPr>
-        <w:t xml:space="preserve"> </w:t>
-      </w:r>
-      <w:r>
-        <w:rPr>
-          <w:rStyle w:val="KeywordTok"/>
-        </w:rPr>
-        <w:t>in</w:t>
-      </w:r>
-      <w:r>
-        <w:rPr>
-          <w:rStyle w:val="NormalTok"/>
-        </w:rPr>
-        <w:t xml:space="preserve"> s.name ]))</w:t>
-      </w:r>
     </w:p>
+    <w:tbl>
+      <w:tblPr>
+        <w:tblStyle w:val="NoGridLeft"/>
+        <w:tblW w:w="0" w:type="auto"/>
+        <w:tblLook w:val="04A0" w:firstRow="1" w:lastRow="0" w:firstColumn="1" w:lastColumn="0" w:noHBand="0" w:noVBand="1"/>
+      </w:tblPr>
+      <w:tblGrid>
+        <w:gridCol w:w="8878"/>
+      </w:tblGrid>
+      <w:tr>
+        <w:tc>
+          <w:tcPr>
+            <w:tcW w:w="8878" w:type="dxa"/>
+          </w:tcPr>
+          <w:p>
+            <w:pPr>
+              <w:pStyle w:val="SourceCode"/>
+            </w:pPr>
+            <w:r>
+              <w:rPr>
+                <w:rStyle w:val="ImportTok"/>
+              </w:rPr>
+              <w:t>import</w:t>
+            </w:r>
+            <w:r>
+              <w:rPr>
+                <w:rStyle w:val="NormalTok"/>
+              </w:rPr>
+              <w:t xml:space="preserve"> pprint</w:t>
+            </w:r>
+            <w:r>
+              <w:br/>
+            </w:r>
+            <w:r>
+              <w:rPr>
+                <w:rStyle w:val="ImportTok"/>
+              </w:rPr>
+              <w:t>import</w:t>
+            </w:r>
+            <w:r>
+              <w:rPr>
+                <w:rStyle w:val="NormalTok"/>
+              </w:rPr>
+              <w:t xml:space="preserve"> docx</w:t>
+            </w:r>
+            <w:r>
+              <w:br/>
+            </w:r>
+            <w:r>
+              <w:br/>
+            </w:r>
+            <w:r>
+              <w:rPr>
+                <w:rStyle w:val="NormalTok"/>
+              </w:rPr>
+              <w:t xml:space="preserve">d </w:t>
+            </w:r>
+            <w:r>
+              <w:rPr>
+                <w:rStyle w:val="OperatorTok"/>
+              </w:rPr>
+              <w:t>=</w:t>
+            </w:r>
+            <w:r>
+              <w:rPr>
+                <w:rStyle w:val="NormalTok"/>
+              </w:rPr>
+              <w:t xml:space="preserve"> docx.Document(</w:t>
+            </w:r>
+            <w:r>
+              <w:rPr>
+                <w:rStyle w:val="StringTok"/>
+              </w:rPr>
+              <w:t>"custom-reference.docx"</w:t>
+            </w:r>
+            <w:r>
+              <w:rPr>
+                <w:rStyle w:val="NormalTok"/>
+              </w:rPr>
+              <w:t>)</w:t>
+            </w:r>
+            <w:r>
+              <w:br/>
+            </w:r>
+            <w:r>
+              <w:rPr>
+                <w:rStyle w:val="NormalTok"/>
+              </w:rPr>
+              <w:t>pprint.pprint(</w:t>
+            </w:r>
+            <w:r>
+              <w:rPr>
+                <w:rStyle w:val="BuiltInTok"/>
+              </w:rPr>
+              <w:t>sorted</w:t>
+            </w:r>
+            <w:r>
+              <w:rPr>
+                <w:rStyle w:val="NormalTok"/>
+              </w:rPr>
+              <w:t xml:space="preserve">([s.name </w:t>
+            </w:r>
+            <w:r>
+              <w:rPr>
+                <w:rStyle w:val="ControlFlowTok"/>
+              </w:rPr>
+              <w:t>for</w:t>
+            </w:r>
+            <w:r>
+              <w:rPr>
+                <w:rStyle w:val="NormalTok"/>
+              </w:rPr>
+              <w:t xml:space="preserve"> s </w:t>
+            </w:r>
+            <w:r>
+              <w:rPr>
+                <w:rStyle w:val="KeywordTok"/>
+              </w:rPr>
+              <w:t>in</w:t>
+            </w:r>
+            <w:r>
+              <w:rPr>
+                <w:rStyle w:val="NormalTok"/>
+              </w:rPr>
+              <w:t xml:space="preserve"> d.styles </w:t>
+            </w:r>
+            <w:r>
+              <w:rPr>
+                <w:rStyle w:val="ControlFlowTok"/>
+              </w:rPr>
+              <w:t>if</w:t>
+            </w:r>
+            <w:r>
+              <w:rPr>
+                <w:rStyle w:val="NormalTok"/>
+              </w:rPr>
+              <w:t xml:space="preserve"> </w:t>
+            </w:r>
+            <w:r>
+              <w:rPr>
+                <w:rStyle w:val="StringTok"/>
+              </w:rPr>
+              <w:t>"Tok"</w:t>
+            </w:r>
+            <w:r>
+              <w:rPr>
+                <w:rStyle w:val="NormalTok"/>
+              </w:rPr>
+              <w:t xml:space="preserve"> </w:t>
+            </w:r>
+            <w:r>
+              <w:rPr>
+                <w:rStyle w:val="KeywordTok"/>
+              </w:rPr>
+              <w:t>in</w:t>
+            </w:r>
+            <w:r>
+              <w:rPr>
+                <w:rStyle w:val="NormalTok"/>
+              </w:rPr>
+              <w:t xml:space="preserve"> s.name ]))</w:t>
+            </w:r>
+          </w:p>
+        </w:tc>
+      </w:tr>
+    </w:tbl>
     <w:p>
       <w:pPr>
         <w:pStyle w:val="a1"/>
@@ -5181,7 +5203,7 @@
         <w:noProof/>
         <w:color w:val="0F243E" w:themeColor="text2" w:themeShade="80"/>
       </w:rPr>
-      <w:instrText>9</w:instrText>
+      <w:instrText>5</w:instrText>
     </w:r>
     <w:r>
       <w:rPr>
@@ -5210,7 +5232,7 @@
         <w:noProof/>
         <w:color w:val="0F243E" w:themeColor="text2" w:themeShade="80"/>
       </w:rPr>
-      <w:t>9</w:t>
+      <w:t>5</w:t>
     </w:r>
     <w:r>
       <w:rPr>
@@ -11754,7 +11776,7 @@
     <w:link w:val="a5"/>
     <w:autoRedefine/>
     <w:qFormat/>
-    <w:rsid w:val="00082EB2"/>
+    <w:rsid w:val="00BC526B"/>
   </w:style>
   <w:style w:type="paragraph" w:customStyle="1" w:styleId="FirstParagraph">
     <w:name w:val="First Paragraph"/>
@@ -12832,11 +12854,11 @@
     <w:name w:val="本文 (文字)"/>
     <w:basedOn w:val="a2"/>
     <w:link w:val="a1"/>
-    <w:rsid w:val="00082EB2"/>
+    <w:rsid w:val="00BC526B"/>
     <w:rPr>
       <w:rFonts w:ascii="Source Han Sans Regular" w:eastAsia="Source Han Sans Regular" w:hAnsi="Source Han Sans Regular" w:cs="Source Han Sans Regular"/>
       <w:sz w:val="18"/>
-      <w:szCs w:val="20"/>
+      <w:szCs w:val="18"/>
     </w:rPr>
   </w:style>
   <w:style w:type="paragraph" w:styleId="aff5">
@@ -13923,10 +13945,9 @@
     <w:name w:val="No Grid Left"/>
     <w:basedOn w:val="a3"/>
     <w:uiPriority w:val="99"/>
-    <w:rsid w:val="00C55C7E"/>
+    <w:rsid w:val="005B59A5"/>
     <w:pPr>
       <w:spacing w:after="0" w:line="240" w:lineRule="auto"/>
-      <w:jc w:val="both"/>
     </w:pPr>
     <w:rPr>
       <w:rFonts w:ascii="Source Han Sans JP" w:eastAsia="Source Han Sans JP" w:hAnsi="Source Han Sans JP" w:cs="Source Han Sans JP"/>

</xml_diff>

<commit_message>
update ref.docx - *Tok and Source Code styles' font changed to Source Han Code JP **R** not N
- otherwise Mac version can't handle it correctly
</commit_message>
<xml_diff>
--- a/system/ref.docx
+++ b/system/ref.docx
@@ -6,44 +6,24 @@
       <w:pPr>
         <w:pStyle w:val="Title"/>
       </w:pPr>
-      <w:r>
-        <w:fldChar w:fldCharType="begin"/>
-      </w:r>
-      <w:r>
-        <w:instrText>DOCPROPERTY  TITLE-META \* MERGEFORMAT</w:instrText>
-      </w:r>
-      <w:r>
-        <w:fldChar w:fldCharType="separate"/>
-      </w:r>
-      <w:r>
-        <w:rPr>
-          <w:rFonts w:hint="eastAsia"/>
-        </w:rPr>
-        <w:t>本のタイトル</w:t>
-      </w:r>
-      <w:r>
-        <w:fldChar w:fldCharType="end"/>
-      </w:r>
+      <w:fldSimple w:instr="DOCPROPERTY  TITLE-META \* MERGEFORMAT">
+        <w:r>
+          <w:rPr>
+            <w:rFonts w:hint="eastAsia"/>
+          </w:rPr>
+          <w:t>本のタイトル</w:t>
+        </w:r>
+      </w:fldSimple>
     </w:p>
     <w:p>
       <w:pPr>
         <w:pStyle w:val="Abstract"/>
       </w:pPr>
-      <w:r>
-        <w:fldChar w:fldCharType="begin"/>
-      </w:r>
-      <w:r>
-        <w:instrText xml:space="preserve"> DOCPROPERTY "subtitle-meta" \* MERGEFORMAT </w:instrText>
-      </w:r>
-      <w:r>
-        <w:fldChar w:fldCharType="separate"/>
-      </w:r>
-      <w:r>
-        <w:t>本の概要</w:t>
-      </w:r>
-      <w:r>
-        <w:fldChar w:fldCharType="end"/>
-      </w:r>
+      <w:fldSimple w:instr=" DOCPROPERTY &quot;subtitle-meta&quot; \* MERGEFORMAT ">
+        <w:r>
+          <w:t>本の概要</w:t>
+        </w:r>
+      </w:fldSimple>
     </w:p>
     <w:p>
       <w:pPr>
@@ -968,15 +948,7 @@
                 <w:noProof/>
                 <w:lang w:eastAsia="ja-JP"/>
               </w:rPr>
-              <w:t>にほん</w:t>
-            </w:r>
-            <w:r>
-              <w:rPr>
-                <w:rStyle w:val="Hyperlink"/>
-                <w:noProof/>
-                <w:lang w:eastAsia="ja-JP"/>
-              </w:rPr>
-              <w:t>ご</w:t>
+              <w:t>にほんご</w:t>
             </w:r>
             <w:r>
               <w:rPr>
@@ -2457,21 +2429,7 @@
               <w:rPr>
                 <w:rStyle w:val="NormalTok"/>
               </w:rPr>
-              <w:t xml:space="preserve"> </w:t>
-            </w:r>
-            <w:proofErr w:type="gramStart"/>
-            <w:r>
-              <w:rPr>
-                <w:rStyle w:val="NormalTok"/>
-              </w:rPr>
-              <w:t>docx.Document</w:t>
-            </w:r>
-            <w:proofErr w:type="gramEnd"/>
-            <w:r>
-              <w:rPr>
-                <w:rStyle w:val="NormalTok"/>
-              </w:rPr>
-              <w:t>(</w:t>
+              <w:t xml:space="preserve"> docx.Document(</w:t>
             </w:r>
             <w:r>
               <w:rPr>
@@ -2488,21 +2446,12 @@
             <w:r>
               <w:br/>
             </w:r>
-            <w:proofErr w:type="gramStart"/>
             <w:r>
               <w:rPr>
                 <w:rStyle w:val="NormalTok"/>
               </w:rPr>
-              <w:t>pprint.pprint</w:t>
-            </w:r>
-            <w:proofErr w:type="gramEnd"/>
-            <w:r>
-              <w:rPr>
-                <w:rStyle w:val="NormalTok"/>
-              </w:rPr>
-              <w:t>(</w:t>
-            </w:r>
-            <w:proofErr w:type="gramStart"/>
+              <w:t>pprint.pprint(</w:t>
+            </w:r>
             <w:r>
               <w:rPr>
                 <w:rStyle w:val="BuiltInTok"/>
@@ -2513,14 +2462,7 @@
               <w:rPr>
                 <w:rStyle w:val="NormalTok"/>
               </w:rPr>
-              <w:t>(</w:t>
-            </w:r>
-            <w:proofErr w:type="gramEnd"/>
-            <w:r>
-              <w:rPr>
-                <w:rStyle w:val="NormalTok"/>
-              </w:rPr>
-              <w:t xml:space="preserve">[s.name </w:t>
+              <w:t xml:space="preserve">([s.name </w:t>
             </w:r>
             <w:r>
               <w:rPr>
@@ -2544,16 +2486,14 @@
               <w:rPr>
                 <w:rStyle w:val="NormalTok"/>
               </w:rPr>
-              <w:t xml:space="preserve"> </w:t>
-            </w:r>
-            <w:proofErr w:type="gramStart"/>
+              <w:t xml:space="preserve"> d.styles </w:t>
+            </w:r>
             <w:r>
               <w:rPr>
-                <w:rStyle w:val="NormalTok"/>
+                <w:rStyle w:val="ControlFlowTok"/>
               </w:rPr>
-              <w:t>d.styles</w:t>
-            </w:r>
-            <w:proofErr w:type="gramEnd"/>
+              <w:t>if</w:t>
+            </w:r>
             <w:r>
               <w:rPr>
                 <w:rStyle w:val="NormalTok"/>
@@ -2562,9 +2502,9 @@
             </w:r>
             <w:r>
               <w:rPr>
-                <w:rStyle w:val="ControlFlowTok"/>
+                <w:rStyle w:val="StringTok"/>
               </w:rPr>
-              <w:t>if</w:t>
+              <w:t>"Tok"</w:t>
             </w:r>
             <w:r>
               <w:rPr>
@@ -2574,18 +2514,6 @@
             </w:r>
             <w:r>
               <w:rPr>
-                <w:rStyle w:val="StringTok"/>
-              </w:rPr>
-              <w:t>"Tok"</w:t>
-            </w:r>
-            <w:r>
-              <w:rPr>
-                <w:rStyle w:val="NormalTok"/>
-              </w:rPr>
-              <w:t xml:space="preserve"> </w:t>
-            </w:r>
-            <w:r>
-              <w:rPr>
                 <w:rStyle w:val="KeywordTok"/>
               </w:rPr>
               <w:t>in</w:t>
@@ -2628,14 +2556,12 @@
       <w:r>
         <w:br/>
       </w:r>
-      <w:proofErr w:type="spellStart"/>
       <w:r>
         <w:rPr>
           <w:rStyle w:val="AlertTok"/>
         </w:rPr>
         <w:t>AlertTok</w:t>
       </w:r>
-      <w:proofErr w:type="spellEnd"/>
       <w:r>
         <w:rPr>
           <w:rStyle w:val="AlertTok"/>
@@ -2647,14 +2573,12 @@
       <w:r>
         <w:br/>
       </w:r>
-      <w:proofErr w:type="spellStart"/>
       <w:r>
         <w:rPr>
           <w:rStyle w:val="AnnotationTok"/>
         </w:rPr>
         <w:t>AnnotationTok</w:t>
       </w:r>
-      <w:proofErr w:type="spellEnd"/>
       <w:r>
         <w:rPr>
           <w:rStyle w:val="AnnotationTok"/>
@@ -2666,7 +2590,6 @@
       <w:r>
         <w:br/>
       </w:r>
-      <w:proofErr w:type="spellStart"/>
       <w:r>
         <w:rPr>
           <w:rStyle w:val="AttributeTok"/>
@@ -2679,11 +2602,9 @@
         </w:rPr>
         <w:t>にほんご</w:t>
       </w:r>
-      <w:proofErr w:type="spellEnd"/>
-      <w:r>
-        <w:br/>
-      </w:r>
-      <w:proofErr w:type="spellStart"/>
+      <w:r>
+        <w:br/>
+      </w:r>
       <w:r>
         <w:rPr>
           <w:rStyle w:val="BaseNTok"/>
@@ -2696,11 +2617,9 @@
         </w:rPr>
         <w:t>にほんご</w:t>
       </w:r>
-      <w:proofErr w:type="spellEnd"/>
-      <w:r>
-        <w:br/>
-      </w:r>
-      <w:proofErr w:type="spellStart"/>
+      <w:r>
+        <w:br/>
+      </w:r>
       <w:r>
         <w:rPr>
           <w:rStyle w:val="BuiltInTok"/>
@@ -2713,11 +2632,9 @@
         </w:rPr>
         <w:t>にほんご</w:t>
       </w:r>
-      <w:proofErr w:type="spellEnd"/>
-      <w:r>
-        <w:br/>
-      </w:r>
-      <w:proofErr w:type="spellStart"/>
+      <w:r>
+        <w:br/>
+      </w:r>
       <w:r>
         <w:rPr>
           <w:rStyle w:val="CharTok"/>
@@ -2730,11 +2647,9 @@
         </w:rPr>
         <w:t>にほんご</w:t>
       </w:r>
-      <w:proofErr w:type="spellEnd"/>
-      <w:r>
-        <w:br/>
-      </w:r>
-      <w:proofErr w:type="spellStart"/>
+      <w:r>
+        <w:br/>
+      </w:r>
       <w:r>
         <w:rPr>
           <w:rStyle w:val="CommentTok"/>
@@ -2747,7 +2662,6 @@
         </w:rPr>
         <w:t>にほんご</w:t>
       </w:r>
-      <w:proofErr w:type="spellEnd"/>
       <w:r>
         <w:rPr>
           <w:rStyle w:val="CommentTok"/>
@@ -2759,7 +2673,6 @@
       <w:r>
         <w:br/>
       </w:r>
-      <w:proofErr w:type="spellStart"/>
       <w:r>
         <w:rPr>
           <w:rStyle w:val="CommentVarTok"/>
@@ -2772,11 +2685,9 @@
         </w:rPr>
         <w:t>にほんご</w:t>
       </w:r>
-      <w:proofErr w:type="spellEnd"/>
-      <w:r>
-        <w:br/>
-      </w:r>
-      <w:proofErr w:type="spellStart"/>
+      <w:r>
+        <w:br/>
+      </w:r>
       <w:r>
         <w:rPr>
           <w:rStyle w:val="ConstantTok"/>
@@ -2789,11 +2700,9 @@
         </w:rPr>
         <w:t>にほんご</w:t>
       </w:r>
-      <w:proofErr w:type="spellEnd"/>
-      <w:r>
-        <w:br/>
-      </w:r>
-      <w:proofErr w:type="spellStart"/>
+      <w:r>
+        <w:br/>
+      </w:r>
       <w:r>
         <w:rPr>
           <w:rStyle w:val="ControlFlowTok"/>
@@ -2806,11 +2715,9 @@
         </w:rPr>
         <w:t>にほんご</w:t>
       </w:r>
-      <w:proofErr w:type="spellEnd"/>
-      <w:r>
-        <w:br/>
-      </w:r>
-      <w:proofErr w:type="spellStart"/>
+      <w:r>
+        <w:br/>
+      </w:r>
       <w:r>
         <w:rPr>
           <w:rStyle w:val="DataTypeTok"/>
@@ -2823,11 +2730,9 @@
         </w:rPr>
         <w:t>にほんご</w:t>
       </w:r>
-      <w:proofErr w:type="spellEnd"/>
-      <w:r>
-        <w:br/>
-      </w:r>
-      <w:proofErr w:type="spellStart"/>
+      <w:r>
+        <w:br/>
+      </w:r>
       <w:r>
         <w:rPr>
           <w:rStyle w:val="DecValTok"/>
@@ -2840,11 +2745,9 @@
         </w:rPr>
         <w:t>にほんご</w:t>
       </w:r>
-      <w:proofErr w:type="spellEnd"/>
-      <w:r>
-        <w:br/>
-      </w:r>
-      <w:proofErr w:type="spellStart"/>
+      <w:r>
+        <w:br/>
+      </w:r>
       <w:r>
         <w:rPr>
           <w:rStyle w:val="DocumentationTok"/>
@@ -2857,11 +2760,9 @@
         </w:rPr>
         <w:t>にほんご</w:t>
       </w:r>
-      <w:proofErr w:type="spellEnd"/>
-      <w:r>
-        <w:br/>
-      </w:r>
-      <w:proofErr w:type="spellStart"/>
+      <w:r>
+        <w:br/>
+      </w:r>
       <w:r>
         <w:rPr>
           <w:rStyle w:val="ErrorTok"/>
@@ -2880,11 +2781,9 @@
         </w:rPr>
         <w:t>にほんご</w:t>
       </w:r>
-      <w:proofErr w:type="spellEnd"/>
-      <w:r>
-        <w:br/>
-      </w:r>
-      <w:proofErr w:type="spellStart"/>
+      <w:r>
+        <w:br/>
+      </w:r>
       <w:r>
         <w:rPr>
           <w:rStyle w:val="ExtensionTok"/>
@@ -2897,11 +2796,9 @@
         </w:rPr>
         <w:t>にほんご</w:t>
       </w:r>
-      <w:proofErr w:type="spellEnd"/>
-      <w:r>
-        <w:br/>
-      </w:r>
-      <w:proofErr w:type="spellStart"/>
+      <w:r>
+        <w:br/>
+      </w:r>
       <w:r>
         <w:rPr>
           <w:rStyle w:val="FloatTok"/>
@@ -2914,11 +2811,9 @@
         </w:rPr>
         <w:t>にほんご</w:t>
       </w:r>
-      <w:proofErr w:type="spellEnd"/>
-      <w:r>
-        <w:br/>
-      </w:r>
-      <w:proofErr w:type="spellStart"/>
+      <w:r>
+        <w:br/>
+      </w:r>
       <w:r>
         <w:rPr>
           <w:rStyle w:val="FunctionTok"/>
@@ -2931,11 +2826,9 @@
         </w:rPr>
         <w:t>にほんご</w:t>
       </w:r>
-      <w:proofErr w:type="spellEnd"/>
-      <w:r>
-        <w:br/>
-      </w:r>
-      <w:proofErr w:type="spellStart"/>
+      <w:r>
+        <w:br/>
+      </w:r>
       <w:r>
         <w:rPr>
           <w:rStyle w:val="ImportTok"/>
@@ -2948,11 +2841,9 @@
         </w:rPr>
         <w:t>にほんご</w:t>
       </w:r>
-      <w:proofErr w:type="spellEnd"/>
-      <w:r>
-        <w:br/>
-      </w:r>
-      <w:proofErr w:type="spellStart"/>
+      <w:r>
+        <w:br/>
+      </w:r>
       <w:r>
         <w:rPr>
           <w:rStyle w:val="InformationTok"/>
@@ -2965,11 +2856,9 @@
         </w:rPr>
         <w:t>にほんご</w:t>
       </w:r>
-      <w:proofErr w:type="spellEnd"/>
-      <w:r>
-        <w:br/>
-      </w:r>
-      <w:proofErr w:type="spellStart"/>
+      <w:r>
+        <w:br/>
+      </w:r>
       <w:r>
         <w:rPr>
           <w:rStyle w:val="KeywordTok"/>
@@ -2982,11 +2871,9 @@
         </w:rPr>
         <w:t>にほんご</w:t>
       </w:r>
-      <w:proofErr w:type="spellEnd"/>
-      <w:r>
-        <w:br/>
-      </w:r>
-      <w:proofErr w:type="spellStart"/>
+      <w:r>
+        <w:br/>
+      </w:r>
       <w:r>
         <w:rPr>
           <w:rStyle w:val="NormalTok"/>
@@ -2999,11 +2886,9 @@
         </w:rPr>
         <w:t>にほんご</w:t>
       </w:r>
-      <w:proofErr w:type="spellEnd"/>
-      <w:r>
-        <w:br/>
-      </w:r>
-      <w:proofErr w:type="spellStart"/>
+      <w:r>
+        <w:br/>
+      </w:r>
       <w:r>
         <w:rPr>
           <w:rStyle w:val="OperatorTok"/>
@@ -3016,11 +2901,9 @@
         </w:rPr>
         <w:t>にほんご</w:t>
       </w:r>
-      <w:proofErr w:type="spellEnd"/>
-      <w:r>
-        <w:br/>
-      </w:r>
-      <w:proofErr w:type="spellStart"/>
+      <w:r>
+        <w:br/>
+      </w:r>
       <w:r>
         <w:rPr>
           <w:rStyle w:val="OtherTok"/>
@@ -3033,11 +2916,9 @@
         </w:rPr>
         <w:t>にほんご</w:t>
       </w:r>
-      <w:proofErr w:type="spellEnd"/>
-      <w:r>
-        <w:br/>
-      </w:r>
-      <w:proofErr w:type="spellStart"/>
+      <w:r>
+        <w:br/>
+      </w:r>
       <w:r>
         <w:rPr>
           <w:rStyle w:val="PreprocessorTok"/>
@@ -3050,11 +2931,9 @@
         </w:rPr>
         <w:t>にほんご</w:t>
       </w:r>
-      <w:proofErr w:type="spellEnd"/>
-      <w:r>
-        <w:br/>
-      </w:r>
-      <w:proofErr w:type="spellStart"/>
+      <w:r>
+        <w:br/>
+      </w:r>
       <w:r>
         <w:rPr>
           <w:rStyle w:val="RegionMarkerTok"/>
@@ -3067,11 +2946,9 @@
         </w:rPr>
         <w:t>にほんご</w:t>
       </w:r>
-      <w:proofErr w:type="spellEnd"/>
-      <w:r>
-        <w:br/>
-      </w:r>
-      <w:proofErr w:type="spellStart"/>
+      <w:r>
+        <w:br/>
+      </w:r>
       <w:r>
         <w:rPr>
           <w:rStyle w:val="SpecialCharTok"/>
@@ -3084,11 +2961,9 @@
         </w:rPr>
         <w:t>にほんご</w:t>
       </w:r>
-      <w:proofErr w:type="spellEnd"/>
-      <w:r>
-        <w:br/>
-      </w:r>
-      <w:proofErr w:type="spellStart"/>
+      <w:r>
+        <w:br/>
+      </w:r>
       <w:r>
         <w:rPr>
           <w:rStyle w:val="SpecialStringTok"/>
@@ -3101,11 +2976,9 @@
         </w:rPr>
         <w:t>にほんご</w:t>
       </w:r>
-      <w:proofErr w:type="spellEnd"/>
-      <w:r>
-        <w:br/>
-      </w:r>
-      <w:proofErr w:type="spellStart"/>
+      <w:r>
+        <w:br/>
+      </w:r>
       <w:r>
         <w:rPr>
           <w:rStyle w:val="StringTok"/>
@@ -3118,11 +2991,9 @@
         </w:rPr>
         <w:t>にほんご</w:t>
       </w:r>
-      <w:proofErr w:type="spellEnd"/>
-      <w:r>
-        <w:br/>
-      </w:r>
-      <w:proofErr w:type="spellStart"/>
+      <w:r>
+        <w:br/>
+      </w:r>
       <w:r>
         <w:rPr>
           <w:rStyle w:val="VariableTok"/>
@@ -3135,11 +3006,9 @@
         </w:rPr>
         <w:t>にほんご</w:t>
       </w:r>
-      <w:proofErr w:type="spellEnd"/>
-      <w:r>
-        <w:br/>
-      </w:r>
-      <w:proofErr w:type="spellStart"/>
+      <w:r>
+        <w:br/>
+      </w:r>
       <w:r>
         <w:rPr>
           <w:rStyle w:val="VerbatimStringTok"/>
@@ -3152,16 +3021,13 @@
         </w:rPr>
         <w:t>にほんご</w:t>
       </w:r>
-      <w:proofErr w:type="spellEnd"/>
-      <w:r>
-        <w:br/>
-      </w:r>
-      <w:proofErr w:type="spellStart"/>
+      <w:r>
+        <w:br/>
+      </w:r>
       <w:r>
         <w:rPr>
           <w:rStyle w:val="WarningTok"/>
         </w:rPr>
-        <w:lastRenderedPageBreak/>
         <w:t>WarningTok</w:t>
       </w:r>
       <w:r>
@@ -3170,7 +3036,6 @@
         </w:rPr>
         <w:t>にほんご</w:t>
       </w:r>
-      <w:proofErr w:type="spellEnd"/>
       <w:r>
         <w:br/>
       </w:r>
@@ -3180,22 +3045,18 @@
         <w:pStyle w:val="SourceCode"/>
       </w:pPr>
       <w:r>
-        <w:t xml:space="preserve">This is a </w:t>
-      </w:r>
-      <w:proofErr w:type="spellStart"/>
-      <w:r>
-        <w:t>pen</w:t>
+        <w:t>This is a pen</w:t>
       </w:r>
       <w:r>
         <w:t>にほんご</w:t>
       </w:r>
-      <w:proofErr w:type="spellEnd"/>
     </w:p>
     <w:p>
       <w:pPr>
         <w:pStyle w:val="BodyText"/>
       </w:pPr>
       <w:r>
+        <w:lastRenderedPageBreak/>
         <w:br/>
       </w:r>
     </w:p>
@@ -4191,16 +4052,8 @@
           <w:rStyle w:val="CommentTok"/>
         </w:rPr>
         <w:tab/>
-        <w:t xml:space="preserve">pip3 </w:t>
-      </w:r>
-      <w:proofErr w:type="gramStart"/>
-      <w:r>
-        <w:rPr>
-          <w:rStyle w:val="CommentTok"/>
-        </w:rPr>
-        <w:t>install .</w:t>
-      </w:r>
-      <w:proofErr w:type="gramEnd"/>
+        <w:t>pip3 install .</w:t>
+      </w:r>
       <w:r>
         <w:br/>
       </w:r>
@@ -4402,7 +4255,6 @@
         <w:rPr>
           <w:vertAlign w:val="subscript"/>
         </w:rPr>
-        <w:lastRenderedPageBreak/>
         <w:t>▼</w:t>
       </w:r>
       <w:r>
@@ -4429,6 +4281,7 @@
         <w:rPr>
           <w:rStyle w:val="CommentTok"/>
         </w:rPr>
+        <w:lastRenderedPageBreak/>
         <w:t>See:</w:t>
       </w:r>
       <w:r>
@@ -5166,18 +5019,18 @@
         <w:tblLook w:val="0600" w:firstRow="0" w:lastRow="0" w:firstColumn="0" w:lastColumn="0" w:noHBand="1" w:noVBand="1"/>
       </w:tblPr>
       <w:tblGrid>
-        <w:gridCol w:w="4620"/>
-        <w:gridCol w:w="762"/>
+        <w:gridCol w:w="4514"/>
+        <w:gridCol w:w="760"/>
         <w:gridCol w:w="673"/>
-        <w:gridCol w:w="230"/>
-        <w:gridCol w:w="230"/>
-        <w:gridCol w:w="230"/>
-        <w:gridCol w:w="230"/>
-        <w:gridCol w:w="230"/>
-        <w:gridCol w:w="230"/>
-        <w:gridCol w:w="230"/>
-        <w:gridCol w:w="230"/>
-        <w:gridCol w:w="230"/>
+        <w:gridCol w:w="242"/>
+        <w:gridCol w:w="242"/>
+        <w:gridCol w:w="242"/>
+        <w:gridCol w:w="242"/>
+        <w:gridCol w:w="242"/>
+        <w:gridCol w:w="242"/>
+        <w:gridCol w:w="242"/>
+        <w:gridCol w:w="242"/>
+        <w:gridCol w:w="242"/>
       </w:tblGrid>
       <w:tr>
         <w:tc>
@@ -5319,13 +5172,8 @@
             <w:pPr>
               <w:pStyle w:val="SourceCode"/>
             </w:pPr>
-            <w:proofErr w:type="gramStart"/>
-            <w:r>
-              <w:t>Left</w:t>
-            </w:r>
-            <w:proofErr w:type="gramEnd"/>
-            <w:r>
-              <w:t xml:space="preserve"> Left Left Left Left Left Left Left Left</w:t>
+            <w:r>
+              <w:t>Left Left Left Left Left Left Left Left Left</w:t>
             </w:r>
           </w:p>
           <w:p>
@@ -7311,23 +7159,11 @@
           <w:pPr>
             <w:pStyle w:val="Footer"/>
           </w:pPr>
-          <w:r>
-            <w:fldChar w:fldCharType="begin"/>
-          </w:r>
-          <w:r>
-            <w:instrText xml:space="preserve"> DOCPROPERTY "year" \* MERGEFORMAT </w:instrText>
-          </w:r>
-          <w:r>
-            <w:fldChar w:fldCharType="separate"/>
-          </w:r>
-          <w:proofErr w:type="spellStart"/>
-          <w:r>
-            <w:t>出版年</w:t>
-          </w:r>
-          <w:proofErr w:type="spellEnd"/>
-          <w:r>
-            <w:fldChar w:fldCharType="end"/>
-          </w:r>
+          <w:fldSimple w:instr=" DOCPROPERTY &quot;year&quot; \* MERGEFORMAT ">
+            <w:r>
+              <w:t>出版年</w:t>
+            </w:r>
+          </w:fldSimple>
         </w:p>
       </w:tc>
     </w:tr>
@@ -10784,9 +10620,9 @@
     <w:basedOn w:val="DefaultParagraphFont"/>
     <w:uiPriority w:val="1"/>
     <w:qFormat/>
-    <w:rsid w:val="007328FC"/>
+    <w:rsid w:val="00473132"/>
     <w:rPr>
-      <w:rFonts w:ascii="源ノ角ゴシック Code JP N" w:eastAsia="源ノ角ゴシック Code JP N" w:hAnsi="源ノ角ゴシック Code JP N" w:cs="源ノ角ゴシック Code JP N"/>
+      <w:rFonts w:ascii="源ノ角ゴシック Code JP R" w:eastAsia="源ノ角ゴシック Code JP R" w:hAnsi="源ノ角ゴシック Code JP R" w:cs="源ノ角ゴシック Code JP R"/>
       <w:bdr w:val="none" w:sz="0" w:space="0" w:color="auto"/>
       <w:shd w:val="clear" w:color="A6A6A6" w:themeColor="background1" w:themeShade="A6" w:fill="F2F2F2" w:themeFill="background1" w:themeFillShade="F2"/>
     </w:rPr>
@@ -11864,15 +11700,15 @@
     <w:next w:val="BodyText"/>
     <w:autoRedefine/>
     <w:qFormat/>
-    <w:rsid w:val="008E07E9"/>
+    <w:rsid w:val="00F216FF"/>
     <w:pPr>
       <w:shd w:val="clear" w:color="auto" w:fill="F2F2F2" w:themeFill="background1" w:themeFillShade="F2"/>
       <w:spacing w:before="100" w:beforeAutospacing="1" w:line="180" w:lineRule="auto"/>
     </w:pPr>
     <w:rPr>
       <w:rFonts w:ascii="源ノ角ゴシック Code JP R" w:eastAsia="源ノ角ゴシック Code JP R" w:hAnsi="源ノ角ゴシック Code JP R" w:cs="源ノ角ゴシック Code JP R"/>
-      <w:sz w:val="13"/>
-      <w:szCs w:val="13"/>
+      <w:sz w:val="12"/>
+      <w:szCs w:val="12"/>
     </w:rPr>
   </w:style>
   <w:style w:type="paragraph" w:customStyle="1" w:styleId="FigureCaption">
@@ -12005,9 +11841,9 @@
     <w:name w:val="BaseNTok"/>
     <w:basedOn w:val="VerbatimChar"/>
     <w:qFormat/>
-    <w:rsid w:val="00437774"/>
+    <w:rsid w:val="00337499"/>
     <w:rPr>
-      <w:rFonts w:ascii="源ノ角ゴシック Code JP N" w:eastAsia="源ノ角ゴシック Code JP N" w:hAnsi="源ノ角ゴシック Code JP N" w:cs="源ノ角ゴシック Code JP N"/>
+      <w:rFonts w:ascii="源ノ角ゴシック Code JP R" w:eastAsia="源ノ角ゴシック Code JP R" w:hAnsi="源ノ角ゴシック Code JP R" w:cs="源ノ角ゴシック Code JP R"/>
       <w:color w:val="B08000"/>
       <w:bdr w:val="none" w:sz="0" w:space="0" w:color="auto"/>
       <w:shd w:val="clear" w:color="auto" w:fill="auto"/>
@@ -12017,9 +11853,9 @@
     <w:name w:val="BuiltInTok"/>
     <w:basedOn w:val="VerbatimChar"/>
     <w:qFormat/>
-    <w:rsid w:val="00B00515"/>
+    <w:rsid w:val="001D7C26"/>
     <w:rPr>
-      <w:rFonts w:ascii="源ノ角ゴシック Code JP N" w:eastAsia="源ノ角ゴシック Code JP N" w:hAnsi="源ノ角ゴシック Code JP N" w:cs="源ノ角ゴシック Code JP N"/>
+      <w:rFonts w:ascii="源ノ角ゴシック Code JP R" w:eastAsia="源ノ角ゴシック Code JP R" w:hAnsi="源ノ角ゴシック Code JP R" w:cs="源ノ角ゴシック Code JP R"/>
       <w:b/>
       <w:color w:val="644A9B"/>
       <w:bdr w:val="none" w:sz="0" w:space="0" w:color="auto"/>
@@ -12030,9 +11866,9 @@
     <w:name w:val="DataTypeTok"/>
     <w:basedOn w:val="VerbatimChar"/>
     <w:qFormat/>
-    <w:rsid w:val="00940FE1"/>
+    <w:rsid w:val="0012680E"/>
     <w:rPr>
-      <w:rFonts w:ascii="源ノ角ゴシック Code JP N" w:eastAsia="源ノ角ゴシック Code JP N" w:hAnsi="源ノ角ゴシック Code JP N" w:cs="源ノ角ゴシック Code JP N"/>
+      <w:rFonts w:ascii="源ノ角ゴシック Code JP R" w:eastAsia="源ノ角ゴシック Code JP R" w:hAnsi="源ノ角ゴシック Code JP R" w:cs="源ノ角ゴシック Code JP R"/>
       <w:color w:val="0057AE"/>
       <w:bdr w:val="none" w:sz="0" w:space="0" w:color="auto"/>
       <w:shd w:val="clear" w:color="auto" w:fill="auto"/>
@@ -12042,9 +11878,9 @@
     <w:name w:val="ExtensionTok"/>
     <w:basedOn w:val="VerbatimChar"/>
     <w:qFormat/>
-    <w:rsid w:val="00B00515"/>
+    <w:rsid w:val="00996914"/>
     <w:rPr>
-      <w:rFonts w:ascii="源ノ角ゴシック Code JP N" w:eastAsia="源ノ角ゴシック Code JP N" w:hAnsi="源ノ角ゴシック Code JP N" w:cs="源ノ角ゴシック Code JP N"/>
+      <w:rFonts w:ascii="源ノ角ゴシック Code JP R" w:eastAsia="源ノ角ゴシック Code JP R" w:hAnsi="源ノ角ゴシック Code JP R" w:cs="源ノ角ゴシック Code JP R"/>
       <w:b/>
       <w:color w:val="0095FF"/>
       <w:bdr w:val="none" w:sz="0" w:space="0" w:color="auto"/>
@@ -12055,9 +11891,9 @@
     <w:name w:val="FunctionTok"/>
     <w:basedOn w:val="VerbatimChar"/>
     <w:qFormat/>
-    <w:rsid w:val="00D77177"/>
+    <w:rsid w:val="009C107D"/>
     <w:rPr>
-      <w:rFonts w:ascii="源ノ角ゴシック Code JP N" w:eastAsia="源ノ角ゴシック Code JP N" w:hAnsi="源ノ角ゴシック Code JP N" w:cs="源ノ角ゴシック Code JP N"/>
+      <w:rFonts w:ascii="源ノ角ゴシック Code JP R" w:eastAsia="源ノ角ゴシック Code JP R" w:hAnsi="源ノ角ゴシック Code JP R" w:cs="源ノ角ゴシック Code JP R"/>
       <w:color w:val="644A9B"/>
       <w:bdr w:val="none" w:sz="0" w:space="0" w:color="auto"/>
       <w:shd w:val="clear" w:color="auto" w:fill="auto"/>
@@ -12067,9 +11903,9 @@
     <w:name w:val="ImportTok"/>
     <w:basedOn w:val="VerbatimChar"/>
     <w:qFormat/>
-    <w:rsid w:val="00D77177"/>
+    <w:rsid w:val="006555A3"/>
     <w:rPr>
-      <w:rFonts w:ascii="源ノ角ゴシック Code JP N" w:eastAsia="源ノ角ゴシック Code JP N" w:hAnsi="源ノ角ゴシック Code JP N" w:cs="源ノ角ゴシック Code JP N"/>
+      <w:rFonts w:ascii="源ノ角ゴシック Code JP R" w:eastAsia="源ノ角ゴシック Code JP R" w:hAnsi="源ノ角ゴシック Code JP R" w:cs="源ノ角ゴシック Code JP R"/>
       <w:color w:val="FF5500"/>
       <w:bdr w:val="none" w:sz="0" w:space="0" w:color="auto"/>
       <w:shd w:val="clear" w:color="auto" w:fill="auto"/>
@@ -12079,9 +11915,9 @@
     <w:name w:val="InformationTok"/>
     <w:basedOn w:val="VerbatimChar"/>
     <w:qFormat/>
-    <w:rsid w:val="00D77177"/>
+    <w:rsid w:val="00B02E0E"/>
     <w:rPr>
-      <w:rFonts w:ascii="源ノ角ゴシック Code JP N" w:eastAsia="源ノ角ゴシック Code JP N" w:hAnsi="源ノ角ゴシック Code JP N" w:cs="源ノ角ゴシック Code JP N"/>
+      <w:rFonts w:ascii="源ノ角ゴシック Code JP R" w:eastAsia="源ノ角ゴシック Code JP R" w:hAnsi="源ノ角ゴシック Code JP R" w:cs="源ノ角ゴシック Code JP R"/>
       <w:color w:val="B08000"/>
       <w:bdr w:val="none" w:sz="0" w:space="0" w:color="auto"/>
       <w:shd w:val="clear" w:color="auto" w:fill="auto"/>
@@ -12091,9 +11927,9 @@
     <w:name w:val="KeywordTok"/>
     <w:basedOn w:val="VerbatimChar"/>
     <w:qFormat/>
-    <w:rsid w:val="00D77177"/>
+    <w:rsid w:val="00B02E0E"/>
     <w:rPr>
-      <w:rFonts w:ascii="源ノ角ゴシック Code JP N" w:eastAsia="源ノ角ゴシック Code JP N" w:hAnsi="源ノ角ゴシック Code JP N" w:cs="源ノ角ゴシック Code JP N"/>
+      <w:rFonts w:ascii="源ノ角ゴシック Code JP R" w:eastAsia="源ノ角ゴシック Code JP R" w:hAnsi="源ノ角ゴシック Code JP R" w:cs="源ノ角ゴシック Code JP R"/>
       <w:b/>
       <w:color w:val="1F1C1B"/>
       <w:bdr w:val="none" w:sz="0" w:space="0" w:color="auto"/>
@@ -12104,9 +11940,9 @@
     <w:name w:val="NormalTok"/>
     <w:basedOn w:val="VerbatimChar"/>
     <w:qFormat/>
-    <w:rsid w:val="00437774"/>
+    <w:rsid w:val="00B02E0E"/>
     <w:rPr>
-      <w:rFonts w:ascii="源ノ角ゴシック Code JP N" w:eastAsia="源ノ角ゴシック Code JP N" w:hAnsi="源ノ角ゴシック Code JP N" w:cs="源ノ角ゴシック Code JP N"/>
+      <w:rFonts w:ascii="源ノ角ゴシック Code JP R" w:eastAsia="源ノ角ゴシック Code JP R" w:hAnsi="源ノ角ゴシック Code JP R" w:cs="源ノ角ゴシック Code JP R"/>
       <w:color w:val="1F1C1B"/>
       <w:bdr w:val="none" w:sz="0" w:space="0" w:color="auto"/>
       <w:shd w:val="clear" w:color="auto" w:fill="auto"/>
@@ -12116,9 +11952,9 @@
     <w:name w:val="OperatorTok"/>
     <w:basedOn w:val="VerbatimChar"/>
     <w:qFormat/>
-    <w:rsid w:val="00940FE1"/>
+    <w:rsid w:val="003321D3"/>
     <w:rPr>
-      <w:rFonts w:ascii="源ノ角ゴシック Code JP N" w:eastAsia="源ノ角ゴシック Code JP N" w:hAnsi="源ノ角ゴシック Code JP N" w:cs="源ノ角ゴシック Code JP N"/>
+      <w:rFonts w:ascii="源ノ角ゴシック Code JP R" w:eastAsia="源ノ角ゴシック Code JP R" w:hAnsi="源ノ角ゴシック Code JP R" w:cs="源ノ角ゴシック Code JP R"/>
       <w:color w:val="1F1C1B"/>
       <w:bdr w:val="none" w:sz="0" w:space="0" w:color="auto"/>
       <w:shd w:val="clear" w:color="auto" w:fill="auto"/>
@@ -12128,9 +11964,9 @@
     <w:name w:val="OtherTok"/>
     <w:basedOn w:val="VerbatimChar"/>
     <w:qFormat/>
-    <w:rsid w:val="00940FE1"/>
+    <w:rsid w:val="005C3901"/>
     <w:rPr>
-      <w:rFonts w:ascii="源ノ角ゴシック Code JP N" w:eastAsia="源ノ角ゴシック Code JP N" w:hAnsi="源ノ角ゴシック Code JP N" w:cs="源ノ角ゴシック Code JP N"/>
+      <w:rFonts w:ascii="源ノ角ゴシック Code JP R" w:eastAsia="源ノ角ゴシック Code JP R" w:hAnsi="源ノ角ゴシック Code JP R" w:cs="源ノ角ゴシック Code JP R"/>
       <w:color w:val="006E28"/>
       <w:bdr w:val="none" w:sz="0" w:space="0" w:color="auto"/>
       <w:shd w:val="thinDiagStripe" w:color="A6A6A6" w:themeColor="background1" w:themeShade="A6" w:fill="auto"/>
@@ -12140,9 +11976,9 @@
     <w:name w:val="PreprocessorTok"/>
     <w:basedOn w:val="VerbatimChar"/>
     <w:qFormat/>
-    <w:rsid w:val="00D77177"/>
+    <w:rsid w:val="005C3901"/>
     <w:rPr>
-      <w:rFonts w:ascii="源ノ角ゴシック Code JP N" w:eastAsia="源ノ角ゴシック Code JP N" w:hAnsi="源ノ角ゴシック Code JP N" w:cs="源ノ角ゴシック Code JP N"/>
+      <w:rFonts w:ascii="源ノ角ゴシック Code JP R" w:eastAsia="源ノ角ゴシック Code JP R" w:hAnsi="源ノ角ゴシック Code JP R" w:cs="源ノ角ゴシック Code JP R"/>
       <w:color w:val="006E28"/>
       <w:bdr w:val="none" w:sz="0" w:space="0" w:color="auto"/>
       <w:shd w:val="clear" w:color="auto" w:fill="auto"/>
@@ -12152,9 +11988,9 @@
     <w:name w:val="RegionMarkerTok"/>
     <w:basedOn w:val="VerbatimChar"/>
     <w:qFormat/>
-    <w:rsid w:val="00940FE1"/>
+    <w:rsid w:val="00EE05DA"/>
     <w:rPr>
-      <w:rFonts w:ascii="源ノ角ゴシック Code JP N" w:eastAsia="源ノ角ゴシック Code JP N" w:hAnsi="源ノ角ゴシック Code JP N" w:cs="源ノ角ゴシック Code JP N"/>
+      <w:rFonts w:ascii="源ノ角ゴシック Code JP R" w:eastAsia="源ノ角ゴシック Code JP R" w:hAnsi="源ノ角ゴシック Code JP R" w:cs="源ノ角ゴシック Code JP R"/>
       <w:color w:val="0057AE"/>
       <w:bdr w:val="none" w:sz="0" w:space="0" w:color="auto"/>
       <w:shd w:val="clear" w:color="auto" w:fill="E0E9F8"/>
@@ -12164,9 +12000,9 @@
     <w:name w:val="SpecialCharTok"/>
     <w:basedOn w:val="VerbatimChar"/>
     <w:qFormat/>
-    <w:rsid w:val="00940FE1"/>
+    <w:rsid w:val="00615BAA"/>
     <w:rPr>
-      <w:rFonts w:ascii="源ノ角ゴシック Code JP N" w:eastAsia="源ノ角ゴシック Code JP N" w:hAnsi="源ノ角ゴシック Code JP N" w:cs="源ノ角ゴシック Code JP N"/>
+      <w:rFonts w:ascii="源ノ角ゴシック Code JP R" w:eastAsia="源ノ角ゴシック Code JP R" w:hAnsi="源ノ角ゴシック Code JP R" w:cs="源ノ角ゴシック Code JP R"/>
       <w:color w:val="3DAEE9"/>
       <w:bdr w:val="none" w:sz="0" w:space="0" w:color="auto"/>
       <w:shd w:val="clear" w:color="auto" w:fill="auto"/>
@@ -12176,9 +12012,9 @@
     <w:name w:val="SpecialStringTok"/>
     <w:basedOn w:val="VerbatimChar"/>
     <w:qFormat/>
-    <w:rsid w:val="00940FE1"/>
+    <w:rsid w:val="00E210BF"/>
     <w:rPr>
-      <w:rFonts w:ascii="源ノ角ゴシック Code JP N" w:eastAsia="源ノ角ゴシック Code JP N" w:hAnsi="源ノ角ゴシック Code JP N" w:cs="源ノ角ゴシック Code JP N"/>
+      <w:rFonts w:ascii="源ノ角ゴシック Code JP R" w:eastAsia="源ノ角ゴシック Code JP R" w:hAnsi="源ノ角ゴシック Code JP R" w:cs="源ノ角ゴシック Code JP R"/>
       <w:color w:val="FF5500"/>
       <w:bdr w:val="none" w:sz="0" w:space="0" w:color="auto"/>
       <w:shd w:val="clear" w:color="auto" w:fill="auto"/>
@@ -12188,9 +12024,9 @@
     <w:name w:val="StringTok"/>
     <w:basedOn w:val="VerbatimChar"/>
     <w:qFormat/>
-    <w:rsid w:val="008E07E9"/>
+    <w:rsid w:val="00E210BF"/>
     <w:rPr>
-      <w:rFonts w:ascii="源ノ角ゴシック Code JP N" w:eastAsia="源ノ角ゴシック Code JP N" w:hAnsi="源ノ角ゴシック Code JP N" w:cs="源ノ角ゴシック Code JP N"/>
+      <w:rFonts w:ascii="源ノ角ゴシック Code JP R" w:eastAsia="源ノ角ゴシック Code JP R" w:hAnsi="源ノ角ゴシック Code JP R" w:cs="源ノ角ゴシック Code JP R"/>
       <w:color w:val="BF0303"/>
       <w:bdr w:val="none" w:sz="0" w:space="0" w:color="auto"/>
       <w:shd w:val="clear" w:color="auto" w:fill="auto"/>
@@ -12200,9 +12036,9 @@
     <w:name w:val="AnnotationTok"/>
     <w:basedOn w:val="VerbatimChar"/>
     <w:qFormat/>
-    <w:rsid w:val="00437774"/>
+    <w:rsid w:val="00473132"/>
     <w:rPr>
-      <w:rFonts w:ascii="源ノ角ゴシック Code JP N" w:eastAsia="源ノ角ゴシック Code JP N" w:hAnsi="源ノ角ゴシック Code JP N" w:cs="源ノ角ゴシック Code JP N"/>
+      <w:rFonts w:ascii="源ノ角ゴシック Code JP R" w:eastAsia="源ノ角ゴシック Code JP R" w:hAnsi="源ノ角ゴシック Code JP R" w:cs="源ノ角ゴシック Code JP R"/>
       <w:color w:val="CA60CA"/>
       <w:bdr w:val="none" w:sz="0" w:space="0" w:color="auto"/>
       <w:shd w:val="clear" w:color="auto" w:fill="auto"/>
@@ -12212,9 +12048,9 @@
     <w:name w:val="AttributeTok"/>
     <w:basedOn w:val="VerbatimChar"/>
     <w:qFormat/>
-    <w:rsid w:val="00437774"/>
+    <w:rsid w:val="00E704CD"/>
     <w:rPr>
-      <w:rFonts w:ascii="源ノ角ゴシック Code JP N" w:eastAsia="源ノ角ゴシック Code JP N" w:hAnsi="源ノ角ゴシック Code JP N" w:cs="源ノ角ゴシック Code JP N"/>
+      <w:rFonts w:ascii="源ノ角ゴシック Code JP R" w:eastAsia="源ノ角ゴシック Code JP R" w:hAnsi="源ノ角ゴシック Code JP R" w:cs="源ノ角ゴシック Code JP R"/>
       <w:color w:val="0057AE"/>
       <w:bdr w:val="none" w:sz="0" w:space="0" w:color="auto"/>
       <w:shd w:val="clear" w:color="auto" w:fill="auto"/>
@@ -12224,9 +12060,9 @@
     <w:name w:val="CharTok"/>
     <w:basedOn w:val="VerbatimChar"/>
     <w:qFormat/>
-    <w:rsid w:val="008E07E9"/>
+    <w:rsid w:val="00AE7E04"/>
     <w:rPr>
-      <w:rFonts w:ascii="源ノ角ゴシック Code JP N" w:eastAsia="源ノ角ゴシック Code JP N" w:hAnsi="源ノ角ゴシック Code JP N" w:cs="源ノ角ゴシック Code JP N"/>
+      <w:rFonts w:ascii="源ノ角ゴシック Code JP R" w:eastAsia="源ノ角ゴシック Code JP R" w:hAnsi="源ノ角ゴシック Code JP R" w:cs="源ノ角ゴシック Code JP R"/>
       <w:color w:val="924C9D"/>
       <w:bdr w:val="none" w:sz="0" w:space="0" w:color="auto"/>
       <w:shd w:val="clear" w:color="auto" w:fill="auto"/>
@@ -12236,9 +12072,9 @@
     <w:name w:val="CommentTok"/>
     <w:basedOn w:val="VerbatimChar"/>
     <w:qFormat/>
-    <w:rsid w:val="008E07E9"/>
+    <w:rsid w:val="00AE7E04"/>
     <w:rPr>
-      <w:rFonts w:ascii="源ノ角ゴシック Code JP N" w:eastAsia="源ノ角ゴシック Code JP N" w:hAnsi="源ノ角ゴシック Code JP N" w:cs="源ノ角ゴシック Code JP N"/>
+      <w:rFonts w:ascii="源ノ角ゴシック Code JP R" w:eastAsia="源ノ角ゴシック Code JP R" w:hAnsi="源ノ角ゴシック Code JP R" w:cs="源ノ角ゴシック Code JP R"/>
       <w:color w:val="898887"/>
       <w:bdr w:val="none" w:sz="0" w:space="0" w:color="auto"/>
       <w:shd w:val="clear" w:color="auto" w:fill="auto"/>
@@ -12248,9 +12084,9 @@
     <w:name w:val="ControlFlowTok"/>
     <w:basedOn w:val="VerbatimChar"/>
     <w:qFormat/>
-    <w:rsid w:val="00940FE1"/>
+    <w:rsid w:val="008855F5"/>
     <w:rPr>
-      <w:rFonts w:ascii="源ノ角ゴシック Code JP N" w:eastAsia="源ノ角ゴシック Code JP N" w:hAnsi="源ノ角ゴシック Code JP N" w:cs="源ノ角ゴシック Code JP N"/>
+      <w:rFonts w:ascii="源ノ角ゴシック Code JP R" w:eastAsia="源ノ角ゴシック Code JP R" w:hAnsi="源ノ角ゴシック Code JP R" w:cs="源ノ角ゴシック Code JP R"/>
       <w:b/>
       <w:color w:val="1F1C1B"/>
       <w:bdr w:val="none" w:sz="0" w:space="0" w:color="auto"/>
@@ -12261,9 +12097,9 @@
     <w:name w:val="DecValTok"/>
     <w:basedOn w:val="VerbatimChar"/>
     <w:qFormat/>
-    <w:rsid w:val="00B00515"/>
+    <w:rsid w:val="0012680E"/>
     <w:rPr>
-      <w:rFonts w:ascii="源ノ角ゴシック Code JP N" w:eastAsia="源ノ角ゴシック Code JP N" w:hAnsi="源ノ角ゴシック Code JP N" w:cs="源ノ角ゴシック Code JP N"/>
+      <w:rFonts w:ascii="源ノ角ゴシック Code JP R" w:eastAsia="源ノ角ゴシック Code JP R" w:hAnsi="源ノ角ゴシック Code JP R" w:cs="源ノ角ゴシック Code JP R"/>
       <w:color w:val="B08000"/>
       <w:bdr w:val="none" w:sz="0" w:space="0" w:color="auto"/>
       <w:shd w:val="clear" w:color="auto" w:fill="auto"/>
@@ -12273,9 +12109,9 @@
     <w:name w:val="ErrorTok"/>
     <w:basedOn w:val="VerbatimChar"/>
     <w:qFormat/>
-    <w:rsid w:val="00B00515"/>
+    <w:rsid w:val="0012680E"/>
     <w:rPr>
-      <w:rFonts w:ascii="源ノ角ゴシック Code JP N" w:eastAsia="源ノ角ゴシック Code JP N" w:hAnsi="源ノ角ゴシック Code JP N" w:cs="源ノ角ゴシック Code JP N"/>
+      <w:rFonts w:ascii="源ノ角ゴシック Code JP R" w:eastAsia="源ノ角ゴシック Code JP R" w:hAnsi="源ノ角ゴシック Code JP R" w:cs="源ノ角ゴシック Code JP R"/>
       <w:color w:val="BF0303"/>
       <w:bdr w:val="none" w:sz="0" w:space="0" w:color="auto"/>
       <w:shd w:val="clear" w:color="auto" w:fill="auto"/>
@@ -12285,9 +12121,9 @@
     <w:name w:val="FloatTok"/>
     <w:basedOn w:val="VerbatimChar"/>
     <w:qFormat/>
-    <w:rsid w:val="00B00515"/>
+    <w:rsid w:val="00D8116A"/>
     <w:rPr>
-      <w:rFonts w:ascii="源ノ角ゴシック Code JP N" w:eastAsia="源ノ角ゴシック Code JP N" w:hAnsi="源ノ角ゴシック Code JP N" w:cs="源ノ角ゴシック Code JP N"/>
+      <w:rFonts w:ascii="源ノ角ゴシック Code JP R" w:eastAsia="源ノ角ゴシック Code JP R" w:hAnsi="源ノ角ゴシック Code JP R" w:cs="源ノ角ゴシック Code JP R"/>
       <w:color w:val="B08000"/>
       <w:bdr w:val="none" w:sz="0" w:space="0" w:color="auto"/>
       <w:shd w:val="clear" w:color="auto" w:fill="auto"/>
@@ -12297,9 +12133,9 @@
     <w:name w:val="VerbatimStringTok"/>
     <w:basedOn w:val="VerbatimChar"/>
     <w:qFormat/>
-    <w:rsid w:val="008E07E9"/>
+    <w:rsid w:val="003D25B4"/>
     <w:rPr>
-      <w:rFonts w:ascii="源ノ角ゴシック Code JP N" w:eastAsia="源ノ角ゴシック Code JP N" w:hAnsi="源ノ角ゴシック Code JP N" w:cs="源ノ角ゴシック Code JP N"/>
+      <w:rFonts w:ascii="源ノ角ゴシック Code JP R" w:eastAsia="源ノ角ゴシック Code JP R" w:hAnsi="源ノ角ゴシック Code JP R" w:cs="源ノ角ゴシック Code JP R"/>
       <w:color w:val="BF0303"/>
       <w:bdr w:val="none" w:sz="0" w:space="0" w:color="auto"/>
       <w:shd w:val="clear" w:color="auto" w:fill="auto"/>
@@ -12309,9 +12145,9 @@
     <w:name w:val="WarningTok"/>
     <w:basedOn w:val="VerbatimChar"/>
     <w:qFormat/>
-    <w:rsid w:val="008E07E9"/>
+    <w:rsid w:val="00F216FF"/>
     <w:rPr>
-      <w:rFonts w:ascii="源ノ角ゴシック Code JP N" w:eastAsia="源ノ角ゴシック Code JP N" w:hAnsi="源ノ角ゴシック Code JP N" w:cs="源ノ角ゴシック Code JP N"/>
+      <w:rFonts w:ascii="源ノ角ゴシック Code JP R" w:eastAsia="源ノ角ゴシック Code JP R" w:hAnsi="源ノ角ゴシック Code JP R" w:cs="源ノ角ゴシック Code JP R"/>
       <w:color w:val="BF0303"/>
       <w:bdr w:val="none" w:sz="0" w:space="0" w:color="auto"/>
       <w:shd w:val="clear" w:color="auto" w:fill="auto"/>
@@ -12321,9 +12157,9 @@
     <w:name w:val="VariableTok"/>
     <w:basedOn w:val="VerbatimChar"/>
     <w:qFormat/>
-    <w:rsid w:val="008E07E9"/>
+    <w:rsid w:val="003D25B4"/>
     <w:rPr>
-      <w:rFonts w:ascii="源ノ角ゴシック Code JP N" w:eastAsia="源ノ角ゴシック Code JP N" w:hAnsi="源ノ角ゴシック Code JP N" w:cs="源ノ角ゴシック Code JP N"/>
+      <w:rFonts w:ascii="源ノ角ゴシック Code JP R" w:eastAsia="源ノ角ゴシック Code JP R" w:hAnsi="源ノ角ゴシック Code JP R" w:cs="源ノ角ゴシック Code JP R"/>
       <w:color w:val="0057AE"/>
       <w:bdr w:val="none" w:sz="0" w:space="0" w:color="auto"/>
       <w:shd w:val="clear" w:color="auto" w:fill="auto"/>
@@ -12348,9 +12184,9 @@
   <w:style w:type="character" w:customStyle="1" w:styleId="AlertTok">
     <w:name w:val="AlertTok"/>
     <w:basedOn w:val="VerbatimChar"/>
-    <w:rsid w:val="00375533"/>
+    <w:rsid w:val="00473132"/>
     <w:rPr>
-      <w:rFonts w:ascii="源ノ角ゴシック Code JP N" w:eastAsia="源ノ角ゴシック Code JP N" w:hAnsi="源ノ角ゴシック Code JP N" w:cs="源ノ角ゴシック Code JP N"/>
+      <w:rFonts w:ascii="源ノ角ゴシック Code JP N" w:eastAsia="源ノ角ゴシック Code JP R" w:hAnsi="源ノ角ゴシック Code JP N" w:cs="源ノ角ゴシック Code JP N"/>
       <w:b/>
       <w:color w:val="BF0303"/>
       <w:bdr w:val="none" w:sz="0" w:space="0" w:color="auto"/>
@@ -12361,9 +12197,9 @@
     <w:name w:val="CommentVarTok"/>
     <w:basedOn w:val="VerbatimChar"/>
     <w:qFormat/>
-    <w:rsid w:val="00B00515"/>
+    <w:rsid w:val="008B0874"/>
     <w:rPr>
-      <w:rFonts w:ascii="源ノ角ゴシック Code JP N" w:eastAsia="源ノ角ゴシック Code JP N" w:hAnsi="源ノ角ゴシック Code JP N" w:cs="源ノ角ゴシック Code JP N"/>
+      <w:rFonts w:ascii="源ノ角ゴシック Code JP R" w:eastAsia="源ノ角ゴシック Code JP R" w:hAnsi="源ノ角ゴシック Code JP R" w:cs="源ノ角ゴシック Code JP R"/>
       <w:color w:val="0095FF"/>
       <w:bdr w:val="none" w:sz="0" w:space="0" w:color="auto"/>
       <w:shd w:val="clear" w:color="auto" w:fill="auto"/>
@@ -12373,9 +12209,9 @@
     <w:name w:val="ConstantTok"/>
     <w:basedOn w:val="VerbatimChar"/>
     <w:qFormat/>
-    <w:rsid w:val="00B00515"/>
+    <w:rsid w:val="00F37B2D"/>
     <w:rPr>
-      <w:rFonts w:ascii="源ノ角ゴシック Code JP N" w:eastAsia="源ノ角ゴシック Code JP N" w:hAnsi="源ノ角ゴシック Code JP N" w:cs="源ノ角ゴシック Code JP N"/>
+      <w:rFonts w:ascii="源ノ角ゴシック Code JP R" w:eastAsia="源ノ角ゴシック Code JP R" w:hAnsi="源ノ角ゴシック Code JP R" w:cs="源ノ角ゴシック Code JP R"/>
       <w:color w:val="AA5500"/>
       <w:bdr w:val="none" w:sz="0" w:space="0" w:color="auto"/>
       <w:shd w:val="clear" w:color="auto" w:fill="auto"/>
@@ -12385,9 +12221,9 @@
     <w:name w:val="DocumentationTok"/>
     <w:basedOn w:val="VerbatimChar"/>
     <w:qFormat/>
-    <w:rsid w:val="00940FE1"/>
+    <w:rsid w:val="0012680E"/>
     <w:rPr>
-      <w:rFonts w:ascii="源ノ角ゴシック Code JP N" w:eastAsia="源ノ角ゴシック Code JP N" w:hAnsi="源ノ角ゴシック Code JP N" w:cs="源ノ角ゴシック Code JP N"/>
+      <w:rFonts w:ascii="源ノ角ゴシック Code JP R" w:eastAsia="源ノ角ゴシック Code JP R" w:hAnsi="源ノ角ゴシック Code JP R" w:cs="源ノ角ゴシック Code JP R"/>
       <w:color w:val="607880"/>
       <w:bdr w:val="none" w:sz="0" w:space="0" w:color="auto"/>
       <w:shd w:val="clear" w:color="auto" w:fill="auto"/>

</xml_diff>

<commit_message>
update ref.docx - Font fix for *Tok and Source Code
- Font names set in Windows are not compatible with Mac version Word
</commit_message>
<xml_diff>
--- a/system/ref.docx
+++ b/system/ref.docx
@@ -4,46 +4,26 @@
   <w:body>
     <w:p>
       <w:pPr>
-        <w:pStyle w:val="Title"/>
-      </w:pPr>
-      <w:r>
-        <w:fldChar w:fldCharType="begin"/>
-      </w:r>
-      <w:r>
-        <w:instrText>DOCPROPERTY  TITLE-META \* MERGEFORMAT</w:instrText>
-      </w:r>
-      <w:r>
-        <w:fldChar w:fldCharType="separate"/>
-      </w:r>
-      <w:r>
-        <w:rPr>
-          <w:rFonts w:hint="eastAsia"/>
-        </w:rPr>
-        <w:t>本のタイトル</w:t>
-      </w:r>
-      <w:r>
-        <w:fldChar w:fldCharType="end"/>
-      </w:r>
+        <w:pStyle w:val="a6"/>
+      </w:pPr>
+      <w:fldSimple w:instr="DOCPROPERTY  TITLE-META \* MERGEFORMAT">
+        <w:r>
+          <w:rPr>
+            <w:rFonts w:hint="eastAsia"/>
+          </w:rPr>
+          <w:t>本のタイトル</w:t>
+        </w:r>
+      </w:fldSimple>
     </w:p>
     <w:p>
       <w:pPr>
         <w:pStyle w:val="Abstract"/>
       </w:pPr>
-      <w:r>
-        <w:fldChar w:fldCharType="begin"/>
-      </w:r>
-      <w:r>
-        <w:instrText xml:space="preserve"> DOCPROPERTY "subtitle-meta" \* MERGEFORMAT </w:instrText>
-      </w:r>
-      <w:r>
-        <w:fldChar w:fldCharType="separate"/>
-      </w:r>
-      <w:r>
-        <w:t>本の概要</w:t>
-      </w:r>
-      <w:r>
-        <w:fldChar w:fldCharType="end"/>
-      </w:r>
+      <w:fldSimple w:instr=" DOCPROPERTY &quot;subtitle-meta&quot; \* MERGEFORMAT ">
+        <w:r>
+          <w:t>本の概要</w:t>
+        </w:r>
+      </w:fldSimple>
     </w:p>
     <w:p>
       <w:pPr>
@@ -83,7 +63,7 @@
     </w:p>
     <w:p>
       <w:pPr>
-        <w:pStyle w:val="BodyText"/>
+        <w:pStyle w:val="a1"/>
         <w:rPr>
           <w:lang w:eastAsia="ja-JP"/>
         </w:rPr>
@@ -97,7 +77,7 @@
     </w:p>
     <w:p>
       <w:pPr>
-        <w:pStyle w:val="TOCHeading"/>
+        <w:pStyle w:val="af2"/>
       </w:pPr>
       <w:r>
         <w:lastRenderedPageBreak/>
@@ -132,7 +112,7 @@
       <w:sdtContent>
         <w:p>
           <w:pPr>
-            <w:pStyle w:val="TOC1"/>
+            <w:pStyle w:val="12"/>
             <w:rPr>
               <w:rFonts w:asciiTheme="minorHAnsi" w:eastAsiaTheme="minorEastAsia" w:hAnsiTheme="minorHAnsi" w:cstheme="minorBidi"/>
               <w:noProof/>
@@ -169,7 +149,7 @@
           <w:hyperlink w:anchor="_Toc135490218" w:history="1">
             <w:r>
               <w:rPr>
-                <w:rStyle w:val="Hyperlink"/>
+                <w:rStyle w:val="af1"/>
                 <w:noProof/>
                 <w:lang w:eastAsia="ja-JP"/>
               </w:rPr>
@@ -227,7 +207,7 @@
         </w:p>
         <w:p>
           <w:pPr>
-            <w:pStyle w:val="TOC2"/>
+            <w:pStyle w:val="27"/>
             <w:tabs>
               <w:tab w:val="right" w:leader="dot" w:pos="8148"/>
             </w:tabs>
@@ -245,7 +225,7 @@
           <w:hyperlink w:anchor="_Toc135490219" w:history="1">
             <w:r>
               <w:rPr>
-                <w:rStyle w:val="Hyperlink"/>
+                <w:rStyle w:val="af1"/>
                 <w:noProof/>
               </w:rPr>
               <w:t>&lt;Heading Unnumbered 2&gt;</w:t>
@@ -302,7 +282,7 @@
         </w:p>
         <w:p>
           <w:pPr>
-            <w:pStyle w:val="TOC3"/>
+            <w:pStyle w:val="33"/>
             <w:tabs>
               <w:tab w:val="right" w:leader="dot" w:pos="8148"/>
             </w:tabs>
@@ -319,7 +299,7 @@
           <w:hyperlink w:anchor="_Toc135490220" w:history="1">
             <w:r>
               <w:rPr>
-                <w:rStyle w:val="Hyperlink"/>
+                <w:rStyle w:val="af1"/>
                 <w:noProof/>
               </w:rPr>
               <w:t>&lt;Heading Unnumbered 3&gt;</w:t>
@@ -376,7 +356,7 @@
         </w:p>
         <w:p>
           <w:pPr>
-            <w:pStyle w:val="TOC1"/>
+            <w:pStyle w:val="12"/>
             <w:rPr>
               <w:rFonts w:asciiTheme="minorHAnsi" w:eastAsiaTheme="minorEastAsia" w:hAnsiTheme="minorHAnsi" w:cstheme="minorBidi"/>
               <w:noProof/>
@@ -390,7 +370,7 @@
           <w:hyperlink w:anchor="_Toc135490221" w:history="1">
             <w:r>
               <w:rPr>
-                <w:rStyle w:val="Hyperlink"/>
+                <w:rStyle w:val="af1"/>
                 <w:noProof/>
               </w:rPr>
               <w:t>1</w:t>
@@ -409,14 +389,14 @@
             </w:r>
             <w:r>
               <w:rPr>
-                <w:rStyle w:val="Hyperlink"/>
+                <w:rStyle w:val="af1"/>
                 <w:noProof/>
               </w:rPr>
               <w:t xml:space="preserve">&lt;Heading </w:t>
             </w:r>
             <w:r>
               <w:rPr>
-                <w:rStyle w:val="Hyperlink"/>
+                <w:rStyle w:val="af1"/>
                 <w:noProof/>
                 <w:lang w:eastAsia="ja-JP"/>
               </w:rPr>
@@ -424,7 +404,7 @@
             </w:r>
             <w:r>
               <w:rPr>
-                <w:rStyle w:val="Hyperlink"/>
+                <w:rStyle w:val="af1"/>
                 <w:noProof/>
               </w:rPr>
               <w:t>1&gt;</w:t>
@@ -481,7 +461,7 @@
         </w:p>
         <w:p>
           <w:pPr>
-            <w:pStyle w:val="TOC2"/>
+            <w:pStyle w:val="27"/>
             <w:tabs>
               <w:tab w:val="left" w:pos="800"/>
               <w:tab w:val="right" w:leader="dot" w:pos="8148"/>
@@ -500,7 +480,7 @@
           <w:hyperlink w:anchor="_Toc135490222" w:history="1">
             <w:r>
               <w:rPr>
-                <w:rStyle w:val="Hyperlink"/>
+                <w:rStyle w:val="af1"/>
                 <w:noProof/>
               </w:rPr>
               <w:t>1.1</w:t>
@@ -520,14 +500,14 @@
             </w:r>
             <w:r>
               <w:rPr>
-                <w:rStyle w:val="Hyperlink"/>
+                <w:rStyle w:val="af1"/>
                 <w:noProof/>
               </w:rPr>
               <w:t xml:space="preserve">&lt;Heading </w:t>
             </w:r>
             <w:r>
               <w:rPr>
-                <w:rStyle w:val="Hyperlink"/>
+                <w:rStyle w:val="af1"/>
                 <w:noProof/>
                 <w:lang w:eastAsia="ja-JP"/>
               </w:rPr>
@@ -535,7 +515,7 @@
             </w:r>
             <w:r>
               <w:rPr>
-                <w:rStyle w:val="Hyperlink"/>
+                <w:rStyle w:val="af1"/>
                 <w:noProof/>
               </w:rPr>
               <w:t>2&gt;</w:t>
@@ -592,7 +572,7 @@
         </w:p>
         <w:p>
           <w:pPr>
-            <w:pStyle w:val="TOC3"/>
+            <w:pStyle w:val="33"/>
             <w:tabs>
               <w:tab w:val="left" w:pos="1200"/>
               <w:tab w:val="right" w:leader="dot" w:pos="8148"/>
@@ -610,7 +590,7 @@
           <w:hyperlink w:anchor="_Toc135490223" w:history="1">
             <w:r>
               <w:rPr>
-                <w:rStyle w:val="Hyperlink"/>
+                <w:rStyle w:val="af1"/>
                 <w:noProof/>
               </w:rPr>
               <w:t>1.1.1</w:t>
@@ -629,14 +609,14 @@
             </w:r>
             <w:r>
               <w:rPr>
-                <w:rStyle w:val="Hyperlink"/>
+                <w:rStyle w:val="af1"/>
                 <w:noProof/>
               </w:rPr>
               <w:t xml:space="preserve">&lt;Heading </w:t>
             </w:r>
             <w:r>
               <w:rPr>
-                <w:rStyle w:val="Hyperlink"/>
+                <w:rStyle w:val="af1"/>
                 <w:noProof/>
                 <w:lang w:eastAsia="ja-JP"/>
               </w:rPr>
@@ -644,7 +624,7 @@
             </w:r>
             <w:r>
               <w:rPr>
-                <w:rStyle w:val="Hyperlink"/>
+                <w:rStyle w:val="af1"/>
                 <w:noProof/>
               </w:rPr>
               <w:t>3&gt;</w:t>
@@ -701,7 +681,7 @@
         </w:p>
         <w:p>
           <w:pPr>
-            <w:pStyle w:val="TOC1"/>
+            <w:pStyle w:val="12"/>
             <w:tabs>
               <w:tab w:val="left" w:pos="1600"/>
             </w:tabs>
@@ -718,7 +698,7 @@
           <w:hyperlink w:anchor="_Toc135490224" w:history="1">
             <w:r>
               <w:rPr>
-                <w:rStyle w:val="Hyperlink"/>
+                <w:rStyle w:val="af1"/>
                 <w:noProof/>
               </w:rPr>
               <w:t>Appendix A.</w:t>
@@ -737,14 +717,14 @@
             </w:r>
             <w:r>
               <w:rPr>
-                <w:rStyle w:val="Hyperlink"/>
+                <w:rStyle w:val="af1"/>
                 <w:noProof/>
               </w:rPr>
               <w:t xml:space="preserve">&lt;Appendix </w:t>
             </w:r>
             <w:r>
               <w:rPr>
-                <w:rStyle w:val="Hyperlink"/>
+                <w:rStyle w:val="af1"/>
                 <w:noProof/>
                 <w:lang w:eastAsia="ja-JP"/>
               </w:rPr>
@@ -752,7 +732,7 @@
             </w:r>
             <w:r>
               <w:rPr>
-                <w:rStyle w:val="Hyperlink"/>
+                <w:rStyle w:val="af1"/>
                 <w:noProof/>
               </w:rPr>
               <w:t>Title&gt;</w:t>
@@ -809,7 +789,7 @@
         </w:p>
         <w:p>
           <w:pPr>
-            <w:pStyle w:val="TOC2"/>
+            <w:pStyle w:val="27"/>
             <w:tabs>
               <w:tab w:val="left" w:pos="800"/>
               <w:tab w:val="right" w:leader="dot" w:pos="8148"/>
@@ -828,7 +808,7 @@
           <w:hyperlink w:anchor="_Toc135490225" w:history="1">
             <w:r>
               <w:rPr>
-                <w:rStyle w:val="Hyperlink"/>
+                <w:rStyle w:val="af1"/>
                 <w:noProof/>
               </w:rPr>
               <w:t>A.1.</w:t>
@@ -848,14 +828,14 @@
             </w:r>
             <w:r>
               <w:rPr>
-                <w:rStyle w:val="Hyperlink"/>
+                <w:rStyle w:val="af1"/>
                 <w:noProof/>
               </w:rPr>
               <w:t xml:space="preserve">&lt;Appendix </w:t>
             </w:r>
             <w:r>
               <w:rPr>
-                <w:rStyle w:val="Hyperlink"/>
+                <w:rStyle w:val="af1"/>
                 <w:noProof/>
                 <w:lang w:eastAsia="ja-JP"/>
               </w:rPr>
@@ -863,7 +843,7 @@
             </w:r>
             <w:r>
               <w:rPr>
-                <w:rStyle w:val="Hyperlink"/>
+                <w:rStyle w:val="af1"/>
                 <w:noProof/>
               </w:rPr>
               <w:t>Subsection&gt;</w:t>
@@ -920,7 +900,7 @@
         </w:p>
         <w:p>
           <w:pPr>
-            <w:pStyle w:val="TOC3"/>
+            <w:pStyle w:val="33"/>
             <w:tabs>
               <w:tab w:val="left" w:pos="1200"/>
               <w:tab w:val="right" w:leader="dot" w:pos="8148"/>
@@ -938,7 +918,7 @@
           <w:hyperlink w:anchor="_Toc135490226" w:history="1">
             <w:r>
               <w:rPr>
-                <w:rStyle w:val="Hyperlink"/>
+                <w:rStyle w:val="af1"/>
                 <w:noProof/>
               </w:rPr>
               <w:t>A.1.1</w:t>
@@ -957,30 +937,22 @@
             </w:r>
             <w:r>
               <w:rPr>
-                <w:rStyle w:val="Hyperlink"/>
+                <w:rStyle w:val="af1"/>
                 <w:noProof/>
               </w:rPr>
               <w:t xml:space="preserve">&lt;Appendix </w:t>
             </w:r>
             <w:r>
               <w:rPr>
-                <w:rStyle w:val="Hyperlink"/>
+                <w:rStyle w:val="af1"/>
                 <w:noProof/>
                 <w:lang w:eastAsia="ja-JP"/>
               </w:rPr>
-              <w:t>にほん</w:t>
+              <w:t>にほんご</w:t>
             </w:r>
             <w:r>
               <w:rPr>
-                <w:rStyle w:val="Hyperlink"/>
-                <w:noProof/>
-                <w:lang w:eastAsia="ja-JP"/>
-              </w:rPr>
-              <w:t>ご</w:t>
-            </w:r>
-            <w:r>
-              <w:rPr>
-                <w:rStyle w:val="Hyperlink"/>
+                <w:rStyle w:val="af1"/>
                 <w:noProof/>
               </w:rPr>
               <w:t>Heading 3&gt;</w:t>
@@ -1044,7 +1016,7 @@
     </w:sdt>
     <w:p>
       <w:pPr>
-        <w:pStyle w:val="BodyText"/>
+        <w:pStyle w:val="a1"/>
       </w:pPr>
       <w:r>
         <w:br w:type="page"/>
@@ -1120,7 +1092,7 @@
     <w:bookmarkEnd w:id="6"/>
     <w:p>
       <w:pPr>
-        <w:pStyle w:val="BodyText"/>
+        <w:pStyle w:val="a1"/>
       </w:pPr>
       <w:r>
         <w:br w:type="page"/>
@@ -1128,7 +1100,7 @@
     </w:p>
     <w:p>
       <w:pPr>
-        <w:pStyle w:val="Heading1"/>
+        <w:pStyle w:val="1"/>
       </w:pPr>
       <w:bookmarkStart w:id="7" w:name="heading-1"/>
       <w:bookmarkStart w:id="8" w:name="_Toc135490221"/>
@@ -1154,7 +1126,7 @@
     </w:p>
     <w:p>
       <w:pPr>
-        <w:pStyle w:val="Heading2"/>
+        <w:pStyle w:val="20"/>
       </w:pPr>
       <w:bookmarkStart w:id="9" w:name="heading-2"/>
       <w:bookmarkStart w:id="10" w:name="_Toc135490222"/>
@@ -1176,7 +1148,7 @@
     </w:p>
     <w:p>
       <w:pPr>
-        <w:pStyle w:val="Heading3"/>
+        <w:pStyle w:val="31"/>
       </w:pPr>
       <w:bookmarkStart w:id="11" w:name="heading-3"/>
       <w:bookmarkStart w:id="12" w:name="_Toc135490223"/>
@@ -1198,7 +1170,7 @@
     </w:p>
     <w:p>
       <w:pPr>
-        <w:pStyle w:val="Heading4"/>
+        <w:pStyle w:val="40"/>
       </w:pPr>
       <w:bookmarkStart w:id="13" w:name="heading-4"/>
       <w:r>
@@ -1218,7 +1190,7 @@
     </w:p>
     <w:p>
       <w:pPr>
-        <w:pStyle w:val="Heading5"/>
+        <w:pStyle w:val="5"/>
       </w:pPr>
       <w:bookmarkStart w:id="14" w:name="heading-5"/>
       <w:r>
@@ -1238,7 +1210,7 @@
     </w:p>
     <w:p>
       <w:pPr>
-        <w:pStyle w:val="BodyText"/>
+        <w:pStyle w:val="a1"/>
       </w:pPr>
       <w:r>
         <w:t>&lt;Body</w:t>
@@ -1288,18 +1260,18 @@
     </w:p>
     <w:tbl>
       <w:tblPr>
-        <w:tblStyle w:val="PlainTable4"/>
+        <w:tblStyle w:val="43"/>
         <w:tblW w:w="0" w:type="pct"/>
         <w:tblLook w:val="0620" w:firstRow="1" w:lastRow="0" w:firstColumn="0" w:lastColumn="0" w:noHBand="1" w:noVBand="1"/>
       </w:tblPr>
       <w:tblGrid>
-        <w:gridCol w:w="2583"/>
-        <w:gridCol w:w="2807"/>
-        <w:gridCol w:w="656"/>
-        <w:gridCol w:w="656"/>
-        <w:gridCol w:w="656"/>
-        <w:gridCol w:w="656"/>
-        <w:gridCol w:w="656"/>
+        <w:gridCol w:w="2501"/>
+        <w:gridCol w:w="2739"/>
+        <w:gridCol w:w="660"/>
+        <w:gridCol w:w="660"/>
+        <w:gridCol w:w="660"/>
+        <w:gridCol w:w="660"/>
+        <w:gridCol w:w="660"/>
       </w:tblGrid>
       <w:tr>
         <w:trPr>
@@ -1587,7 +1559,7 @@
     </w:p>
     <w:p>
       <w:pPr>
-        <w:pStyle w:val="BodyText"/>
+        <w:pStyle w:val="a1"/>
       </w:pPr>
       <w:r>
         <w:t>Numbered equation:</w:t>
@@ -1671,7 +1643,7 @@
     </w:tbl>
     <w:p>
       <w:pPr>
-        <w:pStyle w:val="BodyText"/>
+        <w:pStyle w:val="a1"/>
       </w:pPr>
       <w:r>
         <w:br/>
@@ -1743,7 +1715,7 @@
     </w:p>
     <w:p>
       <w:pPr>
-        <w:pStyle w:val="BodyText"/>
+        <w:pStyle w:val="a1"/>
       </w:pPr>
       <w:r>
         <w:br/>
@@ -1767,7 +1739,7 @@
     </w:p>
     <w:p>
       <w:pPr>
-        <w:pStyle w:val="BodyText"/>
+        <w:pStyle w:val="a1"/>
       </w:pPr>
       <w:r>
         <w:br/>
@@ -1824,7 +1796,7 @@
     </w:p>
     <w:p>
       <w:pPr>
-        <w:pStyle w:val="BodyText"/>
+        <w:pStyle w:val="a1"/>
       </w:pPr>
       <w:r>
         <w:br/>
@@ -1840,7 +1812,7 @@
     </w:p>
     <w:p>
       <w:pPr>
-        <w:pStyle w:val="BodyText"/>
+        <w:pStyle w:val="a1"/>
       </w:pPr>
       <w:r>
         <w:br/>
@@ -2192,12 +2164,12 @@
     </w:tbl>
     <w:p>
       <w:pPr>
-        <w:pStyle w:val="BodyText"/>
+        <w:pStyle w:val="a1"/>
       </w:pPr>
     </w:p>
     <w:p>
       <w:pPr>
-        <w:pStyle w:val="BodyText"/>
+        <w:pStyle w:val="a1"/>
       </w:pPr>
       <w:r>
         <w:br w:type="page"/>
@@ -2379,7 +2351,7 @@
     </w:p>
     <w:p>
       <w:pPr>
-        <w:pStyle w:val="BodyText"/>
+        <w:pStyle w:val="a1"/>
       </w:pPr>
       <w:r>
         <w:br/>
@@ -2457,21 +2429,7 @@
               <w:rPr>
                 <w:rStyle w:val="NormalTok"/>
               </w:rPr>
-              <w:t xml:space="preserve"> </w:t>
-            </w:r>
-            <w:proofErr w:type="gramStart"/>
-            <w:r>
-              <w:rPr>
-                <w:rStyle w:val="NormalTok"/>
-              </w:rPr>
-              <w:t>docx.Document</w:t>
-            </w:r>
-            <w:proofErr w:type="gramEnd"/>
-            <w:r>
-              <w:rPr>
-                <w:rStyle w:val="NormalTok"/>
-              </w:rPr>
-              <w:t>(</w:t>
+              <w:t xml:space="preserve"> docx.Document(</w:t>
             </w:r>
             <w:r>
               <w:rPr>
@@ -2488,21 +2446,12 @@
             <w:r>
               <w:br/>
             </w:r>
-            <w:proofErr w:type="gramStart"/>
             <w:r>
               <w:rPr>
                 <w:rStyle w:val="NormalTok"/>
               </w:rPr>
-              <w:t>pprint.pprint</w:t>
-            </w:r>
-            <w:proofErr w:type="gramEnd"/>
-            <w:r>
-              <w:rPr>
-                <w:rStyle w:val="NormalTok"/>
-              </w:rPr>
-              <w:t>(</w:t>
-            </w:r>
-            <w:proofErr w:type="gramStart"/>
+              <w:t>pprint.pprint(</w:t>
+            </w:r>
             <w:r>
               <w:rPr>
                 <w:rStyle w:val="BuiltInTok"/>
@@ -2513,14 +2462,7 @@
               <w:rPr>
                 <w:rStyle w:val="NormalTok"/>
               </w:rPr>
-              <w:t>(</w:t>
-            </w:r>
-            <w:proofErr w:type="gramEnd"/>
-            <w:r>
-              <w:rPr>
-                <w:rStyle w:val="NormalTok"/>
-              </w:rPr>
-              <w:t xml:space="preserve">[s.name </w:t>
+              <w:t xml:space="preserve">([s.name </w:t>
             </w:r>
             <w:r>
               <w:rPr>
@@ -2544,16 +2486,14 @@
               <w:rPr>
                 <w:rStyle w:val="NormalTok"/>
               </w:rPr>
-              <w:t xml:space="preserve"> </w:t>
-            </w:r>
-            <w:proofErr w:type="gramStart"/>
+              <w:t xml:space="preserve"> d.styles </w:t>
+            </w:r>
             <w:r>
               <w:rPr>
-                <w:rStyle w:val="NormalTok"/>
+                <w:rStyle w:val="ControlFlowTok"/>
               </w:rPr>
-              <w:t>d.styles</w:t>
-            </w:r>
-            <w:proofErr w:type="gramEnd"/>
+              <w:t>if</w:t>
+            </w:r>
             <w:r>
               <w:rPr>
                 <w:rStyle w:val="NormalTok"/>
@@ -2562,9 +2502,9 @@
             </w:r>
             <w:r>
               <w:rPr>
-                <w:rStyle w:val="ControlFlowTok"/>
+                <w:rStyle w:val="StringTok"/>
               </w:rPr>
-              <w:t>if</w:t>
+              <w:t>"Tok"</w:t>
             </w:r>
             <w:r>
               <w:rPr>
@@ -2574,18 +2514,6 @@
             </w:r>
             <w:r>
               <w:rPr>
-                <w:rStyle w:val="StringTok"/>
-              </w:rPr>
-              <w:t>"Tok"</w:t>
-            </w:r>
-            <w:r>
-              <w:rPr>
-                <w:rStyle w:val="NormalTok"/>
-              </w:rPr>
-              <w:t xml:space="preserve"> </w:t>
-            </w:r>
-            <w:r>
-              <w:rPr>
                 <w:rStyle w:val="KeywordTok"/>
               </w:rPr>
               <w:t>in</w:t>
@@ -2602,7 +2530,7 @@
     </w:tbl>
     <w:p>
       <w:pPr>
-        <w:pStyle w:val="BodyText"/>
+        <w:pStyle w:val="a1"/>
       </w:pPr>
       <w:r>
         <w:br/>
@@ -2628,14 +2556,12 @@
       <w:r>
         <w:br/>
       </w:r>
-      <w:proofErr w:type="spellStart"/>
       <w:r>
         <w:rPr>
           <w:rStyle w:val="AlertTok"/>
         </w:rPr>
         <w:t>AlertTok</w:t>
       </w:r>
-      <w:proofErr w:type="spellEnd"/>
       <w:r>
         <w:rPr>
           <w:rStyle w:val="AlertTok"/>
@@ -2647,14 +2573,12 @@
       <w:r>
         <w:br/>
       </w:r>
-      <w:proofErr w:type="spellStart"/>
       <w:r>
         <w:rPr>
           <w:rStyle w:val="AnnotationTok"/>
         </w:rPr>
         <w:t>AnnotationTok</w:t>
       </w:r>
-      <w:proofErr w:type="spellEnd"/>
       <w:r>
         <w:rPr>
           <w:rStyle w:val="AnnotationTok"/>
@@ -2666,7 +2590,6 @@
       <w:r>
         <w:br/>
       </w:r>
-      <w:proofErr w:type="spellStart"/>
       <w:r>
         <w:rPr>
           <w:rStyle w:val="AttributeTok"/>
@@ -2679,11 +2602,9 @@
         </w:rPr>
         <w:t>にほんご</w:t>
       </w:r>
-      <w:proofErr w:type="spellEnd"/>
-      <w:r>
-        <w:br/>
-      </w:r>
-      <w:proofErr w:type="spellStart"/>
+      <w:r>
+        <w:br/>
+      </w:r>
       <w:r>
         <w:rPr>
           <w:rStyle w:val="BaseNTok"/>
@@ -2696,11 +2617,9 @@
         </w:rPr>
         <w:t>にほんご</w:t>
       </w:r>
-      <w:proofErr w:type="spellEnd"/>
-      <w:r>
-        <w:br/>
-      </w:r>
-      <w:proofErr w:type="spellStart"/>
+      <w:r>
+        <w:br/>
+      </w:r>
       <w:r>
         <w:rPr>
           <w:rStyle w:val="BuiltInTok"/>
@@ -2713,11 +2632,9 @@
         </w:rPr>
         <w:t>にほんご</w:t>
       </w:r>
-      <w:proofErr w:type="spellEnd"/>
-      <w:r>
-        <w:br/>
-      </w:r>
-      <w:proofErr w:type="spellStart"/>
+      <w:r>
+        <w:br/>
+      </w:r>
       <w:r>
         <w:rPr>
           <w:rStyle w:val="CharTok"/>
@@ -2730,11 +2647,9 @@
         </w:rPr>
         <w:t>にほんご</w:t>
       </w:r>
-      <w:proofErr w:type="spellEnd"/>
-      <w:r>
-        <w:br/>
-      </w:r>
-      <w:proofErr w:type="spellStart"/>
+      <w:r>
+        <w:br/>
+      </w:r>
       <w:r>
         <w:rPr>
           <w:rStyle w:val="CommentTok"/>
@@ -2747,7 +2662,6 @@
         </w:rPr>
         <w:t>にほんご</w:t>
       </w:r>
-      <w:proofErr w:type="spellEnd"/>
       <w:r>
         <w:rPr>
           <w:rStyle w:val="CommentTok"/>
@@ -2759,7 +2673,6 @@
       <w:r>
         <w:br/>
       </w:r>
-      <w:proofErr w:type="spellStart"/>
       <w:r>
         <w:rPr>
           <w:rStyle w:val="CommentVarTok"/>
@@ -2772,11 +2685,9 @@
         </w:rPr>
         <w:t>にほんご</w:t>
       </w:r>
-      <w:proofErr w:type="spellEnd"/>
-      <w:r>
-        <w:br/>
-      </w:r>
-      <w:proofErr w:type="spellStart"/>
+      <w:r>
+        <w:br/>
+      </w:r>
       <w:r>
         <w:rPr>
           <w:rStyle w:val="ConstantTok"/>
@@ -2789,11 +2700,9 @@
         </w:rPr>
         <w:t>にほんご</w:t>
       </w:r>
-      <w:proofErr w:type="spellEnd"/>
-      <w:r>
-        <w:br/>
-      </w:r>
-      <w:proofErr w:type="spellStart"/>
+      <w:r>
+        <w:br/>
+      </w:r>
       <w:r>
         <w:rPr>
           <w:rStyle w:val="ControlFlowTok"/>
@@ -2806,11 +2715,9 @@
         </w:rPr>
         <w:t>にほんご</w:t>
       </w:r>
-      <w:proofErr w:type="spellEnd"/>
-      <w:r>
-        <w:br/>
-      </w:r>
-      <w:proofErr w:type="spellStart"/>
+      <w:r>
+        <w:br/>
+      </w:r>
       <w:r>
         <w:rPr>
           <w:rStyle w:val="DataTypeTok"/>
@@ -2823,11 +2730,9 @@
         </w:rPr>
         <w:t>にほんご</w:t>
       </w:r>
-      <w:proofErr w:type="spellEnd"/>
-      <w:r>
-        <w:br/>
-      </w:r>
-      <w:proofErr w:type="spellStart"/>
+      <w:r>
+        <w:br/>
+      </w:r>
       <w:r>
         <w:rPr>
           <w:rStyle w:val="DecValTok"/>
@@ -2840,11 +2745,9 @@
         </w:rPr>
         <w:t>にほんご</w:t>
       </w:r>
-      <w:proofErr w:type="spellEnd"/>
-      <w:r>
-        <w:br/>
-      </w:r>
-      <w:proofErr w:type="spellStart"/>
+      <w:r>
+        <w:br/>
+      </w:r>
       <w:r>
         <w:rPr>
           <w:rStyle w:val="DocumentationTok"/>
@@ -2857,11 +2760,9 @@
         </w:rPr>
         <w:t>にほんご</w:t>
       </w:r>
-      <w:proofErr w:type="spellEnd"/>
-      <w:r>
-        <w:br/>
-      </w:r>
-      <w:proofErr w:type="spellStart"/>
+      <w:r>
+        <w:br/>
+      </w:r>
       <w:r>
         <w:rPr>
           <w:rStyle w:val="ErrorTok"/>
@@ -2880,11 +2781,9 @@
         </w:rPr>
         <w:t>にほんご</w:t>
       </w:r>
-      <w:proofErr w:type="spellEnd"/>
-      <w:r>
-        <w:br/>
-      </w:r>
-      <w:proofErr w:type="spellStart"/>
+      <w:r>
+        <w:br/>
+      </w:r>
       <w:r>
         <w:rPr>
           <w:rStyle w:val="ExtensionTok"/>
@@ -2897,11 +2796,9 @@
         </w:rPr>
         <w:t>にほんご</w:t>
       </w:r>
-      <w:proofErr w:type="spellEnd"/>
-      <w:r>
-        <w:br/>
-      </w:r>
-      <w:proofErr w:type="spellStart"/>
+      <w:r>
+        <w:br/>
+      </w:r>
       <w:r>
         <w:rPr>
           <w:rStyle w:val="FloatTok"/>
@@ -2914,11 +2811,9 @@
         </w:rPr>
         <w:t>にほんご</w:t>
       </w:r>
-      <w:proofErr w:type="spellEnd"/>
-      <w:r>
-        <w:br/>
-      </w:r>
-      <w:proofErr w:type="spellStart"/>
+      <w:r>
+        <w:br/>
+      </w:r>
       <w:r>
         <w:rPr>
           <w:rStyle w:val="FunctionTok"/>
@@ -2931,11 +2826,9 @@
         </w:rPr>
         <w:t>にほんご</w:t>
       </w:r>
-      <w:proofErr w:type="spellEnd"/>
-      <w:r>
-        <w:br/>
-      </w:r>
-      <w:proofErr w:type="spellStart"/>
+      <w:r>
+        <w:br/>
+      </w:r>
       <w:r>
         <w:rPr>
           <w:rStyle w:val="ImportTok"/>
@@ -2948,11 +2841,9 @@
         </w:rPr>
         <w:t>にほんご</w:t>
       </w:r>
-      <w:proofErr w:type="spellEnd"/>
-      <w:r>
-        <w:br/>
-      </w:r>
-      <w:proofErr w:type="spellStart"/>
+      <w:r>
+        <w:br/>
+      </w:r>
       <w:r>
         <w:rPr>
           <w:rStyle w:val="InformationTok"/>
@@ -2965,11 +2856,9 @@
         </w:rPr>
         <w:t>にほんご</w:t>
       </w:r>
-      <w:proofErr w:type="spellEnd"/>
-      <w:r>
-        <w:br/>
-      </w:r>
-      <w:proofErr w:type="spellStart"/>
+      <w:r>
+        <w:br/>
+      </w:r>
       <w:r>
         <w:rPr>
           <w:rStyle w:val="KeywordTok"/>
@@ -2982,11 +2871,9 @@
         </w:rPr>
         <w:t>にほんご</w:t>
       </w:r>
-      <w:proofErr w:type="spellEnd"/>
-      <w:r>
-        <w:br/>
-      </w:r>
-      <w:proofErr w:type="spellStart"/>
+      <w:r>
+        <w:br/>
+      </w:r>
       <w:r>
         <w:rPr>
           <w:rStyle w:val="NormalTok"/>
@@ -2999,11 +2886,9 @@
         </w:rPr>
         <w:t>にほんご</w:t>
       </w:r>
-      <w:proofErr w:type="spellEnd"/>
-      <w:r>
-        <w:br/>
-      </w:r>
-      <w:proofErr w:type="spellStart"/>
+      <w:r>
+        <w:br/>
+      </w:r>
       <w:r>
         <w:rPr>
           <w:rStyle w:val="OperatorTok"/>
@@ -3016,11 +2901,9 @@
         </w:rPr>
         <w:t>にほんご</w:t>
       </w:r>
-      <w:proofErr w:type="spellEnd"/>
-      <w:r>
-        <w:br/>
-      </w:r>
-      <w:proofErr w:type="spellStart"/>
+      <w:r>
+        <w:br/>
+      </w:r>
       <w:r>
         <w:rPr>
           <w:rStyle w:val="OtherTok"/>
@@ -3033,11 +2916,9 @@
         </w:rPr>
         <w:t>にほんご</w:t>
       </w:r>
-      <w:proofErr w:type="spellEnd"/>
-      <w:r>
-        <w:br/>
-      </w:r>
-      <w:proofErr w:type="spellStart"/>
+      <w:r>
+        <w:br/>
+      </w:r>
       <w:r>
         <w:rPr>
           <w:rStyle w:val="PreprocessorTok"/>
@@ -3050,11 +2931,9 @@
         </w:rPr>
         <w:t>にほんご</w:t>
       </w:r>
-      <w:proofErr w:type="spellEnd"/>
-      <w:r>
-        <w:br/>
-      </w:r>
-      <w:proofErr w:type="spellStart"/>
+      <w:r>
+        <w:br/>
+      </w:r>
       <w:r>
         <w:rPr>
           <w:rStyle w:val="RegionMarkerTok"/>
@@ -3067,11 +2946,9 @@
         </w:rPr>
         <w:t>にほんご</w:t>
       </w:r>
-      <w:proofErr w:type="spellEnd"/>
-      <w:r>
-        <w:br/>
-      </w:r>
-      <w:proofErr w:type="spellStart"/>
+      <w:r>
+        <w:br/>
+      </w:r>
       <w:r>
         <w:rPr>
           <w:rStyle w:val="SpecialCharTok"/>
@@ -3084,11 +2961,9 @@
         </w:rPr>
         <w:t>にほんご</w:t>
       </w:r>
-      <w:proofErr w:type="spellEnd"/>
-      <w:r>
-        <w:br/>
-      </w:r>
-      <w:proofErr w:type="spellStart"/>
+      <w:r>
+        <w:br/>
+      </w:r>
       <w:r>
         <w:rPr>
           <w:rStyle w:val="SpecialStringTok"/>
@@ -3101,11 +2976,9 @@
         </w:rPr>
         <w:t>にほんご</w:t>
       </w:r>
-      <w:proofErr w:type="spellEnd"/>
-      <w:r>
-        <w:br/>
-      </w:r>
-      <w:proofErr w:type="spellStart"/>
+      <w:r>
+        <w:br/>
+      </w:r>
       <w:r>
         <w:rPr>
           <w:rStyle w:val="StringTok"/>
@@ -3118,11 +2991,9 @@
         </w:rPr>
         <w:t>にほんご</w:t>
       </w:r>
-      <w:proofErr w:type="spellEnd"/>
-      <w:r>
-        <w:br/>
-      </w:r>
-      <w:proofErr w:type="spellStart"/>
+      <w:r>
+        <w:br/>
+      </w:r>
       <w:r>
         <w:rPr>
           <w:rStyle w:val="VariableTok"/>
@@ -3135,11 +3006,9 @@
         </w:rPr>
         <w:t>にほんご</w:t>
       </w:r>
-      <w:proofErr w:type="spellEnd"/>
-      <w:r>
-        <w:br/>
-      </w:r>
-      <w:proofErr w:type="spellStart"/>
+      <w:r>
+        <w:br/>
+      </w:r>
       <w:r>
         <w:rPr>
           <w:rStyle w:val="VerbatimStringTok"/>
@@ -3152,16 +3021,13 @@
         </w:rPr>
         <w:t>にほんご</w:t>
       </w:r>
-      <w:proofErr w:type="spellEnd"/>
-      <w:r>
-        <w:br/>
-      </w:r>
-      <w:proofErr w:type="spellStart"/>
+      <w:r>
+        <w:br/>
+      </w:r>
       <w:r>
         <w:rPr>
           <w:rStyle w:val="WarningTok"/>
         </w:rPr>
-        <w:lastRenderedPageBreak/>
         <w:t>WarningTok</w:t>
       </w:r>
       <w:r>
@@ -3170,7 +3036,6 @@
         </w:rPr>
         <w:t>にほんご</w:t>
       </w:r>
-      <w:proofErr w:type="spellEnd"/>
       <w:r>
         <w:br/>
       </w:r>
@@ -3180,22 +3045,18 @@
         <w:pStyle w:val="SourceCode"/>
       </w:pPr>
       <w:r>
-        <w:t xml:space="preserve">This is a </w:t>
-      </w:r>
-      <w:proofErr w:type="spellStart"/>
-      <w:r>
-        <w:t>pen</w:t>
+        <w:t>This is a pen</w:t>
       </w:r>
       <w:r>
         <w:t>にほんご</w:t>
       </w:r>
-      <w:proofErr w:type="spellEnd"/>
     </w:p>
     <w:p>
       <w:pPr>
-        <w:pStyle w:val="BodyText"/>
-      </w:pPr>
-      <w:r>
+        <w:pStyle w:val="a1"/>
+      </w:pPr>
+      <w:r>
+        <w:lastRenderedPageBreak/>
         <w:br/>
       </w:r>
     </w:p>
@@ -3212,7 +3073,7 @@
     </w:p>
     <w:p>
       <w:pPr>
-        <w:pStyle w:val="BodyText"/>
+        <w:pStyle w:val="a1"/>
       </w:pPr>
       <w:r>
         <w:br w:type="page"/>
@@ -3220,7 +3081,7 @@
     </w:p>
     <w:p>
       <w:pPr>
-        <w:pStyle w:val="Caption"/>
+        <w:pStyle w:val="ae"/>
       </w:pPr>
       <w:bookmarkStart w:id="20" w:name="lst:docs-makefile"/>
       <w:r>
@@ -4144,7 +4005,7 @@
     </w:p>
     <w:p>
       <w:pPr>
-        <w:pStyle w:val="Caption"/>
+        <w:pStyle w:val="ae"/>
       </w:pPr>
       <w:bookmarkStart w:id="21" w:name="lst:makefile"/>
       <w:bookmarkEnd w:id="20"/>
@@ -4191,16 +4052,8 @@
           <w:rStyle w:val="CommentTok"/>
         </w:rPr>
         <w:tab/>
-        <w:t xml:space="preserve">pip3 </w:t>
-      </w:r>
-      <w:proofErr w:type="gramStart"/>
-      <w:r>
-        <w:rPr>
-          <w:rStyle w:val="CommentTok"/>
-        </w:rPr>
-        <w:t>install .</w:t>
-      </w:r>
-      <w:proofErr w:type="gramEnd"/>
+        <w:t>pip3 install .</w:t>
+      </w:r>
       <w:r>
         <w:br/>
       </w:r>
@@ -4394,7 +4247,7 @@
     </w:p>
     <w:p>
       <w:pPr>
-        <w:pStyle w:val="Caption"/>
+        <w:pStyle w:val="ae"/>
       </w:pPr>
       <w:bookmarkStart w:id="22" w:name="lst:setup_py"/>
       <w:bookmarkEnd w:id="21"/>
@@ -4402,7 +4255,6 @@
         <w:rPr>
           <w:vertAlign w:val="subscript"/>
         </w:rPr>
-        <w:lastRenderedPageBreak/>
         <w:t>▼</w:t>
       </w:r>
       <w:r>
@@ -4456,6 +4308,7 @@
         <w:rPr>
           <w:rStyle w:val="CommentTok"/>
         </w:rPr>
+        <w:lastRenderedPageBreak/>
         <w:t>"""</w:t>
       </w:r>
       <w:r>
@@ -5113,7 +4966,7 @@
     <w:bookmarkEnd w:id="22"/>
     <w:p>
       <w:pPr>
-        <w:pStyle w:val="BodyText"/>
+        <w:pStyle w:val="a1"/>
       </w:pPr>
       <w:r>
         <w:br w:type="page"/>
@@ -5121,12 +4974,12 @@
     </w:p>
     <w:p>
       <w:pPr>
-        <w:pStyle w:val="BodyText"/>
+        <w:pStyle w:val="a1"/>
       </w:pPr>
       <w:hyperlink r:id="rId7">
         <w:r>
           <w:rPr>
-            <w:rStyle w:val="Hyperlink"/>
+            <w:rStyle w:val="af1"/>
           </w:rPr>
           <w:t>Link</w:t>
         </w:r>
@@ -5134,7 +4987,7 @@
     </w:p>
     <w:p>
       <w:pPr>
-        <w:pStyle w:val="BlockText"/>
+        <w:pStyle w:val="ac"/>
       </w:pPr>
       <w:r>
         <w:t>Block Quote</w:t>
@@ -5166,18 +5019,18 @@
         <w:tblLook w:val="0600" w:firstRow="0" w:lastRow="0" w:firstColumn="0" w:lastColumn="0" w:noHBand="1" w:noVBand="1"/>
       </w:tblPr>
       <w:tblGrid>
-        <w:gridCol w:w="4620"/>
-        <w:gridCol w:w="762"/>
-        <w:gridCol w:w="673"/>
-        <w:gridCol w:w="230"/>
-        <w:gridCol w:w="230"/>
-        <w:gridCol w:w="230"/>
-        <w:gridCol w:w="230"/>
-        <w:gridCol w:w="230"/>
-        <w:gridCol w:w="230"/>
-        <w:gridCol w:w="230"/>
-        <w:gridCol w:w="230"/>
-        <w:gridCol w:w="230"/>
+        <w:gridCol w:w="4392"/>
+        <w:gridCol w:w="757"/>
+        <w:gridCol w:w="672"/>
+        <w:gridCol w:w="256"/>
+        <w:gridCol w:w="256"/>
+        <w:gridCol w:w="256"/>
+        <w:gridCol w:w="256"/>
+        <w:gridCol w:w="256"/>
+        <w:gridCol w:w="256"/>
+        <w:gridCol w:w="256"/>
+        <w:gridCol w:w="256"/>
+        <w:gridCol w:w="256"/>
       </w:tblGrid>
       <w:tr>
         <w:tc>
@@ -5319,13 +5172,8 @@
             <w:pPr>
               <w:pStyle w:val="SourceCode"/>
             </w:pPr>
-            <w:proofErr w:type="gramStart"/>
-            <w:r>
-              <w:t>Left</w:t>
-            </w:r>
-            <w:proofErr w:type="gramEnd"/>
-            <w:r>
-              <w:t xml:space="preserve"> Left Left Left Left Left Left Left Left</w:t>
+            <w:r>
+              <w:t>Left Left Left Left Left Left Left Left Left</w:t>
             </w:r>
           </w:p>
           <w:p>
@@ -7261,7 +7109,7 @@
         </w:tcPr>
         <w:p>
           <w:pPr>
-            <w:pStyle w:val="Footer"/>
+            <w:pStyle w:val="af5"/>
           </w:pPr>
         </w:p>
       </w:tc>
@@ -7277,7 +7125,7 @@
         </w:tcPr>
         <w:p>
           <w:pPr>
-            <w:pStyle w:val="Footer"/>
+            <w:pStyle w:val="af5"/>
           </w:pPr>
         </w:p>
       </w:tc>
@@ -7293,7 +7141,7 @@
         </w:tcPr>
         <w:p>
           <w:pPr>
-            <w:pStyle w:val="Footer"/>
+            <w:pStyle w:val="af5"/>
           </w:pPr>
         </w:p>
       </w:tc>
@@ -7309,32 +7157,20 @@
         </w:tcPr>
         <w:p>
           <w:pPr>
-            <w:pStyle w:val="Footer"/>
+            <w:pStyle w:val="af5"/>
           </w:pPr>
-          <w:r>
-            <w:fldChar w:fldCharType="begin"/>
-          </w:r>
-          <w:r>
-            <w:instrText xml:space="preserve"> DOCPROPERTY "year" \* MERGEFORMAT </w:instrText>
-          </w:r>
-          <w:r>
-            <w:fldChar w:fldCharType="separate"/>
-          </w:r>
-          <w:proofErr w:type="spellStart"/>
-          <w:r>
-            <w:t>出版年</w:t>
-          </w:r>
-          <w:proofErr w:type="spellEnd"/>
-          <w:r>
-            <w:fldChar w:fldCharType="end"/>
-          </w:r>
+          <w:fldSimple w:instr=" DOCPROPERTY &quot;year&quot; \* MERGEFORMAT ">
+            <w:r>
+              <w:t>出版年</w:t>
+            </w:r>
+          </w:fldSimple>
         </w:p>
       </w:tc>
     </w:tr>
   </w:tbl>
   <w:p>
     <w:pPr>
-      <w:pStyle w:val="Footer"/>
+      <w:pStyle w:val="af5"/>
     </w:pPr>
   </w:p>
 </w:ftr>
@@ -7382,7 +7218,7 @@
 <w:hdr xmlns:wpc="http://schemas.microsoft.com/office/word/2010/wordprocessingCanvas" xmlns:cx="http://schemas.microsoft.com/office/drawing/2014/chartex" xmlns:cx1="http://schemas.microsoft.com/office/drawing/2015/9/8/chartex" xmlns:cx2="http://schemas.microsoft.com/office/drawing/2015/10/21/chartex" xmlns:cx3="http://schemas.microsoft.com/office/drawing/2016/5/9/chartex" xmlns:cx4="http://schemas.microsoft.com/office/drawing/2016/5/10/chartex" xmlns:cx5="http://schemas.microsoft.com/office/drawing/2016/5/11/chartex" xmlns:cx6="http://schemas.microsoft.com/office/drawing/2016/5/12/chartex" xmlns:cx7="http://schemas.microsoft.com/office/drawing/2016/5/13/chartex" xmlns:cx8="http://schemas.microsoft.com/office/drawing/2016/5/14/chartex" xmlns:mc="http://schemas.openxmlformats.org/markup-compatibility/2006" xmlns:aink="http://schemas.microsoft.com/office/drawing/2016/ink" xmlns:am3d="http://schemas.microsoft.com/office/drawing/2017/model3d" xmlns:o="urn:schemas-microsoft-com:office:office" xmlns:oel="http://schemas.microsoft.com/office/2019/extlst" xmlns:r="http://schemas.openxmlformats.org/officeDocument/2006/relationships" xmlns:m="http://schemas.openxmlformats.org/officeDocument/2006/math" xmlns:v="urn:schemas-microsoft-com:vml" xmlns:wp14="http://schemas.microsoft.com/office/word/2010/wordprocessingDrawing" xmlns:wp="http://schemas.openxmlformats.org/drawingml/2006/wordprocessingDrawing" xmlns:w10="urn:schemas-microsoft-com:office:word" xmlns:w="http://schemas.openxmlformats.org/wordprocessingml/2006/main" xmlns:w14="http://schemas.microsoft.com/office/word/2010/wordml" xmlns:w15="http://schemas.microsoft.com/office/word/2012/wordml" xmlns:w16cex="http://schemas.microsoft.com/office/word/2018/wordml/cex" xmlns:w16cid="http://schemas.microsoft.com/office/word/2016/wordml/cid" xmlns:w16="http://schemas.microsoft.com/office/word/2018/wordml" xmlns:w16du="http://schemas.microsoft.com/office/word/2023/wordml/word16du" xmlns:w16sdtdh="http://schemas.microsoft.com/office/word/2020/wordml/sdtdatahash" xmlns:w16sdtfl="http://schemas.microsoft.com/office/word/2024/wordml/sdtformatlock" xmlns:w16se="http://schemas.microsoft.com/office/word/2015/wordml/symex" xmlns:wpg="http://schemas.microsoft.com/office/word/2010/wordprocessingGroup" xmlns:wpi="http://schemas.microsoft.com/office/word/2010/wordprocessingInk" xmlns:wne="http://schemas.microsoft.com/office/word/2006/wordml" xmlns:wps="http://schemas.microsoft.com/office/word/2010/wordprocessingShape" mc:Ignorable="w14 w15 w16se w16cid w16 w16cex w16sdtdh w16sdtfl w16du wp14">
   <w:p>
     <w:pPr>
-      <w:pStyle w:val="Header"/>
+      <w:pStyle w:val="af3"/>
     </w:pPr>
     <w:r>
       <w:rPr>
@@ -7437,7 +7273,7 @@
 <w:hdr xmlns:wpc="http://schemas.microsoft.com/office/word/2010/wordprocessingCanvas" xmlns:cx="http://schemas.microsoft.com/office/drawing/2014/chartex" xmlns:cx1="http://schemas.microsoft.com/office/drawing/2015/9/8/chartex" xmlns:cx2="http://schemas.microsoft.com/office/drawing/2015/10/21/chartex" xmlns:cx3="http://schemas.microsoft.com/office/drawing/2016/5/9/chartex" xmlns:cx4="http://schemas.microsoft.com/office/drawing/2016/5/10/chartex" xmlns:cx5="http://schemas.microsoft.com/office/drawing/2016/5/11/chartex" xmlns:cx6="http://schemas.microsoft.com/office/drawing/2016/5/12/chartex" xmlns:cx7="http://schemas.microsoft.com/office/drawing/2016/5/13/chartex" xmlns:cx8="http://schemas.microsoft.com/office/drawing/2016/5/14/chartex" xmlns:mc="http://schemas.openxmlformats.org/markup-compatibility/2006" xmlns:aink="http://schemas.microsoft.com/office/drawing/2016/ink" xmlns:am3d="http://schemas.microsoft.com/office/drawing/2017/model3d" xmlns:o="urn:schemas-microsoft-com:office:office" xmlns:oel="http://schemas.microsoft.com/office/2019/extlst" xmlns:r="http://schemas.openxmlformats.org/officeDocument/2006/relationships" xmlns:m="http://schemas.openxmlformats.org/officeDocument/2006/math" xmlns:v="urn:schemas-microsoft-com:vml" xmlns:wp14="http://schemas.microsoft.com/office/word/2010/wordprocessingDrawing" xmlns:wp="http://schemas.openxmlformats.org/drawingml/2006/wordprocessingDrawing" xmlns:w10="urn:schemas-microsoft-com:office:word" xmlns:w="http://schemas.openxmlformats.org/wordprocessingml/2006/main" xmlns:w14="http://schemas.microsoft.com/office/word/2010/wordml" xmlns:w15="http://schemas.microsoft.com/office/word/2012/wordml" xmlns:w16cex="http://schemas.microsoft.com/office/word/2018/wordml/cex" xmlns:w16cid="http://schemas.microsoft.com/office/word/2016/wordml/cid" xmlns:w16="http://schemas.microsoft.com/office/word/2018/wordml" xmlns:w16du="http://schemas.microsoft.com/office/word/2023/wordml/word16du" xmlns:w16sdtdh="http://schemas.microsoft.com/office/word/2020/wordml/sdtdatahash" xmlns:w16sdtfl="http://schemas.microsoft.com/office/word/2024/wordml/sdtformatlock" xmlns:w16se="http://schemas.microsoft.com/office/word/2015/wordml/symex" xmlns:wpg="http://schemas.microsoft.com/office/word/2010/wordprocessingGroup" xmlns:wpi="http://schemas.microsoft.com/office/word/2010/wordprocessingInk" xmlns:wne="http://schemas.microsoft.com/office/word/2006/wordml" xmlns:wps="http://schemas.microsoft.com/office/word/2010/wordprocessingShape" mc:Ignorable="w14 w15 w16se w16cid w16 w16cex w16sdtdh w16sdtfl w16du wp14">
   <w:p>
     <w:pPr>
-      <w:pStyle w:val="Header"/>
+      <w:pStyle w:val="af3"/>
       <w:ind w:right="90"/>
       <w:jc w:val="right"/>
     </w:pPr>
@@ -7515,7 +7351,7 @@
 <w:hdr xmlns:wpc="http://schemas.microsoft.com/office/word/2010/wordprocessingCanvas" xmlns:cx="http://schemas.microsoft.com/office/drawing/2014/chartex" xmlns:cx1="http://schemas.microsoft.com/office/drawing/2015/9/8/chartex" xmlns:cx2="http://schemas.microsoft.com/office/drawing/2015/10/21/chartex" xmlns:cx3="http://schemas.microsoft.com/office/drawing/2016/5/9/chartex" xmlns:cx4="http://schemas.microsoft.com/office/drawing/2016/5/10/chartex" xmlns:cx5="http://schemas.microsoft.com/office/drawing/2016/5/11/chartex" xmlns:cx6="http://schemas.microsoft.com/office/drawing/2016/5/12/chartex" xmlns:cx7="http://schemas.microsoft.com/office/drawing/2016/5/13/chartex" xmlns:cx8="http://schemas.microsoft.com/office/drawing/2016/5/14/chartex" xmlns:mc="http://schemas.openxmlformats.org/markup-compatibility/2006" xmlns:aink="http://schemas.microsoft.com/office/drawing/2016/ink" xmlns:am3d="http://schemas.microsoft.com/office/drawing/2017/model3d" xmlns:o="urn:schemas-microsoft-com:office:office" xmlns:oel="http://schemas.microsoft.com/office/2019/extlst" xmlns:r="http://schemas.openxmlformats.org/officeDocument/2006/relationships" xmlns:m="http://schemas.openxmlformats.org/officeDocument/2006/math" xmlns:v="urn:schemas-microsoft-com:vml" xmlns:wp14="http://schemas.microsoft.com/office/word/2010/wordprocessingDrawing" xmlns:wp="http://schemas.openxmlformats.org/drawingml/2006/wordprocessingDrawing" xmlns:w10="urn:schemas-microsoft-com:office:word" xmlns:w="http://schemas.openxmlformats.org/wordprocessingml/2006/main" xmlns:w14="http://schemas.microsoft.com/office/word/2010/wordml" xmlns:w15="http://schemas.microsoft.com/office/word/2012/wordml" xmlns:w16cex="http://schemas.microsoft.com/office/word/2018/wordml/cex" xmlns:w16cid="http://schemas.microsoft.com/office/word/2016/wordml/cid" xmlns:w16="http://schemas.microsoft.com/office/word/2018/wordml" xmlns:w16du="http://schemas.microsoft.com/office/word/2023/wordml/word16du" xmlns:w16sdtdh="http://schemas.microsoft.com/office/word/2020/wordml/sdtdatahash" xmlns:w16sdtfl="http://schemas.microsoft.com/office/word/2024/wordml/sdtformatlock" xmlns:w16se="http://schemas.microsoft.com/office/word/2015/wordml/symex" xmlns:wpg="http://schemas.microsoft.com/office/word/2010/wordprocessingGroup" xmlns:wpi="http://schemas.microsoft.com/office/word/2010/wordprocessingInk" xmlns:wne="http://schemas.microsoft.com/office/word/2006/wordml" xmlns:wps="http://schemas.microsoft.com/office/word/2010/wordprocessingShape" mc:Ignorable="w14 w15 w16se w16cid w16 w16cex w16sdtdh w16sdtfl w16du wp14">
   <w:p>
     <w:pPr>
-      <w:pStyle w:val="Header"/>
+      <w:pStyle w:val="af3"/>
       <w:ind w:right="90"/>
       <w:jc w:val="right"/>
     </w:pPr>
@@ -7598,7 +7434,7 @@
     <w:lvl w:ilvl="0">
       <w:start w:val="1"/>
       <w:numFmt w:val="bullet"/>
-      <w:pStyle w:val="ListBullet3"/>
+      <w:pStyle w:val="3"/>
       <w:lvlText w:val=""/>
       <w:lvlJc w:val="left"/>
       <w:pPr>
@@ -7619,7 +7455,7 @@
     <w:lvl w:ilvl="0">
       <w:start w:val="1"/>
       <w:numFmt w:val="bullet"/>
-      <w:pStyle w:val="ListBullet2"/>
+      <w:pStyle w:val="2"/>
       <w:lvlText w:val=""/>
       <w:lvlJc w:val="left"/>
       <w:pPr>
@@ -7640,7 +7476,7 @@
     <w:lvl w:ilvl="0">
       <w:start w:val="1"/>
       <w:numFmt w:val="bullet"/>
-      <w:pStyle w:val="ListBullet"/>
+      <w:pStyle w:val="a"/>
       <w:lvlText w:val=""/>
       <w:lvlJc w:val="left"/>
       <w:pPr>
@@ -7658,7 +7494,7 @@
     <w:nsid w:val="0A9643E0"/>
     <w:multiLevelType w:val="multilevel"/>
     <w:tmpl w:val="1E5CF244"/>
-    <w:styleLink w:val="3"/>
+    <w:styleLink w:val="30"/>
     <w:lvl w:ilvl="0">
       <w:start w:val="1"/>
       <w:numFmt w:val="bullet"/>
@@ -8090,7 +7926,7 @@
     <w:lvl w:ilvl="0">
       <w:start w:val="1"/>
       <w:numFmt w:val="decimal"/>
-      <w:pStyle w:val="Heading1"/>
+      <w:pStyle w:val="1"/>
       <w:lvlText w:val="%1"/>
       <w:lvlJc w:val="left"/>
       <w:pPr>
@@ -8100,7 +7936,7 @@
     <w:lvl w:ilvl="1">
       <w:start w:val="1"/>
       <w:numFmt w:val="decimal"/>
-      <w:pStyle w:val="Heading2"/>
+      <w:pStyle w:val="20"/>
       <w:lvlText w:val="%1.%2"/>
       <w:lvlJc w:val="left"/>
       <w:pPr>
@@ -8110,7 +7946,7 @@
     <w:lvl w:ilvl="2">
       <w:start w:val="1"/>
       <w:numFmt w:val="decimal"/>
-      <w:pStyle w:val="Heading3"/>
+      <w:pStyle w:val="31"/>
       <w:lvlText w:val="%1.%2.%3"/>
       <w:lvlJc w:val="left"/>
       <w:pPr>
@@ -8138,7 +7974,7 @@
     <w:lvl w:ilvl="5">
       <w:start w:val="1"/>
       <w:numFmt w:val="decimal"/>
-      <w:pStyle w:val="Heading6"/>
+      <w:pStyle w:val="6"/>
       <w:lvlText w:val="%1.%2.%3.%4.%5.%6"/>
       <w:lvlJc w:val="left"/>
       <w:pPr>
@@ -8148,7 +7984,7 @@
     <w:lvl w:ilvl="6">
       <w:start w:val="1"/>
       <w:numFmt w:val="decimal"/>
-      <w:pStyle w:val="Heading7"/>
+      <w:pStyle w:val="7"/>
       <w:lvlText w:val="%1.%2.%3.%4.%5.%6.%7"/>
       <w:lvlJc w:val="left"/>
       <w:pPr>
@@ -8158,7 +7994,7 @@
     <w:lvl w:ilvl="7">
       <w:start w:val="1"/>
       <w:numFmt w:val="decimal"/>
-      <w:pStyle w:val="Heading8"/>
+      <w:pStyle w:val="8"/>
       <w:lvlText w:val="%1.%2.%3.%4.%5.%6.%7.%8"/>
       <w:lvlJc w:val="left"/>
       <w:pPr>
@@ -8168,7 +8004,7 @@
     <w:lvl w:ilvl="8">
       <w:start w:val="1"/>
       <w:numFmt w:val="decimal"/>
-      <w:pStyle w:val="Heading9"/>
+      <w:pStyle w:val="9"/>
       <w:lvlText w:val="%1.%2.%3.%4.%5.%6.%7.%8.%9"/>
       <w:lvlJc w:val="left"/>
       <w:pPr>
@@ -8180,7 +8016,7 @@
     <w:nsid w:val="169059F6"/>
     <w:multiLevelType w:val="multilevel"/>
     <w:tmpl w:val="8E524998"/>
-    <w:styleLink w:val="1"/>
+    <w:styleLink w:val="10"/>
     <w:lvl w:ilvl="0">
       <w:start w:val="1"/>
       <w:numFmt w:val="bullet"/>
@@ -8294,7 +8130,7 @@
     <w:nsid w:val="20731ECC"/>
     <w:multiLevelType w:val="multilevel"/>
     <w:tmpl w:val="55DC64C2"/>
-    <w:styleLink w:val="2"/>
+    <w:styleLink w:val="21"/>
     <w:lvl w:ilvl="0">
       <w:start w:val="1"/>
       <w:numFmt w:val="bullet"/>
@@ -8525,7 +8361,7 @@
     <w:lvl w:ilvl="0" w:tplc="E1B6839C">
       <w:start w:val="1"/>
       <w:numFmt w:val="bullet"/>
-      <w:pStyle w:val="Heading5"/>
+      <w:pStyle w:val="5"/>
       <w:lvlText w:val=""/>
       <w:lvlJc w:val="left"/>
       <w:pPr>
@@ -9135,7 +8971,7 @@
     <w:nsid w:val="541D335C"/>
     <w:multiLevelType w:val="multilevel"/>
     <w:tmpl w:val="7C400F1C"/>
-    <w:styleLink w:val="5"/>
+    <w:styleLink w:val="50"/>
     <w:lvl w:ilvl="0">
       <w:start w:val="1"/>
       <w:numFmt w:val="lowerLetter"/>
@@ -9430,7 +9266,7 @@
     <w:nsid w:val="5AB75AAC"/>
     <w:multiLevelType w:val="multilevel"/>
     <w:tmpl w:val="50125688"/>
-    <w:styleLink w:val="6"/>
+    <w:styleLink w:val="60"/>
     <w:lvl w:ilvl="0">
       <w:start w:val="1"/>
       <w:numFmt w:val="lowerLetter"/>
@@ -10288,7 +10124,7 @@
     <w:lsdException w:name="Unresolved Mention" w:semiHidden="1" w:uiPriority="99" w:unhideWhenUsed="1"/>
     <w:lsdException w:name="Smart Link" w:semiHidden="1" w:uiPriority="99" w:unhideWhenUsed="1"/>
   </w:latentStyles>
-  <w:style w:type="paragraph" w:default="1" w:styleId="Normal">
+  <w:style w:type="paragraph" w:default="1" w:styleId="a0">
     <w:name w:val="Normal"/>
     <w:qFormat/>
     <w:rsid w:val="00227F02"/>
@@ -10302,11 +10138,11 @@
       <w:szCs w:val="18"/>
     </w:rPr>
   </w:style>
-  <w:style w:type="paragraph" w:styleId="Heading1">
+  <w:style w:type="paragraph" w:styleId="1">
     <w:name w:val="heading 1"/>
-    <w:basedOn w:val="BodyText"/>
-    <w:next w:val="Normal"/>
-    <w:link w:val="Heading1Char"/>
+    <w:basedOn w:val="a1"/>
+    <w:next w:val="a0"/>
+    <w:link w:val="11"/>
     <w:autoRedefine/>
     <w:uiPriority w:val="9"/>
     <w:qFormat/>
@@ -10330,10 +10166,10 @@
       <w:szCs w:val="36"/>
     </w:rPr>
   </w:style>
-  <w:style w:type="paragraph" w:styleId="Heading2">
+  <w:style w:type="paragraph" w:styleId="20">
     <w:name w:val="heading 2"/>
-    <w:next w:val="Normal"/>
-    <w:link w:val="Heading2Char"/>
+    <w:next w:val="a0"/>
+    <w:link w:val="22"/>
     <w:autoRedefine/>
     <w:uiPriority w:val="9"/>
     <w:unhideWhenUsed/>
@@ -10357,11 +10193,11 @@
       <w:szCs w:val="28"/>
     </w:rPr>
   </w:style>
-  <w:style w:type="paragraph" w:styleId="Heading3">
+  <w:style w:type="paragraph" w:styleId="31">
     <w:name w:val="heading 3"/>
-    <w:basedOn w:val="Normal"/>
-    <w:next w:val="Normal"/>
-    <w:link w:val="Heading3Char"/>
+    <w:basedOn w:val="a0"/>
+    <w:next w:val="a0"/>
+    <w:link w:val="32"/>
     <w:autoRedefine/>
     <w:uiPriority w:val="9"/>
     <w:unhideWhenUsed/>
@@ -10383,11 +10219,11 @@
       <w:szCs w:val="24"/>
     </w:rPr>
   </w:style>
-  <w:style w:type="paragraph" w:styleId="Heading4">
+  <w:style w:type="paragraph" w:styleId="40">
     <w:name w:val="heading 4"/>
-    <w:basedOn w:val="Normal"/>
-    <w:next w:val="Normal"/>
-    <w:link w:val="Heading4Char"/>
+    <w:basedOn w:val="a0"/>
+    <w:next w:val="a0"/>
+    <w:link w:val="41"/>
     <w:autoRedefine/>
     <w:uiPriority w:val="9"/>
     <w:unhideWhenUsed/>
@@ -10403,11 +10239,11 @@
       <w:color w:val="000000" w:themeColor="text1"/>
     </w:rPr>
   </w:style>
-  <w:style w:type="paragraph" w:styleId="Heading5">
+  <w:style w:type="paragraph" w:styleId="5">
     <w:name w:val="heading 5"/>
-    <w:basedOn w:val="Heading4"/>
-    <w:next w:val="Normal"/>
-    <w:link w:val="Heading5Char"/>
+    <w:basedOn w:val="40"/>
+    <w:next w:val="a0"/>
+    <w:link w:val="51"/>
     <w:autoRedefine/>
     <w:uiPriority w:val="9"/>
     <w:unhideWhenUsed/>
@@ -10420,11 +10256,11 @@
       <w:outlineLvl w:val="4"/>
     </w:pPr>
   </w:style>
-  <w:style w:type="paragraph" w:styleId="Heading6">
+  <w:style w:type="paragraph" w:styleId="6">
     <w:name w:val="heading 6"/>
-    <w:basedOn w:val="Normal"/>
-    <w:next w:val="Normal"/>
-    <w:link w:val="Heading6Char"/>
+    <w:basedOn w:val="a0"/>
+    <w:next w:val="a0"/>
+    <w:link w:val="61"/>
     <w:uiPriority w:val="9"/>
     <w:unhideWhenUsed/>
     <w:qFormat/>
@@ -10446,11 +10282,11 @@
       <w:color w:val="17365D" w:themeColor="text2" w:themeShade="BF"/>
     </w:rPr>
   </w:style>
-  <w:style w:type="paragraph" w:styleId="Heading7">
+  <w:style w:type="paragraph" w:styleId="7">
     <w:name w:val="heading 7"/>
-    <w:basedOn w:val="Normal"/>
-    <w:next w:val="Normal"/>
-    <w:link w:val="Heading7Char"/>
+    <w:basedOn w:val="a0"/>
+    <w:next w:val="a0"/>
+    <w:link w:val="70"/>
     <w:uiPriority w:val="9"/>
     <w:unhideWhenUsed/>
     <w:qFormat/>
@@ -10472,11 +10308,11 @@
       <w:color w:val="404040" w:themeColor="text1" w:themeTint="BF"/>
     </w:rPr>
   </w:style>
-  <w:style w:type="paragraph" w:styleId="Heading8">
+  <w:style w:type="paragraph" w:styleId="8">
     <w:name w:val="heading 8"/>
-    <w:basedOn w:val="Normal"/>
-    <w:next w:val="Normal"/>
-    <w:link w:val="Heading8Char"/>
+    <w:basedOn w:val="a0"/>
+    <w:next w:val="a0"/>
+    <w:link w:val="80"/>
     <w:uiPriority w:val="9"/>
     <w:unhideWhenUsed/>
     <w:qFormat/>
@@ -10496,11 +10332,11 @@
       <w:color w:val="404040" w:themeColor="text1" w:themeTint="BF"/>
     </w:rPr>
   </w:style>
-  <w:style w:type="paragraph" w:styleId="Heading9">
+  <w:style w:type="paragraph" w:styleId="9">
     <w:name w:val="heading 9"/>
-    <w:basedOn w:val="Normal"/>
-    <w:next w:val="Normal"/>
-    <w:link w:val="Heading9Char"/>
+    <w:basedOn w:val="a0"/>
+    <w:next w:val="a0"/>
+    <w:link w:val="90"/>
     <w:uiPriority w:val="9"/>
     <w:unhideWhenUsed/>
     <w:qFormat/>
@@ -10522,13 +10358,13 @@
       <w:color w:val="404040" w:themeColor="text1" w:themeTint="BF"/>
     </w:rPr>
   </w:style>
-  <w:style w:type="character" w:default="1" w:styleId="DefaultParagraphFont">
+  <w:style w:type="character" w:default="1" w:styleId="a2">
     <w:name w:val="Default Paragraph Font"/>
     <w:uiPriority w:val="1"/>
     <w:semiHidden/>
     <w:unhideWhenUsed/>
   </w:style>
-  <w:style w:type="table" w:default="1" w:styleId="TableNormal">
+  <w:style w:type="table" w:default="1" w:styleId="a3">
     <w:name w:val="Normal Table"/>
     <w:uiPriority w:val="99"/>
     <w:semiHidden/>
@@ -10543,28 +10379,28 @@
       </w:tblCellMar>
     </w:tblPr>
   </w:style>
-  <w:style w:type="numbering" w:default="1" w:styleId="NoList">
+  <w:style w:type="numbering" w:default="1" w:styleId="a4">
     <w:name w:val="No List"/>
     <w:uiPriority w:val="99"/>
     <w:semiHidden/>
     <w:unhideWhenUsed/>
   </w:style>
-  <w:style w:type="paragraph" w:styleId="BodyText">
+  <w:style w:type="paragraph" w:styleId="a1">
     <w:name w:val="Body Text"/>
-    <w:basedOn w:val="Normal"/>
-    <w:link w:val="BodyTextChar"/>
+    <w:basedOn w:val="a0"/>
+    <w:link w:val="a5"/>
     <w:autoRedefine/>
     <w:qFormat/>
     <w:rsid w:val="00BC526B"/>
   </w:style>
   <w:style w:type="paragraph" w:customStyle="1" w:styleId="FirstParagraph">
     <w:name w:val="First Paragraph"/>
-    <w:basedOn w:val="BodyText"/>
-    <w:next w:val="BodyText"/>
+    <w:basedOn w:val="a1"/>
+    <w:next w:val="a1"/>
   </w:style>
   <w:style w:type="paragraph" w:customStyle="1" w:styleId="Compact">
     <w:name w:val="Compact"/>
-    <w:basedOn w:val="BodyText"/>
+    <w:basedOn w:val="a1"/>
     <w:autoRedefine/>
     <w:qFormat/>
     <w:rsid w:val="00170F12"/>
@@ -10576,11 +10412,11 @@
       <w:lang w:eastAsia="ja-JP"/>
     </w:rPr>
   </w:style>
-  <w:style w:type="paragraph" w:styleId="Title">
+  <w:style w:type="paragraph" w:styleId="a6">
     <w:name w:val="Title"/>
-    <w:basedOn w:val="Normal"/>
-    <w:next w:val="Normal"/>
-    <w:link w:val="TitleChar"/>
+    <w:basedOn w:val="a0"/>
+    <w:next w:val="a0"/>
+    <w:link w:val="a7"/>
     <w:autoRedefine/>
     <w:uiPriority w:val="10"/>
     <w:qFormat/>
@@ -10600,11 +10436,11 @@
       <w:lang w:eastAsia="ja-JP"/>
     </w:rPr>
   </w:style>
-  <w:style w:type="paragraph" w:styleId="Subtitle">
+  <w:style w:type="paragraph" w:styleId="a8">
     <w:name w:val="Subtitle"/>
-    <w:basedOn w:val="Normal"/>
-    <w:next w:val="Normal"/>
-    <w:link w:val="SubtitleChar"/>
+    <w:basedOn w:val="a0"/>
+    <w:next w:val="a0"/>
+    <w:link w:val="a9"/>
     <w:autoRedefine/>
     <w:uiPriority w:val="11"/>
     <w:qFormat/>
@@ -10621,8 +10457,8 @@
   </w:style>
   <w:style w:type="paragraph" w:customStyle="1" w:styleId="Author">
     <w:name w:val="Author"/>
-    <w:basedOn w:val="BodyText"/>
-    <w:next w:val="BodyText"/>
+    <w:basedOn w:val="a1"/>
+    <w:next w:val="a1"/>
     <w:autoRedefine/>
     <w:qFormat/>
     <w:rsid w:val="003876B0"/>
@@ -10635,10 +10471,10 @@
       <w:sz w:val="40"/>
     </w:rPr>
   </w:style>
-  <w:style w:type="paragraph" w:styleId="Date">
+  <w:style w:type="paragraph" w:styleId="aa">
     <w:name w:val="Date"/>
-    <w:basedOn w:val="BodyText"/>
-    <w:next w:val="BodyText"/>
+    <w:basedOn w:val="a1"/>
+    <w:next w:val="a1"/>
     <w:autoRedefine/>
     <w:qFormat/>
     <w:rsid w:val="00CC5A35"/>
@@ -10655,7 +10491,7 @@
   <w:style w:type="paragraph" w:customStyle="1" w:styleId="Abstract">
     <w:name w:val="Abstract"/>
     <w:basedOn w:val="Author"/>
-    <w:next w:val="BodyText"/>
+    <w:next w:val="a1"/>
     <w:autoRedefine/>
     <w:qFormat/>
     <w:rsid w:val="00E40B72"/>
@@ -10664,14 +10500,14 @@
       <w:lang w:eastAsia="ja-JP"/>
     </w:rPr>
   </w:style>
-  <w:style w:type="paragraph" w:styleId="Bibliography">
+  <w:style w:type="paragraph" w:styleId="ab">
     <w:name w:val="Bibliography"/>
-    <w:basedOn w:val="Normal"/>
-  </w:style>
-  <w:style w:type="paragraph" w:styleId="BlockText">
+    <w:basedOn w:val="a0"/>
+  </w:style>
+  <w:style w:type="paragraph" w:styleId="ac">
     <w:name w:val="Block Text"/>
-    <w:basedOn w:val="BodyText"/>
-    <w:next w:val="BodyText"/>
+    <w:basedOn w:val="a1"/>
+    <w:next w:val="a1"/>
     <w:autoRedefine/>
     <w:uiPriority w:val="9"/>
     <w:unhideWhenUsed/>
@@ -10687,9 +10523,9 @@
       <w:color w:val="595959" w:themeColor="text1" w:themeTint="A6"/>
     </w:rPr>
   </w:style>
-  <w:style w:type="paragraph" w:styleId="FootnoteText">
+  <w:style w:type="paragraph" w:styleId="ad">
     <w:name w:val="footnote text"/>
-    <w:basedOn w:val="Normal"/>
+    <w:basedOn w:val="a0"/>
     <w:autoRedefine/>
     <w:uiPriority w:val="9"/>
     <w:unhideWhenUsed/>
@@ -10702,7 +10538,7 @@
   </w:style>
   <w:style w:type="paragraph" w:customStyle="1" w:styleId="DefinitionTerm">
     <w:name w:val="Definition Term"/>
-    <w:basedOn w:val="Normal"/>
+    <w:basedOn w:val="a0"/>
     <w:next w:val="Definition"/>
     <w:pPr>
       <w:keepNext/>
@@ -10714,14 +10550,14 @@
   </w:style>
   <w:style w:type="paragraph" w:customStyle="1" w:styleId="Definition">
     <w:name w:val="Definition"/>
-    <w:basedOn w:val="BodyText"/>
+    <w:basedOn w:val="a1"/>
     <w:autoRedefine/>
   </w:style>
-  <w:style w:type="paragraph" w:styleId="Caption">
+  <w:style w:type="paragraph" w:styleId="ae">
     <w:name w:val="caption"/>
-    <w:basedOn w:val="Normal"/>
-    <w:next w:val="Normal"/>
-    <w:link w:val="CaptionChar"/>
+    <w:basedOn w:val="a0"/>
+    <w:next w:val="a0"/>
+    <w:link w:val="af"/>
     <w:autoRedefine/>
     <w:uiPriority w:val="35"/>
     <w:unhideWhenUsed/>
@@ -10736,7 +10572,7 @@
   </w:style>
   <w:style w:type="paragraph" w:customStyle="1" w:styleId="TableCaption">
     <w:name w:val="Table Caption"/>
-    <w:basedOn w:val="Caption"/>
+    <w:basedOn w:val="ae"/>
     <w:autoRedefine/>
     <w:qFormat/>
     <w:rsid w:val="00F22616"/>
@@ -10757,7 +10593,7 @@
   </w:style>
   <w:style w:type="paragraph" w:customStyle="1" w:styleId="Figure">
     <w:name w:val="Figure"/>
-    <w:basedOn w:val="Normal"/>
+    <w:basedOn w:val="a0"/>
   </w:style>
   <w:style w:type="paragraph" w:customStyle="1" w:styleId="FigurewithCaption">
     <w:name w:val="Figure with Caption"/>
@@ -10766,10 +10602,10 @@
       <w:keepNext/>
     </w:pPr>
   </w:style>
-  <w:style w:type="character" w:customStyle="1" w:styleId="CaptionChar">
-    <w:name w:val="Caption Char"/>
-    <w:basedOn w:val="DefaultParagraphFont"/>
-    <w:link w:val="Caption"/>
+  <w:style w:type="character" w:customStyle="1" w:styleId="af">
+    <w:name w:val="図表番号 (文字)"/>
+    <w:basedOn w:val="a2"/>
+    <w:link w:val="ae"/>
     <w:uiPriority w:val="35"/>
     <w:rsid w:val="007908FF"/>
     <w:rPr>
@@ -10781,28 +10617,28 @@
   </w:style>
   <w:style w:type="character" w:customStyle="1" w:styleId="VerbatimChar">
     <w:name w:val="Verbatim Char"/>
-    <w:basedOn w:val="DefaultParagraphFont"/>
+    <w:basedOn w:val="a2"/>
     <w:uiPriority w:val="1"/>
     <w:qFormat/>
-    <w:rsid w:val="007328FC"/>
+    <w:rsid w:val="00DE1BC2"/>
     <w:rPr>
-      <w:rFonts w:ascii="源ノ角ゴシック Code JP N" w:eastAsia="源ノ角ゴシック Code JP N" w:hAnsi="源ノ角ゴシック Code JP N" w:cs="源ノ角ゴシック Code JP N"/>
+      <w:rFonts w:ascii="Source Han Code JP R" w:eastAsia="Source Han Code JP R" w:hAnsi="Source Han Code JP R" w:cs="Source Han Code JP R"/>
       <w:bdr w:val="none" w:sz="0" w:space="0" w:color="auto"/>
       <w:shd w:val="clear" w:color="A6A6A6" w:themeColor="background1" w:themeShade="A6" w:fill="F2F2F2" w:themeFill="background1" w:themeFillShade="F2"/>
     </w:rPr>
   </w:style>
-  <w:style w:type="character" w:styleId="FootnoteReference">
+  <w:style w:type="character" w:styleId="af0">
     <w:name w:val="footnote reference"/>
-    <w:basedOn w:val="DefaultParagraphFont"/>
+    <w:basedOn w:val="a2"/>
     <w:unhideWhenUsed/>
     <w:rsid w:val="00E57EAE"/>
     <w:rPr>
       <w:vertAlign w:val="superscript"/>
     </w:rPr>
   </w:style>
-  <w:style w:type="character" w:styleId="Hyperlink">
+  <w:style w:type="character" w:styleId="af1">
     <w:name w:val="Hyperlink"/>
-    <w:basedOn w:val="DefaultParagraphFont"/>
+    <w:basedOn w:val="a2"/>
     <w:uiPriority w:val="99"/>
     <w:qFormat/>
     <w:rsid w:val="00720A34"/>
@@ -10811,10 +10647,10 @@
       <w:u w:val="single"/>
     </w:rPr>
   </w:style>
-  <w:style w:type="paragraph" w:styleId="TOCHeading">
+  <w:style w:type="paragraph" w:styleId="af2">
     <w:name w:val="TOC Heading"/>
-    <w:basedOn w:val="Heading1"/>
-    <w:next w:val="Normal"/>
+    <w:basedOn w:val="1"/>
+    <w:next w:val="a0"/>
     <w:autoRedefine/>
     <w:uiPriority w:val="39"/>
     <w:unhideWhenUsed/>
@@ -10837,10 +10673,10 @@
       <w:szCs w:val="24"/>
     </w:rPr>
   </w:style>
-  <w:style w:type="paragraph" w:styleId="Header">
+  <w:style w:type="paragraph" w:styleId="af3">
     <w:name w:val="header"/>
-    <w:basedOn w:val="Normal"/>
-    <w:link w:val="HeaderChar"/>
+    <w:basedOn w:val="a0"/>
+    <w:link w:val="af4"/>
     <w:uiPriority w:val="99"/>
     <w:unhideWhenUsed/>
     <w:rsid w:val="00C17E2B"/>
@@ -10852,10 +10688,10 @@
       <w:snapToGrid w:val="0"/>
     </w:pPr>
   </w:style>
-  <w:style w:type="character" w:customStyle="1" w:styleId="HeaderChar">
-    <w:name w:val="Header Char"/>
-    <w:basedOn w:val="DefaultParagraphFont"/>
-    <w:link w:val="Header"/>
+  <w:style w:type="character" w:customStyle="1" w:styleId="af4">
+    <w:name w:val="ヘッダー (文字)"/>
+    <w:basedOn w:val="a2"/>
+    <w:link w:val="af3"/>
     <w:uiPriority w:val="99"/>
     <w:rsid w:val="00C17E2B"/>
     <w:rPr>
@@ -10864,10 +10700,10 @@
       <w:szCs w:val="20"/>
     </w:rPr>
   </w:style>
-  <w:style w:type="paragraph" w:styleId="Footer">
+  <w:style w:type="paragraph" w:styleId="af5">
     <w:name w:val="footer"/>
-    <w:basedOn w:val="Normal"/>
-    <w:link w:val="FooterChar"/>
+    <w:basedOn w:val="a0"/>
+    <w:link w:val="af6"/>
     <w:autoRedefine/>
     <w:uiPriority w:val="99"/>
     <w:unhideWhenUsed/>
@@ -10882,10 +10718,10 @@
       <w:jc w:val="center"/>
     </w:pPr>
   </w:style>
-  <w:style w:type="character" w:customStyle="1" w:styleId="FooterChar">
-    <w:name w:val="Footer Char"/>
-    <w:basedOn w:val="DefaultParagraphFont"/>
-    <w:link w:val="Footer"/>
+  <w:style w:type="character" w:customStyle="1" w:styleId="af6">
+    <w:name w:val="フッター (文字)"/>
+    <w:basedOn w:val="a2"/>
+    <w:link w:val="af5"/>
     <w:uiPriority w:val="99"/>
     <w:rsid w:val="00BD28C6"/>
     <w:rPr>
@@ -10894,9 +10730,9 @@
       <w:szCs w:val="20"/>
     </w:rPr>
   </w:style>
-  <w:style w:type="paragraph" w:styleId="ListParagraph">
+  <w:style w:type="paragraph" w:styleId="af7">
     <w:name w:val="List Paragraph"/>
-    <w:basedOn w:val="Normal"/>
+    <w:basedOn w:val="a0"/>
     <w:uiPriority w:val="34"/>
     <w:qFormat/>
     <w:rsid w:val="00AB053E"/>
@@ -10904,10 +10740,10 @@
       <w:ind w:left="720"/>
     </w:pPr>
   </w:style>
-  <w:style w:type="character" w:customStyle="1" w:styleId="Heading6Char">
-    <w:name w:val="Heading 6 Char"/>
-    <w:basedOn w:val="DefaultParagraphFont"/>
-    <w:link w:val="Heading6"/>
+  <w:style w:type="character" w:customStyle="1" w:styleId="61">
+    <w:name w:val="見出し 6 (文字)"/>
+    <w:basedOn w:val="a2"/>
+    <w:link w:val="6"/>
     <w:uiPriority w:val="9"/>
     <w:rsid w:val="00313492"/>
     <w:rPr>
@@ -10919,18 +10755,18 @@
       <w:szCs w:val="18"/>
     </w:rPr>
   </w:style>
-  <w:style w:type="character" w:styleId="PlaceholderText">
+  <w:style w:type="character" w:styleId="af8">
     <w:name w:val="Placeholder Text"/>
-    <w:basedOn w:val="DefaultParagraphFont"/>
+    <w:basedOn w:val="a2"/>
     <w:semiHidden/>
     <w:rsid w:val="007C0B1F"/>
     <w:rPr>
       <w:color w:val="808080"/>
     </w:rPr>
   </w:style>
-  <w:style w:type="paragraph" w:styleId="NoSpacing">
+  <w:style w:type="paragraph" w:styleId="af9">
     <w:name w:val="No Spacing"/>
-    <w:link w:val="NoSpacingChar"/>
+    <w:link w:val="afa"/>
     <w:uiPriority w:val="1"/>
     <w:qFormat/>
     <w:rsid w:val="00313492"/>
@@ -10938,17 +10774,17 @@
       <w:spacing w:after="0" w:line="240" w:lineRule="auto"/>
     </w:pPr>
   </w:style>
-  <w:style w:type="character" w:customStyle="1" w:styleId="NoSpacingChar">
-    <w:name w:val="No Spacing Char"/>
-    <w:basedOn w:val="DefaultParagraphFont"/>
-    <w:link w:val="NoSpacing"/>
+  <w:style w:type="character" w:customStyle="1" w:styleId="afa">
+    <w:name w:val="行間詰め (文字)"/>
+    <w:basedOn w:val="a2"/>
+    <w:link w:val="af9"/>
     <w:uiPriority w:val="1"/>
     <w:rsid w:val="00EF0C6F"/>
   </w:style>
-  <w:style w:type="paragraph" w:styleId="TOC1">
+  <w:style w:type="paragraph" w:styleId="12">
     <w:name w:val="toc 1"/>
-    <w:basedOn w:val="Normal"/>
-    <w:next w:val="Normal"/>
+    <w:basedOn w:val="a0"/>
+    <w:next w:val="a0"/>
     <w:autoRedefine/>
     <w:uiPriority w:val="39"/>
     <w:unhideWhenUsed/>
@@ -10969,7 +10805,7 @@
   </w:style>
   <w:style w:type="table" w:customStyle="1" w:styleId="Centered">
     <w:name w:val="Centered"/>
-    <w:basedOn w:val="TableNormal"/>
+    <w:basedOn w:val="a3"/>
     <w:uiPriority w:val="99"/>
     <w:rsid w:val="0061754E"/>
     <w:pPr>
@@ -10992,9 +10828,9 @@
       </w:tcPr>
     </w:tblStylePr>
   </w:style>
-  <w:style w:type="table" w:customStyle="1" w:styleId="11">
+  <w:style w:type="table" w:customStyle="1" w:styleId="110">
     <w:name w:val="標準の表 11"/>
-    <w:basedOn w:val="TableNormal"/>
+    <w:basedOn w:val="a3"/>
     <w:rsid w:val="001B53B3"/>
     <w:pPr>
       <w:spacing w:after="0"/>
@@ -11054,9 +10890,9 @@
       </w:tcPr>
     </w:tblStylePr>
   </w:style>
-  <w:style w:type="table" w:styleId="TableGrid">
+  <w:style w:type="table" w:styleId="afb">
     <w:name w:val="Table Grid"/>
-    <w:basedOn w:val="TableNormal"/>
+    <w:basedOn w:val="a3"/>
     <w:rsid w:val="004D5B15"/>
     <w:pPr>
       <w:spacing w:after="0"/>
@@ -11072,9 +10908,9 @@
       </w:tblBorders>
     </w:tblPr>
   </w:style>
-  <w:style w:type="table" w:styleId="TableClassic1">
+  <w:style w:type="table" w:styleId="13">
     <w:name w:val="Table Classic 1"/>
-    <w:basedOn w:val="TableNormal"/>
+    <w:basedOn w:val="a3"/>
     <w:semiHidden/>
     <w:unhideWhenUsed/>
     <w:rsid w:val="001B7892"/>
@@ -11153,9 +10989,9 @@
       </w:tcPr>
     </w:tblStylePr>
   </w:style>
-  <w:style w:type="table" w:customStyle="1" w:styleId="21">
+  <w:style w:type="table" w:customStyle="1" w:styleId="210">
     <w:name w:val="標準の表 21"/>
-    <w:basedOn w:val="TableNormal"/>
+    <w:basedOn w:val="a3"/>
     <w:rsid w:val="00A113D2"/>
     <w:pPr>
       <w:spacing w:after="0"/>
@@ -11232,9 +11068,9 @@
       </w:tcPr>
     </w:tblStylePr>
   </w:style>
-  <w:style w:type="table" w:styleId="TableGrid1">
+  <w:style w:type="table" w:styleId="14">
     <w:name w:val="Table Grid 1"/>
-    <w:basedOn w:val="TableNormal"/>
+    <w:basedOn w:val="a3"/>
     <w:semiHidden/>
     <w:unhideWhenUsed/>
     <w:rsid w:val="00A113D2"/>
@@ -11287,10 +11123,10 @@
       </w:tcPr>
     </w:tblStylePr>
   </w:style>
-  <w:style w:type="paragraph" w:styleId="BalloonText">
+  <w:style w:type="paragraph" w:styleId="afc">
     <w:name w:val="Balloon Text"/>
-    <w:basedOn w:val="Normal"/>
-    <w:link w:val="BalloonTextChar"/>
+    <w:basedOn w:val="a0"/>
+    <w:link w:val="afd"/>
     <w:semiHidden/>
     <w:unhideWhenUsed/>
     <w:rsid w:val="009E1693"/>
@@ -11298,10 +11134,10 @@
       <w:rFonts w:ascii="ヒラギノ角ゴ ProN W3" w:eastAsia="ヒラギノ角ゴ ProN W3"/>
     </w:rPr>
   </w:style>
-  <w:style w:type="character" w:customStyle="1" w:styleId="BalloonTextChar">
-    <w:name w:val="Balloon Text Char"/>
-    <w:basedOn w:val="DefaultParagraphFont"/>
-    <w:link w:val="BalloonText"/>
+  <w:style w:type="character" w:customStyle="1" w:styleId="afd">
+    <w:name w:val="吹き出し (文字)"/>
+    <w:basedOn w:val="a2"/>
+    <w:link w:val="afc"/>
     <w:semiHidden/>
     <w:rsid w:val="009E1693"/>
     <w:rPr>
@@ -11310,10 +11146,10 @@
       <w:szCs w:val="18"/>
     </w:rPr>
   </w:style>
-  <w:style w:type="character" w:customStyle="1" w:styleId="Heading1Char">
-    <w:name w:val="Heading 1 Char"/>
-    <w:basedOn w:val="DefaultParagraphFont"/>
-    <w:link w:val="Heading1"/>
+  <w:style w:type="character" w:customStyle="1" w:styleId="11">
+    <w:name w:val="見出し 1 (文字)"/>
+    <w:basedOn w:val="a2"/>
+    <w:link w:val="1"/>
     <w:uiPriority w:val="9"/>
     <w:rsid w:val="005B012C"/>
     <w:rPr>
@@ -11323,10 +11159,10 @@
       <w:szCs w:val="36"/>
     </w:rPr>
   </w:style>
-  <w:style w:type="character" w:customStyle="1" w:styleId="Heading2Char">
-    <w:name w:val="Heading 2 Char"/>
-    <w:basedOn w:val="DefaultParagraphFont"/>
-    <w:link w:val="Heading2"/>
+  <w:style w:type="character" w:customStyle="1" w:styleId="22">
+    <w:name w:val="見出し 2 (文字)"/>
+    <w:basedOn w:val="a2"/>
+    <w:link w:val="20"/>
     <w:uiPriority w:val="9"/>
     <w:rsid w:val="005B012C"/>
     <w:rPr>
@@ -11336,10 +11172,10 @@
       <w:szCs w:val="28"/>
     </w:rPr>
   </w:style>
-  <w:style w:type="character" w:customStyle="1" w:styleId="Heading3Char">
-    <w:name w:val="Heading 3 Char"/>
-    <w:basedOn w:val="DefaultParagraphFont"/>
-    <w:link w:val="Heading3"/>
+  <w:style w:type="character" w:customStyle="1" w:styleId="32">
+    <w:name w:val="見出し 3 (文字)"/>
+    <w:basedOn w:val="a2"/>
+    <w:link w:val="31"/>
     <w:uiPriority w:val="9"/>
     <w:rsid w:val="005B012C"/>
     <w:rPr>
@@ -11349,10 +11185,10 @@
       <w:szCs w:val="24"/>
     </w:rPr>
   </w:style>
-  <w:style w:type="character" w:customStyle="1" w:styleId="Heading4Char">
-    <w:name w:val="Heading 4 Char"/>
-    <w:basedOn w:val="DefaultParagraphFont"/>
-    <w:link w:val="Heading4"/>
+  <w:style w:type="character" w:customStyle="1" w:styleId="41">
+    <w:name w:val="見出し 4 (文字)"/>
+    <w:basedOn w:val="a2"/>
+    <w:link w:val="40"/>
     <w:uiPriority w:val="9"/>
     <w:rsid w:val="005B012C"/>
     <w:rPr>
@@ -11363,10 +11199,10 @@
       <w:szCs w:val="20"/>
     </w:rPr>
   </w:style>
-  <w:style w:type="character" w:customStyle="1" w:styleId="Heading5Char">
-    <w:name w:val="Heading 5 Char"/>
-    <w:basedOn w:val="DefaultParagraphFont"/>
-    <w:link w:val="Heading5"/>
+  <w:style w:type="character" w:customStyle="1" w:styleId="51">
+    <w:name w:val="見出し 5 (文字)"/>
+    <w:basedOn w:val="a2"/>
+    <w:link w:val="5"/>
     <w:uiPriority w:val="9"/>
     <w:rsid w:val="00A9252F"/>
     <w:rPr>
@@ -11377,10 +11213,10 @@
       <w:szCs w:val="18"/>
     </w:rPr>
   </w:style>
-  <w:style w:type="character" w:customStyle="1" w:styleId="Heading7Char">
-    <w:name w:val="Heading 7 Char"/>
-    <w:basedOn w:val="DefaultParagraphFont"/>
-    <w:link w:val="Heading7"/>
+  <w:style w:type="character" w:customStyle="1" w:styleId="70">
+    <w:name w:val="見出し 7 (文字)"/>
+    <w:basedOn w:val="a2"/>
+    <w:link w:val="7"/>
     <w:uiPriority w:val="9"/>
     <w:rsid w:val="00313492"/>
     <w:rPr>
@@ -11392,10 +11228,10 @@
       <w:szCs w:val="18"/>
     </w:rPr>
   </w:style>
-  <w:style w:type="character" w:customStyle="1" w:styleId="Heading8Char">
-    <w:name w:val="Heading 8 Char"/>
-    <w:basedOn w:val="DefaultParagraphFont"/>
-    <w:link w:val="Heading8"/>
+  <w:style w:type="character" w:customStyle="1" w:styleId="80">
+    <w:name w:val="見出し 8 (文字)"/>
+    <w:basedOn w:val="a2"/>
+    <w:link w:val="8"/>
     <w:uiPriority w:val="9"/>
     <w:rsid w:val="00313492"/>
     <w:rPr>
@@ -11405,10 +11241,10 @@
       <w:szCs w:val="18"/>
     </w:rPr>
   </w:style>
-  <w:style w:type="character" w:customStyle="1" w:styleId="Heading9Char">
-    <w:name w:val="Heading 9 Char"/>
-    <w:basedOn w:val="DefaultParagraphFont"/>
-    <w:link w:val="Heading9"/>
+  <w:style w:type="character" w:customStyle="1" w:styleId="90">
+    <w:name w:val="見出し 9 (文字)"/>
+    <w:basedOn w:val="a2"/>
+    <w:link w:val="9"/>
     <w:uiPriority w:val="9"/>
     <w:rsid w:val="00313492"/>
     <w:rPr>
@@ -11420,10 +11256,10 @@
       <w:szCs w:val="18"/>
     </w:rPr>
   </w:style>
-  <w:style w:type="character" w:customStyle="1" w:styleId="TitleChar">
-    <w:name w:val="Title Char"/>
-    <w:basedOn w:val="DefaultParagraphFont"/>
-    <w:link w:val="Title"/>
+  <w:style w:type="character" w:customStyle="1" w:styleId="a7">
+    <w:name w:val="表題 (文字)"/>
+    <w:basedOn w:val="a2"/>
+    <w:link w:val="a6"/>
     <w:uiPriority w:val="10"/>
     <w:rsid w:val="00E40B72"/>
     <w:rPr>
@@ -11434,10 +11270,10 @@
       <w:lang w:eastAsia="ja-JP"/>
     </w:rPr>
   </w:style>
-  <w:style w:type="character" w:customStyle="1" w:styleId="SubtitleChar">
-    <w:name w:val="Subtitle Char"/>
-    <w:basedOn w:val="DefaultParagraphFont"/>
-    <w:link w:val="Subtitle"/>
+  <w:style w:type="character" w:customStyle="1" w:styleId="a9">
+    <w:name w:val="副題 (文字)"/>
+    <w:basedOn w:val="a2"/>
+    <w:link w:val="a8"/>
     <w:uiPriority w:val="11"/>
     <w:rsid w:val="00905AF0"/>
     <w:rPr>
@@ -11448,9 +11284,9 @@
       <w:szCs w:val="20"/>
     </w:rPr>
   </w:style>
-  <w:style w:type="character" w:styleId="Strong">
+  <w:style w:type="character" w:styleId="afe">
     <w:name w:val="Strong"/>
-    <w:basedOn w:val="DefaultParagraphFont"/>
+    <w:basedOn w:val="a2"/>
     <w:uiPriority w:val="22"/>
     <w:qFormat/>
     <w:rsid w:val="00313492"/>
@@ -11460,9 +11296,9 @@
       <w:color w:val="000000" w:themeColor="text1"/>
     </w:rPr>
   </w:style>
-  <w:style w:type="character" w:styleId="Emphasis">
+  <w:style w:type="character" w:styleId="aff">
     <w:name w:val="Emphasis"/>
-    <w:basedOn w:val="DefaultParagraphFont"/>
+    <w:basedOn w:val="a2"/>
     <w:uiPriority w:val="20"/>
     <w:qFormat/>
     <w:rsid w:val="00313492"/>
@@ -11472,11 +11308,11 @@
       <w:color w:val="auto"/>
     </w:rPr>
   </w:style>
-  <w:style w:type="paragraph" w:styleId="Quote">
+  <w:style w:type="paragraph" w:styleId="aff0">
     <w:name w:val="Quote"/>
-    <w:basedOn w:val="Normal"/>
-    <w:next w:val="Normal"/>
-    <w:link w:val="QuoteChar"/>
+    <w:basedOn w:val="a0"/>
+    <w:next w:val="a0"/>
+    <w:link w:val="aff1"/>
     <w:uiPriority w:val="29"/>
     <w:qFormat/>
     <w:rsid w:val="00313492"/>
@@ -11490,10 +11326,10 @@
       <w:color w:val="000000" w:themeColor="text1"/>
     </w:rPr>
   </w:style>
-  <w:style w:type="character" w:customStyle="1" w:styleId="QuoteChar">
-    <w:name w:val="Quote Char"/>
-    <w:basedOn w:val="DefaultParagraphFont"/>
-    <w:link w:val="Quote"/>
+  <w:style w:type="character" w:customStyle="1" w:styleId="aff1">
+    <w:name w:val="引用文 (文字)"/>
+    <w:basedOn w:val="a2"/>
+    <w:link w:val="aff0"/>
     <w:uiPriority w:val="29"/>
     <w:rsid w:val="00313492"/>
     <w:rPr>
@@ -11502,11 +11338,11 @@
       <w:color w:val="000000" w:themeColor="text1"/>
     </w:rPr>
   </w:style>
-  <w:style w:type="paragraph" w:styleId="IntenseQuote">
+  <w:style w:type="paragraph" w:styleId="23">
     <w:name w:val="Intense Quote"/>
-    <w:basedOn w:val="Normal"/>
-    <w:next w:val="Normal"/>
-    <w:link w:val="IntenseQuoteChar"/>
+    <w:basedOn w:val="a0"/>
+    <w:next w:val="a0"/>
+    <w:link w:val="24"/>
     <w:uiPriority w:val="30"/>
     <w:qFormat/>
     <w:rsid w:val="00313492"/>
@@ -11524,10 +11360,10 @@
       <w:color w:val="000000" w:themeColor="text1"/>
     </w:rPr>
   </w:style>
-  <w:style w:type="character" w:customStyle="1" w:styleId="IntenseQuoteChar">
-    <w:name w:val="Intense Quote Char"/>
-    <w:basedOn w:val="DefaultParagraphFont"/>
-    <w:link w:val="IntenseQuote"/>
+  <w:style w:type="character" w:customStyle="1" w:styleId="24">
+    <w:name w:val="引用文 2 (文字)"/>
+    <w:basedOn w:val="a2"/>
+    <w:link w:val="23"/>
     <w:uiPriority w:val="30"/>
     <w:rsid w:val="00313492"/>
     <w:rPr>
@@ -11535,9 +11371,9 @@
       <w:shd w:val="clear" w:color="auto" w:fill="F2F2F2" w:themeFill="background1" w:themeFillShade="F2"/>
     </w:rPr>
   </w:style>
-  <w:style w:type="character" w:styleId="SubtleEmphasis">
+  <w:style w:type="character" w:styleId="aff2">
     <w:name w:val="Subtle Emphasis"/>
-    <w:basedOn w:val="DefaultParagraphFont"/>
+    <w:basedOn w:val="a2"/>
     <w:uiPriority w:val="19"/>
     <w:qFormat/>
     <w:rsid w:val="00313492"/>
@@ -11547,9 +11383,9 @@
       <w:color w:val="404040" w:themeColor="text1" w:themeTint="BF"/>
     </w:rPr>
   </w:style>
-  <w:style w:type="character" w:styleId="IntenseEmphasis">
+  <w:style w:type="character" w:styleId="25">
     <w:name w:val="Intense Emphasis"/>
-    <w:basedOn w:val="DefaultParagraphFont"/>
+    <w:basedOn w:val="a2"/>
     <w:uiPriority w:val="21"/>
     <w:qFormat/>
     <w:rsid w:val="00313492"/>
@@ -11561,9 +11397,9 @@
       <w:caps/>
     </w:rPr>
   </w:style>
-  <w:style w:type="character" w:styleId="SubtleReference">
+  <w:style w:type="character" w:styleId="aff3">
     <w:name w:val="Subtle Reference"/>
-    <w:basedOn w:val="DefaultParagraphFont"/>
+    <w:basedOn w:val="a2"/>
     <w:uiPriority w:val="31"/>
     <w:qFormat/>
     <w:rsid w:val="00313492"/>
@@ -11573,9 +11409,9 @@
       <w:u w:val="single" w:color="7F7F7F" w:themeColor="text1" w:themeTint="80"/>
     </w:rPr>
   </w:style>
-  <w:style w:type="character" w:styleId="IntenseReference">
+  <w:style w:type="character" w:styleId="26">
     <w:name w:val="Intense Reference"/>
-    <w:basedOn w:val="DefaultParagraphFont"/>
+    <w:basedOn w:val="a2"/>
     <w:uiPriority w:val="32"/>
     <w:qFormat/>
     <w:rsid w:val="00313492"/>
@@ -11586,9 +11422,9 @@
       <w:u w:val="single"/>
     </w:rPr>
   </w:style>
-  <w:style w:type="character" w:styleId="BookTitle">
+  <w:style w:type="character" w:styleId="aff4">
     <w:name w:val="Book Title"/>
-    <w:basedOn w:val="DefaultParagraphFont"/>
+    <w:basedOn w:val="a2"/>
     <w:uiPriority w:val="33"/>
     <w:qFormat/>
     <w:rsid w:val="00313492"/>
@@ -11599,10 +11435,10 @@
       <w:spacing w:val="5"/>
     </w:rPr>
   </w:style>
-  <w:style w:type="paragraph" w:styleId="TOC2">
+  <w:style w:type="paragraph" w:styleId="27">
     <w:name w:val="toc 2"/>
-    <w:basedOn w:val="Normal"/>
-    <w:next w:val="Normal"/>
+    <w:basedOn w:val="a0"/>
+    <w:next w:val="a0"/>
     <w:autoRedefine/>
     <w:uiPriority w:val="39"/>
     <w:unhideWhenUsed/>
@@ -11617,10 +11453,10 @@
       <w:sz w:val="22"/>
     </w:rPr>
   </w:style>
-  <w:style w:type="paragraph" w:styleId="TOC3">
+  <w:style w:type="paragraph" w:styleId="33">
     <w:name w:val="toc 3"/>
-    <w:basedOn w:val="Normal"/>
-    <w:next w:val="Normal"/>
+    <w:basedOn w:val="a0"/>
+    <w:next w:val="a0"/>
     <w:autoRedefine/>
     <w:uiPriority w:val="39"/>
     <w:unhideWhenUsed/>
@@ -11630,10 +11466,10 @@
       <w:ind w:left="400"/>
     </w:pPr>
   </w:style>
-  <w:style w:type="character" w:customStyle="1" w:styleId="BodyTextChar">
-    <w:name w:val="Body Text Char"/>
-    <w:basedOn w:val="DefaultParagraphFont"/>
-    <w:link w:val="BodyText"/>
+  <w:style w:type="character" w:customStyle="1" w:styleId="a5">
+    <w:name w:val="本文 (文字)"/>
+    <w:basedOn w:val="a2"/>
+    <w:link w:val="a1"/>
     <w:rsid w:val="00BC526B"/>
     <w:rPr>
       <w:rFonts w:ascii="Source Han Sans Regular" w:eastAsia="Source Han Sans Regular" w:hAnsi="Source Han Sans Regular" w:cs="Source Han Sans Regular"/>
@@ -11641,10 +11477,10 @@
       <w:szCs w:val="18"/>
     </w:rPr>
   </w:style>
-  <w:style w:type="paragraph" w:styleId="DocumentMap">
+  <w:style w:type="paragraph" w:styleId="aff5">
     <w:name w:val="Document Map"/>
-    <w:basedOn w:val="Normal"/>
-    <w:link w:val="DocumentMapChar"/>
+    <w:basedOn w:val="a0"/>
+    <w:link w:val="aff6"/>
     <w:semiHidden/>
     <w:unhideWhenUsed/>
     <w:rsid w:val="00522479"/>
@@ -11654,10 +11490,10 @@
       <w:szCs w:val="24"/>
     </w:rPr>
   </w:style>
-  <w:style w:type="character" w:customStyle="1" w:styleId="DocumentMapChar">
-    <w:name w:val="Document Map Char"/>
-    <w:basedOn w:val="DefaultParagraphFont"/>
-    <w:link w:val="DocumentMap"/>
+  <w:style w:type="character" w:customStyle="1" w:styleId="aff6">
+    <w:name w:val="見出しマップ (文字)"/>
+    <w:basedOn w:val="a2"/>
+    <w:link w:val="aff5"/>
     <w:semiHidden/>
     <w:rsid w:val="00522479"/>
     <w:rPr>
@@ -11668,7 +11504,7 @@
   </w:style>
   <w:style w:type="paragraph" w:customStyle="1" w:styleId="HeadingUnnumbered1">
     <w:name w:val="Heading Unnumbered 1"/>
-    <w:basedOn w:val="Heading1"/>
+    <w:basedOn w:val="1"/>
     <w:autoRedefine/>
     <w:qFormat/>
     <w:rsid w:val="005E0ECC"/>
@@ -11680,7 +11516,7 @@
   </w:style>
   <w:style w:type="paragraph" w:customStyle="1" w:styleId="HeadingUnnumbered2">
     <w:name w:val="Heading Unnumbered 2"/>
-    <w:basedOn w:val="Heading2"/>
+    <w:basedOn w:val="20"/>
     <w:autoRedefine/>
     <w:qFormat/>
     <w:rsid w:val="005E0ECC"/>
@@ -11693,7 +11529,7 @@
   </w:style>
   <w:style w:type="paragraph" w:customStyle="1" w:styleId="HeadingUnnumbered3">
     <w:name w:val="Heading Unnumbered 3"/>
-    <w:basedOn w:val="Heading3"/>
+    <w:basedOn w:val="31"/>
     <w:autoRedefine/>
     <w:qFormat/>
     <w:rsid w:val="007F64DA"/>
@@ -11710,14 +11546,14 @@
   </w:style>
   <w:style w:type="paragraph" w:customStyle="1" w:styleId="HeadingUnnumbered4">
     <w:name w:val="Heading Unnumbered 4"/>
-    <w:basedOn w:val="Heading4"/>
+    <w:basedOn w:val="40"/>
     <w:autoRedefine/>
     <w:qFormat/>
     <w:rsid w:val="007F64DA"/>
   </w:style>
-  <w:style w:type="paragraph" w:styleId="ListBullet">
+  <w:style w:type="paragraph" w:styleId="a">
     <w:name w:val="List Bullet"/>
-    <w:basedOn w:val="Normal"/>
+    <w:basedOn w:val="a0"/>
     <w:unhideWhenUsed/>
     <w:rsid w:val="00277BAF"/>
     <w:pPr>
@@ -11726,9 +11562,9 @@
       </w:numPr>
     </w:pPr>
   </w:style>
-  <w:style w:type="paragraph" w:styleId="ListBullet2">
+  <w:style w:type="paragraph" w:styleId="2">
     <w:name w:val="List Bullet 2"/>
-    <w:basedOn w:val="Normal"/>
+    <w:basedOn w:val="a0"/>
     <w:unhideWhenUsed/>
     <w:rsid w:val="00277BAF"/>
     <w:pPr>
@@ -11737,9 +11573,9 @@
       </w:numPr>
     </w:pPr>
   </w:style>
-  <w:style w:type="paragraph" w:styleId="ListBullet3">
+  <w:style w:type="paragraph" w:styleId="3">
     <w:name w:val="List Bullet 3"/>
-    <w:basedOn w:val="Normal"/>
+    <w:basedOn w:val="a0"/>
     <w:unhideWhenUsed/>
     <w:rsid w:val="00277BAF"/>
     <w:pPr>
@@ -11750,7 +11586,7 @@
   </w:style>
   <w:style w:type="paragraph" w:customStyle="1" w:styleId="BulletList1">
     <w:name w:val="Bullet List 1"/>
-    <w:basedOn w:val="ListBullet"/>
+    <w:basedOn w:val="a"/>
     <w:autoRedefine/>
     <w:qFormat/>
     <w:rsid w:val="005B012C"/>
@@ -11762,22 +11598,22 @@
   </w:style>
   <w:style w:type="paragraph" w:customStyle="1" w:styleId="BulletList2">
     <w:name w:val="Bullet List 2"/>
-    <w:basedOn w:val="ListBullet2"/>
+    <w:basedOn w:val="2"/>
     <w:autoRedefine/>
     <w:qFormat/>
     <w:rsid w:val="00C86595"/>
   </w:style>
   <w:style w:type="paragraph" w:customStyle="1" w:styleId="BulletList3">
     <w:name w:val="Bullet List 3"/>
-    <w:basedOn w:val="ListBullet3"/>
+    <w:basedOn w:val="3"/>
     <w:autoRedefine/>
     <w:qFormat/>
     <w:rsid w:val="00B90103"/>
   </w:style>
-  <w:style w:type="paragraph" w:styleId="TOC4">
+  <w:style w:type="paragraph" w:styleId="42">
     <w:name w:val="toc 4"/>
-    <w:basedOn w:val="Normal"/>
-    <w:next w:val="Normal"/>
+    <w:basedOn w:val="a0"/>
+    <w:next w:val="a0"/>
     <w:autoRedefine/>
     <w:unhideWhenUsed/>
     <w:rsid w:val="00CA0677"/>
@@ -11788,10 +11624,10 @@
       <w:rFonts w:asciiTheme="minorHAnsi" w:eastAsiaTheme="minorHAnsi"/>
     </w:rPr>
   </w:style>
-  <w:style w:type="paragraph" w:styleId="TOC5">
+  <w:style w:type="paragraph" w:styleId="52">
     <w:name w:val="toc 5"/>
-    <w:basedOn w:val="Normal"/>
-    <w:next w:val="Normal"/>
+    <w:basedOn w:val="a0"/>
+    <w:next w:val="a0"/>
     <w:autoRedefine/>
     <w:unhideWhenUsed/>
     <w:rsid w:val="00CA0677"/>
@@ -11802,10 +11638,10 @@
       <w:rFonts w:asciiTheme="minorHAnsi" w:eastAsiaTheme="minorHAnsi"/>
     </w:rPr>
   </w:style>
-  <w:style w:type="paragraph" w:styleId="TOC6">
+  <w:style w:type="paragraph" w:styleId="62">
     <w:name w:val="toc 6"/>
-    <w:basedOn w:val="Normal"/>
-    <w:next w:val="Normal"/>
+    <w:basedOn w:val="a0"/>
+    <w:next w:val="a0"/>
     <w:autoRedefine/>
     <w:unhideWhenUsed/>
     <w:rsid w:val="00CA0677"/>
@@ -11816,10 +11652,10 @@
       <w:rFonts w:asciiTheme="minorHAnsi" w:eastAsiaTheme="minorHAnsi"/>
     </w:rPr>
   </w:style>
-  <w:style w:type="paragraph" w:styleId="TOC7">
+  <w:style w:type="paragraph" w:styleId="71">
     <w:name w:val="toc 7"/>
-    <w:basedOn w:val="Normal"/>
-    <w:next w:val="Normal"/>
+    <w:basedOn w:val="a0"/>
+    <w:next w:val="a0"/>
     <w:autoRedefine/>
     <w:unhideWhenUsed/>
     <w:rsid w:val="00CA0677"/>
@@ -11830,10 +11666,10 @@
       <w:rFonts w:asciiTheme="minorHAnsi" w:eastAsiaTheme="minorHAnsi"/>
     </w:rPr>
   </w:style>
-  <w:style w:type="paragraph" w:styleId="TOC8">
+  <w:style w:type="paragraph" w:styleId="81">
     <w:name w:val="toc 8"/>
-    <w:basedOn w:val="Normal"/>
-    <w:next w:val="Normal"/>
+    <w:basedOn w:val="a0"/>
+    <w:next w:val="a0"/>
     <w:autoRedefine/>
     <w:unhideWhenUsed/>
     <w:rsid w:val="00CA0677"/>
@@ -11844,10 +11680,10 @@
       <w:rFonts w:asciiTheme="minorHAnsi" w:eastAsiaTheme="minorHAnsi"/>
     </w:rPr>
   </w:style>
-  <w:style w:type="paragraph" w:styleId="TOC9">
+  <w:style w:type="paragraph" w:styleId="91">
     <w:name w:val="toc 9"/>
-    <w:basedOn w:val="Normal"/>
-    <w:next w:val="Normal"/>
+    <w:basedOn w:val="a0"/>
+    <w:next w:val="a0"/>
     <w:autoRedefine/>
     <w:unhideWhenUsed/>
     <w:rsid w:val="00CA0677"/>
@@ -11860,18 +11696,18 @@
   </w:style>
   <w:style w:type="paragraph" w:customStyle="1" w:styleId="SourceCode">
     <w:name w:val="Source Code"/>
-    <w:basedOn w:val="BodyText"/>
-    <w:next w:val="BodyText"/>
+    <w:basedOn w:val="a1"/>
+    <w:next w:val="a1"/>
     <w:autoRedefine/>
     <w:qFormat/>
-    <w:rsid w:val="008E07E9"/>
+    <w:rsid w:val="0088044D"/>
     <w:pPr>
       <w:shd w:val="clear" w:color="auto" w:fill="F2F2F2" w:themeFill="background1" w:themeFillShade="F2"/>
       <w:spacing w:before="100" w:beforeAutospacing="1" w:line="180" w:lineRule="auto"/>
     </w:pPr>
     <w:rPr>
-      <w:rFonts w:ascii="源ノ角ゴシック Code JP R" w:eastAsia="源ノ角ゴシック Code JP R" w:hAnsi="源ノ角ゴシック Code JP R" w:cs="源ノ角ゴシック Code JP R"/>
-      <w:sz w:val="13"/>
+      <w:rFonts w:ascii="Source Han Code JP R" w:eastAsia="Source Han Code JP R" w:hAnsi="Source Han Code JP R" w:cs="Source Han Code JP R"/>
+      <w:sz w:val="11"/>
       <w:szCs w:val="13"/>
     </w:rPr>
   </w:style>
@@ -11900,9 +11736,9 @@
       </w:pBdr>
     </w:pPr>
   </w:style>
-  <w:style w:type="table" w:customStyle="1" w:styleId="10">
+  <w:style w:type="table" w:customStyle="1" w:styleId="15">
     <w:name w:val="表 (格子)1"/>
-    <w:basedOn w:val="TableGrid"/>
+    <w:basedOn w:val="afb"/>
     <w:uiPriority w:val="99"/>
     <w:rsid w:val="00C21404"/>
     <w:pPr>
@@ -11941,10 +11777,10 @@
       </w:rPr>
     </w:tblStylePr>
   </w:style>
-  <w:style w:type="paragraph" w:styleId="EndnoteText">
+  <w:style w:type="paragraph" w:styleId="aff7">
     <w:name w:val="endnote text"/>
-    <w:basedOn w:val="Normal"/>
-    <w:link w:val="EndnoteTextChar"/>
+    <w:basedOn w:val="a0"/>
+    <w:link w:val="aff8"/>
     <w:autoRedefine/>
     <w:semiHidden/>
     <w:unhideWhenUsed/>
@@ -11956,10 +11792,10 @@
       <w:sz w:val="16"/>
     </w:rPr>
   </w:style>
-  <w:style w:type="character" w:customStyle="1" w:styleId="EndnoteTextChar">
-    <w:name w:val="Endnote Text Char"/>
-    <w:basedOn w:val="DefaultParagraphFont"/>
-    <w:link w:val="EndnoteText"/>
+  <w:style w:type="character" w:customStyle="1" w:styleId="aff8">
+    <w:name w:val="文末脚注文字列 (文字)"/>
+    <w:basedOn w:val="a2"/>
+    <w:link w:val="aff7"/>
     <w:semiHidden/>
     <w:rsid w:val="00E57EAE"/>
     <w:rPr>
@@ -11967,9 +11803,9 @@
       <w:sz w:val="16"/>
     </w:rPr>
   </w:style>
-  <w:style w:type="character" w:styleId="EndnoteReference">
+  <w:style w:type="character" w:styleId="aff9">
     <w:name w:val="endnote reference"/>
-    <w:basedOn w:val="DefaultParagraphFont"/>
+    <w:basedOn w:val="a2"/>
     <w:semiHidden/>
     <w:unhideWhenUsed/>
     <w:rsid w:val="00E57EAE"/>
@@ -12005,9 +11841,9 @@
     <w:name w:val="BaseNTok"/>
     <w:basedOn w:val="VerbatimChar"/>
     <w:qFormat/>
-    <w:rsid w:val="00437774"/>
+    <w:rsid w:val="001B7826"/>
     <w:rPr>
-      <w:rFonts w:ascii="源ノ角ゴシック Code JP N" w:eastAsia="源ノ角ゴシック Code JP N" w:hAnsi="源ノ角ゴシック Code JP N" w:cs="源ノ角ゴシック Code JP N"/>
+      <w:rFonts w:ascii="Source Han Code JP R" w:eastAsia="Source Han Code JP R" w:hAnsi="Source Han Code JP R" w:cs="Source Han Code JP R"/>
       <w:color w:val="B08000"/>
       <w:bdr w:val="none" w:sz="0" w:space="0" w:color="auto"/>
       <w:shd w:val="clear" w:color="auto" w:fill="auto"/>
@@ -12017,9 +11853,9 @@
     <w:name w:val="BuiltInTok"/>
     <w:basedOn w:val="VerbatimChar"/>
     <w:qFormat/>
-    <w:rsid w:val="00B00515"/>
+    <w:rsid w:val="00515C0D"/>
     <w:rPr>
-      <w:rFonts w:ascii="源ノ角ゴシック Code JP N" w:eastAsia="源ノ角ゴシック Code JP N" w:hAnsi="源ノ角ゴシック Code JP N" w:cs="源ノ角ゴシック Code JP N"/>
+      <w:rFonts w:ascii="Source Han Code JP R" w:eastAsia="Source Han Code JP R" w:hAnsi="Source Han Code JP R" w:cs="Source Han Code JP R"/>
       <w:b/>
       <w:color w:val="644A9B"/>
       <w:bdr w:val="none" w:sz="0" w:space="0" w:color="auto"/>
@@ -12030,9 +11866,9 @@
     <w:name w:val="DataTypeTok"/>
     <w:basedOn w:val="VerbatimChar"/>
     <w:qFormat/>
-    <w:rsid w:val="00940FE1"/>
+    <w:rsid w:val="009612A5"/>
     <w:rPr>
-      <w:rFonts w:ascii="源ノ角ゴシック Code JP N" w:eastAsia="源ノ角ゴシック Code JP N" w:hAnsi="源ノ角ゴシック Code JP N" w:cs="源ノ角ゴシック Code JP N"/>
+      <w:rFonts w:ascii="Source Han Code JP R" w:eastAsia="Source Han Code JP R" w:hAnsi="Source Han Code JP R" w:cs="Source Han Code JP R"/>
       <w:color w:val="0057AE"/>
       <w:bdr w:val="none" w:sz="0" w:space="0" w:color="auto"/>
       <w:shd w:val="clear" w:color="auto" w:fill="auto"/>
@@ -12042,9 +11878,9 @@
     <w:name w:val="ExtensionTok"/>
     <w:basedOn w:val="VerbatimChar"/>
     <w:qFormat/>
-    <w:rsid w:val="00B00515"/>
+    <w:rsid w:val="0015099F"/>
     <w:rPr>
-      <w:rFonts w:ascii="源ノ角ゴシック Code JP N" w:eastAsia="源ノ角ゴシック Code JP N" w:hAnsi="源ノ角ゴシック Code JP N" w:cs="源ノ角ゴシック Code JP N"/>
+      <w:rFonts w:ascii="Source Han Code JP R" w:eastAsia="Source Han Code JP R" w:hAnsi="Source Han Code JP R" w:cs="Source Han Code JP R"/>
       <w:b/>
       <w:color w:val="0095FF"/>
       <w:bdr w:val="none" w:sz="0" w:space="0" w:color="auto"/>
@@ -12055,9 +11891,9 @@
     <w:name w:val="FunctionTok"/>
     <w:basedOn w:val="VerbatimChar"/>
     <w:qFormat/>
-    <w:rsid w:val="00D77177"/>
+    <w:rsid w:val="0015099F"/>
     <w:rPr>
-      <w:rFonts w:ascii="源ノ角ゴシック Code JP N" w:eastAsia="源ノ角ゴシック Code JP N" w:hAnsi="源ノ角ゴシック Code JP N" w:cs="源ノ角ゴシック Code JP N"/>
+      <w:rFonts w:ascii="Source Han Code JP R" w:eastAsia="Source Han Code JP R" w:hAnsi="Source Han Code JP R" w:cs="Source Han Code JP R"/>
       <w:color w:val="644A9B"/>
       <w:bdr w:val="none" w:sz="0" w:space="0" w:color="auto"/>
       <w:shd w:val="clear" w:color="auto" w:fill="auto"/>
@@ -12067,9 +11903,9 @@
     <w:name w:val="ImportTok"/>
     <w:basedOn w:val="VerbatimChar"/>
     <w:qFormat/>
-    <w:rsid w:val="00D77177"/>
+    <w:rsid w:val="0015099F"/>
     <w:rPr>
-      <w:rFonts w:ascii="源ノ角ゴシック Code JP N" w:eastAsia="源ノ角ゴシック Code JP N" w:hAnsi="源ノ角ゴシック Code JP N" w:cs="源ノ角ゴシック Code JP N"/>
+      <w:rFonts w:ascii="Source Han Code JP R" w:eastAsia="Source Han Code JP R" w:hAnsi="Source Han Code JP R" w:cs="Source Han Code JP R"/>
       <w:color w:val="FF5500"/>
       <w:bdr w:val="none" w:sz="0" w:space="0" w:color="auto"/>
       <w:shd w:val="clear" w:color="auto" w:fill="auto"/>
@@ -12079,9 +11915,9 @@
     <w:name w:val="InformationTok"/>
     <w:basedOn w:val="VerbatimChar"/>
     <w:qFormat/>
-    <w:rsid w:val="00D77177"/>
+    <w:rsid w:val="0015099F"/>
     <w:rPr>
-      <w:rFonts w:ascii="源ノ角ゴシック Code JP N" w:eastAsia="源ノ角ゴシック Code JP N" w:hAnsi="源ノ角ゴシック Code JP N" w:cs="源ノ角ゴシック Code JP N"/>
+      <w:rFonts w:ascii="Source Han Code JP R" w:eastAsia="Source Han Code JP R" w:hAnsi="Source Han Code JP R" w:cs="Source Han Code JP R"/>
       <w:color w:val="B08000"/>
       <w:bdr w:val="none" w:sz="0" w:space="0" w:color="auto"/>
       <w:shd w:val="clear" w:color="auto" w:fill="auto"/>
@@ -12091,9 +11927,9 @@
     <w:name w:val="KeywordTok"/>
     <w:basedOn w:val="VerbatimChar"/>
     <w:qFormat/>
-    <w:rsid w:val="00D77177"/>
+    <w:rsid w:val="00B9729C"/>
     <w:rPr>
-      <w:rFonts w:ascii="源ノ角ゴシック Code JP N" w:eastAsia="源ノ角ゴシック Code JP N" w:hAnsi="源ノ角ゴシック Code JP N" w:cs="源ノ角ゴシック Code JP N"/>
+      <w:rFonts w:ascii="Source Han Code JP R" w:eastAsia="Source Han Code JP R" w:hAnsi="Source Han Code JP R" w:cs="Source Han Code JP R"/>
       <w:b/>
       <w:color w:val="1F1C1B"/>
       <w:bdr w:val="none" w:sz="0" w:space="0" w:color="auto"/>
@@ -12104,9 +11940,9 @@
     <w:name w:val="NormalTok"/>
     <w:basedOn w:val="VerbatimChar"/>
     <w:qFormat/>
-    <w:rsid w:val="00437774"/>
+    <w:rsid w:val="00B9729C"/>
     <w:rPr>
-      <w:rFonts w:ascii="源ノ角ゴシック Code JP N" w:eastAsia="源ノ角ゴシック Code JP N" w:hAnsi="源ノ角ゴシック Code JP N" w:cs="源ノ角ゴシック Code JP N"/>
+      <w:rFonts w:ascii="Source Han Code JP R" w:eastAsia="Source Han Code JP R" w:hAnsi="Source Han Code JP R" w:cs="Source Han Code JP R"/>
       <w:color w:val="1F1C1B"/>
       <w:bdr w:val="none" w:sz="0" w:space="0" w:color="auto"/>
       <w:shd w:val="clear" w:color="auto" w:fill="auto"/>
@@ -12116,9 +11952,9 @@
     <w:name w:val="OperatorTok"/>
     <w:basedOn w:val="VerbatimChar"/>
     <w:qFormat/>
-    <w:rsid w:val="00940FE1"/>
+    <w:rsid w:val="00B9729C"/>
     <w:rPr>
-      <w:rFonts w:ascii="源ノ角ゴシック Code JP N" w:eastAsia="源ノ角ゴシック Code JP N" w:hAnsi="源ノ角ゴシック Code JP N" w:cs="源ノ角ゴシック Code JP N"/>
+      <w:rFonts w:ascii="Source Han Code JP R" w:eastAsia="Source Han Code JP R" w:hAnsi="Source Han Code JP R" w:cs="Source Han Code JP R"/>
       <w:color w:val="1F1C1B"/>
       <w:bdr w:val="none" w:sz="0" w:space="0" w:color="auto"/>
       <w:shd w:val="clear" w:color="auto" w:fill="auto"/>
@@ -12128,9 +11964,9 @@
     <w:name w:val="OtherTok"/>
     <w:basedOn w:val="VerbatimChar"/>
     <w:qFormat/>
-    <w:rsid w:val="00940FE1"/>
+    <w:rsid w:val="00B9729C"/>
     <w:rPr>
-      <w:rFonts w:ascii="源ノ角ゴシック Code JP N" w:eastAsia="源ノ角ゴシック Code JP N" w:hAnsi="源ノ角ゴシック Code JP N" w:cs="源ノ角ゴシック Code JP N"/>
+      <w:rFonts w:ascii="Source Han Code JP R" w:eastAsia="Source Han Code JP R" w:hAnsi="Source Han Code JP R" w:cs="Source Han Code JP R"/>
       <w:color w:val="006E28"/>
       <w:bdr w:val="none" w:sz="0" w:space="0" w:color="auto"/>
       <w:shd w:val="thinDiagStripe" w:color="A6A6A6" w:themeColor="background1" w:themeShade="A6" w:fill="auto"/>
@@ -12140,9 +11976,9 @@
     <w:name w:val="PreprocessorTok"/>
     <w:basedOn w:val="VerbatimChar"/>
     <w:qFormat/>
-    <w:rsid w:val="00D77177"/>
+    <w:rsid w:val="00B9729C"/>
     <w:rPr>
-      <w:rFonts w:ascii="源ノ角ゴシック Code JP N" w:eastAsia="源ノ角ゴシック Code JP N" w:hAnsi="源ノ角ゴシック Code JP N" w:cs="源ノ角ゴシック Code JP N"/>
+      <w:rFonts w:ascii="Source Han Code JP R" w:eastAsia="Source Han Code JP R" w:hAnsi="Source Han Code JP R" w:cs="Source Han Code JP R"/>
       <w:color w:val="006E28"/>
       <w:bdr w:val="none" w:sz="0" w:space="0" w:color="auto"/>
       <w:shd w:val="clear" w:color="auto" w:fill="auto"/>
@@ -12152,9 +11988,9 @@
     <w:name w:val="RegionMarkerTok"/>
     <w:basedOn w:val="VerbatimChar"/>
     <w:qFormat/>
-    <w:rsid w:val="00940FE1"/>
+    <w:rsid w:val="00B9729C"/>
     <w:rPr>
-      <w:rFonts w:ascii="源ノ角ゴシック Code JP N" w:eastAsia="源ノ角ゴシック Code JP N" w:hAnsi="源ノ角ゴシック Code JP N" w:cs="源ノ角ゴシック Code JP N"/>
+      <w:rFonts w:ascii="Source Han Code JP R" w:eastAsia="Source Han Code JP R" w:hAnsi="Source Han Code JP R" w:cs="Source Han Code JP R"/>
       <w:color w:val="0057AE"/>
       <w:bdr w:val="none" w:sz="0" w:space="0" w:color="auto"/>
       <w:shd w:val="clear" w:color="auto" w:fill="E0E9F8"/>
@@ -12164,9 +12000,9 @@
     <w:name w:val="SpecialCharTok"/>
     <w:basedOn w:val="VerbatimChar"/>
     <w:qFormat/>
-    <w:rsid w:val="00940FE1"/>
+    <w:rsid w:val="00B9729C"/>
     <w:rPr>
-      <w:rFonts w:ascii="源ノ角ゴシック Code JP N" w:eastAsia="源ノ角ゴシック Code JP N" w:hAnsi="源ノ角ゴシック Code JP N" w:cs="源ノ角ゴシック Code JP N"/>
+      <w:rFonts w:ascii="Source Han Code JP R" w:eastAsia="Source Han Code JP R" w:hAnsi="Source Han Code JP R" w:cs="Source Han Code JP R"/>
       <w:color w:val="3DAEE9"/>
       <w:bdr w:val="none" w:sz="0" w:space="0" w:color="auto"/>
       <w:shd w:val="clear" w:color="auto" w:fill="auto"/>
@@ -12176,9 +12012,9 @@
     <w:name w:val="SpecialStringTok"/>
     <w:basedOn w:val="VerbatimChar"/>
     <w:qFormat/>
-    <w:rsid w:val="00940FE1"/>
+    <w:rsid w:val="0088044D"/>
     <w:rPr>
-      <w:rFonts w:ascii="源ノ角ゴシック Code JP N" w:eastAsia="源ノ角ゴシック Code JP N" w:hAnsi="源ノ角ゴシック Code JP N" w:cs="源ノ角ゴシック Code JP N"/>
+      <w:rFonts w:ascii="Source Han Code JP R" w:eastAsia="Source Han Code JP R" w:hAnsi="Source Han Code JP R" w:cs="Source Han Code JP R"/>
       <w:color w:val="FF5500"/>
       <w:bdr w:val="none" w:sz="0" w:space="0" w:color="auto"/>
       <w:shd w:val="clear" w:color="auto" w:fill="auto"/>
@@ -12188,9 +12024,9 @@
     <w:name w:val="StringTok"/>
     <w:basedOn w:val="VerbatimChar"/>
     <w:qFormat/>
-    <w:rsid w:val="008E07E9"/>
+    <w:rsid w:val="0088044D"/>
     <w:rPr>
-      <w:rFonts w:ascii="源ノ角ゴシック Code JP N" w:eastAsia="源ノ角ゴシック Code JP N" w:hAnsi="源ノ角ゴシック Code JP N" w:cs="源ノ角ゴシック Code JP N"/>
+      <w:rFonts w:ascii="Source Han Code JP R" w:eastAsia="Source Han Code JP R" w:hAnsi="Source Han Code JP R" w:cs="Source Han Code JP R"/>
       <w:color w:val="BF0303"/>
       <w:bdr w:val="none" w:sz="0" w:space="0" w:color="auto"/>
       <w:shd w:val="clear" w:color="auto" w:fill="auto"/>
@@ -12200,9 +12036,9 @@
     <w:name w:val="AnnotationTok"/>
     <w:basedOn w:val="VerbatimChar"/>
     <w:qFormat/>
-    <w:rsid w:val="00437774"/>
+    <w:rsid w:val="001B7826"/>
     <w:rPr>
-      <w:rFonts w:ascii="源ノ角ゴシック Code JP N" w:eastAsia="源ノ角ゴシック Code JP N" w:hAnsi="源ノ角ゴシック Code JP N" w:cs="源ノ角ゴシック Code JP N"/>
+      <w:rFonts w:ascii="Source Han Code JP R" w:eastAsia="Source Han Code JP R" w:hAnsi="Source Han Code JP R" w:cs="Source Han Code JP R"/>
       <w:color w:val="CA60CA"/>
       <w:bdr w:val="none" w:sz="0" w:space="0" w:color="auto"/>
       <w:shd w:val="clear" w:color="auto" w:fill="auto"/>
@@ -12212,9 +12048,9 @@
     <w:name w:val="AttributeTok"/>
     <w:basedOn w:val="VerbatimChar"/>
     <w:qFormat/>
-    <w:rsid w:val="00437774"/>
+    <w:rsid w:val="001B7826"/>
     <w:rPr>
-      <w:rFonts w:ascii="源ノ角ゴシック Code JP N" w:eastAsia="源ノ角ゴシック Code JP N" w:hAnsi="源ノ角ゴシック Code JP N" w:cs="源ノ角ゴシック Code JP N"/>
+      <w:rFonts w:ascii="Source Han Code JP R" w:eastAsia="Source Han Code JP R" w:hAnsi="Source Han Code JP R" w:cs="Source Han Code JP R"/>
       <w:color w:val="0057AE"/>
       <w:bdr w:val="none" w:sz="0" w:space="0" w:color="auto"/>
       <w:shd w:val="clear" w:color="auto" w:fill="auto"/>
@@ -12224,9 +12060,9 @@
     <w:name w:val="CharTok"/>
     <w:basedOn w:val="VerbatimChar"/>
     <w:qFormat/>
-    <w:rsid w:val="008E07E9"/>
+    <w:rsid w:val="00515C0D"/>
     <w:rPr>
-      <w:rFonts w:ascii="源ノ角ゴシック Code JP N" w:eastAsia="源ノ角ゴシック Code JP N" w:hAnsi="源ノ角ゴシック Code JP N" w:cs="源ノ角ゴシック Code JP N"/>
+      <w:rFonts w:ascii="Source Han Code JP R" w:eastAsia="Source Han Code JP R" w:hAnsi="Source Han Code JP R" w:cs="Source Han Code JP R"/>
       <w:color w:val="924C9D"/>
       <w:bdr w:val="none" w:sz="0" w:space="0" w:color="auto"/>
       <w:shd w:val="clear" w:color="auto" w:fill="auto"/>
@@ -12236,9 +12072,9 @@
     <w:name w:val="CommentTok"/>
     <w:basedOn w:val="VerbatimChar"/>
     <w:qFormat/>
-    <w:rsid w:val="008E07E9"/>
+    <w:rsid w:val="00515C0D"/>
     <w:rPr>
-      <w:rFonts w:ascii="源ノ角ゴシック Code JP N" w:eastAsia="源ノ角ゴシック Code JP N" w:hAnsi="源ノ角ゴシック Code JP N" w:cs="源ノ角ゴシック Code JP N"/>
+      <w:rFonts w:ascii="Source Han Code JP R" w:eastAsia="Source Han Code JP R" w:hAnsi="Source Han Code JP R" w:cs="Source Han Code JP R"/>
       <w:color w:val="898887"/>
       <w:bdr w:val="none" w:sz="0" w:space="0" w:color="auto"/>
       <w:shd w:val="clear" w:color="auto" w:fill="auto"/>
@@ -12248,9 +12084,9 @@
     <w:name w:val="ControlFlowTok"/>
     <w:basedOn w:val="VerbatimChar"/>
     <w:qFormat/>
-    <w:rsid w:val="00940FE1"/>
+    <w:rsid w:val="00B9729C"/>
     <w:rPr>
-      <w:rFonts w:ascii="源ノ角ゴシック Code JP N" w:eastAsia="源ノ角ゴシック Code JP N" w:hAnsi="源ノ角ゴシック Code JP N" w:cs="源ノ角ゴシック Code JP N"/>
+      <w:rFonts w:ascii="Source Han Code JP R" w:eastAsia="Source Han Code JP R" w:hAnsi="Source Han Code JP R" w:cs="Source Han Code JP R"/>
       <w:b/>
       <w:color w:val="1F1C1B"/>
       <w:bdr w:val="none" w:sz="0" w:space="0" w:color="auto"/>
@@ -12261,9 +12097,9 @@
     <w:name w:val="DecValTok"/>
     <w:basedOn w:val="VerbatimChar"/>
     <w:qFormat/>
-    <w:rsid w:val="00B00515"/>
+    <w:rsid w:val="009612A5"/>
     <w:rPr>
-      <w:rFonts w:ascii="源ノ角ゴシック Code JP N" w:eastAsia="源ノ角ゴシック Code JP N" w:hAnsi="源ノ角ゴシック Code JP N" w:cs="源ノ角ゴシック Code JP N"/>
+      <w:rFonts w:ascii="Source Han Code JP R" w:eastAsia="Source Han Code JP R" w:hAnsi="Source Han Code JP R" w:cs="Source Han Code JP R"/>
       <w:color w:val="B08000"/>
       <w:bdr w:val="none" w:sz="0" w:space="0" w:color="auto"/>
       <w:shd w:val="clear" w:color="auto" w:fill="auto"/>
@@ -12273,9 +12109,9 @@
     <w:name w:val="ErrorTok"/>
     <w:basedOn w:val="VerbatimChar"/>
     <w:qFormat/>
-    <w:rsid w:val="00B00515"/>
+    <w:rsid w:val="0015099F"/>
     <w:rPr>
-      <w:rFonts w:ascii="源ノ角ゴシック Code JP N" w:eastAsia="源ノ角ゴシック Code JP N" w:hAnsi="源ノ角ゴシック Code JP N" w:cs="源ノ角ゴシック Code JP N"/>
+      <w:rFonts w:ascii="Source Han Code JP R" w:eastAsia="Source Han Code JP R" w:hAnsi="Source Han Code JP R" w:cs="Source Han Code JP R"/>
       <w:color w:val="BF0303"/>
       <w:bdr w:val="none" w:sz="0" w:space="0" w:color="auto"/>
       <w:shd w:val="clear" w:color="auto" w:fill="auto"/>
@@ -12285,9 +12121,9 @@
     <w:name w:val="FloatTok"/>
     <w:basedOn w:val="VerbatimChar"/>
     <w:qFormat/>
-    <w:rsid w:val="00B00515"/>
+    <w:rsid w:val="0015099F"/>
     <w:rPr>
-      <w:rFonts w:ascii="源ノ角ゴシック Code JP N" w:eastAsia="源ノ角ゴシック Code JP N" w:hAnsi="源ノ角ゴシック Code JP N" w:cs="源ノ角ゴシック Code JP N"/>
+      <w:rFonts w:ascii="Source Han Code JP R" w:eastAsia="Source Han Code JP R" w:hAnsi="Source Han Code JP R" w:cs="Source Han Code JP R"/>
       <w:color w:val="B08000"/>
       <w:bdr w:val="none" w:sz="0" w:space="0" w:color="auto"/>
       <w:shd w:val="clear" w:color="auto" w:fill="auto"/>
@@ -12297,9 +12133,9 @@
     <w:name w:val="VerbatimStringTok"/>
     <w:basedOn w:val="VerbatimChar"/>
     <w:qFormat/>
-    <w:rsid w:val="008E07E9"/>
+    <w:rsid w:val="0088044D"/>
     <w:rPr>
-      <w:rFonts w:ascii="源ノ角ゴシック Code JP N" w:eastAsia="源ノ角ゴシック Code JP N" w:hAnsi="源ノ角ゴシック Code JP N" w:cs="源ノ角ゴシック Code JP N"/>
+      <w:rFonts w:ascii="Source Han Code JP R" w:eastAsia="Source Han Code JP R" w:hAnsi="Source Han Code JP R" w:cs="Source Han Code JP R"/>
       <w:color w:val="BF0303"/>
       <w:bdr w:val="none" w:sz="0" w:space="0" w:color="auto"/>
       <w:shd w:val="clear" w:color="auto" w:fill="auto"/>
@@ -12309,9 +12145,9 @@
     <w:name w:val="WarningTok"/>
     <w:basedOn w:val="VerbatimChar"/>
     <w:qFormat/>
-    <w:rsid w:val="008E07E9"/>
+    <w:rsid w:val="0088044D"/>
     <w:rPr>
-      <w:rFonts w:ascii="源ノ角ゴシック Code JP N" w:eastAsia="源ノ角ゴシック Code JP N" w:hAnsi="源ノ角ゴシック Code JP N" w:cs="源ノ角ゴシック Code JP N"/>
+      <w:rFonts w:ascii="Source Han Code JP R" w:eastAsia="Source Han Code JP R" w:hAnsi="Source Han Code JP R" w:cs="Source Han Code JP R"/>
       <w:color w:val="BF0303"/>
       <w:bdr w:val="none" w:sz="0" w:space="0" w:color="auto"/>
       <w:shd w:val="clear" w:color="auto" w:fill="auto"/>
@@ -12321,9 +12157,9 @@
     <w:name w:val="VariableTok"/>
     <w:basedOn w:val="VerbatimChar"/>
     <w:qFormat/>
-    <w:rsid w:val="008E07E9"/>
+    <w:rsid w:val="0088044D"/>
     <w:rPr>
-      <w:rFonts w:ascii="源ノ角ゴシック Code JP N" w:eastAsia="源ノ角ゴシック Code JP N" w:hAnsi="源ノ角ゴシック Code JP N" w:cs="源ノ角ゴシック Code JP N"/>
+      <w:rFonts w:ascii="Source Han Code JP R" w:eastAsia="Source Han Code JP R" w:hAnsi="Source Han Code JP R" w:cs="Source Han Code JP R"/>
       <w:color w:val="0057AE"/>
       <w:bdr w:val="none" w:sz="0" w:space="0" w:color="auto"/>
       <w:shd w:val="clear" w:color="auto" w:fill="auto"/>
@@ -12331,7 +12167,7 @@
   </w:style>
   <w:style w:type="paragraph" w:customStyle="1" w:styleId="GraphicAnchor">
     <w:name w:val="Graphic Anchor"/>
-    <w:basedOn w:val="BodyText"/>
+    <w:basedOn w:val="a1"/>
     <w:autoRedefine/>
     <w:qFormat/>
     <w:rsid w:val="005B012C"/>
@@ -12348,9 +12184,10 @@
   <w:style w:type="character" w:customStyle="1" w:styleId="AlertTok">
     <w:name w:val="AlertTok"/>
     <w:basedOn w:val="VerbatimChar"/>
-    <w:rsid w:val="00375533"/>
+    <w:qFormat/>
+    <w:rsid w:val="001B7826"/>
     <w:rPr>
-      <w:rFonts w:ascii="源ノ角ゴシック Code JP N" w:eastAsia="源ノ角ゴシック Code JP N" w:hAnsi="源ノ角ゴシック Code JP N" w:cs="源ノ角ゴシック Code JP N"/>
+      <w:rFonts w:ascii="Source Han Code JP R" w:eastAsia="Source Han Code JP R" w:hAnsi="Source Han Code JP R" w:cs="Source Han Code JP R"/>
       <w:b/>
       <w:color w:val="BF0303"/>
       <w:bdr w:val="none" w:sz="0" w:space="0" w:color="auto"/>
@@ -12361,9 +12198,9 @@
     <w:name w:val="CommentVarTok"/>
     <w:basedOn w:val="VerbatimChar"/>
     <w:qFormat/>
-    <w:rsid w:val="00B00515"/>
+    <w:rsid w:val="00515C0D"/>
     <w:rPr>
-      <w:rFonts w:ascii="源ノ角ゴシック Code JP N" w:eastAsia="源ノ角ゴシック Code JP N" w:hAnsi="源ノ角ゴシック Code JP N" w:cs="源ノ角ゴシック Code JP N"/>
+      <w:rFonts w:ascii="Source Han Code JP R" w:eastAsia="Source Han Code JP R" w:hAnsi="Source Han Code JP R" w:cs="Source Han Code JP R"/>
       <w:color w:val="0095FF"/>
       <w:bdr w:val="none" w:sz="0" w:space="0" w:color="auto"/>
       <w:shd w:val="clear" w:color="auto" w:fill="auto"/>
@@ -12373,9 +12210,9 @@
     <w:name w:val="ConstantTok"/>
     <w:basedOn w:val="VerbatimChar"/>
     <w:qFormat/>
-    <w:rsid w:val="00B00515"/>
+    <w:rsid w:val="00515C0D"/>
     <w:rPr>
-      <w:rFonts w:ascii="源ノ角ゴシック Code JP N" w:eastAsia="源ノ角ゴシック Code JP N" w:hAnsi="源ノ角ゴシック Code JP N" w:cs="源ノ角ゴシック Code JP N"/>
+      <w:rFonts w:ascii="Source Han Code JP R" w:eastAsia="Source Han Code JP R" w:hAnsi="Source Han Code JP R" w:cs="Source Han Code JP R"/>
       <w:color w:val="AA5500"/>
       <w:bdr w:val="none" w:sz="0" w:space="0" w:color="auto"/>
       <w:shd w:val="clear" w:color="auto" w:fill="auto"/>
@@ -12385,9 +12222,9 @@
     <w:name w:val="DocumentationTok"/>
     <w:basedOn w:val="VerbatimChar"/>
     <w:qFormat/>
-    <w:rsid w:val="00940FE1"/>
+    <w:rsid w:val="009612A5"/>
     <w:rPr>
-      <w:rFonts w:ascii="源ノ角ゴシック Code JP N" w:eastAsia="源ノ角ゴシック Code JP N" w:hAnsi="源ノ角ゴシック Code JP N" w:cs="源ノ角ゴシック Code JP N"/>
+      <w:rFonts w:ascii="Source Han Code JP R" w:eastAsia="Source Han Code JP R" w:hAnsi="Source Han Code JP R" w:cs="Source Han Code JP R"/>
       <w:color w:val="607880"/>
       <w:bdr w:val="none" w:sz="0" w:space="0" w:color="auto"/>
       <w:shd w:val="clear" w:color="auto" w:fill="auto"/>
@@ -12395,7 +12232,7 @@
   </w:style>
   <w:style w:type="paragraph" w:customStyle="1" w:styleId="AppendixHeading1">
     <w:name w:val="Appendix Heading 1"/>
-    <w:basedOn w:val="Heading1"/>
+    <w:basedOn w:val="1"/>
     <w:autoRedefine/>
     <w:qFormat/>
     <w:rsid w:val="00507E56"/>
@@ -12407,7 +12244,7 @@
   </w:style>
   <w:style w:type="paragraph" w:customStyle="1" w:styleId="AppendixHeading2">
     <w:name w:val="Appendix Heading 2"/>
-    <w:basedOn w:val="Heading2"/>
+    <w:basedOn w:val="20"/>
     <w:autoRedefine/>
     <w:qFormat/>
     <w:rsid w:val="00507E56"/>
@@ -12419,7 +12256,7 @@
   </w:style>
   <w:style w:type="paragraph" w:customStyle="1" w:styleId="AppendixHeading3">
     <w:name w:val="Appendix Heading 3"/>
-    <w:basedOn w:val="Heading3"/>
+    <w:basedOn w:val="31"/>
     <w:autoRedefine/>
     <w:qFormat/>
     <w:rsid w:val="005640ED"/>
@@ -12431,8 +12268,8 @@
   </w:style>
   <w:style w:type="paragraph" w:customStyle="1" w:styleId="AppendixHeading4">
     <w:name w:val="Appendix Heading 4"/>
-    <w:basedOn w:val="Heading4"/>
-    <w:next w:val="Heading4"/>
+    <w:basedOn w:val="40"/>
+    <w:next w:val="40"/>
     <w:autoRedefine/>
     <w:qFormat/>
     <w:rsid w:val="00507E56"/>
@@ -12445,7 +12282,7 @@
   </w:style>
   <w:style w:type="paragraph" w:customStyle="1" w:styleId="AppendixHeading5">
     <w:name w:val="Appendix Heading 5"/>
-    <w:basedOn w:val="Heading5"/>
+    <w:basedOn w:val="5"/>
     <w:autoRedefine/>
     <w:qFormat/>
     <w:rsid w:val="00464F1E"/>
@@ -12458,7 +12295,7 @@
   </w:style>
   <w:style w:type="paragraph" w:customStyle="1" w:styleId="FeatureList1">
     <w:name w:val="Feature List 1"/>
-    <w:basedOn w:val="Normal"/>
+    <w:basedOn w:val="a0"/>
     <w:autoRedefine/>
     <w:qFormat/>
     <w:rsid w:val="005B012C"/>
@@ -12482,7 +12319,7 @@
   </w:style>
   <w:style w:type="paragraph" w:customStyle="1" w:styleId="Note">
     <w:name w:val="Note"/>
-    <w:basedOn w:val="BodyText"/>
+    <w:basedOn w:val="a1"/>
     <w:autoRedefine/>
     <w:qFormat/>
     <w:rsid w:val="00A9252F"/>
@@ -12581,7 +12418,7 @@
   </w:style>
   <w:style w:type="paragraph" w:customStyle="1" w:styleId="TableHeadLeft">
     <w:name w:val="Table Head Left"/>
-    <w:basedOn w:val="BodyText"/>
+    <w:basedOn w:val="a1"/>
     <w:autoRedefine/>
     <w:qFormat/>
     <w:rsid w:val="00C17E2B"/>
@@ -12606,7 +12443,7 @@
   </w:style>
   <w:style w:type="paragraph" w:customStyle="1" w:styleId="HeadingUnnumbered5">
     <w:name w:val="Heading Unnumbered 5"/>
-    <w:basedOn w:val="Heading5"/>
+    <w:basedOn w:val="5"/>
     <w:autoRedefine/>
     <w:qFormat/>
     <w:rsid w:val="007F64DA"/>
@@ -12619,7 +12456,7 @@
       <w:bCs/>
     </w:rPr>
   </w:style>
-  <w:style w:type="numbering" w:customStyle="1" w:styleId="1">
+  <w:style w:type="numbering" w:customStyle="1" w:styleId="10">
     <w:name w:val="現在のリスト1"/>
     <w:uiPriority w:val="99"/>
     <w:rsid w:val="005B012C"/>
@@ -12629,9 +12466,9 @@
       </w:numPr>
     </w:pPr>
   </w:style>
-  <w:style w:type="character" w:styleId="FollowedHyperlink">
+  <w:style w:type="character" w:styleId="affa">
     <w:name w:val="FollowedHyperlink"/>
-    <w:basedOn w:val="DefaultParagraphFont"/>
+    <w:basedOn w:val="a2"/>
     <w:rsid w:val="00C17E2B"/>
     <w:rPr>
       <w:color w:val="800080" w:themeColor="followedHyperlink"/>
@@ -12640,7 +12477,7 @@
   </w:style>
   <w:style w:type="paragraph" w:customStyle="1" w:styleId="HiddenText">
     <w:name w:val="Hidden Text"/>
-    <w:basedOn w:val="BodyText"/>
+    <w:basedOn w:val="a1"/>
     <w:autoRedefine/>
     <w:qFormat/>
     <w:rsid w:val="00082EB2"/>
@@ -12650,14 +12487,14 @@
       <w:vanish/>
     </w:rPr>
   </w:style>
-  <w:style w:type="paragraph" w:customStyle="1" w:styleId="12">
+  <w:style w:type="paragraph" w:customStyle="1" w:styleId="16">
     <w:name w:val="スタイル1"/>
-    <w:basedOn w:val="BodyText"/>
+    <w:basedOn w:val="a1"/>
     <w:autoRedefine/>
     <w:qFormat/>
     <w:rsid w:val="00082EB2"/>
   </w:style>
-  <w:style w:type="paragraph" w:styleId="Revision">
+  <w:style w:type="paragraph" w:styleId="affb">
     <w:name w:val="Revision"/>
     <w:hidden/>
     <w:semiHidden/>
@@ -12671,7 +12508,7 @@
       <w:szCs w:val="20"/>
     </w:rPr>
   </w:style>
-  <w:style w:type="numbering" w:customStyle="1" w:styleId="2">
+  <w:style w:type="numbering" w:customStyle="1" w:styleId="21">
     <w:name w:val="現在のリスト2"/>
     <w:uiPriority w:val="99"/>
     <w:rsid w:val="00B90103"/>
@@ -12681,7 +12518,7 @@
       </w:numPr>
     </w:pPr>
   </w:style>
-  <w:style w:type="numbering" w:customStyle="1" w:styleId="3">
+  <w:style w:type="numbering" w:customStyle="1" w:styleId="30">
     <w:name w:val="現在のリスト3"/>
     <w:uiPriority w:val="99"/>
     <w:rsid w:val="00B90103"/>
@@ -12701,7 +12538,7 @@
       </w:numPr>
     </w:pPr>
   </w:style>
-  <w:style w:type="numbering" w:customStyle="1" w:styleId="5">
+  <w:style w:type="numbering" w:customStyle="1" w:styleId="50">
     <w:name w:val="現在のリスト5"/>
     <w:uiPriority w:val="99"/>
     <w:rsid w:val="00B90103"/>
@@ -12711,7 +12548,7 @@
       </w:numPr>
     </w:pPr>
   </w:style>
-  <w:style w:type="numbering" w:customStyle="1" w:styleId="6">
+  <w:style w:type="numbering" w:customStyle="1" w:styleId="60">
     <w:name w:val="現在のリスト6"/>
     <w:uiPriority w:val="99"/>
     <w:rsid w:val="00B90103"/>
@@ -12723,7 +12560,7 @@
   </w:style>
   <w:style w:type="table" w:customStyle="1" w:styleId="NoGridLeft">
     <w:name w:val="No Grid Left"/>
-    <w:basedOn w:val="TableNormal"/>
+    <w:basedOn w:val="a3"/>
     <w:uiPriority w:val="99"/>
     <w:rsid w:val="009B5007"/>
     <w:pPr>
@@ -12751,9 +12588,9 @@
       </w:rPr>
     </w:tblStylePr>
   </w:style>
-  <w:style w:type="table" w:styleId="PlainTable4">
+  <w:style w:type="table" w:styleId="43">
     <w:name w:val="Plain Table 4"/>
-    <w:basedOn w:val="TableNormal"/>
+    <w:basedOn w:val="a3"/>
     <w:rsid w:val="00EE300A"/>
     <w:pPr>
       <w:spacing w:after="0" w:line="240" w:lineRule="auto"/>
@@ -12799,9 +12636,9 @@
       </w:tcPr>
     </w:tblStylePr>
   </w:style>
-  <w:style w:type="table" w:styleId="ListTable1Light-Accent6">
+  <w:style w:type="table" w:styleId="1-6">
     <w:name w:val="List Table 1 Light Accent 6"/>
-    <w:basedOn w:val="TableNormal"/>
+    <w:basedOn w:val="a3"/>
     <w:uiPriority w:val="46"/>
     <w:rsid w:val="009B5007"/>
     <w:pPr>
@@ -12860,9 +12697,9 @@
       </w:tcPr>
     </w:tblStylePr>
   </w:style>
-  <w:style w:type="table" w:styleId="GridTable1Light">
+  <w:style w:type="table" w:styleId="17">
     <w:name w:val="Grid Table 1 Light"/>
-    <w:basedOn w:val="TableNormal"/>
+    <w:basedOn w:val="a3"/>
     <w:rsid w:val="009B5007"/>
     <w:pPr>
       <w:spacing w:after="0" w:line="240" w:lineRule="auto"/>

</xml_diff>